<commit_message>
Update laboratory time and teaching staff; synchronize schedule details
</commit_message>
<xml_diff>
--- a/syllabus/PSYC100_L_Introduction_to_Psychology_Fall_2027_Syllabus.docx
+++ b/syllabus/PSYC100_L_Introduction_to_Psychology_Fall_2027_Syllabus.docx
@@ -448,7 +448,7 @@
                 <w:sz w:val="17"/>
                 <w:szCs w:val="17"/>
               </w:rPr>
-              <w:t xml:space="preserve">Wed 12pm – 2:50pm </w:t>
+              <w:t xml:space="preserve">Wed 9am – 11:50am </w:t>
             </w:r>
           </w:p>
           <w:p>
@@ -1098,7 +1098,7 @@
                 <w:sz w:val="17"/>
                 <w:szCs w:val="17"/>
               </w:rPr>
-              <w:t>Lab TA (Section ____)</w:t>
+              <w:t>Lab TA (Section T/W)</w:t>
             </w:r>
           </w:p>
         </w:tc>
@@ -1125,7 +1125,7 @@
                 <w:sz w:val="17"/>
                 <w:szCs w:val="17"/>
               </w:rPr>
-              <w:t>________</w:t>
+              <w:t>Samuel Hires</w:t>
             </w:r>
           </w:p>
         </w:tc>
@@ -1148,7 +1148,7 @@
               </w:rPr>
             </w:pPr>
             <w:r>
-              <w:t>________</w:t>
+              <w:t>hires@usc.edu</w:t>
             </w:r>
           </w:p>
         </w:tc>
@@ -1175,7 +1175,7 @@
                 <w:sz w:val="17"/>
                 <w:szCs w:val="17"/>
               </w:rPr>
-              <w:t>________________</w:t>
+              <w:t>Mon, Fri; 4pm @ANI500A</w:t>
             </w:r>
           </w:p>
         </w:tc>
@@ -1203,7 +1203,7 @@
                 <w:sz w:val="17"/>
                 <w:szCs w:val="17"/>
               </w:rPr>
-              <w:t>Lab TA (Section ____)</w:t>
+              <w:t>Lab TA (Section TH)</w:t>
             </w:r>
           </w:p>
         </w:tc>
@@ -1230,7 +1230,7 @@
                 <w:sz w:val="17"/>
                 <w:szCs w:val="17"/>
               </w:rPr>
-              <w:t>________</w:t>
+              <w:t>David Mckemy</w:t>
             </w:r>
           </w:p>
         </w:tc>
@@ -1253,7 +1253,7 @@
               </w:rPr>
             </w:pPr>
             <w:r>
-              <w:t>________</w:t>
+              <w:t>dkemy@usc.edu</w:t>
             </w:r>
           </w:p>
         </w:tc>
@@ -1280,7 +1280,7 @@
                 <w:sz w:val="17"/>
                 <w:szCs w:val="17"/>
               </w:rPr>
-              <w:t>________________</w:t>
+              <w:t>Tues, Wed, Thurs; 3pm @ANI500A</w:t>
             </w:r>
           </w:p>
         </w:tc>
@@ -1331,7 +1331,7 @@
                 <w:sz w:val="17"/>
                 <w:szCs w:val="17"/>
               </w:rPr>
-              <w:t>________</w:t>
+              <w:t>Sarah W Bottjer</w:t>
             </w:r>
           </w:p>
         </w:tc>
@@ -1353,7 +1353,7 @@
               </w:rPr>
             </w:pPr>
             <w:r>
-              <w:t>________</w:t>
+              <w:t>sbottjer@usc.edu</w:t>
             </w:r>
           </w:p>
         </w:tc>
@@ -1379,7 +1379,7 @@
                 <w:sz w:val="17"/>
                 <w:szCs w:val="17"/>
               </w:rPr>
-              <w:t>________________</w:t>
+              <w:t>ANI 402</w:t>
             </w:r>
           </w:p>
         </w:tc>
@@ -3014,7 +3014,7 @@
         <w:spacing w:after="120" w:line="276" w:lineRule="auto"/>
       </w:pPr>
       <w:r>
-        <w:t>There are four exams, each worth 120 points. Exam 1 covers Lectures 1 to 10, Exam 2 covers Lectures 11 to 20, Exam 3 covers Lectures 21 to 30, and Exam 4 covers Lectures 31 to 41. Exams are not cumulative, but the concepts build on one another. Planned dates are Monday, September 20; Monday, October 18; and Monday, November 8. Exam 4 will use the assigned university appointment within December 8–15. All exams use the separate exam session. Exam time: __________. Room(s): __________. Dates and room reservations remain subject to departmental confirmation.</w:t>
+        <w:t>There are four exams, each worth 120 points. Exam 1 covers Lectures 1 to 10, Exam 2 covers Lectures 11 to 20, Exam 3 covers Lectures 21 to 30, and Exam 4 covers Lectures 31 to 41. Exams are not cumulative, but the concepts build on one another. Planned dates are Monday, September 20; Monday, October 18; and Monday, November 8. Exam 4 will use the assigned university appointment within December 8–15. All exams use the separate exam session. Exams 1–3 meet Mondays at 5:00 PM in NEU 100A or NEU 100B. Exam 4’s assigned date and time will be announced separately. Dates and room reservations remain subject to departmental confirmation.</w:t>
       </w:r>
     </w:p>
     <w:p>
@@ -3336,7 +3336,7 @@
         <w:t xml:space="preserve">New lecture content is introduced on exam days. </w:t>
       </w:r>
       <w:r>
-        <w:t>Exams occur in the separate exam session, so the regular 1:30–2:50 PM lecture meets normally. Material introduced after an exam’s coverage block is assessed on the next relevant exam.</w:t>
+        <w:t>Exams occur in the separate exam session, so the regular 1:00–2:50 PM lecture meets normally. Material introduced after an exam’s coverage block is assessed on the next relevant exam.</w:t>
       </w:r>
     </w:p>
     <w:p>
@@ -4239,7 +4239,7 @@
                 <w:sz w:val="17"/>
                 <w:szCs w:val="17"/>
               </w:rPr>
-              <w:t>Report due Sun Sep 19; Monday sections use an equivalent task Sep 7–10</w:t>
+              <w:t>Report due Sun Sep 19</w:t>
             </w:r>
           </w:p>
         </w:tc>
@@ -5373,7 +5373,7 @@
           <w:sz w:val="18"/>
           <w:szCs w:val="18"/>
         </w:rPr>
-        <w:t>Lab section times and rooms: ____________________. All report and assignment deadlines are 11:59 PM Pacific time. No required regular lab meets in Week 7 or Week 14. Fall Recess is October 7–8, Veterans Day is November 11, and Thanksgiving is November 24–28. Holiday-affected sections receive an equivalent task without required participation on a closure day. The late work policy applies (see Late Work below).</w:t>
+        <w:t>Lab sections meet at the times listed under Course Times &amp; Locations; all sections meet in NEU LAB1A. All report and assignment deadlines are 11:59 PM Pacific time. No required regular lab meets in Week 7 or Week 14. Fall Recess is October 7–8, Veterans Day is November 11, and Thanksgiving is November 24–28. Holiday-affected sections receive an equivalent task without required participation on a closure day. The late work policy applies (see Late Work below).</w:t>
       </w:r>
     </w:p>
     <w:p>
@@ -5860,7 +5860,7 @@
           <w:sz w:val="18"/>
           <w:szCs w:val="18"/>
         </w:rPr>
-        <w:t xml:space="preserve">Lectures meet Monday, Wednesday, and Friday, 1:30–2:50 PM. Every instructional meeting introduces a new topic, beginning August 23 and ending December 3. Exams use the separate session; planned dates are September 20, October 18, and November 8, with Exam 4 in the assigned December 8–15 appointment. Exam time and room: ____________________. Lab </w:t>
+        <w:t xml:space="preserve">Lectures meet Monday, Wednesday, and Friday, 1:00–2:50 PM. Every instructional meeting introduces a new topic, beginning August 23 and ending December 3. Exams use the separate session; planned dates are September 20, October 18, and November 8, with Exam 4 in the assigned December 8–15 appointment. Exams 1–3 meet at 5:00 PM in NEU 100A or NEU 100B; Exam 4’s assigned date and time will be announced separately. Lab </w:t>
       </w:r>
       <w:r>
         <w:rPr>

</xml_diff>

<commit_message>
Require textbook and assigned readings; clarify preparation and exam expectations
</commit_message>
<xml_diff>
--- a/syllabus/PSYC100_L_Introduction_to_Psychology_Fall_2027_Syllabus.docx
+++ b/syllabus/PSYC100_L_Introduction_to_Psychology_Fall_2027_Syllabus.docx
@@ -765,7 +765,7 @@
         <w:spacing w:after="120" w:line="276" w:lineRule="auto"/>
       </w:pPr>
       <w:r>
-        <w:t>Lecture slides are the primary source of instruction, and exams are based on lecture content. Course reference: Myers, D. G., DeWall, C. N., and Gruber, J. Psychology (14th ed.). Worth / Macmillan Learning. This textbook provides the conceptual backbone. No paid courseware or access code is required for the laboratory activities.</w:t>
+        <w:t>Required textbook: Myers, D. G., DeWall, C. N., and Gruber, J. Psychology (14th ed.). Worth / Macmillan Learning. Assigned textbook readings and research articles are required course preparation. The textbook builds the conceptual foundation for lecture, while research articles allow us to examine specific experiments, current findings, and emerging questions. Lectures build on these readings and often extend beyond the textbook.</w:t>
       </w:r>
     </w:p>
     <w:p>
@@ -773,7 +773,15 @@
         <w:spacing w:after="120" w:line="276" w:lineRule="auto"/>
       </w:pPr>
       <w:r>
-        <w:t>Specific textbook readings and research-paper lists are not assigned yet. They will be added separately if assigned. I will teach the material in lecture; any later recommended readings will allow you to examine the evidence in greater depth.</w:t>
+        <w:t>Lecture slides are the primary source of instruction, and exams are based on lecture content. Use the assigned readings to develop context, clarify unfamiliar concepts, and deepen your understanding of the evidence discussed in class. Slides provide a framework for lecture; they do not capture every explanation, example, or discussion that may appear on an exam.</w:t>
+      </w:r>
+    </w:p>
+    <w:p>
+      <w:pPr>
+        <w:spacing w:after="120" w:line="276" w:lineRule="auto"/>
+      </w:pPr>
+      <w:r>
+        <w:t>Although this is an introductory course, it moves quickly and asks you to do more than memorize terminology. We cover substantial material and regularly work through experiments and data. No previous psychology background is expected, but consistent preparation is essential: complete assigned readings, attend lecture, review your notes regularly, and seek help early when something is unclear. The textbook, research articles, lectures, and labs are intended to support one another as you build these skills.</w:t>
       </w:r>
     </w:p>
     <w:p>
@@ -789,7 +797,7 @@
       </w:r>
       <w:proofErr w:type="spellEnd"/>
       <w:r>
-        <w:t>, plus a reliable connection to the course site. Task links, datasets, and analysis templates will be provided. No paid analysis software or prior coding experience is required. Contact the instructor or TA if equipment or accessibility is a concern.</w:t>
+        <w:t>, plus a reliable connection to the course site. Task links, datasets, and analysis templates will be provided. No paid analysis software or prior coding experience is required. Contact the instructor or TA if equipment or accessibility is a concern. No paid courseware or access code is required for the laboratory activities.</w:t>
       </w:r>
     </w:p>
     <w:p>
@@ -12635,7 +12643,7 @@
           <w:sz w:val="18"/>
           <w:szCs w:val="18"/>
         </w:rPr>
-        <w:t>Specific readings and paper lists have not been assigned yet. This section will be completed separately. Current lecture content defines exam coverage; Myers, DeWall, and Gruber’s Psychology, 14th edition, remains the conceptual reference.</w:t>
+        <w:t>Assigned textbook readings and research articles are required course preparation. The dated reading schedule and article list will be posted on the course site. Complete each assigned reading before the corresponding lecture. Current lecture content defines exam coverage.</w:t>
       </w:r>
     </w:p>
     <w:p>

</xml_diff>

<commit_message>
Direct grading concerns and regrade requests to instructor
</commit_message>
<xml_diff>
--- a/syllabus/PSYC100_L_Introduction_to_Psychology_Fall_2027_Syllabus.docx
+++ b/syllabus/PSYC100_L_Introduction_to_Psychology_Fall_2027_Syllabus.docx
@@ -949,7 +949,7 @@
         <w:spacing w:after="120" w:line="276" w:lineRule="auto"/>
       </w:pPr>
       <w:r>
-        <w:t>This course has no co-instructor. Questions about lab logistics, lab reports, and grading should go to your TA first. Email the instructor only for issues that the TA cannot resolve.</w:t>
+        <w:t>This course has no co-instructor. Contact your assigned TA for lab logistics, help understanding assignments, and questions about course material. All grading questions, concerns about scores or feedback, and requests for regrading should be sent directly to me at jlopez11@usc.edu, rather than to a TA. You do not need to contact your TA before bringing a grading concern to me.</w:t>
       </w:r>
     </w:p>
     <w:tbl>
@@ -5738,7 +5738,7 @@
         <w:rPr>
           <w:color w:val="000000"/>
         </w:rPr>
-        <w:t>Questions about psychological concepts, experiments, and data analysis are expected. Use Teaching Assistants as the first point of contact for homework, lab reports, analysis, and routine logistics. TAs hold lab sessions and office hours and can provide timely support. Contact the instructor at jlopez11@usc.edu for unresolved questions, grading concerns, accommodations, or confidential issues. No student is required to disclose personal mental-health experiences during class or lab.</w:t>
+        <w:t>Questions about psychological concepts, experiments, and data analysis are welcome. Your TA can help with homework, lab reports, analysis, and routine logistics during lab sessions and office hours. Contact me directly at jlopez11@usc.edu for all grading concerns and regrade requests, as well as unresolved course questions, accommodations, or confidential issues. For a grading question or regrade request, identify the assignment or exam, the specific question or rubric item, and the reason you would like it reviewed. No student is required to disclose personal mental-health experiences during class or lab.</w:t>
       </w:r>
     </w:p>
     <w:p>

</xml_diff>

<commit_message>
Replace participation grade with Week 11 choice-based experimental practical
</commit_message>
<xml_diff>
--- a/syllabus/PSYC100_L_Introduction_to_Psychology_Fall_2027_Syllabus.docx
+++ b/syllabus/PSYC100_L_Introduction_to_Psychology_Fall_2027_Syllabus.docx
@@ -117,7 +117,7 @@
         <w:spacing w:line="276" w:lineRule="auto"/>
       </w:pPr>
       <w:r>
-        <w:t>jlopez11@usc.edu</w:t>
+        <w:t>jlopez@usc.edu</w:t>
       </w:r>
     </w:p>
     <w:p>
@@ -715,6 +715,7 @@
         <w:spacing w:after="120" w:line="276" w:lineRule="auto"/>
       </w:pPr>
       <w:r>
+        <w:lastRenderedPageBreak/>
         <w:t>This is the only PSYC100 offering that includes experimental laboratory sections in place of discussion sections. Laboratories begin in the first week and meet in their own scheduled sections, outside lecture hours. Students conduct behavioral experiments, formulate testable predictions, analyze data, and communicate findings in scientific reports. Lecture and laboratory together connect core psychological concepts with the methods used to investigate them, preparing students to evaluate psychological claims and pursue further study in psychology and related fields.</w:t>
       </w:r>
     </w:p>
@@ -765,7 +766,7 @@
         <w:spacing w:after="120" w:line="276" w:lineRule="auto"/>
       </w:pPr>
       <w:r>
-        <w:t>Required textbook: Myers, D. G., DeWall, C. N., and Gruber, J. Psychology (14th ed.). Worth / Macmillan Learning. Assigned textbook readings and research articles are required course preparation. The textbook builds the conceptual foundation for lecture, while research articles allow us to examine specific experiments, current findings, and emerging questions. Lectures build on these readings and often extend beyond the textbook.</w:t>
+        <w:t xml:space="preserve">Required textbook: Myers, D. G., DeWall, C. N., and Gruber, J. Psychology (14th ed.). Worth / Macmillan Learning. </w:t>
       </w:r>
     </w:p>
     <w:p>
@@ -773,7 +774,26 @@
         <w:spacing w:after="120" w:line="276" w:lineRule="auto"/>
       </w:pPr>
       <w:r>
-        <w:t>Lecture slides are the primary source of instruction, and exams are based on lecture content. Use the assigned readings to develop context, clarify unfamiliar concepts, and deepen your understanding of the evidence discussed in class. Slides provide a framework for lecture; they do not capture every explanation, example, or discussion that may appear on an exam.</w:t>
+        <w:t>Assigned textbook readings and research articles are required course preparation. The textbook builds the conceptual foundation for lecture, while research articles allow us to examine specific experiments, current findings, and emerging questions. Lectures build on these readings and often extend beyond the textbook.</w:t>
+      </w:r>
+    </w:p>
+    <w:p>
+      <w:pPr>
+        <w:spacing w:after="120" w:line="276" w:lineRule="auto"/>
+      </w:pPr>
+      <w:r>
+        <w:t xml:space="preserve">Lecture slides are the primary source of instruction, and exams are based on lecture content. Use the assigned readings to develop context, clarify unfamiliar concepts, and deepen your understanding of the evidence discussed in class. Slides provide a framework for </w:t>
+      </w:r>
+      <w:proofErr w:type="gramStart"/>
+      <w:r>
+        <w:t>lecture</w:t>
+      </w:r>
+      <w:proofErr w:type="gramEnd"/>
+      <w:r>
+        <w:t xml:space="preserve"> but </w:t>
+      </w:r>
+      <w:r>
+        <w:t>they do not capture every explanation, example, or discussion that may appear on an exam.</w:t>
       </w:r>
     </w:p>
     <w:p>
@@ -797,7 +817,7 @@
       </w:r>
       <w:proofErr w:type="spellEnd"/>
       <w:r>
-        <w:t>, plus a reliable connection to the course site. Task links, datasets, and analysis templates will be provided. No paid analysis software or prior coding experience is required. Contact the instructor or TA if equipment or accessibility is a concern. No paid courseware or access code is required for the laboratory activities.</w:t>
+        <w:t>, plus a reliable connection to the course site. Contact the instructor or TA if equipment or accessibility is a concern. No paid courseware or access code is required for the laboratory activities.</w:t>
       </w:r>
     </w:p>
     <w:p>
@@ -941,6 +961,7 @@
           <w:sz w:val="25"/>
           <w:szCs w:val="25"/>
         </w:rPr>
+        <w:lastRenderedPageBreak/>
         <w:t>Teaching Assistants</w:t>
       </w:r>
     </w:p>
@@ -949,7 +970,18 @@
         <w:spacing w:after="120" w:line="276" w:lineRule="auto"/>
       </w:pPr>
       <w:r>
-        <w:t>This course has no co-instructor. Contact your assigned TA for lab logistics, help understanding assignments, and questions about course material. All grading questions, concerns about scores or feedback, and requests for regrading should be sent directly to me at jlopez11@usc.edu, rather than to a TA. You do not need to contact your TA before bringing a grading concern to me.</w:t>
+        <w:t xml:space="preserve">This course has no co-instructor. Questions about lab logistics, lab reports, and assignment expectations should go to your assigned TA first. Concerns about scores or grading feedback, including requests for regrading, should be sent directly to me at </w:t>
+      </w:r>
+      <w:hyperlink r:id="rId9" w:history="1">
+        <w:r>
+          <w:rPr>
+            <w:rStyle w:val="Hyperlink"/>
+          </w:rPr>
+          <w:t>jlopez@usc.edu</w:t>
+        </w:r>
+      </w:hyperlink>
+      <w:r>
+        <w:t>.</w:t>
       </w:r>
     </w:p>
     <w:tbl>
@@ -1407,7 +1439,6 @@
           <w:sz w:val="25"/>
           <w:szCs w:val="25"/>
         </w:rPr>
-        <w:lastRenderedPageBreak/>
         <w:t>Grading</w:t>
       </w:r>
     </w:p>
@@ -2154,7 +2185,7 @@
                 <w:sz w:val="17"/>
                 <w:szCs w:val="17"/>
               </w:rPr>
-              <w:t>Lab Attendance and Participation</w:t>
+              <w:t>Individual Experimental Practical</w:t>
             </w:r>
           </w:p>
         </w:tc>
@@ -2374,7 +2405,11 @@
         <w:spacing w:after="120" w:line="276" w:lineRule="auto"/>
       </w:pPr>
       <w:r>
-        <w:t>If the final class average, calculated using the weighted lecture and laboratory grades before curving, is below 70%, a curve will be applied at the end of the course. If the class average is 70% or higher, no curve will be applied. The size of any adjustment will depend on overall class performance. A curve accounts for assessment difficulty while maintaining expectations for mastery; it does not guarantee a particular letter grade or a passing grade. Use early assessment results to identify gaps in your understanding, review feedback, and seek help promptly. Do not rely on a possible curve to compensate for missing work or consistently weak performance. You must still earn at least 60% in both the lecture and laboratory components to pass the course.</w:t>
+        <w:t xml:space="preserve">If the final class average, calculated using the weighted lecture and laboratory grades before curving, is below 70%, a curve will be applied at the end of the course. If the class average is 70% or higher, no curve will be applied. The size of any adjustment will depend on overall class performance. A curve accounts for assessment difficulty while maintaining expectations for mastery; it does not guarantee a particular letter grade or a passing grade. Use early assessment results to identify gaps in your understanding, review feedback, and seek help </w:t>
+      </w:r>
+      <w:r>
+        <w:lastRenderedPageBreak/>
+        <w:t>promptly. Do not rely on a possible curve to compensate for missing work or consistently weak performance. You must still earn at least 60% in both the lecture and laboratory components to pass the course.</w:t>
       </w:r>
     </w:p>
     <w:p>
@@ -2449,7 +2484,6 @@
                 <w:sz w:val="17"/>
                 <w:szCs w:val="17"/>
               </w:rPr>
-              <w:lastRenderedPageBreak/>
               <w:t>Letter Grade</w:t>
             </w:r>
           </w:p>
@@ -3195,7 +3229,14 @@
         <w:rPr>
           <w:color w:val="000000"/>
         </w:rPr>
-        <w:t>Draw directly from lecture content, explain specific experiments and findings, and identify the evidence supporting your answer. Use relevant examples of psychological processes and behavior. Memorizing terminology or repeating slide text without demonstrating understanding is not sufficient.</w:t>
+        <w:t xml:space="preserve">Draw directly from lecture content, explain specific experiments and findings, and identify the evidence supporting your answer. Use relevant examples of psychological processes and </w:t>
+      </w:r>
+      <w:r>
+        <w:rPr>
+          <w:color w:val="000000"/>
+        </w:rPr>
+        <w:lastRenderedPageBreak/>
+        <w:t>behavior. Memorizing terminology or repeating slide text without demonstrating understanding is not sufficient.</w:t>
       </w:r>
     </w:p>
     <w:p>
@@ -3247,7 +3288,6 @@
         <w:rPr>
           <w:color w:val="000000"/>
         </w:rPr>
-        <w:lastRenderedPageBreak/>
         <w:t>Bring a photo ID and a pencil (YOU WILL BE VERIFIED). Phones, smartwatches, and notes are not allowed</w:t>
       </w:r>
     </w:p>
@@ -3694,7 +3734,11 @@
         <w:spacing w:after="120" w:line="276" w:lineRule="auto"/>
       </w:pPr>
       <w:r>
-        <w:t>The lab is a required, graded component and begins in Week 1, August 23–27. The first session includes a reaction-time experiment, with brief instruction in ethical participation and data handling. Labs use low-risk behavioral tasks and approved deidentified data. Personal participation as a research subject is voluntary; an equivalent analysis route is available without penalty. No task requires personal clinical disclosure, diagnostic testing of classmates, sleep deprivation, aversive stimulation, or outside recruitment. Use coded data on the approved course system. Classroom activities are not automatically approved for external human-subjects research.</w:t>
+        <w:t xml:space="preserve">The lab is a required, graded component and begins in Week 1, August 23–27. The first session includes a reaction-time experiment, with brief instruction in ethical participation and data handling. Labs use low-risk </w:t>
+      </w:r>
+      <w:r>
+        <w:lastRenderedPageBreak/>
+        <w:t>behavioral tasks and approved deidentified data. Personal participation as a research subject is voluntary; an equivalent analysis route is available without penalty. No task requires personal clinical disclosure, diagnostic testing of classmates, sleep deprivation, aversive stimulation, or outside recruitment. Use coded data on the approved course system. Classroom activities are not automatically approved for external human-subjects research.</w:t>
       </w:r>
     </w:p>
     <w:p>
@@ -3724,14 +3768,7 @@
         <w:rPr>
           <w:color w:val="000000"/>
         </w:rPr>
-        <w:t xml:space="preserve"> Lab 1 uses a guided 2–3-page report; later reports are normally 3–4 pages, excluding figures and references. Use Question and Prediction, Methods, Results, Discussion, and References. Submit a labeled authentic-data figure and an editable </w:t>
-      </w:r>
-      <w:r>
-        <w:rPr>
-          <w:color w:val="000000"/>
-        </w:rPr>
-        <w:lastRenderedPageBreak/>
-        <w:t>analysis file. Apply the comparison taught for the task rather than adding an unjustified significance test to every claim. Each report is scored out of 100: question 15, methods 20, analysis/figure 30, interpretation 25, clarity/references 10.</w:t>
+        <w:t xml:space="preserve"> Lab 1 uses a guided 2–3-page report; later reports are normally 3–4 pages, excluding figures and references. Use Question and Prediction, Methods, Results, Discussion, and References. Submit a labeled authentic-data figure and an editable analysis file. Apply the comparison taught for the task rather than adding an unjustified significance test to every claim. Each report is scored out of 100: question 15, methods 20, analysis/figure 30, interpretation 25, clarity/references 10.</w:t>
       </w:r>
     </w:p>
     <w:p>
@@ -3755,13 +3792,127 @@
           <w:bCs/>
           <w:color w:val="000000"/>
         </w:rPr>
-        <w:t>Lab Attendance and Participation (10%).</w:t>
+        <w:t>Individual Experimental Practical (10%). During your Week 11 lab section (November 2–4), you will complete an individual practical on one of five experiments introduced earlier in the course. Select your topic by Friday, October 22, at 11:59 PM. For your chosen experiment, explain the hypothesis and design, demonstrate the procedure, analyze a provided dataset, create a labeled figure, and interpret the findings. Preparation guides containing the protocols, assessment prompts, rubric, and practice datasets for all five options will be available by October 19, at least two weeks before the first practical. Assessment datasets contain different observations but use the same structure and analysis methods practiced beforehand. All options assess comparable skills using the same rubric: experimental design 20%, procedure 20%, analysis and figure 35%, and interpretation 25%. Your grade reflects your experimental skills and reasoning, not your personal psychological performance or whether results support the hypothesis.</w:t>
       </w:r>
+    </w:p>
+    <w:p>
+      <w:pPr>
+        <w:numPr>
+          <w:ilvl w:val="0"/>
+          <w:numId w:val="1"/>
+        </w:numPr>
+        <w:pBdr>
+          <w:top w:val="nil"/>
+          <w:left w:val="nil"/>
+          <w:bottom w:val="nil"/>
+          <w:right w:val="nil"/>
+          <w:between w:val="nil"/>
+        </w:pBdr>
+        <w:spacing w:after="60" w:line="276" w:lineRule="auto"/>
+      </w:pPr>
       <w:r>
         <w:rPr>
+          <w:b/>
+          <w:bCs/>
           <w:color w:val="000000"/>
         </w:rPr>
-        <w:t xml:space="preserve"> Attend each scheduled lab or an approved equivalent. Submit the session’s data/checkpoint and exit response before leaving, or within the equivalent task’s posted window. Each of 13 required meetings earns 2 points: 1 for attendance/equivalent participation and 1 for the completed checkpoint. The participation percentage is points earned divided by 26, multiplied by 100. Notify the TA promptly about an absence and arrange a make-up or equivalent. The two dropped reports do not automatically excuse attendance.</w:t>
+        <w:t>Reaction time and the speed–accuracy trade-off: Compare speed-focused and accuracy-focused instructions; summarize reaction times and errors and interpret the trade-off.</w:t>
+      </w:r>
+    </w:p>
+    <w:p>
+      <w:pPr>
+        <w:numPr>
+          <w:ilvl w:val="0"/>
+          <w:numId w:val="1"/>
+        </w:numPr>
+        <w:pBdr>
+          <w:top w:val="nil"/>
+          <w:left w:val="nil"/>
+          <w:bottom w:val="nil"/>
+          <w:right w:val="nil"/>
+          <w:between w:val="nil"/>
+        </w:pBdr>
+        <w:spacing w:after="60" w:line="276" w:lineRule="auto"/>
+      </w:pPr>
+      <w:r>
+        <w:rPr>
+          <w:b/>
+          <w:bCs/>
+          <w:color w:val="000000"/>
+        </w:rPr>
+        <w:t>Psychophysics and signal detection: Distinguish signal and noise trials, classify hits and false alarms, and interpret sensitivity and response criterion using the methods taught in Lab 2.</w:t>
+      </w:r>
+    </w:p>
+    <w:p>
+      <w:pPr>
+        <w:numPr>
+          <w:ilvl w:val="0"/>
+          <w:numId w:val="1"/>
+        </w:numPr>
+        <w:pBdr>
+          <w:top w:val="nil"/>
+          <w:left w:val="nil"/>
+          <w:bottom w:val="nil"/>
+          <w:right w:val="nil"/>
+          <w:between w:val="nil"/>
+        </w:pBdr>
+        <w:spacing w:after="60" w:line="276" w:lineRule="auto"/>
+      </w:pPr>
+      <w:r>
+        <w:rPr>
+          <w:b/>
+          <w:bCs/>
+          <w:color w:val="000000"/>
+        </w:rPr>
+        <w:t>Selective attention and Stroop interference: Compare congruent and incongruent trials; calculate interference and interpret reaction time alongside accuracy.</w:t>
+      </w:r>
+    </w:p>
+    <w:p>
+      <w:pPr>
+        <w:numPr>
+          <w:ilvl w:val="0"/>
+          <w:numId w:val="1"/>
+        </w:numPr>
+        <w:pBdr>
+          <w:top w:val="nil"/>
+          <w:left w:val="nil"/>
+          <w:bottom w:val="nil"/>
+          <w:right w:val="nil"/>
+          <w:between w:val="nil"/>
+        </w:pBdr>
+        <w:spacing w:after="60" w:line="276" w:lineRule="auto"/>
+      </w:pPr>
+      <w:r>
+        <w:rPr>
+          <w:b/>
+          <w:bCs/>
+          <w:color w:val="000000"/>
+        </w:rPr>
+        <w:t>Working memory and distraction: Compare memory-load and distraction conditions; calculate accuracy and interpret the effects and limitations of the design.</w:t>
+      </w:r>
+    </w:p>
+    <w:p>
+      <w:pPr>
+        <w:numPr>
+          <w:ilvl w:val="0"/>
+          <w:numId w:val="1"/>
+        </w:numPr>
+        <w:pBdr>
+          <w:top w:val="nil"/>
+          <w:left w:val="nil"/>
+          <w:bottom w:val="nil"/>
+          <w:right w:val="nil"/>
+          <w:between w:val="nil"/>
+        </w:pBdr>
+        <w:spacing w:after="60" w:line="276" w:lineRule="auto"/>
+      </w:pPr>
+      <w:r>
+        <w:rPr>
+          <w:b/>
+          <w:bCs/>
+          <w:color w:val="000000"/>
+        </w:rPr>
+        <w:t>Memory reconstruction and source monitoring: Follow the standardized memory procedure; distinguish recognition from source errors and interpret the findings.</w:t>
       </w:r>
     </w:p>
     <w:p>
@@ -4789,6 +4940,7 @@
                 <w:sz w:val="17"/>
                 <w:szCs w:val="17"/>
               </w:rPr>
+              <w:lastRenderedPageBreak/>
               <w:t>Lab 10</w:t>
             </w:r>
           </w:p>
@@ -4875,7 +5027,7 @@
                 <w:sz w:val="17"/>
                 <w:szCs w:val="17"/>
               </w:rPr>
-              <w:t>Project clinic</w:t>
+              <w:t>Experimental practical / project clinic</w:t>
             </w:r>
           </w:p>
         </w:tc>
@@ -4915,7 +5067,7 @@
                 <w:sz w:val="17"/>
                 <w:szCs w:val="17"/>
               </w:rPr>
-              <w:t>Mini-replication design and approved make-up work</w:t>
+              <w:t>Individual practical: choice of five familiar experiments; mini-replication proposal support</w:t>
             </w:r>
           </w:p>
         </w:tc>
@@ -4935,7 +5087,7 @@
                 <w:sz w:val="17"/>
                 <w:szCs w:val="17"/>
               </w:rPr>
-              <w:t>Proposal due Fri Nov 5</w:t>
+              <w:t>Practical in assigned lab Nov 2–4; proposal due Fri Nov 5</w:t>
             </w:r>
           </w:p>
         </w:tc>
@@ -5133,7 +5285,6 @@
                 <w:sz w:val="17"/>
                 <w:szCs w:val="17"/>
               </w:rPr>
-              <w:lastRenderedPageBreak/>
               <w:t>Methods Assignment 1</w:t>
             </w:r>
           </w:p>
@@ -5347,6 +5498,178 @@
                 <w:szCs w:val="17"/>
               </w:rPr>
               <w:t>Replication, uncertainty, and generalization</w:t>
+            </w:r>
+          </w:p>
+        </w:tc>
+        <w:tc>
+          <w:tcPr>
+            <w:tcW w:w="2109" w:type="dxa"/>
+            <w:tcMar>
+              <w:top w:w="50" w:type="dxa"/>
+              <w:left w:w="80" w:type="dxa"/>
+              <w:bottom w:w="50" w:type="dxa"/>
+              <w:right w:w="80" w:type="dxa"/>
+            </w:tcMar>
+          </w:tcPr>
+          <w:p>
+            <w:r>
+              <w:rPr>
+                <w:sz w:val="17"/>
+                <w:szCs w:val="17"/>
+              </w:rPr>
+              <w:t>Due 11:59 PM</w:t>
+            </w:r>
+          </w:p>
+        </w:tc>
+      </w:tr>
+      <w:tr>
+        <w:trPr>
+          <w:cantSplit/>
+          <w:trHeight w:val="189"/>
+        </w:trPr>
+        <w:tc>
+          <w:tcPr>
+            <w:tcW w:w="1496" w:type="dxa"/>
+            <w:tcMar>
+              <w:top w:w="50" w:type="dxa"/>
+              <w:left w:w="80" w:type="dxa"/>
+              <w:bottom w:w="50" w:type="dxa"/>
+              <w:right w:w="80" w:type="dxa"/>
+            </w:tcMar>
+          </w:tcPr>
+          <w:p>
+            <w:r>
+              <w:rPr>
+                <w:sz w:val="17"/>
+                <w:szCs w:val="17"/>
+              </w:rPr>
+              <w:t>Practical preparation</w:t>
+            </w:r>
+          </w:p>
+        </w:tc>
+        <w:tc>
+          <w:tcPr>
+            <w:tcW w:w="1200" w:type="dxa"/>
+            <w:tcMar>
+              <w:top w:w="50" w:type="dxa"/>
+              <w:left w:w="80" w:type="dxa"/>
+              <w:bottom w:w="50" w:type="dxa"/>
+              <w:right w:w="80" w:type="dxa"/>
+            </w:tcMar>
+          </w:tcPr>
+          <w:p>
+            <w:r>
+              <w:rPr>
+                <w:sz w:val="17"/>
+                <w:szCs w:val="17"/>
+              </w:rPr>
+              <w:t>Tue Oct 19</w:t>
+            </w:r>
+          </w:p>
+        </w:tc>
+        <w:tc>
+          <w:tcPr>
+            <w:tcW w:w="5759" w:type="dxa"/>
+            <w:tcMar>
+              <w:top w:w="50" w:type="dxa"/>
+              <w:left w:w="80" w:type="dxa"/>
+              <w:bottom w:w="50" w:type="dxa"/>
+              <w:right w:w="80" w:type="dxa"/>
+            </w:tcMar>
+          </w:tcPr>
+          <w:p>
+            <w:r>
+              <w:rPr>
+                <w:sz w:val="17"/>
+                <w:szCs w:val="17"/>
+              </w:rPr>
+              <w:t>All five preparation guides, rubrics, and practice datasets available</w:t>
+            </w:r>
+          </w:p>
+        </w:tc>
+        <w:tc>
+          <w:tcPr>
+            <w:tcW w:w="2109" w:type="dxa"/>
+            <w:tcMar>
+              <w:top w:w="50" w:type="dxa"/>
+              <w:left w:w="80" w:type="dxa"/>
+              <w:bottom w:w="50" w:type="dxa"/>
+              <w:right w:w="80" w:type="dxa"/>
+            </w:tcMar>
+          </w:tcPr>
+          <w:p>
+            <w:r>
+              <w:rPr>
+                <w:sz w:val="17"/>
+                <w:szCs w:val="17"/>
+              </w:rPr>
+              <w:t>Prepare before Week 11</w:t>
+            </w:r>
+          </w:p>
+        </w:tc>
+      </w:tr>
+      <w:tr>
+        <w:trPr>
+          <w:cantSplit/>
+          <w:trHeight w:val="189"/>
+        </w:trPr>
+        <w:tc>
+          <w:tcPr>
+            <w:tcW w:w="1496" w:type="dxa"/>
+            <w:tcMar>
+              <w:top w:w="50" w:type="dxa"/>
+              <w:left w:w="80" w:type="dxa"/>
+              <w:bottom w:w="50" w:type="dxa"/>
+              <w:right w:w="80" w:type="dxa"/>
+            </w:tcMar>
+          </w:tcPr>
+          <w:p>
+            <w:r>
+              <w:rPr>
+                <w:sz w:val="17"/>
+                <w:szCs w:val="17"/>
+              </w:rPr>
+              <w:t>Practical topic selection</w:t>
+            </w:r>
+          </w:p>
+        </w:tc>
+        <w:tc>
+          <w:tcPr>
+            <w:tcW w:w="1200" w:type="dxa"/>
+            <w:tcMar>
+              <w:top w:w="50" w:type="dxa"/>
+              <w:left w:w="80" w:type="dxa"/>
+              <w:bottom w:w="50" w:type="dxa"/>
+              <w:right w:w="80" w:type="dxa"/>
+            </w:tcMar>
+          </w:tcPr>
+          <w:p>
+            <w:r>
+              <w:rPr>
+                <w:sz w:val="17"/>
+                <w:szCs w:val="17"/>
+              </w:rPr>
+              <w:t>Fri Oct 22</w:t>
+            </w:r>
+          </w:p>
+        </w:tc>
+        <w:tc>
+          <w:tcPr>
+            <w:tcW w:w="5759" w:type="dxa"/>
+            <w:tcMar>
+              <w:top w:w="50" w:type="dxa"/>
+              <w:left w:w="80" w:type="dxa"/>
+              <w:bottom w:w="50" w:type="dxa"/>
+              <w:right w:w="80" w:type="dxa"/>
+            </w:tcMar>
+          </w:tcPr>
+          <w:p>
+            <w:r>
+              <w:rPr>
+                <w:sz w:val="17"/>
+                <w:szCs w:val="17"/>
+              </w:rPr>
+              <w:t>Choose one of the five practical options</w:t>
             </w:r>
           </w:p>
         </w:tc>
@@ -5535,7 +5858,7 @@
         <w:spacing w:after="120" w:line="276" w:lineRule="auto"/>
       </w:pPr>
       <w:r>
-        <w:t>Attendance at all lectures and labs is expected. Lectures introduce material that is not on the slides, and that material will appear on exams. There is no grade for lecture attendance, but missing lectures will affect your exam performance. Lab attendance is graded, and lab absences will not be excused without documentation.</w:t>
+        <w:t>Attendance at all lectures and labs is expected, but no separate attendance or participation grade is assigned. Lectures introduce explanations and examples that may appear on exams. Labs provide the instruction, experimental work, and data needed for graded assignments. If you miss a lab, contact your assigned TA promptly to arrange an approved way to complete the missed work. Contact me directly about extensions, exceptional circumstances, or grading concerns.</w:t>
       </w:r>
     </w:p>
     <w:p>
@@ -5598,13 +5921,7 @@
           <w:bCs/>
           <w:color w:val="000000"/>
         </w:rPr>
-        <w:t>Lab participation:</w:t>
-      </w:r>
-      <w:r>
-        <w:rPr>
-          <w:color w:val="000000"/>
-        </w:rPr>
-        <w:t xml:space="preserve"> observations, data, and the checkpoint must be submitted through the course site before leaving the lab, or by the approved equivalent task deadline. Submissions outside that window do not earn checkpoint credit without an approved extension.</w:t>
+        <w:t>Experimental practical: This assessment takes place in person during your assigned Week 11 lab section and is not eligible for the ordinary late-submission penalty. If an emergency or approved accommodation affects your ability to attend, contact me as soon as possible to arrange an approved alternative assessment. Missing the practical without an approved arrangement results in a zero for the assessment.</w:t>
       </w:r>
     </w:p>
     <w:p>
@@ -5659,7 +5976,6 @@
           <w:sz w:val="25"/>
           <w:szCs w:val="25"/>
         </w:rPr>
-        <w:lastRenderedPageBreak/>
         <w:t>Academic Integrity and Use of AI Tools</w:t>
       </w:r>
     </w:p>
@@ -5738,7 +6054,7 @@
         <w:rPr>
           <w:color w:val="000000"/>
         </w:rPr>
-        <w:t>Questions about psychological concepts, experiments, and data analysis are welcome. Your TA can help with homework, lab reports, analysis, and routine logistics during lab sessions and office hours. Contact me directly at jlopez11@usc.edu for all grading concerns and regrade requests, as well as unresolved course questions, accommodations, or confidential issues. For a grading question or regrade request, identify the assignment or exam, the specific question or rubric item, and the reason you would like it reviewed. No student is required to disclose personal mental-health experiences during class or lab.</w:t>
+        <w:t>Questions about psychological concepts, experiments, and data analysis are expected. Use Teaching Assistants as the first point of contact for homework, lab reports, analysis, and routine logistics. TAs hold lab sessions and office hours and can provide timely support. Contact the instructor at jlopez@usc.edu for unresolved questions, grading concerns, accommodations, or confidential issues. No student is required to disclose personal mental-health experiences during class or lab.</w:t>
       </w:r>
     </w:p>
     <w:p>
@@ -5802,17 +6118,9 @@
       </w:pPr>
       <w:r>
         <w:rPr>
-          <w:b/>
-          <w:bCs/>
           <w:color w:val="000000"/>
         </w:rPr>
-        <w:t>Unexcused lab absences will affect your Lab Attendance and Participation grade</w:t>
-      </w:r>
-      <w:r>
-        <w:rPr>
-          <w:color w:val="000000"/>
-        </w:rPr>
-        <w:t xml:space="preserve"> under the laboratory attendance policy, regardless of access to lecture recordings. There is no separate lecture attendance grade, but you remain responsible for all missed lecture content. Recordings are provided as a supplement and do not replace in-person participation. Missed exams remain subject to the missed-exam policy.</w:t>
+        <w:t>There is no separate lecture or laboratory attendance grade. You remain responsible for missed instruction and graded work, including the experimental practical. Recordings support review but do not replace the practical skills developed in lab. Missed assignments and assessments follow their applicable policies; communicate promptly if you need an approved arrangement.</w:t>
       </w:r>
     </w:p>
     <w:p>
@@ -5868,15 +6176,7 @@
           <w:sz w:val="18"/>
           <w:szCs w:val="18"/>
         </w:rPr>
-        <w:t xml:space="preserve">Lectures meet Monday, Wednesday, and Friday, 1:00–2:50 PM. Every instructional meeting introduces a new topic, beginning August 23 and ending December 3. Exams use the separate session; planned dates are September 20, October 18, and November 8, with Exam 4 in the assigned December 8–15 appointment. Exams 1–3 meet at 5:00 PM in NEU 100A or NEU 100B; Exam 4’s assigned date and time will be announced separately. Lab </w:t>
-      </w:r>
-      <w:r>
-        <w:rPr>
-          <w:sz w:val="18"/>
-          <w:szCs w:val="18"/>
-        </w:rPr>
-        <w:lastRenderedPageBreak/>
-        <w:t>weeks and deadlines appear above and below. University holidays follow USC’s Fall 2027 academic calendar (https://academics.usc.edu/calendar/).</w:t>
+        <w:t>Lectures meet Monday, Wednesday, and Friday, 1:00–2:50 PM. Every instructional meeting introduces a new topic, beginning August 23 and ending December 3. Exams use the separate session; planned dates are September 20, October 18, and November 8, with Exam 4 in the assigned December 8–15 appointment. Exams 1–3 meet at 5:00 PM in NEU 100A or NEU 100B; Exam 4’s assigned date and time will be announced separately. Lab weeks and deadlines appear above and below. University holidays follow USC’s Fall 2027 academic calendar (https://academics.usc.edu/calendar/).</w:t>
       </w:r>
     </w:p>
     <w:tbl>
@@ -8672,6 +8972,7 @@
                 <w:sz w:val="17"/>
                 <w:szCs w:val="17"/>
               </w:rPr>
+              <w:lastRenderedPageBreak/>
               <w:t>Week 7</w:t>
             </w:r>
           </w:p>
@@ -9113,7 +9414,6 @@
                 <w:sz w:val="17"/>
                 <w:szCs w:val="17"/>
               </w:rPr>
-              <w:lastRenderedPageBreak/>
               <w:t>Mon Oct 11</w:t>
             </w:r>
           </w:p>
@@ -9718,12 +10018,15 @@
             </w:tcMar>
           </w:tcPr>
           <w:p>
-            <w:r>
-              <w:rPr>
-                <w:sz w:val="17"/>
-                <w:szCs w:val="17"/>
-              </w:rPr>
-              <w:t>Wed Oct 20</w:t>
+            <w:pPr>
+              <w:keepNext/>
+            </w:pPr>
+            <w:r>
+              <w:rPr>
+                <w:sz w:val="17"/>
+                <w:szCs w:val="17"/>
+              </w:rPr>
+              <w:t>Tue Oct 19</w:t>
             </w:r>
           </w:p>
         </w:tc>
@@ -9738,12 +10041,15 @@
             </w:tcMar>
           </w:tcPr>
           <w:p>
-            <w:r>
-              <w:rPr>
-                <w:sz w:val="17"/>
-                <w:szCs w:val="17"/>
-              </w:rPr>
-              <w:t>Lecture 24</w:t>
+            <w:pPr>
+              <w:keepNext/>
+            </w:pPr>
+            <w:r>
+              <w:rPr>
+                <w:sz w:val="17"/>
+                <w:szCs w:val="17"/>
+              </w:rPr>
+              <w:t>Practical preparation</w:t>
             </w:r>
           </w:p>
         </w:tc>
@@ -9758,12 +10064,15 @@
             </w:tcMar>
           </w:tcPr>
           <w:p>
-            <w:r>
-              <w:rPr>
-                <w:sz w:val="17"/>
-                <w:szCs w:val="17"/>
-              </w:rPr>
-              <w:t>Attachment, caregiving, and social development</w:t>
+            <w:pPr>
+              <w:keepNext/>
+            </w:pPr>
+            <w:r>
+              <w:rPr>
+                <w:sz w:val="17"/>
+                <w:szCs w:val="17"/>
+              </w:rPr>
+              <w:t>Guides, prompts, rubrics, and practice datasets available for all five options</w:t>
             </w:r>
           </w:p>
         </w:tc>
@@ -9779,11 +10088,19 @@
           </w:tcPr>
           <w:p>
             <w:pPr>
+              <w:keepNext/>
               <w:rPr>
                 <w:sz w:val="16"/>
                 <w:szCs w:val="16"/>
               </w:rPr>
             </w:pPr>
+            <w:r>
+              <w:rPr>
+                <w:sz w:val="16"/>
+                <w:szCs w:val="16"/>
+              </w:rPr>
+              <w:t>At least two weeks before the first practical</w:t>
+            </w:r>
           </w:p>
         </w:tc>
       </w:tr>
@@ -9807,7 +10124,7 @@
                 <w:sz w:val="17"/>
                 <w:szCs w:val="17"/>
               </w:rPr>
-              <w:t>Fri Oct 22</w:t>
+              <w:t>Wed Oct 20</w:t>
             </w:r>
           </w:p>
         </w:tc>
@@ -9827,7 +10144,7 @@
                 <w:sz w:val="17"/>
                 <w:szCs w:val="17"/>
               </w:rPr>
-              <w:t>Lecture 25</w:t>
+              <w:t>Lecture 24</w:t>
             </w:r>
           </w:p>
         </w:tc>
@@ -9847,7 +10164,7 @@
                 <w:sz w:val="17"/>
                 <w:szCs w:val="17"/>
               </w:rPr>
-              <w:t>Adolescence: identity, peers, and risk</w:t>
+              <w:t>Attachment, caregiving, and social development</w:t>
             </w:r>
           </w:p>
         </w:tc>
@@ -9868,13 +10185,6 @@
                 <w:szCs w:val="16"/>
               </w:rPr>
             </w:pPr>
-            <w:r>
-              <w:rPr>
-                <w:sz w:val="16"/>
-                <w:szCs w:val="16"/>
-              </w:rPr>
-              <w:t>Lecture project progress due</w:t>
-            </w:r>
           </w:p>
         </w:tc>
       </w:tr>
@@ -9898,7 +10208,7 @@
                 <w:sz w:val="17"/>
                 <w:szCs w:val="17"/>
               </w:rPr>
-              <w:t>Sun Oct 24</w:t>
+              <w:t>Fri Oct 22</w:t>
             </w:r>
           </w:p>
         </w:tc>
@@ -9918,7 +10228,7 @@
                 <w:sz w:val="17"/>
                 <w:szCs w:val="17"/>
               </w:rPr>
-              <w:t>Report due</w:t>
+              <w:t>Lecture 25</w:t>
             </w:r>
           </w:p>
         </w:tc>
@@ -9938,7 +10248,7 @@
                 <w:sz w:val="17"/>
                 <w:szCs w:val="17"/>
               </w:rPr>
-              <w:t>Lab 7 report</w:t>
+              <w:t>Adolescence: identity, peers, and risk</w:t>
             </w:r>
           </w:p>
         </w:tc>
@@ -9964,7 +10274,7 @@
                 <w:sz w:val="16"/>
                 <w:szCs w:val="16"/>
               </w:rPr>
-              <w:t>Due 11:59 PM</w:t>
+              <w:t>Lecture project progress and practical topic selection due</w:t>
             </w:r>
           </w:p>
         </w:tc>
@@ -9989,7 +10299,7 @@
                 <w:sz w:val="17"/>
                 <w:szCs w:val="17"/>
               </w:rPr>
-              <w:t>Week 10</w:t>
+              <w:t>Sun Oct 24</w:t>
             </w:r>
           </w:p>
         </w:tc>
@@ -10009,7 +10319,7 @@
                 <w:sz w:val="17"/>
                 <w:szCs w:val="17"/>
               </w:rPr>
-              <w:t>Lab 9</w:t>
+              <w:t>Report due</w:t>
             </w:r>
           </w:p>
         </w:tc>
@@ -10029,7 +10339,7 @@
                 <w:sz w:val="17"/>
                 <w:szCs w:val="17"/>
               </w:rPr>
-              <w:t>Personality measurement and the role of situations</w:t>
+              <w:t>Lab 7 report</w:t>
             </w:r>
           </w:p>
         </w:tc>
@@ -10055,7 +10365,7 @@
                 <w:sz w:val="16"/>
                 <w:szCs w:val="16"/>
               </w:rPr>
-              <w:t>Meets Oct 25–29; report due Sun Nov 7</w:t>
+              <w:t>Due 11:59 PM</w:t>
             </w:r>
           </w:p>
         </w:tc>
@@ -10080,7 +10390,7 @@
                 <w:sz w:val="17"/>
                 <w:szCs w:val="17"/>
               </w:rPr>
-              <w:t>Mon Oct 25</w:t>
+              <w:t>Week 10</w:t>
             </w:r>
           </w:p>
         </w:tc>
@@ -10100,7 +10410,7 @@
                 <w:sz w:val="17"/>
                 <w:szCs w:val="17"/>
               </w:rPr>
-              <w:t>Lecture 26</w:t>
+              <w:t>Lab 9</w:t>
             </w:r>
           </w:p>
         </w:tc>
@@ -10120,7 +10430,7 @@
                 <w:sz w:val="17"/>
                 <w:szCs w:val="17"/>
               </w:rPr>
-              <w:t>Adulthood, aging, and cognitive change</w:t>
+              <w:t>Personality measurement and the role of situations</w:t>
             </w:r>
           </w:p>
         </w:tc>
@@ -10141,6 +10451,13 @@
                 <w:szCs w:val="16"/>
               </w:rPr>
             </w:pPr>
+            <w:r>
+              <w:rPr>
+                <w:sz w:val="16"/>
+                <w:szCs w:val="16"/>
+              </w:rPr>
+              <w:t>Meets Oct 25–29; report due Sun Nov 7</w:t>
+            </w:r>
           </w:p>
         </w:tc>
       </w:tr>
@@ -10164,7 +10481,7 @@
                 <w:sz w:val="17"/>
                 <w:szCs w:val="17"/>
               </w:rPr>
-              <w:t>Wed Oct 27</w:t>
+              <w:t>Mon Oct 25</w:t>
             </w:r>
           </w:p>
         </w:tc>
@@ -10184,7 +10501,7 @@
                 <w:sz w:val="17"/>
                 <w:szCs w:val="17"/>
               </w:rPr>
-              <w:t>Lecture 27</w:t>
+              <w:t>Lecture 26</w:t>
             </w:r>
           </w:p>
         </w:tc>
@@ -10204,7 +10521,7 @@
                 <w:sz w:val="17"/>
                 <w:szCs w:val="17"/>
               </w:rPr>
-              <w:t>Personality: traits, situations, and the self</w:t>
+              <w:t>Adulthood, aging, and cognitive change</w:t>
             </w:r>
           </w:p>
         </w:tc>
@@ -10248,7 +10565,7 @@
                 <w:sz w:val="17"/>
                 <w:szCs w:val="17"/>
               </w:rPr>
-              <w:t>Fri Oct 29</w:t>
+              <w:t>Wed Oct 27</w:t>
             </w:r>
           </w:p>
         </w:tc>
@@ -10268,7 +10585,7 @@
                 <w:sz w:val="17"/>
                 <w:szCs w:val="17"/>
               </w:rPr>
-              <w:t>Lecture 28</w:t>
+              <w:t>Lecture 27</w:t>
             </w:r>
           </w:p>
         </w:tc>
@@ -10288,7 +10605,7 @@
                 <w:sz w:val="17"/>
                 <w:szCs w:val="17"/>
               </w:rPr>
-              <w:t>Sex, gender, and sexual behavior</w:t>
+              <w:t>Personality: traits, situations, and the self</w:t>
             </w:r>
           </w:p>
         </w:tc>
@@ -10309,13 +10626,6 @@
                 <w:szCs w:val="16"/>
               </w:rPr>
             </w:pPr>
-            <w:r>
-              <w:rPr>
-                <w:sz w:val="16"/>
-                <w:szCs w:val="16"/>
-              </w:rPr>
-              <w:t>Methods Assignment 3 due</w:t>
-            </w:r>
           </w:p>
         </w:tc>
       </w:tr>
@@ -10339,7 +10649,7 @@
                 <w:sz w:val="17"/>
                 <w:szCs w:val="17"/>
               </w:rPr>
-              <w:t>Sun Oct 31</w:t>
+              <w:t>Fri Oct 29</w:t>
             </w:r>
           </w:p>
         </w:tc>
@@ -10359,7 +10669,7 @@
                 <w:sz w:val="17"/>
                 <w:szCs w:val="17"/>
               </w:rPr>
-              <w:t>Report due</w:t>
+              <w:t>Lecture 28</w:t>
             </w:r>
           </w:p>
         </w:tc>
@@ -10379,7 +10689,7 @@
                 <w:sz w:val="17"/>
                 <w:szCs w:val="17"/>
               </w:rPr>
-              <w:t>Lab 8 report</w:t>
+              <w:t>Sex, gender, and sexual behavior</w:t>
             </w:r>
           </w:p>
         </w:tc>
@@ -10405,7 +10715,7 @@
                 <w:sz w:val="16"/>
                 <w:szCs w:val="16"/>
               </w:rPr>
-              <w:t>Due 11:59 PM</w:t>
+              <w:t>Methods Assignment 3 due</w:t>
             </w:r>
           </w:p>
         </w:tc>
@@ -10430,7 +10740,7 @@
                 <w:sz w:val="17"/>
                 <w:szCs w:val="17"/>
               </w:rPr>
-              <w:t>Week 11</w:t>
+              <w:t>Sun Oct 31</w:t>
             </w:r>
           </w:p>
         </w:tc>
@@ -10450,7 +10760,7 @@
                 <w:sz w:val="17"/>
                 <w:szCs w:val="17"/>
               </w:rPr>
-              <w:t>Laboratory</w:t>
+              <w:t>Report due</w:t>
             </w:r>
           </w:p>
         </w:tc>
@@ -10470,7 +10780,7 @@
                 <w:sz w:val="17"/>
                 <w:szCs w:val="17"/>
               </w:rPr>
-              <w:t>Mini-replication design clinic and make-up work</w:t>
+              <w:t>Lab 8 report</w:t>
             </w:r>
           </w:p>
         </w:tc>
@@ -10496,7 +10806,7 @@
                 <w:sz w:val="16"/>
                 <w:szCs w:val="16"/>
               </w:rPr>
-              <w:t>Proposal due Fri Nov 5</w:t>
+              <w:t>Due 11:59 PM</w:t>
             </w:r>
           </w:p>
         </w:tc>
@@ -10521,7 +10831,7 @@
                 <w:sz w:val="17"/>
                 <w:szCs w:val="17"/>
               </w:rPr>
-              <w:t>Mon Nov 1</w:t>
+              <w:t>Week 11</w:t>
             </w:r>
           </w:p>
         </w:tc>
@@ -10541,7 +10851,7 @@
                 <w:sz w:val="17"/>
                 <w:szCs w:val="17"/>
               </w:rPr>
-              <w:t>Lecture 29</w:t>
+              <w:t>Laboratory</w:t>
             </w:r>
           </w:p>
         </w:tc>
@@ -10561,7 +10871,7 @@
                 <w:sz w:val="17"/>
                 <w:szCs w:val="17"/>
               </w:rPr>
-              <w:t>Social perception, attribution, and first impressions</w:t>
+              <w:t>Individual experimental practical and mini-replication proposal support</w:t>
             </w:r>
           </w:p>
         </w:tc>
@@ -10582,6 +10892,13 @@
                 <w:szCs w:val="16"/>
               </w:rPr>
             </w:pPr>
+            <w:r>
+              <w:rPr>
+                <w:sz w:val="16"/>
+                <w:szCs w:val="16"/>
+              </w:rPr>
+              <w:t>Practical in assigned lab Nov 2–4; proposal due Fri Nov 5</w:t>
+            </w:r>
           </w:p>
         </w:tc>
       </w:tr>
@@ -10605,7 +10922,7 @@
                 <w:sz w:val="17"/>
                 <w:szCs w:val="17"/>
               </w:rPr>
-              <w:t>Wed Nov 3</w:t>
+              <w:t>Mon Nov 1</w:t>
             </w:r>
           </w:p>
         </w:tc>
@@ -10625,7 +10942,7 @@
                 <w:sz w:val="17"/>
                 <w:szCs w:val="17"/>
               </w:rPr>
-              <w:t>Lecture 30</w:t>
+              <w:t>Lecture 29</w:t>
             </w:r>
           </w:p>
         </w:tc>
@@ -10645,7 +10962,7 @@
                 <w:sz w:val="17"/>
                 <w:szCs w:val="17"/>
               </w:rPr>
-              <w:t>Conformity, obedience, and social power</w:t>
+              <w:t>Social perception, attribution, and first impressions</w:t>
             </w:r>
           </w:p>
         </w:tc>
@@ -10689,7 +11006,7 @@
                 <w:sz w:val="17"/>
                 <w:szCs w:val="17"/>
               </w:rPr>
-              <w:t>Fri Nov 5</w:t>
+              <w:t>Wed Nov 3</w:t>
             </w:r>
           </w:p>
         </w:tc>
@@ -10709,7 +11026,7 @@
                 <w:sz w:val="17"/>
                 <w:szCs w:val="17"/>
               </w:rPr>
-              <w:t>Lecture 31</w:t>
+              <w:t>Lecture 30</w:t>
             </w:r>
           </w:p>
         </w:tc>
@@ -10729,7 +11046,7 @@
                 <w:sz w:val="17"/>
                 <w:szCs w:val="17"/>
               </w:rPr>
-              <w:t>Prejudice, discrimination, and intergroup behavior</w:t>
+              <w:t>Conformity, obedience, and social power</w:t>
             </w:r>
           </w:p>
         </w:tc>
@@ -10750,13 +11067,6 @@
                 <w:szCs w:val="16"/>
               </w:rPr>
             </w:pPr>
-            <w:r>
-              <w:rPr>
-                <w:sz w:val="16"/>
-                <w:szCs w:val="16"/>
-              </w:rPr>
-              <w:t>Lab-project proposal due</w:t>
-            </w:r>
           </w:p>
         </w:tc>
       </w:tr>
@@ -10780,7 +11090,7 @@
                 <w:sz w:val="17"/>
                 <w:szCs w:val="17"/>
               </w:rPr>
-              <w:t>Sun Nov 7</w:t>
+              <w:t>Fri Nov 5</w:t>
             </w:r>
           </w:p>
         </w:tc>
@@ -10800,7 +11110,7 @@
                 <w:sz w:val="17"/>
                 <w:szCs w:val="17"/>
               </w:rPr>
-              <w:t>Report due</w:t>
+              <w:t>Lecture 31</w:t>
             </w:r>
           </w:p>
         </w:tc>
@@ -10820,7 +11130,7 @@
                 <w:sz w:val="17"/>
                 <w:szCs w:val="17"/>
               </w:rPr>
-              <w:t>Lab 9 report</w:t>
+              <w:t>Prejudice, discrimination, and intergroup behavior</w:t>
             </w:r>
           </w:p>
         </w:tc>
@@ -10846,7 +11156,7 @@
                 <w:sz w:val="16"/>
                 <w:szCs w:val="16"/>
               </w:rPr>
-              <w:t>Due 11:59 PM</w:t>
+              <w:t>Lab-project proposal due</w:t>
             </w:r>
           </w:p>
         </w:tc>
@@ -10871,7 +11181,7 @@
                 <w:sz w:val="17"/>
                 <w:szCs w:val="17"/>
               </w:rPr>
-              <w:t>Week 12</w:t>
+              <w:t>Sun Nov 7</w:t>
             </w:r>
           </w:p>
         </w:tc>
@@ -10891,7 +11201,7 @@
                 <w:sz w:val="17"/>
                 <w:szCs w:val="17"/>
               </w:rPr>
-              <w:t>Lab 10</w:t>
+              <w:t>Report due</w:t>
             </w:r>
           </w:p>
         </w:tc>
@@ -10911,7 +11221,7 @@
                 <w:sz w:val="17"/>
                 <w:szCs w:val="17"/>
               </w:rPr>
-              <w:t>Cooperation, social norms, and group decisions</w:t>
+              <w:t>Lab 9 report</w:t>
             </w:r>
           </w:p>
         </w:tc>
@@ -10937,7 +11247,7 @@
                 <w:sz w:val="16"/>
                 <w:szCs w:val="16"/>
               </w:rPr>
-              <w:t>Meets Nov 8–12; report due Sun Nov 21</w:t>
+              <w:t>Due 11:59 PM</w:t>
             </w:r>
           </w:p>
         </w:tc>
@@ -10962,7 +11272,7 @@
                 <w:sz w:val="17"/>
                 <w:szCs w:val="17"/>
               </w:rPr>
-              <w:t>Mon Nov 8</w:t>
+              <w:t>Week 12</w:t>
             </w:r>
           </w:p>
         </w:tc>
@@ -10982,7 +11292,7 @@
                 <w:sz w:val="17"/>
                 <w:szCs w:val="17"/>
               </w:rPr>
-              <w:t>EXAM 3</w:t>
+              <w:t>Lab 10</w:t>
             </w:r>
           </w:p>
         </w:tc>
@@ -11002,7 +11312,7 @@
                 <w:sz w:val="17"/>
                 <w:szCs w:val="17"/>
               </w:rPr>
-              <w:t>Lectures 21 to 30</w:t>
+              <w:t>Cooperation, social norms, and group decisions</w:t>
             </w:r>
           </w:p>
         </w:tc>
@@ -11028,7 +11338,7 @@
                 <w:sz w:val="16"/>
                 <w:szCs w:val="16"/>
               </w:rPr>
-              <w:t>Separate exam session; regular lecture also meets</w:t>
+              <w:t>Meets Nov 8–12; report due Sun Nov 21</w:t>
             </w:r>
           </w:p>
         </w:tc>
@@ -11073,7 +11383,7 @@
                 <w:sz w:val="17"/>
                 <w:szCs w:val="17"/>
               </w:rPr>
-              <w:t>Lecture 32</w:t>
+              <w:t>EXAM 3</w:t>
             </w:r>
           </w:p>
         </w:tc>
@@ -11093,7 +11403,7 @@
                 <w:sz w:val="17"/>
                 <w:szCs w:val="17"/>
               </w:rPr>
-              <w:t>Cooperation, helping, and collective action</w:t>
+              <w:t>Lectures 21 to 30</w:t>
             </w:r>
           </w:p>
         </w:tc>
@@ -11114,6 +11424,13 @@
                 <w:szCs w:val="16"/>
               </w:rPr>
             </w:pPr>
+            <w:r>
+              <w:rPr>
+                <w:sz w:val="16"/>
+                <w:szCs w:val="16"/>
+              </w:rPr>
+              <w:t>Separate exam session; regular lecture also meets</w:t>
+            </w:r>
           </w:p>
         </w:tc>
       </w:tr>
@@ -11137,7 +11454,7 @@
                 <w:sz w:val="17"/>
                 <w:szCs w:val="17"/>
               </w:rPr>
-              <w:t>Wed Nov 10</w:t>
+              <w:t>Mon Nov 8</w:t>
             </w:r>
           </w:p>
         </w:tc>
@@ -11157,7 +11474,7 @@
                 <w:sz w:val="17"/>
                 <w:szCs w:val="17"/>
               </w:rPr>
-              <w:t>Lecture 33</w:t>
+              <w:t>Lecture 32</w:t>
             </w:r>
           </w:p>
         </w:tc>
@@ -11177,7 +11494,7 @@
                 <w:sz w:val="17"/>
                 <w:szCs w:val="17"/>
               </w:rPr>
-              <w:t>Relationships, belonging, and loneliness</w:t>
+              <w:t>Cooperation, helping, and collective action</w:t>
             </w:r>
           </w:p>
         </w:tc>
@@ -11221,7 +11538,7 @@
                 <w:sz w:val="17"/>
                 <w:szCs w:val="17"/>
               </w:rPr>
-              <w:t>Thu Nov 11</w:t>
+              <w:t>Wed Nov 10</w:t>
             </w:r>
           </w:p>
         </w:tc>
@@ -11241,7 +11558,7 @@
                 <w:sz w:val="17"/>
                 <w:szCs w:val="17"/>
               </w:rPr>
-              <w:t>Holiday</w:t>
+              <w:t>Lecture 33</w:t>
             </w:r>
           </w:p>
         </w:tc>
@@ -11261,7 +11578,7 @@
                 <w:sz w:val="17"/>
                 <w:szCs w:val="17"/>
               </w:rPr>
-              <w:t>Veterans Day Holiday (Thursday)</w:t>
+              <w:t>Relationships, belonging, and loneliness</w:t>
             </w:r>
           </w:p>
         </w:tc>
@@ -11282,13 +11599,6 @@
                 <w:szCs w:val="16"/>
               </w:rPr>
             </w:pPr>
-            <w:r>
-              <w:rPr>
-                <w:sz w:val="16"/>
-                <w:szCs w:val="16"/>
-              </w:rPr>
-              <w:t>No class or labs</w:t>
-            </w:r>
           </w:p>
         </w:tc>
       </w:tr>
@@ -11312,7 +11622,7 @@
                 <w:sz w:val="17"/>
                 <w:szCs w:val="17"/>
               </w:rPr>
-              <w:t>Fri Nov 12</w:t>
+              <w:t>Thu Nov 11</w:t>
             </w:r>
           </w:p>
         </w:tc>
@@ -11332,7 +11642,7 @@
                 <w:sz w:val="17"/>
                 <w:szCs w:val="17"/>
               </w:rPr>
-              <w:t>Lecture 34</w:t>
+              <w:t>Holiday</w:t>
             </w:r>
           </w:p>
         </w:tc>
@@ -11352,7 +11662,7 @@
                 <w:sz w:val="17"/>
                 <w:szCs w:val="17"/>
               </w:rPr>
-              <w:t>Culture, work, and behavior in organizations</w:t>
+              <w:t>Veterans Day Holiday (Thursday)</w:t>
             </w:r>
           </w:p>
         </w:tc>
@@ -11373,6 +11683,13 @@
                 <w:szCs w:val="16"/>
               </w:rPr>
             </w:pPr>
+            <w:r>
+              <w:rPr>
+                <w:sz w:val="16"/>
+                <w:szCs w:val="16"/>
+              </w:rPr>
+              <w:t>No class or labs</w:t>
+            </w:r>
           </w:p>
         </w:tc>
       </w:tr>
@@ -11396,7 +11713,7 @@
                 <w:sz w:val="17"/>
                 <w:szCs w:val="17"/>
               </w:rPr>
-              <w:t>Week 13</w:t>
+              <w:t>Fri Nov 12</w:t>
             </w:r>
           </w:p>
         </w:tc>
@@ -11416,7 +11733,7 @@
                 <w:sz w:val="17"/>
                 <w:szCs w:val="17"/>
               </w:rPr>
-              <w:t>Laboratory</w:t>
+              <w:t>Lecture 34</w:t>
             </w:r>
           </w:p>
         </w:tc>
@@ -11436,7 +11753,7 @@
                 <w:sz w:val="17"/>
                 <w:szCs w:val="17"/>
               </w:rPr>
-              <w:t>Mini-replication data session and make-up work</w:t>
+              <w:t>Culture, work, and behavior in organizations</w:t>
             </w:r>
           </w:p>
         </w:tc>
@@ -11457,13 +11774,6 @@
                 <w:szCs w:val="16"/>
               </w:rPr>
             </w:pPr>
-            <w:r>
-              <w:rPr>
-                <w:sz w:val="16"/>
-                <w:szCs w:val="16"/>
-              </w:rPr>
-              <w:t>Checkpoint due Fri Nov 19</w:t>
-            </w:r>
           </w:p>
         </w:tc>
       </w:tr>
@@ -11487,7 +11797,7 @@
                 <w:sz w:val="17"/>
                 <w:szCs w:val="17"/>
               </w:rPr>
-              <w:t>Mon Nov 15</w:t>
+              <w:t>Week 13</w:t>
             </w:r>
           </w:p>
         </w:tc>
@@ -11507,7 +11817,7 @@
                 <w:sz w:val="17"/>
                 <w:szCs w:val="17"/>
               </w:rPr>
-              <w:t>Lecture 35</w:t>
+              <w:t>Laboratory</w:t>
             </w:r>
           </w:p>
         </w:tc>
@@ -11527,7 +11837,7 @@
                 <w:sz w:val="17"/>
                 <w:szCs w:val="17"/>
               </w:rPr>
-              <w:t>Psychological disorders, assessment, and neurodevelopment</w:t>
+              <w:t>Mini-replication data session and make-up work</w:t>
             </w:r>
           </w:p>
         </w:tc>
@@ -11548,6 +11858,13 @@
                 <w:szCs w:val="16"/>
               </w:rPr>
             </w:pPr>
+            <w:r>
+              <w:rPr>
+                <w:sz w:val="16"/>
+                <w:szCs w:val="16"/>
+              </w:rPr>
+              <w:t>Checkpoint due Fri Nov 19</w:t>
+            </w:r>
           </w:p>
         </w:tc>
       </w:tr>
@@ -11571,7 +11888,7 @@
                 <w:sz w:val="17"/>
                 <w:szCs w:val="17"/>
               </w:rPr>
-              <w:t>Wed Nov 17</w:t>
+              <w:t>Mon Nov 15</w:t>
             </w:r>
           </w:p>
         </w:tc>
@@ -11591,7 +11908,7 @@
                 <w:sz w:val="17"/>
                 <w:szCs w:val="17"/>
               </w:rPr>
-              <w:t>Lecture 36</w:t>
+              <w:t>Lecture 35</w:t>
             </w:r>
           </w:p>
         </w:tc>
@@ -11611,7 +11928,7 @@
                 <w:sz w:val="17"/>
                 <w:szCs w:val="17"/>
               </w:rPr>
-              <w:t>Anxiety, trauma, and obsessive-compulsive disorders</w:t>
+              <w:t>Psychological disorders, assessment, and neurodevelopment</w:t>
             </w:r>
           </w:p>
         </w:tc>
@@ -11655,7 +11972,7 @@
                 <w:sz w:val="17"/>
                 <w:szCs w:val="17"/>
               </w:rPr>
-              <w:t>Fri Nov 19</w:t>
+              <w:t>Wed Nov 17</w:t>
             </w:r>
           </w:p>
         </w:tc>
@@ -11675,7 +11992,7 @@
                 <w:sz w:val="17"/>
                 <w:szCs w:val="17"/>
               </w:rPr>
-              <w:t>Lecture 37</w:t>
+              <w:t>Lecture 36</w:t>
             </w:r>
           </w:p>
         </w:tc>
@@ -11695,7 +12012,7 @@
                 <w:sz w:val="17"/>
                 <w:szCs w:val="17"/>
               </w:rPr>
-              <w:t>Mood disorders: depression and bipolar disorder</w:t>
+              <w:t>Anxiety, trauma, and obsessive-compulsive disorders</w:t>
             </w:r>
           </w:p>
         </w:tc>
@@ -11716,13 +12033,6 @@
                 <w:szCs w:val="16"/>
               </w:rPr>
             </w:pPr>
-            <w:r>
-              <w:rPr>
-                <w:sz w:val="16"/>
-                <w:szCs w:val="16"/>
-              </w:rPr>
-              <w:t>Lecture project final and lab-project checkpoint due</w:t>
-            </w:r>
           </w:p>
         </w:tc>
       </w:tr>
@@ -11746,7 +12056,7 @@
                 <w:sz w:val="17"/>
                 <w:szCs w:val="17"/>
               </w:rPr>
-              <w:t>Sun Nov 21</w:t>
+              <w:t>Fri Nov 19</w:t>
             </w:r>
           </w:p>
         </w:tc>
@@ -11766,7 +12076,7 @@
                 <w:sz w:val="17"/>
                 <w:szCs w:val="17"/>
               </w:rPr>
-              <w:t>Report due</w:t>
+              <w:t>Lecture 37</w:t>
             </w:r>
           </w:p>
         </w:tc>
@@ -11786,7 +12096,7 @@
                 <w:sz w:val="17"/>
                 <w:szCs w:val="17"/>
               </w:rPr>
-              <w:t>Lab 10 report</w:t>
+              <w:t>Mood disorders: depression and bipolar disorder</w:t>
             </w:r>
           </w:p>
         </w:tc>
@@ -11812,7 +12122,7 @@
                 <w:sz w:val="16"/>
                 <w:szCs w:val="16"/>
               </w:rPr>
-              <w:t>Due 11:59 PM</w:t>
+              <w:t>Lecture project final and lab-project checkpoint due</w:t>
             </w:r>
           </w:p>
         </w:tc>
@@ -11837,7 +12147,7 @@
                 <w:sz w:val="17"/>
                 <w:szCs w:val="17"/>
               </w:rPr>
-              <w:t>Week 14</w:t>
+              <w:t>Sun Nov 21</w:t>
             </w:r>
           </w:p>
         </w:tc>
@@ -11857,7 +12167,7 @@
                 <w:sz w:val="17"/>
                 <w:szCs w:val="17"/>
               </w:rPr>
-              <w:t>Laboratory</w:t>
+              <w:t>Report due</w:t>
             </w:r>
           </w:p>
         </w:tc>
@@ -11877,7 +12187,7 @@
                 <w:sz w:val="17"/>
                 <w:szCs w:val="17"/>
               </w:rPr>
-              <w:t>Thanksgiving week</w:t>
+              <w:t>Lab 10 report</w:t>
             </w:r>
           </w:p>
         </w:tc>
@@ -11903,7 +12213,7 @@
                 <w:sz w:val="16"/>
                 <w:szCs w:val="16"/>
               </w:rPr>
-              <w:t>No required regular lab this week</w:t>
+              <w:t>Due 11:59 PM</w:t>
             </w:r>
           </w:p>
         </w:tc>
@@ -11928,7 +12238,7 @@
                 <w:sz w:val="17"/>
                 <w:szCs w:val="17"/>
               </w:rPr>
-              <w:t>Mon Nov 22</w:t>
+              <w:t>Week 14</w:t>
             </w:r>
           </w:p>
         </w:tc>
@@ -11948,7 +12258,7 @@
                 <w:sz w:val="17"/>
                 <w:szCs w:val="17"/>
               </w:rPr>
-              <w:t>Lecture 38</w:t>
+              <w:t>Laboratory</w:t>
             </w:r>
           </w:p>
         </w:tc>
@@ -11968,7 +12278,7 @@
                 <w:sz w:val="17"/>
                 <w:szCs w:val="17"/>
               </w:rPr>
-              <w:t>Schizophrenia and psychosis</w:t>
+              <w:t>Thanksgiving week</w:t>
             </w:r>
           </w:p>
         </w:tc>
@@ -11989,6 +12299,13 @@
                 <w:szCs w:val="16"/>
               </w:rPr>
             </w:pPr>
+            <w:r>
+              <w:rPr>
+                <w:sz w:val="16"/>
+                <w:szCs w:val="16"/>
+              </w:rPr>
+              <w:t>No required regular lab this week</w:t>
+            </w:r>
           </w:p>
         </w:tc>
       </w:tr>
@@ -12012,7 +12329,7 @@
                 <w:sz w:val="17"/>
                 <w:szCs w:val="17"/>
               </w:rPr>
-              <w:t>Wed Nov 24</w:t>
+              <w:t>Mon Nov 22</w:t>
             </w:r>
           </w:p>
         </w:tc>
@@ -12032,7 +12349,7 @@
                 <w:sz w:val="17"/>
                 <w:szCs w:val="17"/>
               </w:rPr>
-              <w:t>Holiday</w:t>
+              <w:t>Lecture 38</w:t>
             </w:r>
           </w:p>
         </w:tc>
@@ -12052,7 +12369,7 @@
                 <w:sz w:val="17"/>
                 <w:szCs w:val="17"/>
               </w:rPr>
-              <w:t>Thanksgiving Holiday: November 24–28</w:t>
+              <w:t>Schizophrenia and psychosis</w:t>
             </w:r>
           </w:p>
         </w:tc>
@@ -12073,13 +12390,6 @@
                 <w:szCs w:val="16"/>
               </w:rPr>
             </w:pPr>
-            <w:r>
-              <w:rPr>
-                <w:sz w:val="16"/>
-                <w:szCs w:val="16"/>
-              </w:rPr>
-              <w:t>No class or labs</w:t>
-            </w:r>
           </w:p>
         </w:tc>
       </w:tr>
@@ -12103,7 +12413,8 @@
                 <w:sz w:val="17"/>
                 <w:szCs w:val="17"/>
               </w:rPr>
-              <w:t>Week 15</w:t>
+              <w:lastRenderedPageBreak/>
+              <w:t>Wed Nov 24</w:t>
             </w:r>
           </w:p>
         </w:tc>
@@ -12123,7 +12434,7 @@
                 <w:sz w:val="17"/>
                 <w:szCs w:val="17"/>
               </w:rPr>
-              <w:t>Laboratory</w:t>
+              <w:t>Holiday</w:t>
             </w:r>
           </w:p>
         </w:tc>
@@ -12143,7 +12454,7 @@
                 <w:sz w:val="17"/>
                 <w:szCs w:val="17"/>
               </w:rPr>
-              <w:t>Mini-replication presentations in LAB sections</w:t>
+              <w:t>Thanksgiving Holiday: November 24–28</w:t>
             </w:r>
           </w:p>
         </w:tc>
@@ -12169,7 +12480,7 @@
                 <w:sz w:val="16"/>
                 <w:szCs w:val="16"/>
               </w:rPr>
-              <w:t>Final due Fri Dec 3; lectures meet normally</w:t>
+              <w:t>No class or labs</w:t>
             </w:r>
           </w:p>
         </w:tc>
@@ -12194,7 +12505,7 @@
                 <w:sz w:val="17"/>
                 <w:szCs w:val="17"/>
               </w:rPr>
-              <w:t>Mon Nov 29</w:t>
+              <w:t>Week 15</w:t>
             </w:r>
           </w:p>
         </w:tc>
@@ -12214,7 +12525,7 @@
                 <w:sz w:val="17"/>
                 <w:szCs w:val="17"/>
               </w:rPr>
-              <w:t>Lecture 39</w:t>
+              <w:t>Laboratory</w:t>
             </w:r>
           </w:p>
         </w:tc>
@@ -12234,7 +12545,7 @@
                 <w:sz w:val="17"/>
                 <w:szCs w:val="17"/>
               </w:rPr>
-              <w:t>Dissociative, personality, and eating disorders</w:t>
+              <w:t>Mini-replication presentations in LAB sections</w:t>
             </w:r>
           </w:p>
         </w:tc>
@@ -12255,6 +12566,13 @@
                 <w:szCs w:val="16"/>
               </w:rPr>
             </w:pPr>
+            <w:r>
+              <w:rPr>
+                <w:sz w:val="16"/>
+                <w:szCs w:val="16"/>
+              </w:rPr>
+              <w:t>Final due Fri Dec 3; lectures meet normally</w:t>
+            </w:r>
           </w:p>
         </w:tc>
       </w:tr>
@@ -12278,7 +12596,7 @@
                 <w:sz w:val="17"/>
                 <w:szCs w:val="17"/>
               </w:rPr>
-              <w:t>Wed Dec 1</w:t>
+              <w:t>Mon Nov 29</w:t>
             </w:r>
           </w:p>
         </w:tc>
@@ -12298,7 +12616,7 @@
                 <w:sz w:val="17"/>
                 <w:szCs w:val="17"/>
               </w:rPr>
-              <w:t>Lecture 40</w:t>
+              <w:t>Lecture 39</w:t>
             </w:r>
           </w:p>
         </w:tc>
@@ -12318,7 +12636,7 @@
                 <w:sz w:val="17"/>
                 <w:szCs w:val="17"/>
               </w:rPr>
-              <w:t>Treatments: psychotherapy, medication, and prevention</w:t>
+              <w:t>Dissociative, personality, and eating disorders</w:t>
             </w:r>
           </w:p>
         </w:tc>
@@ -12362,7 +12680,7 @@
                 <w:sz w:val="17"/>
                 <w:szCs w:val="17"/>
               </w:rPr>
-              <w:t>Fri Dec 3</w:t>
+              <w:t>Wed Dec 1</w:t>
             </w:r>
           </w:p>
         </w:tc>
@@ -12382,7 +12700,7 @@
                 <w:sz w:val="17"/>
                 <w:szCs w:val="17"/>
               </w:rPr>
-              <w:t>Lecture 41</w:t>
+              <w:t>Lecture 40</w:t>
             </w:r>
           </w:p>
         </w:tc>
@@ -12402,7 +12720,7 @@
                 <w:sz w:val="17"/>
                 <w:szCs w:val="17"/>
               </w:rPr>
-              <w:t>Psychology in the digital world: persuasion, misinformation, and AI</w:t>
+              <w:t>Treatments: psychotherapy, medication, and prevention</w:t>
             </w:r>
           </w:p>
         </w:tc>
@@ -12423,13 +12741,6 @@
                 <w:szCs w:val="16"/>
               </w:rPr>
             </w:pPr>
-            <w:r>
-              <w:rPr>
-                <w:sz w:val="16"/>
-                <w:szCs w:val="16"/>
-              </w:rPr>
-              <w:t>Lab-project final due</w:t>
-            </w:r>
           </w:p>
         </w:tc>
       </w:tr>
@@ -12453,7 +12764,97 @@
                 <w:sz w:val="17"/>
                 <w:szCs w:val="17"/>
               </w:rPr>
-              <w:lastRenderedPageBreak/>
+              <w:t>Fri Dec 3</w:t>
+            </w:r>
+          </w:p>
+        </w:tc>
+        <w:tc>
+          <w:tcPr>
+            <w:tcW w:w="1368" w:type="dxa"/>
+            <w:tcMar>
+              <w:top w:w="50" w:type="dxa"/>
+              <w:left w:w="80" w:type="dxa"/>
+              <w:bottom w:w="50" w:type="dxa"/>
+              <w:right w:w="80" w:type="dxa"/>
+            </w:tcMar>
+          </w:tcPr>
+          <w:p>
+            <w:r>
+              <w:rPr>
+                <w:sz w:val="17"/>
+                <w:szCs w:val="17"/>
+              </w:rPr>
+              <w:t>Lecture 41</w:t>
+            </w:r>
+          </w:p>
+        </w:tc>
+        <w:tc>
+          <w:tcPr>
+            <w:tcW w:w="5197" w:type="dxa"/>
+            <w:tcMar>
+              <w:top w:w="50" w:type="dxa"/>
+              <w:left w:w="80" w:type="dxa"/>
+              <w:bottom w:w="50" w:type="dxa"/>
+              <w:right w:w="80" w:type="dxa"/>
+            </w:tcMar>
+          </w:tcPr>
+          <w:p>
+            <w:r>
+              <w:rPr>
+                <w:sz w:val="17"/>
+                <w:szCs w:val="17"/>
+              </w:rPr>
+              <w:t>Psychology in the digital world: persuasion, misinformation, and AI</w:t>
+            </w:r>
+          </w:p>
+        </w:tc>
+        <w:tc>
+          <w:tcPr>
+            <w:tcW w:w="2075" w:type="dxa"/>
+            <w:tcMar>
+              <w:top w:w="50" w:type="dxa"/>
+              <w:left w:w="80" w:type="dxa"/>
+              <w:bottom w:w="50" w:type="dxa"/>
+              <w:right w:w="80" w:type="dxa"/>
+            </w:tcMar>
+          </w:tcPr>
+          <w:p>
+            <w:pPr>
+              <w:rPr>
+                <w:sz w:val="16"/>
+                <w:szCs w:val="16"/>
+              </w:rPr>
+            </w:pPr>
+            <w:r>
+              <w:rPr>
+                <w:sz w:val="16"/>
+                <w:szCs w:val="16"/>
+              </w:rPr>
+              <w:t>Lab-project final due</w:t>
+            </w:r>
+          </w:p>
+        </w:tc>
+      </w:tr>
+      <w:tr>
+        <w:trPr>
+          <w:cantSplit/>
+        </w:trPr>
+        <w:tc>
+          <w:tcPr>
+            <w:tcW w:w="1440" w:type="dxa"/>
+            <w:tcMar>
+              <w:top w:w="50" w:type="dxa"/>
+              <w:left w:w="80" w:type="dxa"/>
+              <w:bottom w:w="50" w:type="dxa"/>
+              <w:right w:w="80" w:type="dxa"/>
+            </w:tcMar>
+          </w:tcPr>
+          <w:p>
+            <w:r>
+              <w:rPr>
+                <w:sz w:val="17"/>
+                <w:szCs w:val="17"/>
+              </w:rPr>
               <w:t>Dec 4–7</w:t>
             </w:r>
           </w:p>
@@ -12683,7 +13084,7 @@
       </w:r>
     </w:p>
     <w:sectPr>
-      <w:footerReference w:type="default" r:id="rId9"/>
+      <w:footerReference w:type="default" r:id="rId10"/>
       <w:pgSz w:w="12240" w:h="15840"/>
       <w:pgMar w:top="864" w:right="1080" w:bottom="1152" w:left="1080" w:header="708" w:footer="708" w:gutter="0"/>
       <w:pgNumType w:start="1"/>

</xml_diff>

<commit_message>
Match practical descriptions to existing inline-label formatting
</commit_message>
<xml_diff>
--- a/syllabus/PSYC100_L_Introduction_to_Psychology_Fall_2027_Syllabus.docx
+++ b/syllabus/PSYC100_L_Introduction_to_Psychology_Fall_2027_Syllabus.docx
@@ -3792,7 +3792,15 @@
           <w:bCs/>
           <w:color w:val="000000"/>
         </w:rPr>
-        <w:t>Individual Experimental Practical (10%). During your Week 11 lab section (November 2–4), you will complete an individual practical on one of five experiments introduced earlier in the course. Select your topic by Friday, October 22, at 11:59 PM. For your chosen experiment, explain the hypothesis and design, demonstrate the procedure, analyze a provided dataset, create a labeled figure, and interpret the findings. Preparation guides containing the protocols, assessment prompts, rubric, and practice datasets for all five options will be available by October 19, at least two weeks before the first practical. Assessment datasets contain different observations but use the same structure and analysis methods practiced beforehand. All options assess comparable skills using the same rubric: experimental design 20%, procedure 20%, analysis and figure 35%, and interpretation 25%. Your grade reflects your experimental skills and reasoning, not your personal psychological performance or whether results support the hypothesis.</w:t>
+        <w:t>Individual Experimental Practical (10%).</w:t>
+      </w:r>
+      <w:r>
+        <w:rPr>
+          <w:b w:val="0"/>
+          <w:bCs w:val="0"/>
+          <w:color w:val="000000"/>
+        </w:rPr>
+        <w:t xml:space="preserve"> During your Week 11 lab section (November 2–4), you will complete an individual practical on one of five experiments introduced earlier in the course. Select your topic by Friday, October 22, at 11:59 PM. For your chosen experiment, explain the hypothesis and design, demonstrate the procedure, analyze a provided dataset, create a labeled figure, and interpret the findings. Preparation guides containing the protocols, assessment prompts, rubric, and practice datasets for all five options will be available by October 19, at least two weeks before the first practical. Assessment datasets contain different observations but use the same structure and analysis methods practiced beforehand. All options assess comparable skills using the same rubric: experimental design 20%, procedure 20%, analysis and figure 35%, and interpretation 25%. Your grade reflects your experimental skills and reasoning, not your personal psychological performance or whether results support the hypothesis.</w:t>
       </w:r>
     </w:p>
     <w:p>
@@ -3816,7 +3824,15 @@
           <w:bCs/>
           <w:color w:val="000000"/>
         </w:rPr>
-        <w:t>Reaction time and the speed–accuracy trade-off: Compare speed-focused and accuracy-focused instructions; summarize reaction times and errors and interpret the trade-off.</w:t>
+        <w:t>Reaction time and the speed–accuracy trade-off:</w:t>
+      </w:r>
+      <w:r>
+        <w:rPr>
+          <w:b w:val="0"/>
+          <w:bCs w:val="0"/>
+          <w:color w:val="000000"/>
+        </w:rPr>
+        <w:t xml:space="preserve"> Compare speed-focused and accuracy-focused instructions; summarize reaction times and errors and interpret the trade-off.</w:t>
       </w:r>
     </w:p>
     <w:p>
@@ -3840,7 +3856,15 @@
           <w:bCs/>
           <w:color w:val="000000"/>
         </w:rPr>
-        <w:t>Psychophysics and signal detection: Distinguish signal and noise trials, classify hits and false alarms, and interpret sensitivity and response criterion using the methods taught in Lab 2.</w:t>
+        <w:t>Psychophysics and signal detection:</w:t>
+      </w:r>
+      <w:r>
+        <w:rPr>
+          <w:b w:val="0"/>
+          <w:bCs w:val="0"/>
+          <w:color w:val="000000"/>
+        </w:rPr>
+        <w:t xml:space="preserve"> Distinguish signal and noise trials, classify hits and false alarms, and interpret sensitivity and response criterion using the methods taught in Lab 2.</w:t>
       </w:r>
     </w:p>
     <w:p>
@@ -3864,7 +3888,15 @@
           <w:bCs/>
           <w:color w:val="000000"/>
         </w:rPr>
-        <w:t>Selective attention and Stroop interference: Compare congruent and incongruent trials; calculate interference and interpret reaction time alongside accuracy.</w:t>
+        <w:t>Selective attention and Stroop interference:</w:t>
+      </w:r>
+      <w:r>
+        <w:rPr>
+          <w:b w:val="0"/>
+          <w:bCs w:val="0"/>
+          <w:color w:val="000000"/>
+        </w:rPr>
+        <w:t xml:space="preserve"> Compare congruent and incongruent trials; calculate interference and interpret reaction time alongside accuracy.</w:t>
       </w:r>
     </w:p>
     <w:p>
@@ -3888,7 +3920,15 @@
           <w:bCs/>
           <w:color w:val="000000"/>
         </w:rPr>
-        <w:t>Working memory and distraction: Compare memory-load and distraction conditions; calculate accuracy and interpret the effects and limitations of the design.</w:t>
+        <w:t>Working memory and distraction:</w:t>
+      </w:r>
+      <w:r>
+        <w:rPr>
+          <w:b w:val="0"/>
+          <w:bCs w:val="0"/>
+          <w:color w:val="000000"/>
+        </w:rPr>
+        <w:t xml:space="preserve"> Compare memory-load and distraction conditions; calculate accuracy and interpret the effects and limitations of the design.</w:t>
       </w:r>
     </w:p>
     <w:p>
@@ -3912,7 +3952,15 @@
           <w:bCs/>
           <w:color w:val="000000"/>
         </w:rPr>
-        <w:t>Memory reconstruction and source monitoring: Follow the standardized memory procedure; distinguish recognition from source errors and interpret the findings.</w:t>
+        <w:t>Memory reconstruction and source monitoring:</w:t>
+      </w:r>
+      <w:r>
+        <w:rPr>
+          <w:b w:val="0"/>
+          <w:bCs w:val="0"/>
+          <w:color w:val="000000"/>
+        </w:rPr>
+        <w:t xml:space="preserve"> Follow the standardized memory procedure; distinguish recognition from source errors and interpret the findings.</w:t>
       </w:r>
     </w:p>
     <w:p>

</xml_diff>

<commit_message>
Enlarge syllabus text, nest practical options, and revise exams to 65 questions
</commit_message>
<xml_diff>
--- a/syllabus/PSYC100_L_Introduction_to_Psychology_Fall_2027_Syllabus.docx
+++ b/syllabus/PSYC100_L_Introduction_to_Psychology_Fall_2027_Syllabus.docx
@@ -86,8 +86,8 @@
           <w:b/>
           <w:bCs/>
           <w:color w:val="1A1A1A"/>
-          <w:sz w:val="25"/>
-          <w:szCs w:val="25"/>
+          <w:sz w:val="24"/>
+          <w:szCs w:val="24"/>
         </w:rPr>
         <w:t>Instructor</w:t>
       </w:r>
@@ -100,6 +100,8 @@
         <w:rPr>
           <w:b/>
           <w:bCs/>
+          <w:sz w:val="24"/>
+          <w:szCs w:val="24"/>
         </w:rPr>
         <w:t>Jordan Lopez, M.D., Ph.D.</w:t>
       </w:r>
@@ -109,6 +111,10 @@
         <w:spacing w:line="276" w:lineRule="auto"/>
       </w:pPr>
       <w:r>
+        <w:rPr>
+          <w:sz w:val="24"/>
+          <w:szCs w:val="24"/>
+        </w:rPr>
         <w:t>Professor of Psychology, Biological Sciences, Neurobiology &amp; Biomedical Engineering</w:t>
       </w:r>
     </w:p>
@@ -117,6 +123,10 @@
         <w:spacing w:line="276" w:lineRule="auto"/>
       </w:pPr>
       <w:r>
+        <w:rPr>
+          <w:sz w:val="24"/>
+          <w:szCs w:val="24"/>
+        </w:rPr>
         <w:t>jlopez@usc.edu</w:t>
       </w:r>
     </w:p>
@@ -125,18 +135,32 @@
         <w:spacing w:line="276" w:lineRule="auto"/>
       </w:pPr>
       <w:r>
+        <w:rPr>
+          <w:sz w:val="24"/>
+          <w:szCs w:val="24"/>
+        </w:rPr>
         <w:t xml:space="preserve">Office: </w:t>
       </w:r>
       <w:r>
+        <w:rPr>
+          <w:sz w:val="24"/>
+          <w:szCs w:val="24"/>
+        </w:rPr>
         <w:t>Auditory Neuroscience Institute, Suite 500 (5</w:t>
       </w:r>
       <w:r>
         <w:rPr>
           <w:vertAlign w:val="superscript"/>
+          <w:sz w:val="24"/>
+          <w:szCs w:val="24"/>
         </w:rPr>
         <w:t>th</w:t>
       </w:r>
       <w:r>
+        <w:rPr>
+          <w:sz w:val="24"/>
+          <w:szCs w:val="24"/>
+        </w:rPr>
         <w:t xml:space="preserve"> floor)</w:t>
       </w:r>
     </w:p>
@@ -145,9 +169,17 @@
         <w:spacing w:after="120" w:line="276" w:lineRule="auto"/>
       </w:pPr>
       <w:r>
+        <w:rPr>
+          <w:sz w:val="24"/>
+          <w:szCs w:val="24"/>
+        </w:rPr>
         <w:t xml:space="preserve">Office Hours: </w:t>
       </w:r>
       <w:r>
+        <w:rPr>
+          <w:sz w:val="24"/>
+          <w:szCs w:val="24"/>
+        </w:rPr>
         <w:t xml:space="preserve">T/TH 11am &amp; 7pm </w:t>
       </w:r>
     </w:p>
@@ -162,8 +194,8 @@
           <w:b/>
           <w:bCs/>
           <w:color w:val="1A1A1A"/>
-          <w:sz w:val="25"/>
-          <w:szCs w:val="25"/>
+          <w:sz w:val="24"/>
+          <w:szCs w:val="24"/>
         </w:rPr>
         <w:t>Course Times &amp; Locations</w:t>
       </w:r>
@@ -212,8 +244,8 @@
               <w:rPr>
                 <w:b/>
                 <w:bCs/>
-                <w:sz w:val="17"/>
-                <w:szCs w:val="17"/>
+                <w:sz w:val="22"/>
+                <w:szCs w:val="22"/>
               </w:rPr>
               <w:t>Component</w:t>
             </w:r>
@@ -238,8 +270,8 @@
               <w:rPr>
                 <w:b/>
                 <w:bCs/>
-                <w:sz w:val="17"/>
-                <w:szCs w:val="17"/>
+                <w:sz w:val="22"/>
+                <w:szCs w:val="22"/>
               </w:rPr>
               <w:t>Days &amp; Times</w:t>
             </w:r>
@@ -264,8 +296,8 @@
               <w:rPr>
                 <w:b/>
                 <w:bCs/>
-                <w:sz w:val="17"/>
-                <w:szCs w:val="17"/>
+                <w:sz w:val="22"/>
+                <w:szCs w:val="22"/>
               </w:rPr>
               <w:t>Location</w:t>
             </w:r>
@@ -292,8 +324,8 @@
             </w:pPr>
             <w:r>
               <w:rPr>
-                <w:sz w:val="17"/>
-                <w:szCs w:val="17"/>
+                <w:sz w:val="22"/>
+                <w:szCs w:val="22"/>
               </w:rPr>
               <w:t>Lecture</w:t>
             </w:r>
@@ -315,22 +347,22 @@
             </w:pPr>
             <w:r>
               <w:rPr>
-                <w:sz w:val="17"/>
-                <w:szCs w:val="17"/>
+                <w:sz w:val="22"/>
+                <w:szCs w:val="22"/>
               </w:rPr>
               <w:t>Mon / Wed / Fri, 1:</w:t>
             </w:r>
             <w:r>
               <w:rPr>
-                <w:sz w:val="17"/>
-                <w:szCs w:val="17"/>
+                <w:sz w:val="22"/>
+                <w:szCs w:val="22"/>
               </w:rPr>
               <w:t>00</w:t>
             </w:r>
             <w:r>
               <w:rPr>
-                <w:sz w:val="17"/>
-                <w:szCs w:val="17"/>
+                <w:sz w:val="22"/>
+                <w:szCs w:val="22"/>
               </w:rPr>
               <w:t xml:space="preserve"> to 2:50 PM</w:t>
             </w:r>
@@ -352,8 +384,8 @@
             </w:pPr>
             <w:r>
               <w:rPr>
-                <w:sz w:val="17"/>
-                <w:szCs w:val="17"/>
+                <w:sz w:val="22"/>
+                <w:szCs w:val="22"/>
               </w:rPr>
               <w:t>NEU 500</w:t>
             </w:r>
@@ -380,8 +412,8 @@
             </w:pPr>
             <w:r>
               <w:rPr>
-                <w:sz w:val="17"/>
-                <w:szCs w:val="17"/>
+                <w:sz w:val="22"/>
+                <w:szCs w:val="22"/>
               </w:rPr>
               <w:t>Laboratory</w:t>
             </w:r>
@@ -407,29 +439,29 @@
             </w:pPr>
             <w:r>
               <w:rPr>
-                <w:sz w:val="17"/>
-                <w:szCs w:val="17"/>
+                <w:sz w:val="22"/>
+                <w:szCs w:val="22"/>
               </w:rPr>
               <w:t>Lab sections (begin Week 1):</w:t>
             </w:r>
             <w:r>
               <w:rPr>
-                <w:sz w:val="17"/>
-                <w:szCs w:val="17"/>
+                <w:sz w:val="22"/>
+                <w:szCs w:val="22"/>
               </w:rPr>
               <w:br/>
             </w:r>
             <w:r>
               <w:rPr>
-                <w:sz w:val="17"/>
-                <w:szCs w:val="17"/>
+                <w:sz w:val="22"/>
+                <w:szCs w:val="22"/>
               </w:rPr>
               <w:t xml:space="preserve">Tue 10am – 12:50pm </w:t>
             </w:r>
             <w:r>
               <w:rPr>
-                <w:sz w:val="17"/>
-                <w:szCs w:val="17"/>
+                <w:sz w:val="22"/>
+                <w:szCs w:val="22"/>
               </w:rPr>
               <w:br/>
               <w:t xml:space="preserve">Tue 1pm – 3:50pm </w:t>
@@ -445,8 +477,8 @@
             </w:pPr>
             <w:r>
               <w:rPr>
-                <w:sz w:val="17"/>
-                <w:szCs w:val="17"/>
+                <w:sz w:val="22"/>
+                <w:szCs w:val="22"/>
               </w:rPr>
               <w:t xml:space="preserve">Wed 9am – 11:50am </w:t>
             </w:r>
@@ -461,15 +493,15 @@
             </w:pPr>
             <w:r>
               <w:rPr>
-                <w:sz w:val="17"/>
-                <w:szCs w:val="17"/>
+                <w:sz w:val="22"/>
+                <w:szCs w:val="22"/>
               </w:rPr>
               <w:t xml:space="preserve">Thu 10am – 12:50pm </w:t>
             </w:r>
             <w:r>
               <w:rPr>
-                <w:sz w:val="17"/>
-                <w:szCs w:val="17"/>
+                <w:sz w:val="22"/>
+                <w:szCs w:val="22"/>
               </w:rPr>
               <w:br/>
               <w:t xml:space="preserve">Thu 4pm – 6:50pm </w:t>
@@ -505,8 +537,8 @@
             </w:pPr>
             <w:r>
               <w:rPr>
-                <w:sz w:val="17"/>
-                <w:szCs w:val="17"/>
+                <w:sz w:val="22"/>
+                <w:szCs w:val="22"/>
               </w:rPr>
               <w:t>NEU LAB1A</w:t>
             </w:r>
@@ -517,31 +549,31 @@
             </w:pPr>
             <w:r>
               <w:rPr>
-                <w:sz w:val="17"/>
-                <w:szCs w:val="17"/>
+                <w:sz w:val="22"/>
+                <w:szCs w:val="22"/>
               </w:rPr>
               <w:t>NEU LAB1A</w:t>
             </w:r>
             <w:r>
               <w:rPr>
-                <w:sz w:val="17"/>
-                <w:szCs w:val="17"/>
+                <w:sz w:val="22"/>
+                <w:szCs w:val="22"/>
               </w:rPr>
               <w:br/>
               <w:t>NEU LAB1A</w:t>
             </w:r>
             <w:r>
               <w:rPr>
-                <w:sz w:val="17"/>
-                <w:szCs w:val="17"/>
+                <w:sz w:val="22"/>
+                <w:szCs w:val="22"/>
               </w:rPr>
               <w:br/>
               <w:t>NEU LAB1A</w:t>
             </w:r>
             <w:r>
               <w:rPr>
-                <w:sz w:val="17"/>
-                <w:szCs w:val="17"/>
+                <w:sz w:val="22"/>
+                <w:szCs w:val="22"/>
               </w:rPr>
               <w:br/>
               <w:t>NEU LAB1A</w:t>
@@ -566,8 +598,8 @@
           <w:p>
             <w:r>
               <w:rPr>
-                <w:sz w:val="17"/>
-                <w:szCs w:val="17"/>
+                <w:sz w:val="22"/>
+                <w:szCs w:val="22"/>
               </w:rPr>
               <w:t>Exams (4 total)</w:t>
             </w:r>
@@ -592,8 +624,8 @@
             </w:pPr>
             <w:r>
               <w:rPr>
-                <w:sz w:val="17"/>
-                <w:szCs w:val="17"/>
+                <w:sz w:val="22"/>
+                <w:szCs w:val="22"/>
               </w:rPr>
               <w:t>**Exams taken in Quiz Section</w:t>
             </w:r>
@@ -615,15 +647,15 @@
             </w:pPr>
             <w:r>
               <w:rPr>
-                <w:sz w:val="17"/>
-                <w:szCs w:val="17"/>
+                <w:sz w:val="22"/>
+                <w:szCs w:val="22"/>
               </w:rPr>
               <w:t xml:space="preserve">Mondays </w:t>
             </w:r>
             <w:r>
               <w:rPr>
-                <w:sz w:val="17"/>
-                <w:szCs w:val="17"/>
+                <w:sz w:val="22"/>
+                <w:szCs w:val="22"/>
               </w:rPr>
               <w:t>at 5:00 PM</w:t>
             </w:r>
@@ -631,8 +663,8 @@
           <w:p>
             <w:r>
               <w:rPr>
-                <w:sz w:val="17"/>
-                <w:szCs w:val="17"/>
+                <w:sz w:val="22"/>
+                <w:szCs w:val="22"/>
               </w:rPr>
               <w:br/>
               <w:t>Sep 20, Oct 18, Nov 8; Exam 4: Dec 8–15</w:t>
@@ -668,8 +700,8 @@
           <w:p>
             <w:r>
               <w:rPr>
-                <w:sz w:val="17"/>
-                <w:szCs w:val="17"/>
+                <w:sz w:val="22"/>
+                <w:szCs w:val="22"/>
               </w:rPr>
               <w:t>NEU 100A or NEU 100B</w:t>
             </w:r>
@@ -688,8 +720,8 @@
           <w:b/>
           <w:bCs/>
           <w:color w:val="1A1A1A"/>
-          <w:sz w:val="25"/>
-          <w:szCs w:val="25"/>
+          <w:sz w:val="24"/>
+          <w:szCs w:val="24"/>
         </w:rPr>
         <w:t>Course Description</w:t>
       </w:r>
@@ -699,6 +731,10 @@
         <w:spacing w:after="120" w:line="276" w:lineRule="auto"/>
       </w:pPr>
       <w:r>
+        <w:rPr>
+          <w:sz w:val="24"/>
+          <w:szCs w:val="24"/>
+        </w:rPr>
         <w:t>Psychology is the scientific study of mind and behavior. PSYC100 L introduces the biological, cognitive, developmental, and social processes that shape human experience. Topics include sensation and perception, consciousness, learning and memory, language and decision-making, intelligence, motivation and emotion, development across the lifespan, personality, social behavior, psychological disorders, and treatment. Psychological concepts are examined through the experiments and observations that established them and the questions that continue to guide research.</w:t>
       </w:r>
     </w:p>
@@ -707,6 +743,10 @@
         <w:spacing w:after="120" w:line="276" w:lineRule="auto"/>
       </w:pPr>
       <w:r>
+        <w:rPr>
+          <w:sz w:val="24"/>
+          <w:szCs w:val="24"/>
+        </w:rPr>
         <w:t>The course emphasizes how psychological theories are developed, tested, and revised. Foundational experiments and contemporary research provide a framework for examining relationships among brain function, cognition, behavior, and the social and cultural environment. Students evaluate experimental designs, interpret behavioral data, distinguish causal evidence from correlation, and consider how sampling, measurement, and reproducibility affect scientific conclusions. Across topics, the goal is to explain psychological processes and assess the evidence supporting competing explanations.</w:t>
       </w:r>
     </w:p>
@@ -715,6 +755,10 @@
         <w:spacing w:after="120" w:line="276" w:lineRule="auto"/>
       </w:pPr>
       <w:r>
+        <w:rPr>
+          <w:sz w:val="24"/>
+          <w:szCs w:val="24"/>
+        </w:rPr>
         <w:lastRenderedPageBreak/>
         <w:t>This is the only PSYC100 offering that includes experimental laboratory sections in place of discussion sections. Laboratories begin in the first week and meet in their own scheduled sections, outside lecture hours. Students conduct behavioral experiments, formulate testable predictions, analyze data, and communicate findings in scientific reports. Lecture and laboratory together connect core psychological concepts with the methods used to investigate them, preparing students to evaluate psychological claims and pursue further study in psychology and related fields.</w:t>
       </w:r>
@@ -730,8 +774,8 @@
           <w:b/>
           <w:bCs/>
           <w:color w:val="1A1A1A"/>
-          <w:sz w:val="25"/>
-          <w:szCs w:val="25"/>
+          <w:sz w:val="24"/>
+          <w:szCs w:val="24"/>
         </w:rPr>
         <w:t>Prerequisites</w:t>
       </w:r>
@@ -741,6 +785,10 @@
         <w:spacing w:after="120" w:line="276" w:lineRule="auto"/>
       </w:pPr>
       <w:r>
+        <w:rPr>
+          <w:sz w:val="24"/>
+          <w:szCs w:val="24"/>
+        </w:rPr>
         <w:t>Basic-level statistics is required for this offering of PSYC100. Students must satisfy the statistics prerequisite or receive a waiver before registering; students who have neither satisfied the prerequisite nor received a waiver will be unable to register. An approved equivalent may be recognized automatically, or the prerequisite may be waived automatically during course registration. Contact the instructor with questions about eligibility or to request consideration of a waiver. Students accessing this syllabus are presumed to have satisfied the statistics prerequisite or received an approved waiver. No previous psychology, neuroscience, programming, or advanced statistics knowledge is assumed; course-specific methods and analyses are introduced in lecture and laboratory.</w:t>
       </w:r>
     </w:p>
@@ -755,8 +803,8 @@
           <w:b/>
           <w:bCs/>
           <w:color w:val="1A1A1A"/>
-          <w:sz w:val="25"/>
-          <w:szCs w:val="25"/>
+          <w:sz w:val="24"/>
+          <w:szCs w:val="24"/>
         </w:rPr>
         <w:t>Course Materials</w:t>
       </w:r>
@@ -766,6 +814,10 @@
         <w:spacing w:after="120" w:line="276" w:lineRule="auto"/>
       </w:pPr>
       <w:r>
+        <w:rPr>
+          <w:sz w:val="24"/>
+          <w:szCs w:val="24"/>
+        </w:rPr>
         <w:t xml:space="preserve">Required textbook: Myers, D. G., DeWall, C. N., and Gruber, J. Psychology (14th ed.). Worth / Macmillan Learning. </w:t>
       </w:r>
     </w:p>
@@ -774,6 +826,10 @@
         <w:spacing w:after="120" w:line="276" w:lineRule="auto"/>
       </w:pPr>
       <w:r>
+        <w:rPr>
+          <w:sz w:val="24"/>
+          <w:szCs w:val="24"/>
+        </w:rPr>
         <w:t>Assigned textbook readings and research articles are required course preparation. The textbook builds the conceptual foundation for lecture, while research articles allow us to examine specific experiments, current findings, and emerging questions. Lectures build on these readings and often extend beyond the textbook.</w:t>
       </w:r>
     </w:p>
@@ -782,17 +838,33 @@
         <w:spacing w:after="120" w:line="276" w:lineRule="auto"/>
       </w:pPr>
       <w:r>
+        <w:rPr>
+          <w:sz w:val="24"/>
+          <w:szCs w:val="24"/>
+        </w:rPr>
         <w:t xml:space="preserve">Lecture slides are the primary source of instruction, and exams are based on lecture content. Use the assigned readings to develop context, clarify unfamiliar concepts, and deepen your understanding of the evidence discussed in class. Slides provide a framework for </w:t>
       </w:r>
       <w:proofErr w:type="gramStart"/>
       <w:r>
+        <w:rPr>
+          <w:sz w:val="24"/>
+          <w:szCs w:val="24"/>
+        </w:rPr>
         <w:t>lecture</w:t>
       </w:r>
       <w:proofErr w:type="gramEnd"/>
       <w:r>
+        <w:rPr>
+          <w:sz w:val="24"/>
+          <w:szCs w:val="24"/>
+        </w:rPr>
         <w:t xml:space="preserve"> but </w:t>
       </w:r>
       <w:r>
+        <w:rPr>
+          <w:sz w:val="24"/>
+          <w:szCs w:val="24"/>
+        </w:rPr>
         <w:t>they do not capture every explanation, example, or discussion that may appear on an exam.</w:t>
       </w:r>
     </w:p>
@@ -801,6 +873,10 @@
         <w:spacing w:after="120" w:line="276" w:lineRule="auto"/>
       </w:pPr>
       <w:r>
+        <w:rPr>
+          <w:sz w:val="24"/>
+          <w:szCs w:val="24"/>
+        </w:rPr>
         <w:t>Although this is an introductory course, it moves quickly and asks you to do more than memorize terminology. We cover substantial material and regularly work through experiments and data. No previous psychology background is expected, but consistent preparation is essential: complete assigned readings, attend lecture, review your notes regularly, and seek help early when something is unclear. The textbook, research articles, lectures, and labs are intended to support one another as you build these skills.</w:t>
       </w:r>
     </w:p>
@@ -809,14 +885,26 @@
         <w:spacing w:after="120" w:line="276" w:lineRule="auto"/>
       </w:pPr>
       <w:r>
+        <w:rPr>
+          <w:sz w:val="24"/>
+          <w:szCs w:val="24"/>
+        </w:rPr>
         <w:t xml:space="preserve">Required equipment: a laptop with a current browser and access to a spreadsheet or a free graphical analysis tool such as </w:t>
       </w:r>
       <w:proofErr w:type="spellStart"/>
       <w:r>
+        <w:rPr>
+          <w:sz w:val="24"/>
+          <w:szCs w:val="24"/>
+        </w:rPr>
         <w:t>jamovi</w:t>
       </w:r>
       <w:proofErr w:type="spellEnd"/>
       <w:r>
+        <w:rPr>
+          <w:sz w:val="24"/>
+          <w:szCs w:val="24"/>
+        </w:rPr>
         <w:t>, plus a reliable connection to the course site. Contact the instructor or TA if equipment or accessibility is a concern. No paid courseware or access code is required for the laboratory activities.</w:t>
       </w:r>
     </w:p>
@@ -831,8 +919,8 @@
           <w:b/>
           <w:bCs/>
           <w:color w:val="1A1A1A"/>
-          <w:sz w:val="25"/>
-          <w:szCs w:val="25"/>
+          <w:sz w:val="24"/>
+          <w:szCs w:val="24"/>
         </w:rPr>
         <w:t>Course Objectives</w:t>
       </w:r>
@@ -855,6 +943,8 @@
       <w:r>
         <w:rPr>
           <w:color w:val="000000"/>
+          <w:sz w:val="24"/>
+          <w:szCs w:val="24"/>
         </w:rPr>
         <w:t>Explain fundamental concepts across biological, cognitive, developmental, social, personality, and clinical psychology.</w:t>
       </w:r>
@@ -877,6 +967,8 @@
       <w:r>
         <w:rPr>
           <w:color w:val="000000"/>
+          <w:sz w:val="24"/>
+          <w:szCs w:val="24"/>
         </w:rPr>
         <w:t>Describe how experiments test explanations of perception, learning, memory, motivation, development, and behavior.</w:t>
       </w:r>
@@ -899,6 +991,8 @@
       <w:r>
         <w:rPr>
           <w:color w:val="000000"/>
+          <w:sz w:val="24"/>
+          <w:szCs w:val="24"/>
         </w:rPr>
         <w:t>Evaluate psychological evidence, interpret figures and results, and distinguish causation, correlation, and uncertainty.</w:t>
       </w:r>
@@ -921,6 +1015,8 @@
       <w:r>
         <w:rPr>
           <w:color w:val="000000"/>
+          <w:sz w:val="24"/>
+          <w:szCs w:val="24"/>
         </w:rPr>
         <w:t>Compare foundational and contemporary findings, including how culture, sampling, and context affect generalization.</w:t>
       </w:r>
@@ -943,6 +1039,8 @@
       <w:r>
         <w:rPr>
           <w:color w:val="000000"/>
+          <w:sz w:val="24"/>
+          <w:szCs w:val="24"/>
         </w:rPr>
         <w:t>Conduct a structured laboratory task, analyze authentic data, and communicate a defensible scientific conclusion.</w:t>
       </w:r>
@@ -958,8 +1056,8 @@
           <w:b/>
           <w:bCs/>
           <w:color w:val="1A1A1A"/>
-          <w:sz w:val="25"/>
-          <w:szCs w:val="25"/>
+          <w:sz w:val="24"/>
+          <w:szCs w:val="24"/>
         </w:rPr>
         <w:lastRenderedPageBreak/>
         <w:t>Teaching Assistants</w:t>
@@ -970,17 +1068,27 @@
         <w:spacing w:after="120" w:line="276" w:lineRule="auto"/>
       </w:pPr>
       <w:r>
+        <w:rPr>
+          <w:sz w:val="24"/>
+          <w:szCs w:val="24"/>
+        </w:rPr>
         <w:t xml:space="preserve">This course has no co-instructor. Questions about lab logistics, lab reports, and assignment expectations should go to your assigned TA first. Concerns about scores or grading feedback, including requests for regrading, should be sent directly to me at </w:t>
       </w:r>
       <w:hyperlink r:id="rId9" w:history="1">
         <w:r>
           <w:rPr>
             <w:rStyle w:val="Hyperlink"/>
+            <w:sz w:val="24"/>
+            <w:szCs w:val="24"/>
           </w:rPr>
           <w:t>jlopez@usc.edu</w:t>
         </w:r>
       </w:hyperlink>
       <w:r>
+        <w:rPr>
+          <w:sz w:val="24"/>
+          <w:szCs w:val="24"/>
+        </w:rPr>
         <w:t>.</w:t>
       </w:r>
     </w:p>
@@ -1029,8 +1137,8 @@
               <w:rPr>
                 <w:b/>
                 <w:bCs/>
-                <w:sz w:val="17"/>
-                <w:szCs w:val="17"/>
+                <w:sz w:val="22"/>
+                <w:szCs w:val="22"/>
               </w:rPr>
               <w:t>Role</w:t>
             </w:r>
@@ -1055,8 +1163,8 @@
               <w:rPr>
                 <w:b/>
                 <w:bCs/>
-                <w:sz w:val="17"/>
-                <w:szCs w:val="17"/>
+                <w:sz w:val="22"/>
+                <w:szCs w:val="22"/>
               </w:rPr>
               <w:t>Name</w:t>
             </w:r>
@@ -1081,8 +1189,8 @@
               <w:rPr>
                 <w:b/>
                 <w:bCs/>
-                <w:sz w:val="17"/>
-                <w:szCs w:val="17"/>
+                <w:sz w:val="22"/>
+                <w:szCs w:val="22"/>
               </w:rPr>
               <w:t>Email</w:t>
             </w:r>
@@ -1107,8 +1215,8 @@
               <w:rPr>
                 <w:b/>
                 <w:bCs/>
-                <w:sz w:val="17"/>
-                <w:szCs w:val="17"/>
+                <w:sz w:val="22"/>
+                <w:szCs w:val="22"/>
               </w:rPr>
               <w:t>Office Hours / Location</w:t>
             </w:r>
@@ -1135,8 +1243,8 @@
             </w:pPr>
             <w:r>
               <w:rPr>
-                <w:sz w:val="17"/>
-                <w:szCs w:val="17"/>
+                <w:sz w:val="22"/>
+                <w:szCs w:val="22"/>
               </w:rPr>
               <w:t>Lab TA (Section T/W)</w:t>
             </w:r>
@@ -1162,8 +1270,8 @@
             </w:pPr>
             <w:r>
               <w:rPr>
-                <w:sz w:val="17"/>
-                <w:szCs w:val="17"/>
+                <w:sz w:val="22"/>
+                <w:szCs w:val="22"/>
               </w:rPr>
               <w:t>Samuel Hires</w:t>
             </w:r>
@@ -1188,6 +1296,10 @@
               </w:rPr>
             </w:pPr>
             <w:r>
+              <w:rPr>
+                <w:sz w:val="22"/>
+                <w:szCs w:val="22"/>
+              </w:rPr>
               <w:t>hires@usc.edu</w:t>
             </w:r>
           </w:p>
@@ -1212,8 +1324,8 @@
             </w:pPr>
             <w:r>
               <w:rPr>
-                <w:sz w:val="17"/>
-                <w:szCs w:val="17"/>
+                <w:sz w:val="22"/>
+                <w:szCs w:val="22"/>
               </w:rPr>
               <w:t>Mon, Fri; 4pm @ANI500A</w:t>
             </w:r>
@@ -1240,8 +1352,8 @@
             </w:pPr>
             <w:r>
               <w:rPr>
-                <w:sz w:val="17"/>
-                <w:szCs w:val="17"/>
+                <w:sz w:val="22"/>
+                <w:szCs w:val="22"/>
               </w:rPr>
               <w:t>Lab TA (Section TH)</w:t>
             </w:r>
@@ -1267,8 +1379,8 @@
             </w:pPr>
             <w:r>
               <w:rPr>
-                <w:sz w:val="17"/>
-                <w:szCs w:val="17"/>
+                <w:sz w:val="22"/>
+                <w:szCs w:val="22"/>
               </w:rPr>
               <w:t>David Mckemy</w:t>
             </w:r>
@@ -1293,6 +1405,10 @@
               </w:rPr>
             </w:pPr>
             <w:r>
+              <w:rPr>
+                <w:sz w:val="22"/>
+                <w:szCs w:val="22"/>
+              </w:rPr>
               <w:t>dkemy@usc.edu</w:t>
             </w:r>
           </w:p>
@@ -1317,8 +1433,8 @@
             </w:pPr>
             <w:r>
               <w:rPr>
-                <w:sz w:val="17"/>
-                <w:szCs w:val="17"/>
+                <w:sz w:val="22"/>
+                <w:szCs w:val="22"/>
               </w:rPr>
               <w:t>Tues, Wed, Thurs; 3pm @ANI500A</w:t>
             </w:r>
@@ -1342,8 +1458,8 @@
           <w:p>
             <w:r>
               <w:rPr>
-                <w:sz w:val="17"/>
-                <w:szCs w:val="17"/>
+                <w:sz w:val="22"/>
+                <w:szCs w:val="22"/>
               </w:rPr>
               <w:t>Exam Proctor</w:t>
             </w:r>
@@ -1368,8 +1484,8 @@
             </w:pPr>
             <w:r>
               <w:rPr>
-                <w:sz w:val="17"/>
-                <w:szCs w:val="17"/>
+                <w:sz w:val="22"/>
+                <w:szCs w:val="22"/>
               </w:rPr>
               <w:t>Sarah W Bottjer</w:t>
             </w:r>
@@ -1393,6 +1509,10 @@
               </w:rPr>
             </w:pPr>
             <w:r>
+              <w:rPr>
+                <w:sz w:val="22"/>
+                <w:szCs w:val="22"/>
+              </w:rPr>
               <w:t>sbottjer@usc.edu</w:t>
             </w:r>
           </w:p>
@@ -1416,8 +1536,8 @@
             </w:pPr>
             <w:r>
               <w:rPr>
-                <w:sz w:val="17"/>
-                <w:szCs w:val="17"/>
+                <w:sz w:val="22"/>
+                <w:szCs w:val="22"/>
               </w:rPr>
               <w:t>ANI 402</w:t>
             </w:r>
@@ -1436,8 +1556,8 @@
           <w:b/>
           <w:bCs/>
           <w:color w:val="1A1A1A"/>
-          <w:sz w:val="25"/>
-          <w:szCs w:val="25"/>
+          <w:sz w:val="24"/>
+          <w:szCs w:val="24"/>
         </w:rPr>
         <w:t>Grading</w:t>
       </w:r>
@@ -1447,16 +1567,26 @@
         <w:spacing w:after="120" w:line="276" w:lineRule="auto"/>
       </w:pPr>
       <w:r>
+        <w:rPr>
+          <w:sz w:val="24"/>
+          <w:szCs w:val="24"/>
+        </w:rPr>
         <w:t xml:space="preserve">This course has two components, lecture and laboratory. Each is scored out of 100 percent. Your final grade is 50 percent lecture and 50 percent laboratory. </w:t>
       </w:r>
       <w:r>
         <w:rPr>
           <w:b/>
           <w:bCs/>
+          <w:sz w:val="24"/>
+          <w:szCs w:val="24"/>
         </w:rPr>
         <w:t>You must earn at least 60 percent in BOTH components to pass the course.</w:t>
       </w:r>
       <w:r>
+        <w:rPr>
+          <w:sz w:val="24"/>
+          <w:szCs w:val="24"/>
+        </w:rPr>
         <w:t xml:space="preserve"> A strong lecture score does not rescue a failing lab score, and the reverse is also true. </w:t>
       </w:r>
     </w:p>
@@ -1471,8 +1601,8 @@
           <w:b/>
           <w:bCs/>
           <w:color w:val="1A1A1A"/>
-          <w:sz w:val="21"/>
-          <w:szCs w:val="21"/>
+          <w:sz w:val="24"/>
+          <w:szCs w:val="24"/>
         </w:rPr>
         <w:t>Lecture Component (100%)</w:t>
       </w:r>
@@ -1521,8 +1651,8 @@
               <w:rPr>
                 <w:b/>
                 <w:bCs/>
-                <w:sz w:val="17"/>
-                <w:szCs w:val="17"/>
+                <w:sz w:val="22"/>
+                <w:szCs w:val="22"/>
               </w:rPr>
               <w:t>Assessment</w:t>
             </w:r>
@@ -1547,8 +1677,8 @@
               <w:rPr>
                 <w:b/>
                 <w:bCs/>
-                <w:sz w:val="17"/>
-                <w:szCs w:val="17"/>
+                <w:sz w:val="22"/>
+                <w:szCs w:val="22"/>
               </w:rPr>
               <w:t>Weight of Lecture Grade</w:t>
             </w:r>
@@ -1573,8 +1703,8 @@
               <w:rPr>
                 <w:b/>
                 <w:bCs/>
-                <w:sz w:val="17"/>
-                <w:szCs w:val="17"/>
+                <w:sz w:val="22"/>
+                <w:szCs w:val="22"/>
               </w:rPr>
               <w:t>Points</w:t>
             </w:r>
@@ -1601,8 +1731,8 @@
             </w:pPr>
             <w:r>
               <w:rPr>
-                <w:sz w:val="17"/>
-                <w:szCs w:val="17"/>
+                <w:sz w:val="22"/>
+                <w:szCs w:val="22"/>
               </w:rPr>
               <w:t>Exam 1 (Lectures 1 to 10)</w:t>
             </w:r>
@@ -1624,8 +1754,8 @@
             </w:pPr>
             <w:r>
               <w:rPr>
-                <w:sz w:val="17"/>
-                <w:szCs w:val="17"/>
+                <w:sz w:val="22"/>
+                <w:szCs w:val="22"/>
               </w:rPr>
               <w:t>20%</w:t>
             </w:r>
@@ -1647,8 +1777,8 @@
             </w:pPr>
             <w:r>
               <w:rPr>
-                <w:sz w:val="17"/>
-                <w:szCs w:val="17"/>
+                <w:sz w:val="22"/>
+                <w:szCs w:val="22"/>
               </w:rPr>
               <w:t>120</w:t>
             </w:r>
@@ -1675,8 +1805,8 @@
             </w:pPr>
             <w:r>
               <w:rPr>
-                <w:sz w:val="17"/>
-                <w:szCs w:val="17"/>
+                <w:sz w:val="22"/>
+                <w:szCs w:val="22"/>
               </w:rPr>
               <w:t>Exam 2 (Lectures 11 to 20)</w:t>
             </w:r>
@@ -1698,8 +1828,8 @@
             </w:pPr>
             <w:r>
               <w:rPr>
-                <w:sz w:val="17"/>
-                <w:szCs w:val="17"/>
+                <w:sz w:val="22"/>
+                <w:szCs w:val="22"/>
               </w:rPr>
               <w:t>20%</w:t>
             </w:r>
@@ -1721,8 +1851,8 @@
             </w:pPr>
             <w:r>
               <w:rPr>
-                <w:sz w:val="17"/>
-                <w:szCs w:val="17"/>
+                <w:sz w:val="22"/>
+                <w:szCs w:val="22"/>
               </w:rPr>
               <w:t>120</w:t>
             </w:r>
@@ -1749,8 +1879,8 @@
             </w:pPr>
             <w:r>
               <w:rPr>
-                <w:sz w:val="17"/>
-                <w:szCs w:val="17"/>
+                <w:sz w:val="22"/>
+                <w:szCs w:val="22"/>
               </w:rPr>
               <w:t>Exam 3 (Lectures 21 to 30)</w:t>
             </w:r>
@@ -1772,8 +1902,8 @@
             </w:pPr>
             <w:r>
               <w:rPr>
-                <w:sz w:val="17"/>
-                <w:szCs w:val="17"/>
+                <w:sz w:val="22"/>
+                <w:szCs w:val="22"/>
               </w:rPr>
               <w:t>20%</w:t>
             </w:r>
@@ -1795,8 +1925,8 @@
             </w:pPr>
             <w:r>
               <w:rPr>
-                <w:sz w:val="17"/>
-                <w:szCs w:val="17"/>
+                <w:sz w:val="22"/>
+                <w:szCs w:val="22"/>
               </w:rPr>
               <w:t>120</w:t>
             </w:r>
@@ -1823,8 +1953,8 @@
             </w:pPr>
             <w:r>
               <w:rPr>
-                <w:sz w:val="17"/>
-                <w:szCs w:val="17"/>
+                <w:sz w:val="22"/>
+                <w:szCs w:val="22"/>
               </w:rPr>
               <w:t>Exam 4 (Lectures 31 to 41)</w:t>
             </w:r>
@@ -1846,8 +1976,8 @@
             </w:pPr>
             <w:r>
               <w:rPr>
-                <w:sz w:val="17"/>
-                <w:szCs w:val="17"/>
+                <w:sz w:val="22"/>
+                <w:szCs w:val="22"/>
               </w:rPr>
               <w:t>20%</w:t>
             </w:r>
@@ -1869,8 +1999,8 @@
             </w:pPr>
             <w:r>
               <w:rPr>
-                <w:sz w:val="17"/>
-                <w:szCs w:val="17"/>
+                <w:sz w:val="22"/>
+                <w:szCs w:val="22"/>
               </w:rPr>
               <w:t>120</w:t>
             </w:r>
@@ -1897,8 +2027,8 @@
             </w:pPr>
             <w:r>
               <w:rPr>
-                <w:sz w:val="17"/>
-                <w:szCs w:val="17"/>
+                <w:sz w:val="22"/>
+                <w:szCs w:val="22"/>
               </w:rPr>
               <w:t>Lecture Project (data analysis or APA paper)</w:t>
             </w:r>
@@ -1920,8 +2050,8 @@
             </w:pPr>
             <w:r>
               <w:rPr>
-                <w:sz w:val="17"/>
-                <w:szCs w:val="17"/>
+                <w:sz w:val="22"/>
+                <w:szCs w:val="22"/>
               </w:rPr>
               <w:t>20%</w:t>
             </w:r>
@@ -1943,8 +2073,8 @@
             </w:pPr>
             <w:r>
               <w:rPr>
-                <w:sz w:val="17"/>
-                <w:szCs w:val="17"/>
+                <w:sz w:val="22"/>
+                <w:szCs w:val="22"/>
               </w:rPr>
               <w:t>120</w:t>
             </w:r>
@@ -1968,8 +2098,8 @@
           <w:p>
             <w:r>
               <w:rPr>
-                <w:sz w:val="17"/>
-                <w:szCs w:val="17"/>
+                <w:sz w:val="22"/>
+                <w:szCs w:val="22"/>
               </w:rPr>
               <w:t>Total</w:t>
             </w:r>
@@ -1988,8 +2118,8 @@
           <w:p>
             <w:r>
               <w:rPr>
-                <w:sz w:val="17"/>
-                <w:szCs w:val="17"/>
+                <w:sz w:val="22"/>
+                <w:szCs w:val="22"/>
               </w:rPr>
               <w:t>100%</w:t>
             </w:r>
@@ -2008,8 +2138,8 @@
           <w:p>
             <w:r>
               <w:rPr>
-                <w:sz w:val="17"/>
-                <w:szCs w:val="17"/>
+                <w:sz w:val="22"/>
+                <w:szCs w:val="22"/>
               </w:rPr>
               <w:t>600</w:t>
             </w:r>
@@ -2028,8 +2158,8 @@
           <w:b/>
           <w:bCs/>
           <w:color w:val="1A1A1A"/>
-          <w:sz w:val="21"/>
-          <w:szCs w:val="21"/>
+          <w:sz w:val="24"/>
+          <w:szCs w:val="24"/>
         </w:rPr>
         <w:t>Laboratory Component (100%)</w:t>
       </w:r>
@@ -2077,8 +2207,8 @@
               <w:rPr>
                 <w:b/>
                 <w:bCs/>
-                <w:sz w:val="17"/>
-                <w:szCs w:val="17"/>
+                <w:sz w:val="22"/>
+                <w:szCs w:val="22"/>
               </w:rPr>
               <w:t>Assessment</w:t>
             </w:r>
@@ -2103,8 +2233,8 @@
               <w:rPr>
                 <w:b/>
                 <w:bCs/>
-                <w:sz w:val="17"/>
-                <w:szCs w:val="17"/>
+                <w:sz w:val="22"/>
+                <w:szCs w:val="22"/>
               </w:rPr>
               <w:t>Weight of Lab Grade</w:t>
             </w:r>
@@ -2131,8 +2261,8 @@
             </w:pPr>
             <w:r>
               <w:rPr>
-                <w:sz w:val="17"/>
-                <w:szCs w:val="17"/>
+                <w:sz w:val="22"/>
+                <w:szCs w:val="22"/>
               </w:rPr>
               <w:t>Lab Reports (8 counted of 10, 7.5% each)</w:t>
             </w:r>
@@ -2154,8 +2284,8 @@
             </w:pPr>
             <w:r>
               <w:rPr>
-                <w:sz w:val="17"/>
-                <w:szCs w:val="17"/>
+                <w:sz w:val="22"/>
+                <w:szCs w:val="22"/>
               </w:rPr>
               <w:t>60%</w:t>
             </w:r>
@@ -2182,8 +2312,8 @@
             </w:pPr>
             <w:r>
               <w:rPr>
-                <w:sz w:val="17"/>
-                <w:szCs w:val="17"/>
+                <w:sz w:val="22"/>
+                <w:szCs w:val="22"/>
               </w:rPr>
               <w:t>Individual Experimental Practical</w:t>
             </w:r>
@@ -2205,8 +2335,8 @@
             </w:pPr>
             <w:r>
               <w:rPr>
-                <w:sz w:val="17"/>
-                <w:szCs w:val="17"/>
+                <w:sz w:val="22"/>
+                <w:szCs w:val="22"/>
               </w:rPr>
               <w:t>10%</w:t>
             </w:r>
@@ -2233,8 +2363,8 @@
             </w:pPr>
             <w:r>
               <w:rPr>
-                <w:sz w:val="17"/>
-                <w:szCs w:val="17"/>
+                <w:sz w:val="22"/>
+                <w:szCs w:val="22"/>
               </w:rPr>
               <w:t>Methods Assignments (3 at 5% each)</w:t>
             </w:r>
@@ -2256,8 +2386,8 @@
             </w:pPr>
             <w:r>
               <w:rPr>
-                <w:sz w:val="17"/>
-                <w:szCs w:val="17"/>
+                <w:sz w:val="22"/>
+                <w:szCs w:val="22"/>
               </w:rPr>
               <w:t>15%</w:t>
             </w:r>
@@ -2284,8 +2414,8 @@
             </w:pPr>
             <w:r>
               <w:rPr>
-                <w:sz w:val="17"/>
-                <w:szCs w:val="17"/>
+                <w:sz w:val="22"/>
+                <w:szCs w:val="22"/>
               </w:rPr>
               <w:t>Mini-Replication Project</w:t>
             </w:r>
@@ -2307,8 +2437,8 @@
             </w:pPr>
             <w:r>
               <w:rPr>
-                <w:sz w:val="17"/>
-                <w:szCs w:val="17"/>
+                <w:sz w:val="22"/>
+                <w:szCs w:val="22"/>
               </w:rPr>
               <w:t>15%</w:t>
             </w:r>
@@ -2332,8 +2462,8 @@
           <w:p>
             <w:r>
               <w:rPr>
-                <w:sz w:val="17"/>
-                <w:szCs w:val="17"/>
+                <w:sz w:val="22"/>
+                <w:szCs w:val="22"/>
               </w:rPr>
               <w:t>Total</w:t>
             </w:r>
@@ -2352,8 +2482,8 @@
           <w:p>
             <w:r>
               <w:rPr>
-                <w:sz w:val="17"/>
-                <w:szCs w:val="17"/>
+                <w:sz w:val="22"/>
+                <w:szCs w:val="22"/>
               </w:rPr>
               <w:t>100%</w:t>
             </w:r>
@@ -2378,8 +2508,8 @@
           <w:b/>
           <w:bCs/>
           <w:color w:val="1A1A1A"/>
-          <w:sz w:val="25"/>
-          <w:szCs w:val="25"/>
+          <w:sz w:val="24"/>
+          <w:szCs w:val="24"/>
         </w:rPr>
         <w:t>Dr. J’s Grading Philosophy and Curve</w:t>
       </w:r>
@@ -2389,6 +2519,10 @@
         <w:spacing w:after="120" w:line="276" w:lineRule="auto"/>
       </w:pPr>
       <w:r>
+        <w:rPr>
+          <w:sz w:val="24"/>
+          <w:szCs w:val="24"/>
+        </w:rPr>
         <w:t>Psychology requires you to explain behavior, interpret experimental evidence, and compare competing explanations. This is an introductory course, so unfamiliar terms, methods, and analyses are introduced step by step. Memorizing terminology alone is not sufficient; you must be able to explain a concept, describe what an experiment tested, and apply your understanding to unfamiliar results.</w:t>
       </w:r>
     </w:p>
@@ -2397,6 +2531,10 @@
         <w:spacing w:after="120" w:line="276" w:lineRule="auto"/>
       </w:pPr>
       <w:r>
+        <w:rPr>
+          <w:sz w:val="24"/>
+          <w:szCs w:val="24"/>
+        </w:rPr>
         <w:t>Exams and laboratory assignments reflect these expectations. Some assessments will be difficult, and raw percentages may be lower than you are accustomed to. Grades reflect demonstrated understanding, scientific accuracy, and the quality of your reasoning. Consistent effort and participation are important, but they do not substitute for meeting the course’s academic standards.</w:t>
       </w:r>
     </w:p>
@@ -2405,9 +2543,17 @@
         <w:spacing w:after="120" w:line="276" w:lineRule="auto"/>
       </w:pPr>
       <w:r>
+        <w:rPr>
+          <w:sz w:val="24"/>
+          <w:szCs w:val="24"/>
+        </w:rPr>
         <w:t xml:space="preserve">If the final class average, calculated using the weighted lecture and laboratory grades before curving, is below 70%, a curve will be applied at the end of the course. If the class average is 70% or higher, no curve will be applied. The size of any adjustment will depend on overall class performance. A curve accounts for assessment difficulty while maintaining expectations for mastery; it does not guarantee a particular letter grade or a passing grade. Use early assessment results to identify gaps in your understanding, review feedback, and seek help </w:t>
       </w:r>
       <w:r>
+        <w:rPr>
+          <w:sz w:val="24"/>
+          <w:szCs w:val="24"/>
+        </w:rPr>
         <w:lastRenderedPageBreak/>
         <w:t>promptly. Do not rely on a possible curve to compensate for missing work or consistently weak performance. You must still earn at least 60% in both the lecture and laboratory components to pass the course.</w:t>
       </w:r>
@@ -2423,8 +2569,8 @@
           <w:b/>
           <w:bCs/>
           <w:color w:val="1A1A1A"/>
-          <w:sz w:val="21"/>
-          <w:szCs w:val="21"/>
+          <w:sz w:val="24"/>
+          <w:szCs w:val="24"/>
         </w:rPr>
         <w:t>Grading Scale After Curving (changes year to year)</w:t>
       </w:r>
@@ -2434,6 +2580,10 @@
         <w:spacing w:after="120" w:line="276" w:lineRule="auto"/>
       </w:pPr>
       <w:r>
+        <w:rPr>
+          <w:sz w:val="24"/>
+          <w:szCs w:val="24"/>
+        </w:rPr>
         <w:t>The percentage ranges below are approximate estimates, not fixed or guaranteed cutoffs. The grading scale may change from year to year, and final cutoffs for this semester may differ based on overall class performance and any curve applied under the policy above. Use this table as a general guide when estimating your grade.</w:t>
       </w:r>
     </w:p>
@@ -2481,8 +2631,8 @@
               <w:rPr>
                 <w:b/>
                 <w:bCs/>
-                <w:sz w:val="17"/>
-                <w:szCs w:val="17"/>
+                <w:sz w:val="22"/>
+                <w:szCs w:val="22"/>
               </w:rPr>
               <w:t>Letter Grade</w:t>
             </w:r>
@@ -2507,8 +2657,8 @@
               <w:rPr>
                 <w:b/>
                 <w:bCs/>
-                <w:sz w:val="17"/>
-                <w:szCs w:val="17"/>
+                <w:sz w:val="22"/>
+                <w:szCs w:val="22"/>
               </w:rPr>
               <w:t>Approximate Percentage Range</w:t>
             </w:r>
@@ -2535,8 +2685,8 @@
             </w:pPr>
             <w:r>
               <w:rPr>
-                <w:sz w:val="17"/>
-                <w:szCs w:val="17"/>
+                <w:sz w:val="22"/>
+                <w:szCs w:val="22"/>
               </w:rPr>
               <w:t>A</w:t>
             </w:r>
@@ -2558,8 +2708,8 @@
             </w:pPr>
             <w:r>
               <w:rPr>
-                <w:sz w:val="17"/>
-                <w:szCs w:val="17"/>
+                <w:sz w:val="22"/>
+                <w:szCs w:val="22"/>
               </w:rPr>
               <w:t>90-100%</w:t>
             </w:r>
@@ -2586,8 +2736,8 @@
             </w:pPr>
             <w:r>
               <w:rPr>
-                <w:sz w:val="17"/>
-                <w:szCs w:val="17"/>
+                <w:sz w:val="22"/>
+                <w:szCs w:val="22"/>
               </w:rPr>
               <w:t>A-</w:t>
             </w:r>
@@ -2609,8 +2759,8 @@
             </w:pPr>
             <w:r>
               <w:rPr>
-                <w:sz w:val="17"/>
-                <w:szCs w:val="17"/>
+                <w:sz w:val="22"/>
+                <w:szCs w:val="22"/>
               </w:rPr>
               <w:t>85-89.9%</w:t>
             </w:r>
@@ -2637,8 +2787,8 @@
             </w:pPr>
             <w:r>
               <w:rPr>
-                <w:sz w:val="17"/>
-                <w:szCs w:val="17"/>
+                <w:sz w:val="22"/>
+                <w:szCs w:val="22"/>
               </w:rPr>
               <w:t>B+</w:t>
             </w:r>
@@ -2660,8 +2810,8 @@
             </w:pPr>
             <w:r>
               <w:rPr>
-                <w:sz w:val="17"/>
-                <w:szCs w:val="17"/>
+                <w:sz w:val="22"/>
+                <w:szCs w:val="22"/>
               </w:rPr>
               <w:t>80-84.9%</w:t>
             </w:r>
@@ -2688,8 +2838,8 @@
             </w:pPr>
             <w:r>
               <w:rPr>
-                <w:sz w:val="17"/>
-                <w:szCs w:val="17"/>
+                <w:sz w:val="22"/>
+                <w:szCs w:val="22"/>
               </w:rPr>
               <w:t>B</w:t>
             </w:r>
@@ -2711,8 +2861,8 @@
             </w:pPr>
             <w:r>
               <w:rPr>
-                <w:sz w:val="17"/>
-                <w:szCs w:val="17"/>
+                <w:sz w:val="22"/>
+                <w:szCs w:val="22"/>
               </w:rPr>
               <w:t>75-79.9%</w:t>
             </w:r>
@@ -2739,8 +2889,8 @@
             </w:pPr>
             <w:r>
               <w:rPr>
-                <w:sz w:val="17"/>
-                <w:szCs w:val="17"/>
+                <w:sz w:val="22"/>
+                <w:szCs w:val="22"/>
               </w:rPr>
               <w:t>B-</w:t>
             </w:r>
@@ -2762,8 +2912,8 @@
             </w:pPr>
             <w:r>
               <w:rPr>
-                <w:sz w:val="17"/>
-                <w:szCs w:val="17"/>
+                <w:sz w:val="22"/>
+                <w:szCs w:val="22"/>
               </w:rPr>
               <w:t>70-74.9%</w:t>
             </w:r>
@@ -2790,8 +2940,8 @@
             </w:pPr>
             <w:r>
               <w:rPr>
-                <w:sz w:val="17"/>
-                <w:szCs w:val="17"/>
+                <w:sz w:val="22"/>
+                <w:szCs w:val="22"/>
               </w:rPr>
               <w:t>C+</w:t>
             </w:r>
@@ -2813,8 +2963,8 @@
             </w:pPr>
             <w:r>
               <w:rPr>
-                <w:sz w:val="17"/>
-                <w:szCs w:val="17"/>
+                <w:sz w:val="22"/>
+                <w:szCs w:val="22"/>
               </w:rPr>
               <w:t>65-69.9%</w:t>
             </w:r>
@@ -2841,8 +2991,8 @@
             </w:pPr>
             <w:r>
               <w:rPr>
-                <w:sz w:val="17"/>
-                <w:szCs w:val="17"/>
+                <w:sz w:val="22"/>
+                <w:szCs w:val="22"/>
               </w:rPr>
               <w:t>C</w:t>
             </w:r>
@@ -2864,8 +3014,8 @@
             </w:pPr>
             <w:r>
               <w:rPr>
-                <w:sz w:val="17"/>
-                <w:szCs w:val="17"/>
+                <w:sz w:val="22"/>
+                <w:szCs w:val="22"/>
               </w:rPr>
               <w:t>60-64.9%</w:t>
             </w:r>
@@ -2892,8 +3042,8 @@
             </w:pPr>
             <w:r>
               <w:rPr>
-                <w:sz w:val="17"/>
-                <w:szCs w:val="17"/>
+                <w:sz w:val="22"/>
+                <w:szCs w:val="22"/>
               </w:rPr>
               <w:t>C-</w:t>
             </w:r>
@@ -2915,8 +3065,8 @@
             </w:pPr>
             <w:r>
               <w:rPr>
-                <w:sz w:val="17"/>
-                <w:szCs w:val="17"/>
+                <w:sz w:val="22"/>
+                <w:szCs w:val="22"/>
               </w:rPr>
               <w:t>55-59.9%</w:t>
             </w:r>
@@ -2943,8 +3093,8 @@
             </w:pPr>
             <w:r>
               <w:rPr>
-                <w:sz w:val="17"/>
-                <w:szCs w:val="17"/>
+                <w:sz w:val="22"/>
+                <w:szCs w:val="22"/>
               </w:rPr>
               <w:t>D</w:t>
             </w:r>
@@ -2966,8 +3116,8 @@
             </w:pPr>
             <w:r>
               <w:rPr>
-                <w:sz w:val="17"/>
-                <w:szCs w:val="17"/>
+                <w:sz w:val="22"/>
+                <w:szCs w:val="22"/>
               </w:rPr>
               <w:t>45-54.9%</w:t>
             </w:r>
@@ -2991,8 +3141,8 @@
           <w:p>
             <w:r>
               <w:rPr>
-                <w:sz w:val="17"/>
-                <w:szCs w:val="17"/>
+                <w:sz w:val="22"/>
+                <w:szCs w:val="22"/>
               </w:rPr>
               <w:t>F</w:t>
             </w:r>
@@ -3011,8 +3161,8 @@
           <w:p>
             <w:r>
               <w:rPr>
-                <w:sz w:val="17"/>
-                <w:szCs w:val="17"/>
+                <w:sz w:val="22"/>
+                <w:szCs w:val="22"/>
               </w:rPr>
               <w:t>Below 45%</w:t>
             </w:r>
@@ -3025,6 +3175,10 @@
         <w:spacing w:after="120" w:line="276" w:lineRule="auto"/>
       </w:pPr>
       <w:r>
+        <w:rPr>
+          <w:sz w:val="24"/>
+          <w:szCs w:val="24"/>
+        </w:rPr>
         <w:t>Final grades are not rounded up. Letter grades will be assigned strictly according to the finalized cutoffs, which will be announced before final grades are assigned. Regardless of any adjustment to the scale, you must earn at least 60% in both the lecture and laboratory components to pass the course.</w:t>
       </w:r>
     </w:p>
@@ -3045,8 +3199,8 @@
           <w:b/>
           <w:bCs/>
           <w:color w:val="1A1A1A"/>
-          <w:sz w:val="25"/>
-          <w:szCs w:val="25"/>
+          <w:sz w:val="24"/>
+          <w:szCs w:val="24"/>
         </w:rPr>
         <w:t>Exams</w:t>
       </w:r>
@@ -3056,6 +3210,10 @@
         <w:spacing w:after="120" w:line="276" w:lineRule="auto"/>
       </w:pPr>
       <w:r>
+        <w:rPr>
+          <w:sz w:val="24"/>
+          <w:szCs w:val="24"/>
+        </w:rPr>
         <w:t>There are four exams, each worth 120 points. Exam 1 covers Lectures 1 to 10, Exam 2 covers Lectures 11 to 20, Exam 3 covers Lectures 21 to 30, and Exam 4 covers Lectures 31 to 41. Exams are not cumulative, but the concepts build on one another. Planned dates are Monday, September 20; Monday, October 18; and Monday, November 8. Exam 4 will use the assigned university appointment within December 8–15. All exams use the separate exam session. Exams 1–3 meet Mondays at 5:00 PM in NEU 100A or NEU 100B. Exam 4’s assigned date and time will be announced separately. Dates and room reservations remain subject to departmental confirmation.</w:t>
       </w:r>
     </w:p>
@@ -3079,19 +3237,25 @@
           <w:b/>
           <w:bCs/>
           <w:color w:val="000000"/>
+          <w:sz w:val="24"/>
+          <w:szCs w:val="24"/>
         </w:rPr>
         <w:t xml:space="preserve">Number of questions and versions: </w:t>
       </w:r>
       <w:r>
         <w:rPr>
           <w:color w:val="000000"/>
-        </w:rPr>
-        <w:t xml:space="preserve">Expect 40 questions totaling 120 points: 10 multiple-choice items at 2 points each, 20 fill-in or brief-answer items at 2 points each, and 10 short-response or data-interpretation items at 6 points each. The final timing will be checked against the assigned exam-session length. Exams may use three versions (V1, V2, and V3), with </w:t>
+          <w:sz w:val="24"/>
+          <w:szCs w:val="24"/>
+        </w:rPr>
+        <w:t xml:space="preserve">Expect 65 questions totaling 120 points: 10 multiple-choice items at 1 point each, 40 fill-in or brief-answer items at 2 points each, and 15 short-response or data-interpretation items at 2 points each. Written responses account for 55 of the 65 questions and 110 of the 120 points. The final timing will be checked against the assigned exam-session length. Exams may use three versions (V1, V2, and V3), with </w:t>
       </w:r>
       <w:proofErr w:type="gramStart"/>
       <w:r>
         <w:rPr>
           <w:color w:val="000000"/>
+          <w:sz w:val="24"/>
+          <w:szCs w:val="24"/>
         </w:rPr>
         <w:t>question and answer</w:t>
       </w:r>
@@ -3099,6 +3263,8 @@
       <w:r>
         <w:rPr>
           <w:color w:val="000000"/>
+          <w:sz w:val="24"/>
+          <w:szCs w:val="24"/>
         </w:rPr>
         <w:t xml:space="preserve"> order mixed within each lecture section.</w:t>
       </w:r>
@@ -3123,12 +3289,16 @@
           <w:b/>
           <w:bCs/>
           <w:color w:val="000000"/>
+          <w:sz w:val="24"/>
+          <w:szCs w:val="24"/>
         </w:rPr>
         <w:t xml:space="preserve">Question order: </w:t>
       </w:r>
       <w:r>
         <w:rPr>
           <w:color w:val="000000"/>
+          <w:sz w:val="24"/>
+          <w:szCs w:val="24"/>
         </w:rPr>
         <w:t>Exam questions are ordered by lecture. Questions on Lecture 1 come first, followed by questions on Lecture 2, and so on through the last lecture covered by that exam.</w:t>
       </w:r>
@@ -3153,12 +3323,16 @@
           <w:b/>
           <w:bCs/>
           <w:color w:val="000000"/>
+          <w:sz w:val="24"/>
+          <w:szCs w:val="24"/>
         </w:rPr>
         <w:t xml:space="preserve">Room and version assignment: </w:t>
       </w:r>
       <w:r>
         <w:rPr>
           <w:color w:val="000000"/>
+          <w:sz w:val="24"/>
+          <w:szCs w:val="24"/>
         </w:rPr>
         <w:t>Your assigned exam room and version will be posted on the course site before each exam. Attend the assigned room unless the instructor approves a change. Approved accommodations are implemented through the university process.</w:t>
       </w:r>
@@ -3192,12 +3366,16 @@
           <w:b/>
           <w:bCs/>
           <w:color w:val="000000"/>
+          <w:sz w:val="24"/>
+          <w:szCs w:val="24"/>
         </w:rPr>
         <w:t xml:space="preserve">Exam format: </w:t>
       </w:r>
       <w:r>
         <w:rPr>
           <w:color w:val="000000"/>
+          <w:sz w:val="24"/>
+          <w:szCs w:val="24"/>
         </w:rPr>
         <w:t>In-person paper exams consisting primarily of written free-response and fill-in-the-blank questions, with a smaller number of multiple-choice questions. Questions may require definitions in context, explanations of findings, interpretation of figures and data, or evaluation of an experimental design. Approximately 40% of points address concepts directly and 60% address studies or experimental reasoning.</w:t>
       </w:r>
@@ -3222,18 +3400,24 @@
           <w:b/>
           <w:bCs/>
           <w:color w:val="000000"/>
+          <w:sz w:val="24"/>
+          <w:szCs w:val="24"/>
         </w:rPr>
         <w:t xml:space="preserve">Expectations for answers: </w:t>
       </w:r>
       <w:r>
         <w:rPr>
           <w:color w:val="000000"/>
+          <w:sz w:val="24"/>
+          <w:szCs w:val="24"/>
         </w:rPr>
         <w:t xml:space="preserve">Draw directly from lecture content, explain specific experiments and findings, and identify the evidence supporting your answer. Use relevant examples of psychological processes and </w:t>
       </w:r>
       <w:r>
         <w:rPr>
           <w:color w:val="000000"/>
+          <w:sz w:val="24"/>
+          <w:szCs w:val="24"/>
         </w:rPr>
         <w:lastRenderedPageBreak/>
         <w:t>behavior. Memorizing terminology or repeating slide text without demonstrating understanding is not sufficient.</w:t>
@@ -3259,12 +3443,16 @@
           <w:b/>
           <w:bCs/>
           <w:color w:val="000000"/>
+          <w:sz w:val="24"/>
+          <w:szCs w:val="24"/>
         </w:rPr>
         <w:t xml:space="preserve">Missed exams: </w:t>
       </w:r>
       <w:r>
         <w:rPr>
           <w:color w:val="000000"/>
+          <w:sz w:val="24"/>
+          <w:szCs w:val="24"/>
         </w:rPr>
         <w:t>Make-up exams are not given. If you miss one exam, a zero will initially be recorded. If the absence is approved for a valid, documented medical or official reason, that zero will be replaced at the end of the semester by the average of your other three exam scores. This replacement uses your other exam scores, not your final course grade. An undocumented or unapproved absence will remain a zero. Approved accommodations, religious observance, and university-required alternatives take precedence.</w:t>
       </w:r>
@@ -3287,6 +3475,8 @@
       <w:r>
         <w:rPr>
           <w:color w:val="000000"/>
+          <w:sz w:val="24"/>
+          <w:szCs w:val="24"/>
         </w:rPr>
         <w:t>Bring a photo ID and a pencil (YOU WILL BE VERIFIED). Phones, smartwatches, and notes are not allowed</w:t>
       </w:r>
@@ -3314,12 +3504,16 @@
           <w:b/>
           <w:bCs/>
           <w:color w:val="000000"/>
+          <w:sz w:val="24"/>
+          <w:szCs w:val="24"/>
         </w:rPr>
         <w:t>Exams are closed-note</w:t>
       </w:r>
       <w:r>
         <w:rPr>
           <w:color w:val="000000"/>
+          <w:sz w:val="24"/>
+          <w:szCs w:val="24"/>
         </w:rPr>
         <w:t xml:space="preserve"> unless the class negotiates an alternative at the beginning of the semester (and/or before Exam I). The class may negotiate permission to bring </w:t>
       </w:r>
@@ -3328,6 +3522,8 @@
           <w:b/>
           <w:bCs/>
           <w:color w:val="000000"/>
+          <w:sz w:val="24"/>
+          <w:szCs w:val="24"/>
         </w:rPr>
         <w:t>one 8.5 × 11-inch handwritten reference sheet (double sided, OK). In exchange, the class agrees to replace the multiple-choice questions with additional fill in the blank questions (</w:t>
       </w:r>
@@ -3335,6 +3531,8 @@
         <w:rPr>
           <w:b/>
           <w:bCs/>
+          <w:sz w:val="24"/>
+          <w:szCs w:val="24"/>
         </w:rPr>
         <w:t>any change needs to be negotiated with the class as a whole</w:t>
       </w:r>
@@ -3343,12 +3541,16 @@
           <w:b/>
           <w:bCs/>
           <w:color w:val="000000"/>
+          <w:sz w:val="24"/>
+          <w:szCs w:val="24"/>
         </w:rPr>
         <w:t>)</w:t>
       </w:r>
       <w:r>
         <w:rPr>
           <w:color w:val="000000"/>
+          <w:sz w:val="24"/>
+          <w:szCs w:val="24"/>
         </w:rPr>
         <w:t xml:space="preserve">. Reference sheets must be handwritten; typed or printed material is not permitted. </w:t>
       </w:r>
@@ -3380,10 +3582,16 @@
         <w:rPr>
           <w:b/>
           <w:bCs/>
+          <w:sz w:val="24"/>
+          <w:szCs w:val="24"/>
         </w:rPr>
         <w:t xml:space="preserve">New lecture content is introduced on exam days. </w:t>
       </w:r>
       <w:r>
+        <w:rPr>
+          <w:sz w:val="24"/>
+          <w:szCs w:val="24"/>
+        </w:rPr>
         <w:t>Exams occur in the separate exam session, so the regular 1:00–2:50 PM lecture meets normally. Material introduced after an exam’s coverage block is assessed on the next relevant exam.</w:t>
       </w:r>
     </w:p>
@@ -3398,8 +3606,8 @@
           <w:b/>
           <w:bCs/>
           <w:color w:val="1A1A1A"/>
-          <w:sz w:val="25"/>
-          <w:szCs w:val="25"/>
+          <w:sz w:val="24"/>
+          <w:szCs w:val="24"/>
         </w:rPr>
         <w:t>Lecture Project (20% of Lecture Grade)</w:t>
       </w:r>
@@ -3409,6 +3617,10 @@
         <w:spacing w:after="120" w:line="276" w:lineRule="auto"/>
       </w:pPr>
       <w:r>
+        <w:rPr>
+          <w:sz w:val="24"/>
+          <w:szCs w:val="24"/>
+        </w:rPr>
         <w:t>Each student completes one Psychological Evidence Project based on a focused question covered in class. Choose ONE option. Your choice is due with your proposal. Both routes are individual work and are worth 120 points.</w:t>
       </w:r>
     </w:p>
@@ -3423,8 +3635,8 @@
           <w:b/>
           <w:bCs/>
           <w:color w:val="1A1A1A"/>
-          <w:sz w:val="21"/>
-          <w:szCs w:val="21"/>
+          <w:sz w:val="24"/>
+          <w:szCs w:val="24"/>
         </w:rPr>
         <w:t>Option A: Data Analysis Project</w:t>
       </w:r>
@@ -3434,14 +3646,26 @@
         <w:spacing w:after="120" w:line="276" w:lineRule="auto"/>
       </w:pPr>
       <w:r>
+        <w:rPr>
+          <w:sz w:val="24"/>
+          <w:szCs w:val="24"/>
+        </w:rPr>
         <w:t xml:space="preserve">Use an instructor-approved, deidentified public or provided dataset to examine a psychological question. State a prediction, reproduce a meaningful comparison, create an accurately labeled figure from the actual data, and interpret the finding. Submit the editable analysis file, a 4–6-page APA-style report, and a 5-minute recorded explanation. Include at least 4 primary studies, at least 2 published from 2000 onward and at least 1 from 2020 onward. Use a spreadsheet, </w:t>
       </w:r>
       <w:proofErr w:type="spellStart"/>
       <w:r>
+        <w:rPr>
+          <w:sz w:val="24"/>
+          <w:szCs w:val="24"/>
+        </w:rPr>
         <w:t>jamovi</w:t>
       </w:r>
       <w:proofErr w:type="spellEnd"/>
       <w:r>
+        <w:rPr>
+          <w:sz w:val="24"/>
+          <w:szCs w:val="24"/>
+        </w:rPr>
         <w:t>, or an equivalent tool; advanced coding is not required. Do not collect new participant data for this project.</w:t>
       </w:r>
     </w:p>
@@ -3456,8 +3680,8 @@
           <w:b/>
           <w:bCs/>
           <w:color w:val="1A1A1A"/>
-          <w:sz w:val="21"/>
-          <w:szCs w:val="21"/>
+          <w:sz w:val="24"/>
+          <w:szCs w:val="24"/>
         </w:rPr>
         <w:t>Option B: Psychological Evidence Paper</w:t>
       </w:r>
@@ -3467,6 +3691,10 @@
         <w:spacing w:after="120" w:line="276" w:lineRule="auto"/>
       </w:pPr>
       <w:r>
+        <w:rPr>
+          <w:sz w:val="24"/>
+          <w:szCs w:val="24"/>
+        </w:rPr>
         <w:t>Write a 4–6-page paper in APA 7th edition format, excluding title page, figures, and references, on a focused psychological claim. Compare at least 5 primary research articles, at least 3 published from 2000 onward and at least 1 from 2020 onward. Explain what researchers did and found, assess agreements and disagreements, and propose a feasible follow-up experiment. Submit a 5-minute recorded explanation. Unrelated summaries of individual papers are insufficient. Both options use the same 120-point rubric: concepts/question 20, primary evidence 35, analysis/synthesis 30, source verification and methods 20, and communication 15.</w:t>
       </w:r>
     </w:p>
@@ -3481,8 +3709,8 @@
           <w:b/>
           <w:bCs/>
           <w:color w:val="1A1A1A"/>
-          <w:sz w:val="21"/>
-          <w:szCs w:val="21"/>
+          <w:sz w:val="24"/>
+          <w:szCs w:val="24"/>
         </w:rPr>
         <w:t>Project Milestones</w:t>
       </w:r>
@@ -3530,8 +3758,8 @@
               <w:rPr>
                 <w:b/>
                 <w:bCs/>
-                <w:sz w:val="17"/>
-                <w:szCs w:val="17"/>
+                <w:sz w:val="22"/>
+                <w:szCs w:val="22"/>
               </w:rPr>
               <w:t>Milestone</w:t>
             </w:r>
@@ -3556,8 +3784,8 @@
               <w:rPr>
                 <w:b/>
                 <w:bCs/>
-                <w:sz w:val="17"/>
-                <w:szCs w:val="17"/>
+                <w:sz w:val="22"/>
+                <w:szCs w:val="22"/>
               </w:rPr>
               <w:t>Due</w:t>
             </w:r>
@@ -3584,8 +3812,8 @@
             </w:pPr>
             <w:r>
               <w:rPr>
-                <w:sz w:val="17"/>
-                <w:szCs w:val="17"/>
+                <w:sz w:val="22"/>
+                <w:szCs w:val="22"/>
               </w:rPr>
               <w:t>Proposal: chosen option, focused question, initial references, and dataset if applicable (1 page)</w:t>
             </w:r>
@@ -3607,8 +3835,8 @@
             </w:pPr>
             <w:r>
               <w:rPr>
-                <w:sz w:val="17"/>
-                <w:szCs w:val="17"/>
+                <w:sz w:val="22"/>
+                <w:szCs w:val="22"/>
               </w:rPr>
               <w:t>Fri Sep 24, 11:59 PM</w:t>
             </w:r>
@@ -3635,8 +3863,8 @@
             </w:pPr>
             <w:r>
               <w:rPr>
-                <w:sz w:val="17"/>
-                <w:szCs w:val="17"/>
+                <w:sz w:val="22"/>
+                <w:szCs w:val="22"/>
               </w:rPr>
               <w:t>Progress check: argument outline or preliminary analysis, figure, and source list</w:t>
             </w:r>
@@ -3658,8 +3886,8 @@
             </w:pPr>
             <w:r>
               <w:rPr>
-                <w:sz w:val="17"/>
-                <w:szCs w:val="17"/>
+                <w:sz w:val="22"/>
+                <w:szCs w:val="22"/>
               </w:rPr>
               <w:t>Fri Oct 22, 11:59 PM</w:t>
             </w:r>
@@ -3683,8 +3911,8 @@
           <w:p>
             <w:r>
               <w:rPr>
-                <w:sz w:val="17"/>
-                <w:szCs w:val="17"/>
+                <w:sz w:val="22"/>
+                <w:szCs w:val="22"/>
               </w:rPr>
               <w:t>Final report, editable analysis if applicable, and recorded explanation</w:t>
             </w:r>
@@ -3703,8 +3931,8 @@
           <w:p>
             <w:r>
               <w:rPr>
-                <w:sz w:val="17"/>
-                <w:szCs w:val="17"/>
+                <w:sz w:val="22"/>
+                <w:szCs w:val="22"/>
               </w:rPr>
               <w:t>Fri Nov 19, 11:59 PM</w:t>
             </w:r>
@@ -3723,8 +3951,8 @@
           <w:b/>
           <w:bCs/>
           <w:color w:val="1A1A1A"/>
-          <w:sz w:val="25"/>
-          <w:szCs w:val="25"/>
+          <w:sz w:val="24"/>
+          <w:szCs w:val="24"/>
         </w:rPr>
         <w:t>Laboratory Component</w:t>
       </w:r>
@@ -3734,9 +3962,17 @@
         <w:spacing w:after="120" w:line="276" w:lineRule="auto"/>
       </w:pPr>
       <w:r>
+        <w:rPr>
+          <w:sz w:val="24"/>
+          <w:szCs w:val="24"/>
+        </w:rPr>
         <w:t xml:space="preserve">The lab is a required, graded component and begins in Week 1, August 23–27. The first session includes a reaction-time experiment, with brief instruction in ethical participation and data handling. Labs use low-risk </w:t>
       </w:r>
       <w:r>
+        <w:rPr>
+          <w:sz w:val="24"/>
+          <w:szCs w:val="24"/>
+        </w:rPr>
         <w:lastRenderedPageBreak/>
         <w:t>behavioral tasks and approved deidentified data. Personal participation as a research subject is voluntary; an equivalent analysis route is available without penalty. No task requires personal clinical disclosure, diagnostic testing of classmates, sleep deprivation, aversive stimulation, or outside recruitment. Use coded data on the approved course system. Classroom activities are not automatically approved for external human-subjects research.</w:t>
       </w:r>
@@ -3761,12 +3997,16 @@
           <w:b/>
           <w:bCs/>
           <w:color w:val="000000"/>
+          <w:sz w:val="24"/>
+          <w:szCs w:val="24"/>
         </w:rPr>
         <w:t>Lab Reports (10 labs, lowest 2 dropped, 7.5% each for the 8 counted).</w:t>
       </w:r>
       <w:r>
         <w:rPr>
           <w:color w:val="000000"/>
+          <w:sz w:val="24"/>
+          <w:szCs w:val="24"/>
         </w:rPr>
         <w:t xml:space="preserve"> Lab 1 uses a guided 2–3-page report; later reports are normally 3–4 pages, excluding figures and references. Use Question and Prediction, Methods, Results, Discussion, and References. Submit a labeled authentic-data figure and an editable analysis file. Apply the comparison taught for the task rather than adding an unjustified significance test to every claim. Each report is scored out of 100: question 15, methods 20, analysis/figure 30, interpretation 25, clarity/references 10.</w:t>
       </w:r>
@@ -3791,6 +4031,8 @@
           <w:b/>
           <w:bCs/>
           <w:color w:val="000000"/>
+          <w:sz w:val="24"/>
+          <w:szCs w:val="24"/>
         </w:rPr>
         <w:t>Individual Experimental Practical (10%).</w:t>
       </w:r>
@@ -3799,8 +4041,195 @@
           <w:b w:val="0"/>
           <w:bCs w:val="0"/>
           <w:color w:val="000000"/>
+          <w:sz w:val="24"/>
+          <w:szCs w:val="24"/>
         </w:rPr>
         <w:t xml:space="preserve"> During your Week 11 lab section (November 2–4), you will complete an individual practical on one of five experiments introduced earlier in the course. Select your topic by Friday, October 22, at 11:59 PM. For your chosen experiment, explain the hypothesis and design, demonstrate the procedure, analyze a provided dataset, create a labeled figure, and interpret the findings. Preparation guides containing the protocols, assessment prompts, rubric, and practice datasets for all five options will be available by October 19, at least two weeks before the first practical. Assessment datasets contain different observations but use the same structure and analysis methods practiced beforehand. All options assess comparable skills using the same rubric: experimental design 20%, procedure 20%, analysis and figure 35%, and interpretation 25%. Your grade reflects your experimental skills and reasoning, not your personal psychological performance or whether results support the hypothesis.</w:t>
+      </w:r>
+    </w:p>
+    <w:p>
+      <w:pPr>
+        <w:numPr>
+          <w:ilvl w:val="1"/>
+          <w:numId w:val="2"/>
+        </w:numPr>
+        <w:pBdr>
+          <w:top w:val="nil"/>
+          <w:left w:val="nil"/>
+          <w:bottom w:val="nil"/>
+          <w:right w:val="nil"/>
+          <w:between w:val="nil"/>
+        </w:pBdr>
+        <w:spacing w:after="60" w:line="276" w:lineRule="auto"/>
+        <w:ind w:left="1080" w:hanging="360"/>
+      </w:pPr>
+      <w:r>
+        <w:rPr>
+          <w:b/>
+          <w:bCs/>
+          <w:color w:val="000000"/>
+          <w:sz w:val="24"/>
+          <w:szCs w:val="24"/>
+        </w:rPr>
+        <w:t>Reaction time and the speed–accuracy trade-off:</w:t>
+      </w:r>
+      <w:r>
+        <w:rPr>
+          <w:b w:val="0"/>
+          <w:bCs w:val="0"/>
+          <w:color w:val="000000"/>
+          <w:sz w:val="24"/>
+          <w:szCs w:val="24"/>
+        </w:rPr>
+        <w:t xml:space="preserve"> Compare speed-focused and accuracy-focused instructions; summarize reaction times and errors and interpret the trade-off.</w:t>
+      </w:r>
+    </w:p>
+    <w:p>
+      <w:pPr>
+        <w:numPr>
+          <w:ilvl w:val="1"/>
+          <w:numId w:val="2"/>
+        </w:numPr>
+        <w:pBdr>
+          <w:top w:val="nil"/>
+          <w:left w:val="nil"/>
+          <w:bottom w:val="nil"/>
+          <w:right w:val="nil"/>
+          <w:between w:val="nil"/>
+        </w:pBdr>
+        <w:spacing w:after="60" w:line="276" w:lineRule="auto"/>
+        <w:ind w:left="1080" w:hanging="360"/>
+      </w:pPr>
+      <w:r>
+        <w:rPr>
+          <w:b/>
+          <w:bCs/>
+          <w:color w:val="000000"/>
+          <w:sz w:val="24"/>
+          <w:szCs w:val="24"/>
+        </w:rPr>
+        <w:t>Psychophysics and signal detection:</w:t>
+      </w:r>
+      <w:r>
+        <w:rPr>
+          <w:b w:val="0"/>
+          <w:bCs w:val="0"/>
+          <w:color w:val="000000"/>
+          <w:sz w:val="24"/>
+          <w:szCs w:val="24"/>
+        </w:rPr>
+        <w:t xml:space="preserve"> Distinguish signal and noise trials, classify hits and false alarms, and interpret sensitivity and response criterion using the methods taught in Lab 2.</w:t>
+      </w:r>
+    </w:p>
+    <w:p>
+      <w:pPr>
+        <w:numPr>
+          <w:ilvl w:val="1"/>
+          <w:numId w:val="2"/>
+        </w:numPr>
+        <w:pBdr>
+          <w:top w:val="nil"/>
+          <w:left w:val="nil"/>
+          <w:bottom w:val="nil"/>
+          <w:right w:val="nil"/>
+          <w:between w:val="nil"/>
+        </w:pBdr>
+        <w:spacing w:after="60" w:line="276" w:lineRule="auto"/>
+        <w:ind w:left="1080" w:hanging="360"/>
+      </w:pPr>
+      <w:r>
+        <w:rPr>
+          <w:b/>
+          <w:bCs/>
+          <w:color w:val="000000"/>
+          <w:sz w:val="24"/>
+          <w:szCs w:val="24"/>
+        </w:rPr>
+        <w:t>Selective attention and Stroop interference:</w:t>
+      </w:r>
+      <w:r>
+        <w:rPr>
+          <w:b w:val="0"/>
+          <w:bCs w:val="0"/>
+          <w:color w:val="000000"/>
+          <w:sz w:val="24"/>
+          <w:szCs w:val="24"/>
+        </w:rPr>
+        <w:t xml:space="preserve"> Compare congruent and incongruent trials; calculate interference and interpret reaction time alongside accuracy.</w:t>
+      </w:r>
+    </w:p>
+    <w:p>
+      <w:pPr>
+        <w:numPr>
+          <w:ilvl w:val="1"/>
+          <w:numId w:val="2"/>
+        </w:numPr>
+        <w:pBdr>
+          <w:top w:val="nil"/>
+          <w:left w:val="nil"/>
+          <w:bottom w:val="nil"/>
+          <w:right w:val="nil"/>
+          <w:between w:val="nil"/>
+        </w:pBdr>
+        <w:spacing w:after="60" w:line="276" w:lineRule="auto"/>
+        <w:ind w:left="1080" w:hanging="360"/>
+      </w:pPr>
+      <w:r>
+        <w:rPr>
+          <w:b/>
+          <w:bCs/>
+          <w:color w:val="000000"/>
+          <w:sz w:val="24"/>
+          <w:szCs w:val="24"/>
+        </w:rPr>
+        <w:t>Working memory and distraction:</w:t>
+      </w:r>
+      <w:r>
+        <w:rPr>
+          <w:b w:val="0"/>
+          <w:bCs w:val="0"/>
+          <w:color w:val="000000"/>
+          <w:sz w:val="24"/>
+          <w:szCs w:val="24"/>
+        </w:rPr>
+        <w:t xml:space="preserve"> Compare memory-load and distraction conditions; calculate accuracy and interpret the effects and limitations of the design.</w:t>
+      </w:r>
+    </w:p>
+    <w:p>
+      <w:pPr>
+        <w:numPr>
+          <w:ilvl w:val="1"/>
+          <w:numId w:val="2"/>
+        </w:numPr>
+        <w:pBdr>
+          <w:top w:val="nil"/>
+          <w:left w:val="nil"/>
+          <w:bottom w:val="nil"/>
+          <w:right w:val="nil"/>
+          <w:between w:val="nil"/>
+        </w:pBdr>
+        <w:spacing w:after="60" w:line="276" w:lineRule="auto"/>
+        <w:ind w:left="1080" w:hanging="360"/>
+      </w:pPr>
+      <w:r>
+        <w:rPr>
+          <w:b/>
+          <w:bCs/>
+          <w:color w:val="000000"/>
+          <w:sz w:val="24"/>
+          <w:szCs w:val="24"/>
+        </w:rPr>
+        <w:t>Memory reconstruction and source monitoring:</w:t>
+      </w:r>
+      <w:r>
+        <w:rPr>
+          <w:b w:val="0"/>
+          <w:bCs w:val="0"/>
+          <w:color w:val="000000"/>
+          <w:sz w:val="24"/>
+          <w:szCs w:val="24"/>
+        </w:rPr>
+        <w:t xml:space="preserve"> Follow the standardized memory procedure; distinguish recognition from source errors and interpret the findings.</w:t>
       </w:r>
     </w:p>
     <w:p>
@@ -3823,16 +4252,18 @@
           <w:b/>
           <w:bCs/>
           <w:color w:val="000000"/>
-        </w:rPr>
-        <w:t>Reaction time and the speed–accuracy trade-off:</w:t>
-      </w:r>
-      <w:r>
-        <w:rPr>
-          <w:b w:val="0"/>
-          <w:bCs w:val="0"/>
+          <w:sz w:val="24"/>
+          <w:szCs w:val="24"/>
+        </w:rPr>
+        <w:t>Methods Assignments (3 assignments, 5% each, 15% total).</w:t>
+      </w:r>
+      <w:r>
+        <w:rPr>
           <w:color w:val="000000"/>
-        </w:rPr>
-        <w:t xml:space="preserve"> Compare speed-focused and accuracy-focused instructions; summarize reaction times and errors and interpret the trade-off.</w:t>
+          <w:sz w:val="24"/>
+          <w:szCs w:val="24"/>
+        </w:rPr>
+        <w:t xml:space="preserve"> Assignment 1, due September 10, teaches cleaning a reaction-time file, condition summaries, and an accurate figure. Assignment 2, due October 1, asks you to design an ethical, controlled experiment and identify a confound. Assignment 3, due October 29, compares study results, uncertainty, and generalization. Submit the editable analysis and a 1–2-page interpretation or design, as specified in the prompt. Use free graphical tools or a spreadsheet; coding is optional.</w:t>
       </w:r>
     </w:p>
     <w:p>
@@ -3855,16 +4286,18 @@
           <w:b/>
           <w:bCs/>
           <w:color w:val="000000"/>
-        </w:rPr>
-        <w:t>Psychophysics and signal detection:</w:t>
-      </w:r>
-      <w:r>
-        <w:rPr>
-          <w:b w:val="0"/>
-          <w:bCs w:val="0"/>
+          <w:sz w:val="24"/>
+          <w:szCs w:val="24"/>
+        </w:rPr>
+        <w:t>Mini-Replication Project (15%).</w:t>
+      </w:r>
+      <w:r>
+        <w:rPr>
           <w:color w:val="000000"/>
-        </w:rPr>
-        <w:t xml:space="preserve"> Distinguish signal and noise trials, classify hits and false alarms, and interpret sensitivity and response criterion using the methods taught in Lab 2.</w:t>
+          <w:sz w:val="24"/>
+          <w:szCs w:val="24"/>
+        </w:rPr>
+        <w:t xml:space="preserve"> Teams of 3–4 select an approved neutral task already introduced in lab. Before collecting data or inspecting the outcome, submit a one-page prediction, design, exclusion rule, and analysis plan by November 5. A data checkpoint is due November 19. Submit a shared poster and editable analysis plus an individual 2–3-page interpretation by December 3. Present for 5 minutes in your assigned Week 15 lab section. Do not submit the lecture project again as the lab project. Team design, analysis, and poster account for 60 points; individual interpretation and contribution account for 40.</w:t>
       </w:r>
     </w:p>
     <w:p>
@@ -3881,177 +4314,25 @@
           <w:between w:val="nil"/>
         </w:pBdr>
         <w:spacing w:after="60" w:line="276" w:lineRule="auto"/>
+        <w:rPr>
+          <w:color w:val="000000"/>
+        </w:rPr>
       </w:pPr>
       <w:r>
         <w:rPr>
           <w:b/>
           <w:bCs/>
           <w:color w:val="000000"/>
-        </w:rPr>
-        <w:t>Selective attention and Stroop interference:</w:t>
-      </w:r>
-      <w:r>
-        <w:rPr>
-          <w:b w:val="0"/>
-          <w:bCs w:val="0"/>
+          <w:sz w:val="24"/>
+          <w:szCs w:val="24"/>
+        </w:rPr>
+        <w:t xml:space="preserve">Participation and access: </w:t>
+      </w:r>
+      <w:r>
+        <w:rPr>
           <w:color w:val="000000"/>
-        </w:rPr>
-        <w:t xml:space="preserve"> Compare congruent and incongruent trials; calculate interference and interpret reaction time alongside accuracy.</w:t>
-      </w:r>
-    </w:p>
-    <w:p>
-      <w:pPr>
-        <w:numPr>
-          <w:ilvl w:val="0"/>
-          <w:numId w:val="1"/>
-        </w:numPr>
-        <w:pBdr>
-          <w:top w:val="nil"/>
-          <w:left w:val="nil"/>
-          <w:bottom w:val="nil"/>
-          <w:right w:val="nil"/>
-          <w:between w:val="nil"/>
-        </w:pBdr>
-        <w:spacing w:after="60" w:line="276" w:lineRule="auto"/>
-      </w:pPr>
-      <w:r>
-        <w:rPr>
-          <w:b/>
-          <w:bCs/>
-          <w:color w:val="000000"/>
-        </w:rPr>
-        <w:t>Working memory and distraction:</w:t>
-      </w:r>
-      <w:r>
-        <w:rPr>
-          <w:b w:val="0"/>
-          <w:bCs w:val="0"/>
-          <w:color w:val="000000"/>
-        </w:rPr>
-        <w:t xml:space="preserve"> Compare memory-load and distraction conditions; calculate accuracy and interpret the effects and limitations of the design.</w:t>
-      </w:r>
-    </w:p>
-    <w:p>
-      <w:pPr>
-        <w:numPr>
-          <w:ilvl w:val="0"/>
-          <w:numId w:val="1"/>
-        </w:numPr>
-        <w:pBdr>
-          <w:top w:val="nil"/>
-          <w:left w:val="nil"/>
-          <w:bottom w:val="nil"/>
-          <w:right w:val="nil"/>
-          <w:between w:val="nil"/>
-        </w:pBdr>
-        <w:spacing w:after="60" w:line="276" w:lineRule="auto"/>
-      </w:pPr>
-      <w:r>
-        <w:rPr>
-          <w:b/>
-          <w:bCs/>
-          <w:color w:val="000000"/>
-        </w:rPr>
-        <w:t>Memory reconstruction and source monitoring:</w:t>
-      </w:r>
-      <w:r>
-        <w:rPr>
-          <w:b w:val="0"/>
-          <w:bCs w:val="0"/>
-          <w:color w:val="000000"/>
-        </w:rPr>
-        <w:t xml:space="preserve"> Follow the standardized memory procedure; distinguish recognition from source errors and interpret the findings.</w:t>
-      </w:r>
-    </w:p>
-    <w:p>
-      <w:pPr>
-        <w:numPr>
-          <w:ilvl w:val="0"/>
-          <w:numId w:val="1"/>
-        </w:numPr>
-        <w:pBdr>
-          <w:top w:val="nil"/>
-          <w:left w:val="nil"/>
-          <w:bottom w:val="nil"/>
-          <w:right w:val="nil"/>
-          <w:between w:val="nil"/>
-        </w:pBdr>
-        <w:spacing w:after="60" w:line="276" w:lineRule="auto"/>
-      </w:pPr>
-      <w:r>
-        <w:rPr>
-          <w:b/>
-          <w:bCs/>
-          <w:color w:val="000000"/>
-        </w:rPr>
-        <w:t>Methods Assignments (3 assignments, 5% each, 15% total).</w:t>
-      </w:r>
-      <w:r>
-        <w:rPr>
-          <w:color w:val="000000"/>
-        </w:rPr>
-        <w:t xml:space="preserve"> Assignment 1, due September 10, teaches cleaning a reaction-time file, condition summaries, and an accurate figure. Assignment 2, due October 1, asks you to design an ethical, controlled experiment and identify a confound. Assignment 3, due October 29, compares study results, uncertainty, and generalization. Submit the editable analysis and a 1–2-page interpretation or design, as specified in the prompt. Use free graphical tools or a spreadsheet; coding is optional.</w:t>
-      </w:r>
-    </w:p>
-    <w:p>
-      <w:pPr>
-        <w:numPr>
-          <w:ilvl w:val="0"/>
-          <w:numId w:val="1"/>
-        </w:numPr>
-        <w:pBdr>
-          <w:top w:val="nil"/>
-          <w:left w:val="nil"/>
-          <w:bottom w:val="nil"/>
-          <w:right w:val="nil"/>
-          <w:between w:val="nil"/>
-        </w:pBdr>
-        <w:spacing w:after="60" w:line="276" w:lineRule="auto"/>
-      </w:pPr>
-      <w:r>
-        <w:rPr>
-          <w:b/>
-          <w:bCs/>
-          <w:color w:val="000000"/>
-        </w:rPr>
-        <w:t>Mini-Replication Project (15%).</w:t>
-      </w:r>
-      <w:r>
-        <w:rPr>
-          <w:color w:val="000000"/>
-        </w:rPr>
-        <w:t xml:space="preserve"> Teams of 3–4 select an approved neutral task already introduced in lab. Before collecting data or inspecting the outcome, submit a one-page prediction, design, exclusion rule, and analysis plan by November 5. A data checkpoint is due November 19. Submit a shared poster and editable analysis plus an individual 2–3-page interpretation by December 3. Present for 5 minutes in your assigned Week 15 lab section. Do not submit the lecture project again as the lab project. Team design, analysis, and poster account for 60 points; individual interpretation and contribution account for 40.</w:t>
-      </w:r>
-    </w:p>
-    <w:p>
-      <w:pPr>
-        <w:numPr>
-          <w:ilvl w:val="0"/>
-          <w:numId w:val="1"/>
-        </w:numPr>
-        <w:pBdr>
-          <w:top w:val="nil"/>
-          <w:left w:val="nil"/>
-          <w:bottom w:val="nil"/>
-          <w:right w:val="nil"/>
-          <w:between w:val="nil"/>
-        </w:pBdr>
-        <w:spacing w:after="60" w:line="276" w:lineRule="auto"/>
-        <w:rPr>
-          <w:color w:val="000000"/>
-        </w:rPr>
-      </w:pPr>
-      <w:r>
-        <w:rPr>
-          <w:b/>
-          <w:bCs/>
-          <w:color w:val="000000"/>
-        </w:rPr>
-        <w:t xml:space="preserve">Participation and access: </w:t>
-      </w:r>
-      <w:r>
-        <w:rPr>
-          <w:color w:val="000000"/>
+          <w:sz w:val="24"/>
+          <w:szCs w:val="24"/>
         </w:rPr>
         <w:t>The project may use an approved classroom task or an approved public-data reanalysis. No outside recruitment is authorized. A student’s grade depends on reasoning and analysis, not a particular psychological score or agreement to supply personal data. Report authentic results even when they are inconclusive; do not fabricate findings or citations.</w:t>
       </w:r>
@@ -4067,8 +4348,8 @@
           <w:b/>
           <w:bCs/>
           <w:color w:val="1A1A1A"/>
-          <w:sz w:val="21"/>
-          <w:szCs w:val="21"/>
+          <w:sz w:val="24"/>
+          <w:szCs w:val="24"/>
         </w:rPr>
         <w:t>Lab Schedule and Due Dates</w:t>
       </w:r>
@@ -5749,8 +6030,8 @@
       </w:pPr>
       <w:r>
         <w:rPr>
-          <w:sz w:val="18"/>
-          <w:szCs w:val="18"/>
+          <w:sz w:val="24"/>
+          <w:szCs w:val="24"/>
         </w:rPr>
         <w:t>Lab sections meet at the times listed under Course Times &amp; Locations; all sections meet in NEU LAB1A. All report and assignment deadlines are 11:59 PM Pacific time. No required regular lab meets in Week 7 or Week 14. Fall Recess is October 7–8, Veterans Day is November 11, and Thanksgiving is November 24–28. Holiday-affected sections receive an equivalent task without required participation on a closure day. The late work policy applies (see Late Work below).</w:t>
       </w:r>
@@ -5773,8 +6054,8 @@
           <w:b/>
           <w:bCs/>
           <w:color w:val="1A1A1A"/>
-          <w:sz w:val="25"/>
-          <w:szCs w:val="25"/>
+          <w:sz w:val="24"/>
+          <w:szCs w:val="24"/>
         </w:rPr>
         <w:t>Lecture Recordings and Study Materials</w:t>
       </w:r>
@@ -5791,6 +6072,8 @@
       <w:r>
         <w:rPr>
           <w:color w:val="000000"/>
+          <w:sz w:val="24"/>
+          <w:szCs w:val="24"/>
         </w:rPr>
         <w:t xml:space="preserve">Lectures are recorded. Recordings are released </w:t>
       </w:r>
@@ -5799,12 +6082,16 @@
           <w:b/>
           <w:bCs/>
           <w:color w:val="000000"/>
+          <w:sz w:val="24"/>
+          <w:szCs w:val="24"/>
         </w:rPr>
         <w:t>one week before the exam that covers them</w:t>
       </w:r>
       <w:r>
         <w:rPr>
           <w:color w:val="000000"/>
+          <w:sz w:val="24"/>
+          <w:szCs w:val="24"/>
         </w:rPr>
         <w:t xml:space="preserve">. I may release them two weeks before an exam at my discretion, but early release is not guaranteed and should not be expected. You are responsible for attending lecture, taking thorough notes, and studying throughout the semester. </w:t>
       </w:r>
@@ -5813,6 +6100,8 @@
           <w:b/>
           <w:bCs/>
           <w:color w:val="000000"/>
+          <w:sz w:val="24"/>
+          <w:szCs w:val="24"/>
         </w:rPr>
         <w:t>Do not wait for recordings to begin preparing for an exam.</w:t>
       </w:r>
@@ -5827,6 +6116,8 @@
       <w:r>
         <w:rPr>
           <w:color w:val="000000"/>
+          <w:sz w:val="24"/>
+          <w:szCs w:val="24"/>
         </w:rPr>
         <w:t xml:space="preserve">Recordings from previous offerings may also be posted as supplemental study materials. This course changes between semesters, and older recordings may omit current topics or include material that is no longer covered. </w:t>
       </w:r>
@@ -5835,12 +6126,16 @@
           <w:b/>
           <w:bCs/>
           <w:color w:val="000000"/>
+          <w:sz w:val="24"/>
+          <w:szCs w:val="24"/>
         </w:rPr>
         <w:t>This semester’s lectures determine what is examinable.</w:t>
       </w:r>
       <w:r>
         <w:rPr>
           <w:color w:val="000000"/>
+          <w:sz w:val="24"/>
+          <w:szCs w:val="24"/>
         </w:rPr>
         <w:t xml:space="preserve"> You are responsible for identifying those differences using the current lectures and slides.</w:t>
       </w:r>
@@ -5855,6 +6150,8 @@
       <w:r>
         <w:rPr>
           <w:color w:val="000000"/>
+          <w:sz w:val="24"/>
+          <w:szCs w:val="24"/>
         </w:rPr>
         <w:t>Recordings do not replace attendance or excuse arriving unprepared. Lecture content is dense and requires consistent engagement. Choosing to rely on recordings does not reduce the material you are expected to know or change the standards by which your work will be graded.</w:t>
       </w:r>
@@ -5870,8 +6167,8 @@
           <w:b/>
           <w:bCs/>
           <w:color w:val="1A1A1A"/>
-          <w:sz w:val="25"/>
-          <w:szCs w:val="25"/>
+          <w:sz w:val="24"/>
+          <w:szCs w:val="24"/>
         </w:rPr>
         <w:t>Study Expectations</w:t>
       </w:r>
@@ -5881,6 +6178,10 @@
         <w:spacing w:after="120" w:line="276" w:lineRule="auto"/>
       </w:pPr>
       <w:r>
+        <w:rPr>
+          <w:sz w:val="24"/>
+          <w:szCs w:val="24"/>
+        </w:rPr>
         <w:t>This course covers substantial material on a fast schedule. Plan at least two hours of outside study for every hour of class. Review each lecture within 48 hours. Practice retrieving concepts, explaining experiments, and interpreting figures rather than only rereading. Form study groups but make sure each person can answer exam questions alone. Start reports while the procedure is fresh and begin the project well before its deadline.</w:t>
       </w:r>
     </w:p>
@@ -5895,8 +6196,8 @@
           <w:b/>
           <w:bCs/>
           <w:color w:val="1A1A1A"/>
-          <w:sz w:val="25"/>
-          <w:szCs w:val="25"/>
+          <w:sz w:val="24"/>
+          <w:szCs w:val="24"/>
         </w:rPr>
         <w:t>Lecture &amp; Lab Attendance</w:t>
       </w:r>
@@ -5906,6 +6207,10 @@
         <w:spacing w:after="120" w:line="276" w:lineRule="auto"/>
       </w:pPr>
       <w:r>
+        <w:rPr>
+          <w:sz w:val="24"/>
+          <w:szCs w:val="24"/>
+        </w:rPr>
         <w:t>Attendance at all lectures and labs is expected, but no separate attendance or participation grade is assigned. Lectures introduce explanations and examples that may appear on exams. Labs provide the instruction, experimental work, and data needed for graded assignments. If you miss a lab, contact your assigned TA promptly to arrange an approved way to complete the missed work. Contact me directly about extensions, exceptional circumstances, or grading concerns.</w:t>
       </w:r>
     </w:p>
@@ -5920,8 +6225,8 @@
           <w:b/>
           <w:bCs/>
           <w:color w:val="1A1A1A"/>
-          <w:sz w:val="25"/>
-          <w:szCs w:val="25"/>
+          <w:sz w:val="24"/>
+          <w:szCs w:val="24"/>
         </w:rPr>
         <w:t>Late Work</w:t>
       </w:r>
@@ -5944,6 +6249,8 @@
       <w:r>
         <w:rPr>
           <w:color w:val="000000"/>
+          <w:sz w:val="24"/>
+          <w:szCs w:val="24"/>
         </w:rPr>
         <w:t>Lab reports, methods assignments, and the Mini-Replication Project: 5% deduction from the available points per calendar day late for the first 7 days. Work more than 1 week late is not accepted without an approved extension.</w:t>
       </w:r>
@@ -5968,6 +6275,8 @@
           <w:b/>
           <w:bCs/>
           <w:color w:val="000000"/>
+          <w:sz w:val="24"/>
+          <w:szCs w:val="24"/>
         </w:rPr>
         <w:t>Experimental practical: This assessment takes place in person during your assigned Week 11 lab section and is not eligible for the ordinary late-submission penalty. If an emergency or approved accommodation affects your ability to attend, contact me as soon as possible to arrange an approved alternative assessment. Missing the practical without an approved arrangement results in a zero for the assessment.</w:t>
       </w:r>
@@ -5992,12 +6301,16 @@
           <w:b/>
           <w:bCs/>
           <w:color w:val="000000"/>
+          <w:sz w:val="24"/>
+          <w:szCs w:val="24"/>
         </w:rPr>
         <w:t>Lecture project:</w:t>
       </w:r>
       <w:r>
         <w:rPr>
           <w:color w:val="000000"/>
+          <w:sz w:val="24"/>
+          <w:szCs w:val="24"/>
         </w:rPr>
         <w:t xml:space="preserve"> 30% deduction for any submission after 11:59 PM on the due date. Projects submitted more than 48 hours late are not accepted.</w:t>
       </w:r>
@@ -6007,6 +6320,10 @@
         <w:spacing w:after="120" w:line="276" w:lineRule="auto"/>
       </w:pPr>
       <w:r>
+        <w:rPr>
+          <w:sz w:val="24"/>
+          <w:szCs w:val="24"/>
+        </w:rPr>
         <w:t>Extensions require instructor approval. Contact me before the deadline when possible, or as soon as reasonably possible in an emergency. Approved accommodations, religious observance, and university-required arrangements take precedence over ordinary late penalties.</w:t>
       </w:r>
     </w:p>
@@ -6021,8 +6338,8 @@
           <w:b/>
           <w:bCs/>
           <w:color w:val="1A1A1A"/>
-          <w:sz w:val="25"/>
-          <w:szCs w:val="25"/>
+          <w:sz w:val="24"/>
+          <w:szCs w:val="24"/>
         </w:rPr>
         <w:t>Academic Integrity and Use of AI Tools</w:t>
       </w:r>
@@ -6039,6 +6356,10 @@
         </w:rPr>
       </w:pPr>
       <w:r>
+        <w:rPr>
+          <w:sz w:val="24"/>
+          <w:szCs w:val="24"/>
+        </w:rPr>
         <w:t>Follow the university’s standards of academic integrity. Cheating, plagiarism, unauthorized collaboration, fabricated data or citations, and unauthorized exam materials are handled under university procedures. Generative AI may not write lab report prose, the lecture-project paper, individual mini-replication interpretations, or exam answers. Coding or software-troubleshooting assistance is permitted only when authorized and disclosed; verify all output and retain the original files. Team collection and analysis are allowed only for the specified team components. Do not upload classmates’ data to external AI services.</w:t>
       </w:r>
     </w:p>
@@ -6053,8 +6374,8 @@
           <w:b/>
           <w:bCs/>
           <w:color w:val="1A1A1A"/>
-          <w:sz w:val="25"/>
-          <w:szCs w:val="25"/>
+          <w:sz w:val="24"/>
+          <w:szCs w:val="24"/>
         </w:rPr>
         <w:t>Accommodations</w:t>
       </w:r>
@@ -6064,6 +6385,10 @@
         <w:spacing w:after="120" w:line="276" w:lineRule="auto"/>
       </w:pPr>
       <w:r>
+        <w:rPr>
+          <w:sz w:val="24"/>
+          <w:szCs w:val="24"/>
+        </w:rPr>
         <w:t>Students seeking accommodations should contact the Office of Student Accessibility Services as early as possible. Provide the approved notice through the university process and coordinate lecture, lab, software, deadline, and exam arrangements with the instructor. Early notice supports planning; a course deadline does not cancel an approved accommodation. OSAS: https://osas.usc.edu/.</w:t>
       </w:r>
     </w:p>
@@ -6085,8 +6410,8 @@
           <w:b/>
           <w:bCs/>
           <w:color w:val="1A1A1A"/>
-          <w:sz w:val="25"/>
-          <w:szCs w:val="25"/>
+          <w:sz w:val="24"/>
+          <w:szCs w:val="24"/>
         </w:rPr>
         <w:t>Communication</w:t>
       </w:r>
@@ -6101,6 +6426,8 @@
       <w:r>
         <w:rPr>
           <w:color w:val="000000"/>
+          <w:sz w:val="24"/>
+          <w:szCs w:val="24"/>
         </w:rPr>
         <w:t>Questions about psychological concepts, experiments, and data analysis are expected. Use Teaching Assistants as the first point of contact for homework, lab reports, analysis, and routine logistics. TAs hold lab sessions and office hours and can provide timely support. Contact the instructor at jlopez@usc.edu for unresolved questions, grading concerns, accommodations, or confidential issues. No student is required to disclose personal mental-health experiences during class or lab.</w:t>
       </w:r>
@@ -6115,6 +6442,8 @@
       <w:r>
         <w:rPr>
           <w:color w:val="000000"/>
+          <w:sz w:val="24"/>
+          <w:szCs w:val="24"/>
         </w:rPr>
         <w:t>I will make every effort to respond to emails and messages promptly; however, because I teach multiple courses and run an active research laboratory, response times may be delayed. Students should generally expect responses within one business day. Messages sent in the evening, overnight, or on weekends will typically be addressed the following business day. Use clear subject lines that include the course number and topic, such as “PSYC100 L: Lab 3 report question.” Keep questions concise and include relevant context, such as the assignment name or lab section. Reach out early rather than waiting until deadlines or exam days. Consult the syllabus and current lecture materials for exam coverage before emailing.</w:t>
       </w:r>
@@ -6135,8 +6464,8 @@
           <w:b/>
           <w:bCs/>
           <w:color w:val="1A1A1A"/>
-          <w:sz w:val="25"/>
-          <w:szCs w:val="25"/>
+          <w:sz w:val="24"/>
+          <w:szCs w:val="24"/>
         </w:rPr>
         <w:t>Absences and Communication</w:t>
       </w:r>
@@ -6153,6 +6482,8 @@
       <w:r>
         <w:rPr>
           <w:color w:val="000000"/>
+          <w:sz w:val="24"/>
+          <w:szCs w:val="24"/>
         </w:rPr>
         <w:t>I understand that many students balance academic responsibilities with work, family obligations, and other commitments. If you anticipate an absence or experience an emergency, contact me as soon as possible. For lab absences, notify your TA promptly and arrange the appropriate documentation, make-up, or equivalent task. Communicating early helps us find an appropriate arrangement.</w:t>
       </w:r>
@@ -6167,6 +6498,8 @@
       <w:r>
         <w:rPr>
           <w:color w:val="000000"/>
+          <w:sz w:val="24"/>
+          <w:szCs w:val="24"/>
         </w:rPr>
         <w:t>There is no separate lecture or laboratory attendance grade. You remain responsible for missed instruction and graded work, including the experimental practical. Recordings support review but do not replace the practical skills developed in lab. Missed assignments and assessments follow their applicable policies; communicate promptly if you need an approved arrangement.</w:t>
       </w:r>
@@ -6208,8 +6541,8 @@
           <w:b/>
           <w:bCs/>
           <w:color w:val="1A1A1A"/>
-          <w:sz w:val="25"/>
-          <w:szCs w:val="25"/>
+          <w:sz w:val="24"/>
+          <w:szCs w:val="24"/>
         </w:rPr>
         <w:t>Course Calendar</w:t>
       </w:r>
@@ -6221,8 +6554,8 @@
       </w:pPr>
       <w:r>
         <w:rPr>
-          <w:sz w:val="18"/>
-          <w:szCs w:val="18"/>
+          <w:sz w:val="24"/>
+          <w:szCs w:val="24"/>
         </w:rPr>
         <w:t>Lectures meet Monday, Wednesday, and Friday, 1:00–2:50 PM. Every instructional meeting introduces a new topic, beginning August 23 and ending December 3. Exams use the separate session; planned dates are September 20, October 18, and November 8, with Exam 4 in the assigned December 8–15 appointment. Exams 1–3 meet at 5:00 PM in NEU 100A or NEU 100B; Exam 4’s assigned date and time will be announced separately. Lab weeks and deadlines appear above and below. University holidays follow USC’s Fall 2027 academic calendar (https://academics.usc.edu/calendar/).</w:t>
       </w:r>
@@ -13077,8 +13410,8 @@
           <w:b/>
           <w:bCs/>
           <w:color w:val="1A1A1A"/>
-          <w:sz w:val="25"/>
-          <w:szCs w:val="25"/>
+          <w:sz w:val="24"/>
+          <w:szCs w:val="24"/>
         </w:rPr>
         <w:t>Readings Calendar</w:t>
       </w:r>
@@ -13089,8 +13422,8 @@
       </w:pPr>
       <w:r>
         <w:rPr>
-          <w:sz w:val="18"/>
-          <w:szCs w:val="18"/>
+          <w:sz w:val="24"/>
+          <w:szCs w:val="24"/>
         </w:rPr>
         <w:t>Assigned textbook readings and research articles are required course preparation. The dated reading schedule and article list will be posted on the course site. Complete each assigned reading before the corresponding lecture. Current lecture content defines exam coverage.</w:t>
       </w:r>
@@ -13106,8 +13439,8 @@
           <w:b/>
           <w:bCs/>
           <w:color w:val="1A1A1A"/>
-          <w:sz w:val="25"/>
-          <w:szCs w:val="25"/>
+          <w:sz w:val="24"/>
+          <w:szCs w:val="24"/>
         </w:rPr>
         <w:t>Final Word</w:t>
       </w:r>
@@ -13117,6 +13450,10 @@
         <w:spacing w:after="120" w:line="276" w:lineRule="auto"/>
       </w:pPr>
       <w:r>
+        <w:rPr>
+          <w:sz w:val="24"/>
+          <w:szCs w:val="24"/>
+        </w:rPr>
         <w:t>This course asks you to think like a psychological scientist: explain a behavior, examine the experiment, and decide what the evidence supports. If you show up to lecture and lab, review the material regularly, and start early, you will leave with a working understanding of how people perceive, learn, remember, develop, and interact. Be prepared to question an explanation, work carefully with data, and revise a conclusion when the evidence changes.</w:t>
       </w:r>
     </w:p>

</xml_diff>

<commit_message>
Emphasize written exam responses and align room assignments with Neuroethology
</commit_message>
<xml_diff>
--- a/syllabus/PSYC100_L_Introduction_to_Psychology_Fall_2027_Syllabus.docx
+++ b/syllabus/PSYC100_L_Introduction_to_Psychology_Fall_2027_Syllabus.docx
@@ -3232,10 +3232,12 @@
         </w:pBdr>
         <w:spacing w:after="60" w:line="276" w:lineRule="auto"/>
       </w:pPr>
+      <w:proofErr w:type="gramStart"/>
+      <w:proofErr w:type="gramEnd"/>
       <w:r>
         <w:rPr>
-          <w:b/>
-          <w:bCs/>
+          <w:b w:val="1"/>
+          <w:bCs w:val="1"/>
           <w:color w:val="000000"/>
           <w:sz w:val="24"/>
           <w:szCs w:val="24"/>
@@ -3244,29 +3246,13 @@
       </w:r>
       <w:r>
         <w:rPr>
+          <w:b w:val="0"/>
+          <w:bCs w:val="0"/>
           <w:color w:val="000000"/>
           <w:sz w:val="24"/>
           <w:szCs w:val="24"/>
         </w:rPr>
-        <w:t xml:space="preserve">Expect 65 questions totaling 120 points: 10 multiple-choice items at 1 point each, 40 fill-in or brief-answer items at 2 points each, and 15 short-response or data-interpretation items at 2 points each. Written responses account for 55 of the 65 questions and 110 of the 120 points. The final timing will be checked against the assigned exam-session length. Exams may use three versions (V1, V2, and V3), with </w:t>
-      </w:r>
-      <w:proofErr w:type="gramStart"/>
-      <w:r>
-        <w:rPr>
-          <w:color w:val="000000"/>
-          <w:sz w:val="24"/>
-          <w:szCs w:val="24"/>
-        </w:rPr>
-        <w:t>question and answer</w:t>
-      </w:r>
-      <w:proofErr w:type="gramEnd"/>
-      <w:r>
-        <w:rPr>
-          <w:color w:val="000000"/>
-          <w:sz w:val="24"/>
-          <w:szCs w:val="24"/>
-        </w:rPr>
-        <w:t xml:space="preserve"> order mixed within each lecture section.</w:t>
+        <w:t xml:space="preserve">Expect 65 questions totaling 120 points: 10 multiple-choice questions at 1 point each, 10 fill-in-the-blank questions at 1 point each, 35 short written-response questions at 2 points each, and 10 extended written-response or data-interpretation questions at 3 points each. Written-response questions account for 45 of the 65 questions and 100 of the 120 points. The final timing will be checked against the assigned exam-session length. Each exam comes in three versions (V1, V2, and V3). The three versions contain the same questions, with the order of questions and answer choices mixed within each lecture section.</w:t>
       </w:r>
     </w:p>
     <w:p>
@@ -3320,8 +3306,8 @@
       </w:pPr>
       <w:r>
         <w:rPr>
-          <w:b/>
-          <w:bCs/>
+          <w:b w:val="1"/>
+          <w:bCs w:val="1"/>
           <w:color w:val="000000"/>
           <w:sz w:val="24"/>
           <w:szCs w:val="24"/>
@@ -3330,11 +3316,13 @@
       </w:r>
       <w:r>
         <w:rPr>
+          <w:b w:val="0"/>
+          <w:bCs w:val="0"/>
           <w:color w:val="000000"/>
           <w:sz w:val="24"/>
           <w:szCs w:val="24"/>
         </w:rPr>
-        <w:t>Your assigned exam room and version will be posted on the course site before each exam. Attend the assigned room unless the instructor approves a change. Approved accommodations are implemented through the university process.</w:t>
+        <w:t xml:space="preserve">Before each exam, a randomized algorithm assigns every student to Room A (NEU 100A) or Room B (NEU 100B) and to one of three versions (V1, V2, or V3). Assignments are posted on the course site before the exam. Assignments are random, and requests to change them will not be accepted. Approved accommodations are implemented through the university process.</w:t>
       </w:r>
     </w:p>
     <w:p>

</xml_diff>

<commit_message>
Remove syllabus rubrics and set calendar section to 10 point
</commit_message>
<xml_diff>
--- a/syllabus/PSYC100_L_Introduction_to_Psychology_Fall_2027_Syllabus.docx
+++ b/syllabus/PSYC100_L_Introduction_to_Psychology_Fall_2027_Syllabus.docx
@@ -3683,7 +3683,7 @@
           <w:sz w:val="24"/>
           <w:szCs w:val="24"/>
         </w:rPr>
-        <w:t>Write a 4–6-page paper in APA 7th edition format, excluding title page, figures, and references, on a focused psychological claim. Compare at least 5 primary research articles, at least 3 published from 2000 onward and at least 1 from 2020 onward. Explain what researchers did and found, assess agreements and disagreements, and propose a feasible follow-up experiment. Submit a 5-minute recorded explanation. Unrelated summaries of individual papers are insufficient. Both options use the same 120-point rubric: concepts/question 20, primary evidence 35, analysis/synthesis 30, source verification and methods 20, and communication 15.</w:t>
+        <w:t>Write a 4–6-page paper in APA 7th edition format, excluding title page, figures, and references, on a focused psychological claim. Compare at least 5 primary research articles, at least 3 published from 2000 onward and at least 1 from 2020 onward. Explain what researchers did and found, assess agreements and disagreements, and propose a feasible follow-up experiment. Submit a 5-minute recorded explanation. Unrelated summaries of individual papers are insufficient.</w:t>
       </w:r>
     </w:p>
     <w:p>
@@ -3996,7 +3996,7 @@
           <w:sz w:val="24"/>
           <w:szCs w:val="24"/>
         </w:rPr>
-        <w:t xml:space="preserve"> Lab 1 uses a guided 2–3-page report; later reports are normally 3–4 pages, excluding figures and references. Use Question and Prediction, Methods, Results, Discussion, and References. Submit a labeled authentic-data figure and an editable analysis file. Apply the comparison taught for the task rather than adding an unjustified significance test to every claim. Each report is scored out of 100: question 15, methods 20, analysis/figure 30, interpretation 25, clarity/references 10.</w:t>
+        <w:t xml:space="preserve"> Lab 1 uses a guided 2–3-page report; later reports are normally 3–4 pages, excluding figures and references. Use Question and Prediction, Methods, Results, Discussion, and References. Submit a labeled authentic-data figure and an editable analysis file. Apply the comparison taught for the task rather than adding an unjustified significance test to every claim.</w:t>
       </w:r>
     </w:p>
     <w:p>
@@ -4032,7 +4032,7 @@
           <w:sz w:val="24"/>
           <w:szCs w:val="24"/>
         </w:rPr>
-        <w:t xml:space="preserve"> During your Week 11 lab section (November 2–4), you will complete an individual practical on one of five experiments introduced earlier in the course. Select your topic by Friday, October 22, at 11:59 PM. For your chosen experiment, explain the hypothesis and design, demonstrate the procedure, analyze a provided dataset, create a labeled figure, and interpret the findings. Preparation guides containing the protocols, assessment prompts, rubric, and practice datasets for all five options will be available by October 19, at least two weeks before the first practical. Assessment datasets contain different observations but use the same structure and analysis methods practiced beforehand. All options assess comparable skills using the same rubric: experimental design 20%, procedure 20%, analysis and figure 35%, and interpretation 25%. Your grade reflects your experimental skills and reasoning, not your personal psychological performance or whether results support the hypothesis.</w:t>
+        <w:t xml:space="preserve"> During your Week 11 lab section (November 2–4), you will complete an individual practical on one of five experiments introduced earlier in the course. Select your topic by Friday, October 22, at 11:59 PM. For your chosen experiment, explain the hypothesis and design, demonstrate the procedure, analyze a provided dataset, create a labeled figure, and interpret the findings. Preparation guides containing the protocols, assessment prompts, and practice datasets for all five options will be available by October 19, at least two weeks before the first practical. Assessment datasets contain different observations but use the same structure and analysis methods practiced beforehand. All options assess comparable experimental skills. Your grade reflects your experimental skills and reasoning, not your personal psychological performance or whether results support the hypothesis.</w:t>
       </w:r>
     </w:p>
     <w:p>
@@ -4285,7 +4285,7 @@
           <w:sz w:val="24"/>
           <w:szCs w:val="24"/>
         </w:rPr>
-        <w:t xml:space="preserve"> Teams of 3–4 select an approved neutral task already introduced in lab. Before collecting data or inspecting the outcome, submit a one-page prediction, design, exclusion rule, and analysis plan by November 5. A data checkpoint is due November 19. Submit a shared poster and editable analysis plus an individual 2–3-page interpretation by December 3. Present for 5 minutes in your assigned Week 15 lab section. Do not submit the lecture project again as the lab project. Team design, analysis, and poster account for 60 points; individual interpretation and contribution account for 40.</w:t>
+        <w:t xml:space="preserve"> Teams of 3–4 select an approved neutral task already introduced in lab. Before collecting data or inspecting the outcome, submit a one-page prediction, design, exclusion rule, and analysis plan by November 5. A data checkpoint is due November 19. Submit a shared poster and editable analysis plus an individual 2–3-page interpretation by December 3. Present for 5 minutes in your assigned Week 15 lab section. Do not submit the lecture project again as the lab project.</w:t>
       </w:r>
     </w:p>
     <w:p>
@@ -5900,7 +5900,7 @@
                 <w:sz w:val="17"/>
                 <w:szCs w:val="17"/>
               </w:rPr>
-              <w:t>All five preparation guides, rubrics, and practice datasets available</w:t>
+              <w:t>All five preparation guides and practice datasets available</w:t>
             </w:r>
           </w:p>
         </w:tc>
@@ -6542,8 +6542,8 @@
       </w:pPr>
       <w:r>
         <w:rPr>
-          <w:sz w:val="24"/>
-          <w:szCs w:val="24"/>
+          <w:sz w:val="20"/>
+          <w:szCs w:val="20"/>
         </w:rPr>
         <w:t>Lectures meet Monday, Wednesday, and Friday, 1:00–2:50 PM. Every instructional meeting introduces a new topic, beginning August 23 and ending December 3. Exams use the separate session; planned dates are September 20, October 18, and November 8, with Exam 4 in the assigned December 8–15 appointment. Exams 1–3 meet at 5:00 PM in NEU 100A or NEU 100B; Exam 4’s assigned date and time will be announced separately. Lab weeks and deadlines appear above and below. University holidays follow USC’s Fall 2027 academic calendar (https://academics.usc.edu/calendar/).</w:t>
       </w:r>
@@ -6593,8 +6593,8 @@
               <w:rPr>
                 <w:b/>
                 <w:bCs/>
-                <w:sz w:val="17"/>
-                <w:szCs w:val="17"/>
+                <w:sz w:val="20"/>
+                <w:szCs w:val="20"/>
               </w:rPr>
               <w:t>Date (2027)</w:t>
             </w:r>
@@ -6619,8 +6619,8 @@
               <w:rPr>
                 <w:b/>
                 <w:bCs/>
-                <w:sz w:val="17"/>
-                <w:szCs w:val="17"/>
+                <w:sz w:val="20"/>
+                <w:szCs w:val="20"/>
               </w:rPr>
               <w:t>Session</w:t>
             </w:r>
@@ -6645,8 +6645,8 @@
               <w:rPr>
                 <w:b/>
                 <w:bCs/>
-                <w:sz w:val="17"/>
-                <w:szCs w:val="17"/>
+                <w:sz w:val="20"/>
+                <w:szCs w:val="20"/>
               </w:rPr>
               <w:t>Topic</w:t>
             </w:r>
@@ -6671,8 +6671,8 @@
               <w:rPr>
                 <w:b/>
                 <w:bCs/>
-                <w:sz w:val="17"/>
-                <w:szCs w:val="17"/>
+                <w:sz w:val="20"/>
+                <w:szCs w:val="20"/>
               </w:rPr>
               <w:t>Assessment / Notes</w:t>
             </w:r>
@@ -6699,8 +6699,8 @@
             </w:pPr>
             <w:r>
               <w:rPr>
-                <w:sz w:val="17"/>
-                <w:szCs w:val="17"/>
+                <w:sz w:val="20"/>
+                <w:szCs w:val="20"/>
               </w:rPr>
               <w:t>Week 1</w:t>
             </w:r>
@@ -6722,8 +6722,8 @@
             </w:pPr>
             <w:r>
               <w:rPr>
-                <w:sz w:val="17"/>
-                <w:szCs w:val="17"/>
+                <w:sz w:val="20"/>
+                <w:szCs w:val="20"/>
               </w:rPr>
               <w:t>Lab 1</w:t>
             </w:r>
@@ -6745,8 +6745,8 @@
             </w:pPr>
             <w:r>
               <w:rPr>
-                <w:sz w:val="17"/>
-                <w:szCs w:val="17"/>
+                <w:sz w:val="20"/>
+                <w:szCs w:val="20"/>
               </w:rPr>
               <w:t>Reaction time and the speed–accuracy trade-off</w:t>
             </w:r>
@@ -6772,8 +6772,8 @@
             </w:pPr>
             <w:r>
               <w:rPr>
-                <w:sz w:val="16"/>
-                <w:szCs w:val="16"/>
+                <w:sz w:val="20"/>
+                <w:szCs w:val="20"/>
               </w:rPr>
               <w:t>Meets Aug 23–27; report due Sun Sep 5</w:t>
             </w:r>
@@ -6797,8 +6797,8 @@
           <w:p>
             <w:r>
               <w:rPr>
-                <w:sz w:val="17"/>
-                <w:szCs w:val="17"/>
+                <w:sz w:val="20"/>
+                <w:szCs w:val="20"/>
               </w:rPr>
               <w:t>Mon Aug 23</w:t>
             </w:r>
@@ -6817,8 +6817,8 @@
           <w:p>
             <w:r>
               <w:rPr>
-                <w:sz w:val="17"/>
-                <w:szCs w:val="17"/>
+                <w:sz w:val="20"/>
+                <w:szCs w:val="20"/>
               </w:rPr>
               <w:t>Lecture 1</w:t>
             </w:r>
@@ -6837,8 +6837,8 @@
           <w:p>
             <w:r>
               <w:rPr>
-                <w:sz w:val="17"/>
-                <w:szCs w:val="17"/>
+                <w:sz w:val="20"/>
+                <w:szCs w:val="20"/>
               </w:rPr>
               <w:t>Perception, illusions, and the mind’s predictions</w:t>
             </w:r>
@@ -6881,8 +6881,8 @@
           <w:p>
             <w:r>
               <w:rPr>
-                <w:sz w:val="17"/>
-                <w:szCs w:val="17"/>
+                <w:sz w:val="20"/>
+                <w:szCs w:val="20"/>
               </w:rPr>
               <w:t>Wed Aug 25</w:t>
             </w:r>
@@ -6901,8 +6901,8 @@
           <w:p>
             <w:r>
               <w:rPr>
-                <w:sz w:val="17"/>
-                <w:szCs w:val="17"/>
+                <w:sz w:val="20"/>
+                <w:szCs w:val="20"/>
               </w:rPr>
               <w:t>Lecture 2</w:t>
             </w:r>
@@ -6921,8 +6921,8 @@
           <w:p>
             <w:r>
               <w:rPr>
-                <w:sz w:val="17"/>
-                <w:szCs w:val="17"/>
+                <w:sz w:val="20"/>
+                <w:szCs w:val="20"/>
               </w:rPr>
               <w:t>Experiments, causality, and psychological evidence</w:t>
             </w:r>
@@ -6965,8 +6965,8 @@
           <w:p>
             <w:r>
               <w:rPr>
-                <w:sz w:val="17"/>
-                <w:szCs w:val="17"/>
+                <w:sz w:val="20"/>
+                <w:szCs w:val="20"/>
               </w:rPr>
               <w:t>Fri Aug 27</w:t>
             </w:r>
@@ -6985,8 +6985,8 @@
           <w:p>
             <w:r>
               <w:rPr>
-                <w:sz w:val="17"/>
-                <w:szCs w:val="17"/>
+                <w:sz w:val="20"/>
+                <w:szCs w:val="20"/>
               </w:rPr>
               <w:t>Lecture 3</w:t>
             </w:r>
@@ -7005,8 +7005,8 @@
           <w:p>
             <w:r>
               <w:rPr>
-                <w:sz w:val="17"/>
-                <w:szCs w:val="17"/>
+                <w:sz w:val="20"/>
+                <w:szCs w:val="20"/>
               </w:rPr>
               <w:t>Neurons, networks, and the biology of behavior</w:t>
             </w:r>
@@ -7049,8 +7049,8 @@
           <w:p>
             <w:r>
               <w:rPr>
-                <w:sz w:val="17"/>
-                <w:szCs w:val="17"/>
+                <w:sz w:val="20"/>
+                <w:szCs w:val="20"/>
               </w:rPr>
               <w:t>Week 2</w:t>
             </w:r>
@@ -7069,8 +7069,8 @@
           <w:p>
             <w:r>
               <w:rPr>
-                <w:sz w:val="17"/>
-                <w:szCs w:val="17"/>
+                <w:sz w:val="20"/>
+                <w:szCs w:val="20"/>
               </w:rPr>
               <w:t>Lab 2</w:t>
             </w:r>
@@ -7089,8 +7089,8 @@
           <w:p>
             <w:r>
               <w:rPr>
-                <w:sz w:val="17"/>
-                <w:szCs w:val="17"/>
+                <w:sz w:val="20"/>
+                <w:szCs w:val="20"/>
               </w:rPr>
               <w:t>Psychophysics: detection and response criterion</w:t>
             </w:r>
@@ -7115,8 +7115,8 @@
             </w:pPr>
             <w:r>
               <w:rPr>
-                <w:sz w:val="16"/>
-                <w:szCs w:val="16"/>
+                <w:sz w:val="20"/>
+                <w:szCs w:val="20"/>
               </w:rPr>
               <w:t>Meets Aug 30–Sep 3; report due Sun Sep 12</w:t>
             </w:r>
@@ -7140,8 +7140,8 @@
           <w:p>
             <w:r>
               <w:rPr>
-                <w:sz w:val="17"/>
-                <w:szCs w:val="17"/>
+                <w:sz w:val="20"/>
+                <w:szCs w:val="20"/>
               </w:rPr>
               <w:t>Mon Aug 30</w:t>
             </w:r>
@@ -7160,8 +7160,8 @@
           <w:p>
             <w:r>
               <w:rPr>
-                <w:sz w:val="17"/>
-                <w:szCs w:val="17"/>
+                <w:sz w:val="20"/>
+                <w:szCs w:val="20"/>
               </w:rPr>
               <w:t>Lecture 4</w:t>
             </w:r>
@@ -7180,8 +7180,8 @@
           <w:p>
             <w:r>
               <w:rPr>
-                <w:sz w:val="17"/>
-                <w:szCs w:val="17"/>
+                <w:sz w:val="20"/>
+                <w:szCs w:val="20"/>
               </w:rPr>
               <w:t>Brain damage, plasticity, and the divided mind</w:t>
             </w:r>
@@ -7224,8 +7224,8 @@
           <w:p>
             <w:r>
               <w:rPr>
-                <w:sz w:val="17"/>
-                <w:szCs w:val="17"/>
+                <w:sz w:val="20"/>
+                <w:szCs w:val="20"/>
               </w:rPr>
               <w:t>Wed Sep 1</w:t>
             </w:r>
@@ -7244,8 +7244,8 @@
           <w:p>
             <w:r>
               <w:rPr>
-                <w:sz w:val="17"/>
-                <w:szCs w:val="17"/>
+                <w:sz w:val="20"/>
+                <w:szCs w:val="20"/>
               </w:rPr>
               <w:t>Lecture 5</w:t>
             </w:r>
@@ -7264,8 +7264,8 @@
           <w:p>
             <w:r>
               <w:rPr>
-                <w:sz w:val="17"/>
-                <w:szCs w:val="17"/>
+                <w:sz w:val="20"/>
+                <w:szCs w:val="20"/>
               </w:rPr>
               <w:t>Genes, experience, and human differences</w:t>
             </w:r>
@@ -7308,8 +7308,8 @@
           <w:p>
             <w:r>
               <w:rPr>
-                <w:sz w:val="17"/>
-                <w:szCs w:val="17"/>
+                <w:sz w:val="20"/>
+                <w:szCs w:val="20"/>
               </w:rPr>
               <w:t>Fri Sep 3</w:t>
             </w:r>
@@ -7328,8 +7328,8 @@
           <w:p>
             <w:r>
               <w:rPr>
-                <w:sz w:val="17"/>
-                <w:szCs w:val="17"/>
+                <w:sz w:val="20"/>
+                <w:szCs w:val="20"/>
               </w:rPr>
               <w:t>Lecture 6</w:t>
             </w:r>
@@ -7348,8 +7348,8 @@
           <w:p>
             <w:r>
               <w:rPr>
-                <w:sz w:val="17"/>
-                <w:szCs w:val="17"/>
+                <w:sz w:val="20"/>
+                <w:szCs w:val="20"/>
               </w:rPr>
               <w:t>Seeing, hearing, and detecting weak signals</w:t>
             </w:r>
@@ -7392,8 +7392,8 @@
           <w:p>
             <w:r>
               <w:rPr>
-                <w:sz w:val="17"/>
-                <w:szCs w:val="17"/>
+                <w:sz w:val="20"/>
+                <w:szCs w:val="20"/>
               </w:rPr>
               <w:t>Sun Sep 5</w:t>
             </w:r>
@@ -7412,8 +7412,8 @@
           <w:p>
             <w:r>
               <w:rPr>
-                <w:sz w:val="17"/>
-                <w:szCs w:val="17"/>
+                <w:sz w:val="20"/>
+                <w:szCs w:val="20"/>
               </w:rPr>
               <w:t>Report due</w:t>
             </w:r>
@@ -7432,8 +7432,8 @@
           <w:p>
             <w:r>
               <w:rPr>
-                <w:sz w:val="17"/>
-                <w:szCs w:val="17"/>
+                <w:sz w:val="20"/>
+                <w:szCs w:val="20"/>
               </w:rPr>
               <w:t>Lab 1 report</w:t>
             </w:r>
@@ -7458,8 +7458,8 @@
             </w:pPr>
             <w:r>
               <w:rPr>
-                <w:sz w:val="16"/>
-                <w:szCs w:val="16"/>
+                <w:sz w:val="20"/>
+                <w:szCs w:val="20"/>
               </w:rPr>
               <w:t>Due 11:59 PM</w:t>
             </w:r>
@@ -7483,8 +7483,8 @@
           <w:p>
             <w:r>
               <w:rPr>
-                <w:sz w:val="17"/>
-                <w:szCs w:val="17"/>
+                <w:sz w:val="20"/>
+                <w:szCs w:val="20"/>
               </w:rPr>
               <w:t>Mon Sep 6</w:t>
             </w:r>
@@ -7503,8 +7503,8 @@
           <w:p>
             <w:r>
               <w:rPr>
-                <w:sz w:val="17"/>
-                <w:szCs w:val="17"/>
+                <w:sz w:val="20"/>
+                <w:szCs w:val="20"/>
               </w:rPr>
               <w:t>Holiday</w:t>
             </w:r>
@@ -7523,8 +7523,8 @@
           <w:p>
             <w:r>
               <w:rPr>
-                <w:sz w:val="17"/>
-                <w:szCs w:val="17"/>
+                <w:sz w:val="20"/>
+                <w:szCs w:val="20"/>
               </w:rPr>
               <w:t>Labor Day Holiday</w:t>
             </w:r>
@@ -7549,8 +7549,8 @@
             </w:pPr>
             <w:r>
               <w:rPr>
-                <w:sz w:val="16"/>
-                <w:szCs w:val="16"/>
+                <w:sz w:val="20"/>
+                <w:szCs w:val="20"/>
               </w:rPr>
               <w:t>No class or labs</w:t>
             </w:r>
@@ -7574,8 +7574,8 @@
           <w:p>
             <w:r>
               <w:rPr>
-                <w:sz w:val="17"/>
-                <w:szCs w:val="17"/>
+                <w:sz w:val="20"/>
+                <w:szCs w:val="20"/>
               </w:rPr>
               <w:t>Week 3</w:t>
             </w:r>
@@ -7594,8 +7594,8 @@
           <w:p>
             <w:r>
               <w:rPr>
-                <w:sz w:val="17"/>
-                <w:szCs w:val="17"/>
+                <w:sz w:val="20"/>
+                <w:szCs w:val="20"/>
               </w:rPr>
               <w:t>Lab 3</w:t>
             </w:r>
@@ -7614,8 +7614,8 @@
           <w:p>
             <w:r>
               <w:rPr>
-                <w:sz w:val="17"/>
-                <w:szCs w:val="17"/>
+                <w:sz w:val="20"/>
+                <w:szCs w:val="20"/>
               </w:rPr>
               <w:t>Selective attention and Stroop interference</w:t>
             </w:r>
@@ -7640,8 +7640,8 @@
             </w:pPr>
             <w:r>
               <w:rPr>
-                <w:sz w:val="16"/>
-                <w:szCs w:val="16"/>
+                <w:sz w:val="20"/>
+                <w:szCs w:val="20"/>
               </w:rPr>
               <w:t>Meets Sep 7–10; report due Sun Sep 19</w:t>
             </w:r>
@@ -7665,8 +7665,8 @@
           <w:p>
             <w:r>
               <w:rPr>
-                <w:sz w:val="17"/>
-                <w:szCs w:val="17"/>
+                <w:sz w:val="20"/>
+                <w:szCs w:val="20"/>
               </w:rPr>
               <w:t>Wed Sep 8</w:t>
             </w:r>
@@ -7685,8 +7685,8 @@
           <w:p>
             <w:r>
               <w:rPr>
-                <w:sz w:val="17"/>
-                <w:szCs w:val="17"/>
+                <w:sz w:val="20"/>
+                <w:szCs w:val="20"/>
               </w:rPr>
               <w:t>Lecture 7</w:t>
             </w:r>
@@ -7705,8 +7705,8 @@
           <w:p>
             <w:r>
               <w:rPr>
-                <w:sz w:val="17"/>
-                <w:szCs w:val="17"/>
+                <w:sz w:val="20"/>
+                <w:szCs w:val="20"/>
               </w:rPr>
               <w:t>Attention, distraction, and failures of awareness</w:t>
             </w:r>
@@ -7749,8 +7749,8 @@
           <w:p>
             <w:r>
               <w:rPr>
-                <w:sz w:val="17"/>
-                <w:szCs w:val="17"/>
+                <w:sz w:val="20"/>
+                <w:szCs w:val="20"/>
               </w:rPr>
               <w:t>Fri Sep 10</w:t>
             </w:r>
@@ -7769,8 +7769,8 @@
           <w:p>
             <w:r>
               <w:rPr>
-                <w:sz w:val="17"/>
-                <w:szCs w:val="17"/>
+                <w:sz w:val="20"/>
+                <w:szCs w:val="20"/>
               </w:rPr>
               <w:t>Lecture 8</w:t>
             </w:r>
@@ -7789,8 +7789,8 @@
           <w:p>
             <w:r>
               <w:rPr>
-                <w:sz w:val="17"/>
-                <w:szCs w:val="17"/>
+                <w:sz w:val="20"/>
+                <w:szCs w:val="20"/>
               </w:rPr>
               <w:t>Consciousness, unconscious processing, and agency</w:t>
             </w:r>
@@ -7815,8 +7815,8 @@
             </w:pPr>
             <w:r>
               <w:rPr>
-                <w:sz w:val="16"/>
-                <w:szCs w:val="16"/>
+                <w:sz w:val="20"/>
+                <w:szCs w:val="20"/>
               </w:rPr>
               <w:t>Methods Assignment 1 due</w:t>
             </w:r>
@@ -7840,8 +7840,8 @@
           <w:p>
             <w:r>
               <w:rPr>
-                <w:sz w:val="17"/>
-                <w:szCs w:val="17"/>
+                <w:sz w:val="20"/>
+                <w:szCs w:val="20"/>
               </w:rPr>
               <w:t>Sun Sep 12</w:t>
             </w:r>
@@ -7860,8 +7860,8 @@
           <w:p>
             <w:r>
               <w:rPr>
-                <w:sz w:val="17"/>
-                <w:szCs w:val="17"/>
+                <w:sz w:val="20"/>
+                <w:szCs w:val="20"/>
               </w:rPr>
               <w:t>Report due</w:t>
             </w:r>
@@ -7880,8 +7880,8 @@
           <w:p>
             <w:r>
               <w:rPr>
-                <w:sz w:val="17"/>
-                <w:szCs w:val="17"/>
+                <w:sz w:val="20"/>
+                <w:szCs w:val="20"/>
               </w:rPr>
               <w:t>Lab 2 report</w:t>
             </w:r>
@@ -7906,8 +7906,8 @@
             </w:pPr>
             <w:r>
               <w:rPr>
-                <w:sz w:val="16"/>
-                <w:szCs w:val="16"/>
+                <w:sz w:val="20"/>
+                <w:szCs w:val="20"/>
               </w:rPr>
               <w:t>Due 11:59 PM</w:t>
             </w:r>
@@ -7931,8 +7931,8 @@
           <w:p>
             <w:r>
               <w:rPr>
-                <w:sz w:val="17"/>
-                <w:szCs w:val="17"/>
+                <w:sz w:val="20"/>
+                <w:szCs w:val="20"/>
               </w:rPr>
               <w:t>Week 4</w:t>
             </w:r>
@@ -7951,8 +7951,8 @@
           <w:p>
             <w:r>
               <w:rPr>
-                <w:sz w:val="17"/>
-                <w:szCs w:val="17"/>
+                <w:sz w:val="20"/>
+                <w:szCs w:val="20"/>
               </w:rPr>
               <w:t>Lab 4</w:t>
             </w:r>
@@ -7971,8 +7971,8 @@
           <w:p>
             <w:r>
               <w:rPr>
-                <w:sz w:val="17"/>
-                <w:szCs w:val="17"/>
+                <w:sz w:val="20"/>
+                <w:szCs w:val="20"/>
               </w:rPr>
               <w:t>Learning and reversal of action–outcome contingencies</w:t>
             </w:r>
@@ -7997,8 +7997,8 @@
             </w:pPr>
             <w:r>
               <w:rPr>
-                <w:sz w:val="16"/>
-                <w:szCs w:val="16"/>
+                <w:sz w:val="20"/>
+                <w:szCs w:val="20"/>
               </w:rPr>
               <w:t>Meets Sep 13–17; report due Sun Sep 26</w:t>
             </w:r>
@@ -8022,8 +8022,8 @@
           <w:p>
             <w:r>
               <w:rPr>
-                <w:sz w:val="17"/>
-                <w:szCs w:val="17"/>
+                <w:sz w:val="20"/>
+                <w:szCs w:val="20"/>
               </w:rPr>
               <w:t>Mon Sep 13</w:t>
             </w:r>
@@ -8042,8 +8042,8 @@
           <w:p>
             <w:r>
               <w:rPr>
-                <w:sz w:val="17"/>
-                <w:szCs w:val="17"/>
+                <w:sz w:val="20"/>
+                <w:szCs w:val="20"/>
               </w:rPr>
               <w:t>Lecture 9</w:t>
             </w:r>
@@ -8062,8 +8062,8 @@
           <w:p>
             <w:r>
               <w:rPr>
-                <w:sz w:val="17"/>
-                <w:szCs w:val="17"/>
+                <w:sz w:val="20"/>
+                <w:szCs w:val="20"/>
               </w:rPr>
               <w:t>Sleep, dreaming, and biological clocks</w:t>
             </w:r>
@@ -8106,8 +8106,8 @@
           <w:p>
             <w:r>
               <w:rPr>
-                <w:sz w:val="17"/>
-                <w:szCs w:val="17"/>
+                <w:sz w:val="20"/>
+                <w:szCs w:val="20"/>
               </w:rPr>
               <w:t>Wed Sep 15</w:t>
             </w:r>
@@ -8126,8 +8126,8 @@
           <w:p>
             <w:r>
               <w:rPr>
-                <w:sz w:val="17"/>
-                <w:szCs w:val="17"/>
+                <w:sz w:val="20"/>
+                <w:szCs w:val="20"/>
               </w:rPr>
               <w:t>Lecture 10</w:t>
             </w:r>
@@ -8146,8 +8146,8 @@
           <w:p>
             <w:r>
               <w:rPr>
-                <w:sz w:val="17"/>
-                <w:szCs w:val="17"/>
+                <w:sz w:val="20"/>
+                <w:szCs w:val="20"/>
               </w:rPr>
               <w:t>Drugs, reward, and addiction</w:t>
             </w:r>
@@ -8190,8 +8190,8 @@
           <w:p>
             <w:r>
               <w:rPr>
-                <w:sz w:val="17"/>
-                <w:szCs w:val="17"/>
+                <w:sz w:val="20"/>
+                <w:szCs w:val="20"/>
               </w:rPr>
               <w:t>Fri Sep 17</w:t>
             </w:r>
@@ -8210,8 +8210,8 @@
           <w:p>
             <w:r>
               <w:rPr>
-                <w:sz w:val="17"/>
-                <w:szCs w:val="17"/>
+                <w:sz w:val="20"/>
+                <w:szCs w:val="20"/>
               </w:rPr>
               <w:t>Lecture 11</w:t>
             </w:r>
@@ -8230,8 +8230,8 @@
           <w:p>
             <w:r>
               <w:rPr>
-                <w:sz w:val="17"/>
-                <w:szCs w:val="17"/>
+                <w:sz w:val="20"/>
+                <w:szCs w:val="20"/>
               </w:rPr>
               <w:t>Classical conditioning: learning predictive relationships</w:t>
             </w:r>
@@ -8274,8 +8274,8 @@
           <w:p>
             <w:r>
               <w:rPr>
-                <w:sz w:val="17"/>
-                <w:szCs w:val="17"/>
+                <w:sz w:val="20"/>
+                <w:szCs w:val="20"/>
               </w:rPr>
               <w:t>Sun Sep 19</w:t>
             </w:r>
@@ -8294,8 +8294,8 @@
           <w:p>
             <w:r>
               <w:rPr>
-                <w:sz w:val="17"/>
-                <w:szCs w:val="17"/>
+                <w:sz w:val="20"/>
+                <w:szCs w:val="20"/>
               </w:rPr>
               <w:t>Report due</w:t>
             </w:r>
@@ -8314,8 +8314,8 @@
           <w:p>
             <w:r>
               <w:rPr>
-                <w:sz w:val="17"/>
-                <w:szCs w:val="17"/>
+                <w:sz w:val="20"/>
+                <w:szCs w:val="20"/>
               </w:rPr>
               <w:t>Lab 3 report</w:t>
             </w:r>
@@ -8340,8 +8340,8 @@
             </w:pPr>
             <w:r>
               <w:rPr>
-                <w:sz w:val="16"/>
-                <w:szCs w:val="16"/>
+                <w:sz w:val="20"/>
+                <w:szCs w:val="20"/>
               </w:rPr>
               <w:t>Due 11:59 PM</w:t>
             </w:r>
@@ -8365,8 +8365,8 @@
           <w:p>
             <w:r>
               <w:rPr>
-                <w:sz w:val="17"/>
-                <w:szCs w:val="17"/>
+                <w:sz w:val="20"/>
+                <w:szCs w:val="20"/>
               </w:rPr>
               <w:t>Week 5</w:t>
             </w:r>
@@ -8385,8 +8385,8 @@
           <w:p>
             <w:r>
               <w:rPr>
-                <w:sz w:val="17"/>
-                <w:szCs w:val="17"/>
+                <w:sz w:val="20"/>
+                <w:szCs w:val="20"/>
               </w:rPr>
               <w:t>Lab 5</w:t>
             </w:r>
@@ -8405,8 +8405,8 @@
           <w:p>
             <w:r>
               <w:rPr>
-                <w:sz w:val="17"/>
-                <w:szCs w:val="17"/>
+                <w:sz w:val="20"/>
+                <w:szCs w:val="20"/>
               </w:rPr>
               <w:t>Working-memory load and distraction</w:t>
             </w:r>
@@ -8431,8 +8431,8 @@
             </w:pPr>
             <w:r>
               <w:rPr>
-                <w:sz w:val="16"/>
-                <w:szCs w:val="16"/>
+                <w:sz w:val="20"/>
+                <w:szCs w:val="20"/>
               </w:rPr>
               <w:t>Meets Sep 20–24; report due Sun Oct 3</w:t>
             </w:r>
@@ -8456,8 +8456,8 @@
           <w:p>
             <w:r>
               <w:rPr>
-                <w:sz w:val="17"/>
-                <w:szCs w:val="17"/>
+                <w:sz w:val="20"/>
+                <w:szCs w:val="20"/>
               </w:rPr>
               <w:t>Mon Sep 20</w:t>
             </w:r>
@@ -8476,8 +8476,8 @@
           <w:p>
             <w:r>
               <w:rPr>
-                <w:sz w:val="17"/>
-                <w:szCs w:val="17"/>
+                <w:sz w:val="20"/>
+                <w:szCs w:val="20"/>
               </w:rPr>
               <w:t>EXAM 1</w:t>
             </w:r>
@@ -8496,8 +8496,8 @@
           <w:p>
             <w:r>
               <w:rPr>
-                <w:sz w:val="17"/>
-                <w:szCs w:val="17"/>
+                <w:sz w:val="20"/>
+                <w:szCs w:val="20"/>
               </w:rPr>
               <w:t>Lectures 1 to 10</w:t>
             </w:r>
@@ -8522,8 +8522,8 @@
             </w:pPr>
             <w:r>
               <w:rPr>
-                <w:sz w:val="16"/>
-                <w:szCs w:val="16"/>
+                <w:sz w:val="20"/>
+                <w:szCs w:val="20"/>
               </w:rPr>
               <w:t>Separate exam session; regular lecture also meets</w:t>
             </w:r>
@@ -8547,8 +8547,8 @@
           <w:p>
             <w:r>
               <w:rPr>
-                <w:sz w:val="17"/>
-                <w:szCs w:val="17"/>
+                <w:sz w:val="20"/>
+                <w:szCs w:val="20"/>
               </w:rPr>
               <w:t>Mon Sep 20</w:t>
             </w:r>
@@ -8567,8 +8567,8 @@
           <w:p>
             <w:r>
               <w:rPr>
-                <w:sz w:val="17"/>
-                <w:szCs w:val="17"/>
+                <w:sz w:val="20"/>
+                <w:szCs w:val="20"/>
               </w:rPr>
               <w:t>Lecture 12</w:t>
             </w:r>
@@ -8587,8 +8587,8 @@
           <w:p>
             <w:r>
               <w:rPr>
-                <w:sz w:val="17"/>
-                <w:szCs w:val="17"/>
+                <w:sz w:val="20"/>
+                <w:szCs w:val="20"/>
               </w:rPr>
               <w:t>Operant conditioning: actions and consequences</w:t>
             </w:r>
@@ -8631,8 +8631,8 @@
           <w:p>
             <w:r>
               <w:rPr>
-                <w:sz w:val="17"/>
-                <w:szCs w:val="17"/>
+                <w:sz w:val="20"/>
+                <w:szCs w:val="20"/>
               </w:rPr>
               <w:t>Wed Sep 22</w:t>
             </w:r>
@@ -8651,8 +8651,8 @@
           <w:p>
             <w:r>
               <w:rPr>
-                <w:sz w:val="17"/>
-                <w:szCs w:val="17"/>
+                <w:sz w:val="20"/>
+                <w:szCs w:val="20"/>
               </w:rPr>
               <w:t>Lecture 13</w:t>
             </w:r>
@@ -8671,8 +8671,8 @@
           <w:p>
             <w:r>
               <w:rPr>
-                <w:sz w:val="17"/>
-                <w:szCs w:val="17"/>
+                <w:sz w:val="20"/>
+                <w:szCs w:val="20"/>
               </w:rPr>
               <w:t>Observational learning and cultural transmission</w:t>
             </w:r>
@@ -8715,8 +8715,8 @@
           <w:p>
             <w:r>
               <w:rPr>
-                <w:sz w:val="17"/>
-                <w:szCs w:val="17"/>
+                <w:sz w:val="20"/>
+                <w:szCs w:val="20"/>
               </w:rPr>
               <w:t>Fri Sep 24</w:t>
             </w:r>
@@ -8735,8 +8735,8 @@
           <w:p>
             <w:r>
               <w:rPr>
-                <w:sz w:val="17"/>
-                <w:szCs w:val="17"/>
+                <w:sz w:val="20"/>
+                <w:szCs w:val="20"/>
               </w:rPr>
               <w:t>Lecture 14</w:t>
             </w:r>
@@ -8755,8 +8755,8 @@
           <w:p>
             <w:r>
               <w:rPr>
-                <w:sz w:val="17"/>
-                <w:szCs w:val="17"/>
+                <w:sz w:val="20"/>
+                <w:szCs w:val="20"/>
               </w:rPr>
               <w:t>Working memory, amnesia, and memory systems</w:t>
             </w:r>
@@ -8781,8 +8781,8 @@
             </w:pPr>
             <w:r>
               <w:rPr>
-                <w:sz w:val="16"/>
-                <w:szCs w:val="16"/>
+                <w:sz w:val="20"/>
+                <w:szCs w:val="20"/>
               </w:rPr>
               <w:t>Lecture project proposal due</w:t>
             </w:r>
@@ -8806,8 +8806,8 @@
           <w:p>
             <w:r>
               <w:rPr>
-                <w:sz w:val="17"/>
-                <w:szCs w:val="17"/>
+                <w:sz w:val="20"/>
+                <w:szCs w:val="20"/>
               </w:rPr>
               <w:t>Sun Sep 26</w:t>
             </w:r>
@@ -8826,8 +8826,8 @@
           <w:p>
             <w:r>
               <w:rPr>
-                <w:sz w:val="17"/>
-                <w:szCs w:val="17"/>
+                <w:sz w:val="20"/>
+                <w:szCs w:val="20"/>
               </w:rPr>
               <w:t>Report due</w:t>
             </w:r>
@@ -8846,8 +8846,8 @@
           <w:p>
             <w:r>
               <w:rPr>
-                <w:sz w:val="17"/>
-                <w:szCs w:val="17"/>
+                <w:sz w:val="20"/>
+                <w:szCs w:val="20"/>
               </w:rPr>
               <w:t>Lab 4 report</w:t>
             </w:r>
@@ -8872,8 +8872,8 @@
             </w:pPr>
             <w:r>
               <w:rPr>
-                <w:sz w:val="16"/>
-                <w:szCs w:val="16"/>
+                <w:sz w:val="20"/>
+                <w:szCs w:val="20"/>
               </w:rPr>
               <w:t>Due 11:59 PM</w:t>
             </w:r>
@@ -8897,8 +8897,8 @@
           <w:p>
             <w:r>
               <w:rPr>
-                <w:sz w:val="17"/>
-                <w:szCs w:val="17"/>
+                <w:sz w:val="20"/>
+                <w:szCs w:val="20"/>
               </w:rPr>
               <w:t>Week 6</w:t>
             </w:r>
@@ -8917,8 +8917,8 @@
           <w:p>
             <w:r>
               <w:rPr>
-                <w:sz w:val="17"/>
-                <w:szCs w:val="17"/>
+                <w:sz w:val="20"/>
+                <w:szCs w:val="20"/>
               </w:rPr>
               <w:t>Lab 6</w:t>
             </w:r>
@@ -8937,8 +8937,8 @@
           <w:p>
             <w:r>
               <w:rPr>
-                <w:sz w:val="17"/>
-                <w:szCs w:val="17"/>
+                <w:sz w:val="20"/>
+                <w:szCs w:val="20"/>
               </w:rPr>
               <w:t>Memory reconstruction and source monitoring</w:t>
             </w:r>
@@ -8963,8 +8963,8 @@
             </w:pPr>
             <w:r>
               <w:rPr>
-                <w:sz w:val="16"/>
-                <w:szCs w:val="16"/>
+                <w:sz w:val="20"/>
+                <w:szCs w:val="20"/>
               </w:rPr>
               <w:t>Meets Sep 27–Oct 1; report due Sun Oct 17</w:t>
             </w:r>
@@ -8988,8 +8988,8 @@
           <w:p>
             <w:r>
               <w:rPr>
-                <w:sz w:val="17"/>
-                <w:szCs w:val="17"/>
+                <w:sz w:val="20"/>
+                <w:szCs w:val="20"/>
               </w:rPr>
               <w:t>Mon Sep 27</w:t>
             </w:r>
@@ -9008,8 +9008,8 @@
           <w:p>
             <w:r>
               <w:rPr>
-                <w:sz w:val="17"/>
-                <w:szCs w:val="17"/>
+                <w:sz w:val="20"/>
+                <w:szCs w:val="20"/>
               </w:rPr>
               <w:t>Lecture 15</w:t>
             </w:r>
@@ -9028,8 +9028,8 @@
           <w:p>
             <w:r>
               <w:rPr>
-                <w:sz w:val="17"/>
-                <w:szCs w:val="17"/>
+                <w:sz w:val="20"/>
+                <w:szCs w:val="20"/>
               </w:rPr>
               <w:t>False memories and eyewitness identification</w:t>
             </w:r>
@@ -9072,8 +9072,8 @@
           <w:p>
             <w:r>
               <w:rPr>
-                <w:sz w:val="17"/>
-                <w:szCs w:val="17"/>
+                <w:sz w:val="20"/>
+                <w:szCs w:val="20"/>
               </w:rPr>
               <w:t>Wed Sep 29</w:t>
             </w:r>
@@ -9092,8 +9092,8 @@
           <w:p>
             <w:r>
               <w:rPr>
-                <w:sz w:val="17"/>
-                <w:szCs w:val="17"/>
+                <w:sz w:val="20"/>
+                <w:szCs w:val="20"/>
               </w:rPr>
               <w:t>Lecture 16</w:t>
             </w:r>
@@ -9112,8 +9112,8 @@
           <w:p>
             <w:r>
               <w:rPr>
-                <w:sz w:val="17"/>
-                <w:szCs w:val="17"/>
+                <w:sz w:val="20"/>
+                <w:szCs w:val="20"/>
               </w:rPr>
               <w:t>Retrieval, forgetting, and durable learning</w:t>
             </w:r>
@@ -9156,8 +9156,8 @@
           <w:p>
             <w:r>
               <w:rPr>
-                <w:sz w:val="17"/>
-                <w:szCs w:val="17"/>
+                <w:sz w:val="20"/>
+                <w:szCs w:val="20"/>
               </w:rPr>
               <w:t>Fri Oct 1</w:t>
             </w:r>
@@ -9176,8 +9176,8 @@
           <w:p>
             <w:r>
               <w:rPr>
-                <w:sz w:val="17"/>
-                <w:szCs w:val="17"/>
+                <w:sz w:val="20"/>
+                <w:szCs w:val="20"/>
               </w:rPr>
               <w:t>Lecture 17</w:t>
             </w:r>
@@ -9196,8 +9196,8 @@
           <w:p>
             <w:r>
               <w:rPr>
-                <w:sz w:val="17"/>
-                <w:szCs w:val="17"/>
+                <w:sz w:val="20"/>
+                <w:szCs w:val="20"/>
               </w:rPr>
               <w:t>Language: acquisition, comprehension, and the brain</w:t>
             </w:r>
@@ -9222,8 +9222,8 @@
             </w:pPr>
             <w:r>
               <w:rPr>
-                <w:sz w:val="16"/>
-                <w:szCs w:val="16"/>
+                <w:sz w:val="20"/>
+                <w:szCs w:val="20"/>
               </w:rPr>
               <w:t>Methods Assignment 2 due</w:t>
             </w:r>
@@ -9247,8 +9247,8 @@
           <w:p>
             <w:r>
               <w:rPr>
-                <w:sz w:val="17"/>
-                <w:szCs w:val="17"/>
+                <w:sz w:val="20"/>
+                <w:szCs w:val="20"/>
               </w:rPr>
               <w:t>Sun Oct 3</w:t>
             </w:r>
@@ -9267,8 +9267,8 @@
           <w:p>
             <w:r>
               <w:rPr>
-                <w:sz w:val="17"/>
-                <w:szCs w:val="17"/>
+                <w:sz w:val="20"/>
+                <w:szCs w:val="20"/>
               </w:rPr>
               <w:t>Report due</w:t>
             </w:r>
@@ -9287,8 +9287,8 @@
           <w:p>
             <w:r>
               <w:rPr>
-                <w:sz w:val="17"/>
-                <w:szCs w:val="17"/>
+                <w:sz w:val="20"/>
+                <w:szCs w:val="20"/>
               </w:rPr>
               <w:t>Lab 5 report</w:t>
             </w:r>
@@ -9313,8 +9313,8 @@
             </w:pPr>
             <w:r>
               <w:rPr>
-                <w:sz w:val="16"/>
-                <w:szCs w:val="16"/>
+                <w:sz w:val="20"/>
+                <w:szCs w:val="20"/>
               </w:rPr>
               <w:t>Due 11:59 PM</w:t>
             </w:r>
@@ -9338,8 +9338,8 @@
           <w:p>
             <w:r>
               <w:rPr>
-                <w:sz w:val="17"/>
-                <w:szCs w:val="17"/>
+                <w:sz w:val="20"/>
+                <w:szCs w:val="20"/>
               </w:rPr>
               <w:lastRenderedPageBreak/>
               <w:t>Week 7</w:t>
@@ -9359,8 +9359,8 @@
           <w:p>
             <w:r>
               <w:rPr>
-                <w:sz w:val="17"/>
-                <w:szCs w:val="17"/>
+                <w:sz w:val="20"/>
+                <w:szCs w:val="20"/>
               </w:rPr>
               <w:t>Laboratory</w:t>
             </w:r>
@@ -9379,8 +9379,8 @@
           <w:p>
             <w:r>
               <w:rPr>
-                <w:sz w:val="17"/>
-                <w:szCs w:val="17"/>
+                <w:sz w:val="20"/>
+                <w:szCs w:val="20"/>
               </w:rPr>
               <w:t>Analysis support before Fall Recess</w:t>
             </w:r>
@@ -9405,8 +9405,8 @@
             </w:pPr>
             <w:r>
               <w:rPr>
-                <w:sz w:val="16"/>
-                <w:szCs w:val="16"/>
+                <w:sz w:val="20"/>
+                <w:szCs w:val="20"/>
               </w:rPr>
               <w:t>No required regular lab this week</w:t>
             </w:r>
@@ -9430,8 +9430,8 @@
           <w:p>
             <w:r>
               <w:rPr>
-                <w:sz w:val="17"/>
-                <w:szCs w:val="17"/>
+                <w:sz w:val="20"/>
+                <w:szCs w:val="20"/>
               </w:rPr>
               <w:t>Mon Oct 4</w:t>
             </w:r>
@@ -9450,8 +9450,8 @@
           <w:p>
             <w:r>
               <w:rPr>
-                <w:sz w:val="17"/>
-                <w:szCs w:val="17"/>
+                <w:sz w:val="20"/>
+                <w:szCs w:val="20"/>
               </w:rPr>
               <w:t>Lecture 18</w:t>
             </w:r>
@@ -9470,8 +9470,8 @@
           <w:p>
             <w:r>
               <w:rPr>
-                <w:sz w:val="17"/>
-                <w:szCs w:val="17"/>
+                <w:sz w:val="20"/>
+                <w:szCs w:val="20"/>
               </w:rPr>
               <w:t>Judgment, risk, and decision-making</w:t>
             </w:r>
@@ -9514,8 +9514,8 @@
           <w:p>
             <w:r>
               <w:rPr>
-                <w:sz w:val="17"/>
-                <w:szCs w:val="17"/>
+                <w:sz w:val="20"/>
+                <w:szCs w:val="20"/>
               </w:rPr>
               <w:t>Wed Oct 6</w:t>
             </w:r>
@@ -9534,8 +9534,8 @@
           <w:p>
             <w:r>
               <w:rPr>
-                <w:sz w:val="17"/>
-                <w:szCs w:val="17"/>
+                <w:sz w:val="20"/>
+                <w:szCs w:val="20"/>
               </w:rPr>
               <w:t>Lecture 19</w:t>
             </w:r>
@@ -9554,8 +9554,8 @@
           <w:p>
             <w:r>
               <w:rPr>
-                <w:sz w:val="17"/>
-                <w:szCs w:val="17"/>
+                <w:sz w:val="20"/>
+                <w:szCs w:val="20"/>
               </w:rPr>
               <w:t>Intelligence: measurement, development, and fairness</w:t>
             </w:r>
@@ -9598,8 +9598,8 @@
           <w:p>
             <w:r>
               <w:rPr>
-                <w:sz w:val="17"/>
-                <w:szCs w:val="17"/>
+                <w:sz w:val="20"/>
+                <w:szCs w:val="20"/>
               </w:rPr>
               <w:t>Fri Oct 8</w:t>
             </w:r>
@@ -9618,8 +9618,8 @@
           <w:p>
             <w:r>
               <w:rPr>
-                <w:sz w:val="17"/>
-                <w:szCs w:val="17"/>
+                <w:sz w:val="20"/>
+                <w:szCs w:val="20"/>
               </w:rPr>
               <w:t>Holiday</w:t>
             </w:r>
@@ -9638,8 +9638,8 @@
           <w:p>
             <w:r>
               <w:rPr>
-                <w:sz w:val="17"/>
-                <w:szCs w:val="17"/>
+                <w:sz w:val="20"/>
+                <w:szCs w:val="20"/>
               </w:rPr>
               <w:t>Fall Recess: October 7–8</w:t>
             </w:r>
@@ -9664,8 +9664,8 @@
             </w:pPr>
             <w:r>
               <w:rPr>
-                <w:sz w:val="16"/>
-                <w:szCs w:val="16"/>
+                <w:sz w:val="20"/>
+                <w:szCs w:val="20"/>
               </w:rPr>
               <w:t>No class or labs</w:t>
             </w:r>
@@ -9689,8 +9689,8 @@
           <w:p>
             <w:r>
               <w:rPr>
-                <w:sz w:val="17"/>
-                <w:szCs w:val="17"/>
+                <w:sz w:val="20"/>
+                <w:szCs w:val="20"/>
               </w:rPr>
               <w:t>Week 8</w:t>
             </w:r>
@@ -9709,8 +9709,8 @@
           <w:p>
             <w:r>
               <w:rPr>
-                <w:sz w:val="17"/>
-                <w:szCs w:val="17"/>
+                <w:sz w:val="20"/>
+                <w:szCs w:val="20"/>
               </w:rPr>
               <w:t>Lab 7</w:t>
             </w:r>
@@ -9729,8 +9729,8 @@
           <w:p>
             <w:r>
               <w:rPr>
-                <w:sz w:val="17"/>
-                <w:szCs w:val="17"/>
+                <w:sz w:val="20"/>
+                <w:szCs w:val="20"/>
               </w:rPr>
               <w:t>Framing and risky decisions</w:t>
             </w:r>
@@ -9755,8 +9755,8 @@
             </w:pPr>
             <w:r>
               <w:rPr>
-                <w:sz w:val="16"/>
-                <w:szCs w:val="16"/>
+                <w:sz w:val="20"/>
+                <w:szCs w:val="20"/>
               </w:rPr>
               <w:t>Meets Oct 11–15; report due Sun Oct 24</w:t>
             </w:r>
@@ -9780,8 +9780,8 @@
           <w:p>
             <w:r>
               <w:rPr>
-                <w:sz w:val="17"/>
-                <w:szCs w:val="17"/>
+                <w:sz w:val="20"/>
+                <w:szCs w:val="20"/>
               </w:rPr>
               <w:t>Mon Oct 11</w:t>
             </w:r>
@@ -9800,8 +9800,8 @@
           <w:p>
             <w:r>
               <w:rPr>
-                <w:sz w:val="17"/>
-                <w:szCs w:val="17"/>
+                <w:sz w:val="20"/>
+                <w:szCs w:val="20"/>
               </w:rPr>
               <w:t>Lecture 20</w:t>
             </w:r>
@@ -9820,8 +9820,8 @@
           <w:p>
             <w:r>
               <w:rPr>
-                <w:sz w:val="17"/>
-                <w:szCs w:val="17"/>
+                <w:sz w:val="20"/>
+                <w:szCs w:val="20"/>
               </w:rPr>
               <w:t>Motivation: hunger, goals, and self-control</w:t>
             </w:r>
@@ -9864,8 +9864,8 @@
           <w:p>
             <w:r>
               <w:rPr>
-                <w:sz w:val="17"/>
-                <w:szCs w:val="17"/>
+                <w:sz w:val="20"/>
+                <w:szCs w:val="20"/>
               </w:rPr>
               <w:t>Wed Oct 13</w:t>
             </w:r>
@@ -9884,8 +9884,8 @@
           <w:p>
             <w:r>
               <w:rPr>
-                <w:sz w:val="17"/>
-                <w:szCs w:val="17"/>
+                <w:sz w:val="20"/>
+                <w:szCs w:val="20"/>
               </w:rPr>
               <w:t>Lecture 21</w:t>
             </w:r>
@@ -9904,8 +9904,8 @@
           <w:p>
             <w:r>
               <w:rPr>
-                <w:sz w:val="17"/>
-                <w:szCs w:val="17"/>
+                <w:sz w:val="20"/>
+                <w:szCs w:val="20"/>
               </w:rPr>
               <w:t>Emotion: bodily responses, appraisal, and regulation</w:t>
             </w:r>
@@ -9948,8 +9948,8 @@
           <w:p>
             <w:r>
               <w:rPr>
-                <w:sz w:val="17"/>
-                <w:szCs w:val="17"/>
+                <w:sz w:val="20"/>
+                <w:szCs w:val="20"/>
               </w:rPr>
               <w:t>Fri Oct 15</w:t>
             </w:r>
@@ -9968,8 +9968,8 @@
           <w:p>
             <w:r>
               <w:rPr>
-                <w:sz w:val="17"/>
-                <w:szCs w:val="17"/>
+                <w:sz w:val="20"/>
+                <w:szCs w:val="20"/>
               </w:rPr>
               <w:t>Lecture 22</w:t>
             </w:r>
@@ -9988,8 +9988,8 @@
           <w:p>
             <w:r>
               <w:rPr>
-                <w:sz w:val="17"/>
-                <w:szCs w:val="17"/>
+                <w:sz w:val="20"/>
+                <w:szCs w:val="20"/>
               </w:rPr>
               <w:t>Stress, health, and the social environment</w:t>
             </w:r>
@@ -10032,8 +10032,8 @@
           <w:p>
             <w:r>
               <w:rPr>
-                <w:sz w:val="17"/>
-                <w:szCs w:val="17"/>
+                <w:sz w:val="20"/>
+                <w:szCs w:val="20"/>
               </w:rPr>
               <w:t>Sun Oct 17</w:t>
             </w:r>
@@ -10052,8 +10052,8 @@
           <w:p>
             <w:r>
               <w:rPr>
-                <w:sz w:val="17"/>
-                <w:szCs w:val="17"/>
+                <w:sz w:val="20"/>
+                <w:szCs w:val="20"/>
               </w:rPr>
               <w:t>Report due</w:t>
             </w:r>
@@ -10072,8 +10072,8 @@
           <w:p>
             <w:r>
               <w:rPr>
-                <w:sz w:val="17"/>
-                <w:szCs w:val="17"/>
+                <w:sz w:val="20"/>
+                <w:szCs w:val="20"/>
               </w:rPr>
               <w:t>Lab 6 report</w:t>
             </w:r>
@@ -10098,8 +10098,8 @@
             </w:pPr>
             <w:r>
               <w:rPr>
-                <w:sz w:val="16"/>
-                <w:szCs w:val="16"/>
+                <w:sz w:val="20"/>
+                <w:szCs w:val="20"/>
               </w:rPr>
               <w:t>Due 11:59 PM</w:t>
             </w:r>
@@ -10123,8 +10123,8 @@
           <w:p>
             <w:r>
               <w:rPr>
-                <w:sz w:val="17"/>
-                <w:szCs w:val="17"/>
+                <w:sz w:val="20"/>
+                <w:szCs w:val="20"/>
               </w:rPr>
               <w:t>Week 9</w:t>
             </w:r>
@@ -10143,8 +10143,8 @@
           <w:p>
             <w:r>
               <w:rPr>
-                <w:sz w:val="17"/>
-                <w:szCs w:val="17"/>
+                <w:sz w:val="20"/>
+                <w:szCs w:val="20"/>
               </w:rPr>
               <w:t>Lab 8</w:t>
             </w:r>
@@ -10163,8 +10163,8 @@
           <w:p>
             <w:r>
               <w:rPr>
-                <w:sz w:val="17"/>
-                <w:szCs w:val="17"/>
+                <w:sz w:val="20"/>
+                <w:szCs w:val="20"/>
               </w:rPr>
               <w:t>Infant cognition through looking-time data</w:t>
             </w:r>
@@ -10189,8 +10189,8 @@
             </w:pPr>
             <w:r>
               <w:rPr>
-                <w:sz w:val="16"/>
-                <w:szCs w:val="16"/>
+                <w:sz w:val="20"/>
+                <w:szCs w:val="20"/>
               </w:rPr>
               <w:t>Meets Oct 18–22; report due Sun Oct 31</w:t>
             </w:r>
@@ -10214,8 +10214,8 @@
           <w:p>
             <w:r>
               <w:rPr>
-                <w:sz w:val="17"/>
-                <w:szCs w:val="17"/>
+                <w:sz w:val="20"/>
+                <w:szCs w:val="20"/>
               </w:rPr>
               <w:t>Mon Oct 18</w:t>
             </w:r>
@@ -10234,8 +10234,8 @@
           <w:p>
             <w:r>
               <w:rPr>
-                <w:sz w:val="17"/>
-                <w:szCs w:val="17"/>
+                <w:sz w:val="20"/>
+                <w:szCs w:val="20"/>
               </w:rPr>
               <w:t>EXAM 2</w:t>
             </w:r>
@@ -10254,8 +10254,8 @@
           <w:p>
             <w:r>
               <w:rPr>
-                <w:sz w:val="17"/>
-                <w:szCs w:val="17"/>
+                <w:sz w:val="20"/>
+                <w:szCs w:val="20"/>
               </w:rPr>
               <w:t>Lectures 11 to 20</w:t>
             </w:r>
@@ -10280,8 +10280,8 @@
             </w:pPr>
             <w:r>
               <w:rPr>
-                <w:sz w:val="16"/>
-                <w:szCs w:val="16"/>
+                <w:sz w:val="20"/>
+                <w:szCs w:val="20"/>
               </w:rPr>
               <w:t>Separate exam session; regular lecture also meets</w:t>
             </w:r>
@@ -10305,8 +10305,8 @@
           <w:p>
             <w:r>
               <w:rPr>
-                <w:sz w:val="17"/>
-                <w:szCs w:val="17"/>
+                <w:sz w:val="20"/>
+                <w:szCs w:val="20"/>
               </w:rPr>
               <w:t>Mon Oct 18</w:t>
             </w:r>
@@ -10325,8 +10325,8 @@
           <w:p>
             <w:r>
               <w:rPr>
-                <w:sz w:val="17"/>
-                <w:szCs w:val="17"/>
+                <w:sz w:val="20"/>
+                <w:szCs w:val="20"/>
               </w:rPr>
               <w:t>Lecture 23</w:t>
             </w:r>
@@ -10345,8 +10345,8 @@
           <w:p>
             <w:r>
               <w:rPr>
-                <w:sz w:val="17"/>
-                <w:szCs w:val="17"/>
+                <w:sz w:val="20"/>
+                <w:szCs w:val="20"/>
               </w:rPr>
               <w:t>Infant cognition and the developing mind</w:t>
             </w:r>
@@ -10392,8 +10392,8 @@
             </w:pPr>
             <w:r>
               <w:rPr>
-                <w:sz w:val="17"/>
-                <w:szCs w:val="17"/>
+                <w:sz w:val="20"/>
+                <w:szCs w:val="20"/>
               </w:rPr>
               <w:t>Tue Oct 19</w:t>
             </w:r>
@@ -10415,8 +10415,8 @@
             </w:pPr>
             <w:r>
               <w:rPr>
-                <w:sz w:val="17"/>
-                <w:szCs w:val="17"/>
+                <w:sz w:val="20"/>
+                <w:szCs w:val="20"/>
               </w:rPr>
               <w:t>Practical preparation</w:t>
             </w:r>
@@ -10438,10 +10438,10 @@
             </w:pPr>
             <w:r>
               <w:rPr>
-                <w:sz w:val="17"/>
-                <w:szCs w:val="17"/>
-              </w:rPr>
-              <w:t>Guides, prompts, rubrics, and practice datasets available for all five options</w:t>
+                <w:sz w:val="20"/>
+                <w:szCs w:val="20"/>
+              </w:rPr>
+              <w:t>Guides, prompts, and practice datasets available for all five options</w:t>
             </w:r>
           </w:p>
         </w:tc>
@@ -10465,8 +10465,8 @@
             </w:pPr>
             <w:r>
               <w:rPr>
-                <w:sz w:val="16"/>
-                <w:szCs w:val="16"/>
+                <w:sz w:val="20"/>
+                <w:szCs w:val="20"/>
               </w:rPr>
               <w:t>At least two weeks before the first practical</w:t>
             </w:r>
@@ -10490,8 +10490,8 @@
           <w:p>
             <w:r>
               <w:rPr>
-                <w:sz w:val="17"/>
-                <w:szCs w:val="17"/>
+                <w:sz w:val="20"/>
+                <w:szCs w:val="20"/>
               </w:rPr>
               <w:t>Wed Oct 20</w:t>
             </w:r>
@@ -10510,8 +10510,8 @@
           <w:p>
             <w:r>
               <w:rPr>
-                <w:sz w:val="17"/>
-                <w:szCs w:val="17"/>
+                <w:sz w:val="20"/>
+                <w:szCs w:val="20"/>
               </w:rPr>
               <w:t>Lecture 24</w:t>
             </w:r>
@@ -10530,8 +10530,8 @@
           <w:p>
             <w:r>
               <w:rPr>
-                <w:sz w:val="17"/>
-                <w:szCs w:val="17"/>
+                <w:sz w:val="20"/>
+                <w:szCs w:val="20"/>
               </w:rPr>
               <w:t>Attachment, caregiving, and social development</w:t>
             </w:r>
@@ -10574,8 +10574,8 @@
           <w:p>
             <w:r>
               <w:rPr>
-                <w:sz w:val="17"/>
-                <w:szCs w:val="17"/>
+                <w:sz w:val="20"/>
+                <w:szCs w:val="20"/>
               </w:rPr>
               <w:t>Fri Oct 22</w:t>
             </w:r>
@@ -10594,8 +10594,8 @@
           <w:p>
             <w:r>
               <w:rPr>
-                <w:sz w:val="17"/>
-                <w:szCs w:val="17"/>
+                <w:sz w:val="20"/>
+                <w:szCs w:val="20"/>
               </w:rPr>
               <w:t>Lecture 25</w:t>
             </w:r>
@@ -10614,8 +10614,8 @@
           <w:p>
             <w:r>
               <w:rPr>
-                <w:sz w:val="17"/>
-                <w:szCs w:val="17"/>
+                <w:sz w:val="20"/>
+                <w:szCs w:val="20"/>
               </w:rPr>
               <w:t>Adolescence: identity, peers, and risk</w:t>
             </w:r>
@@ -10640,8 +10640,8 @@
             </w:pPr>
             <w:r>
               <w:rPr>
-                <w:sz w:val="16"/>
-                <w:szCs w:val="16"/>
+                <w:sz w:val="20"/>
+                <w:szCs w:val="20"/>
               </w:rPr>
               <w:t>Lecture project progress and practical topic selection due</w:t>
             </w:r>
@@ -10665,8 +10665,8 @@
           <w:p>
             <w:r>
               <w:rPr>
-                <w:sz w:val="17"/>
-                <w:szCs w:val="17"/>
+                <w:sz w:val="20"/>
+                <w:szCs w:val="20"/>
               </w:rPr>
               <w:t>Sun Oct 24</w:t>
             </w:r>
@@ -10685,8 +10685,8 @@
           <w:p>
             <w:r>
               <w:rPr>
-                <w:sz w:val="17"/>
-                <w:szCs w:val="17"/>
+                <w:sz w:val="20"/>
+                <w:szCs w:val="20"/>
               </w:rPr>
               <w:t>Report due</w:t>
             </w:r>
@@ -10705,8 +10705,8 @@
           <w:p>
             <w:r>
               <w:rPr>
-                <w:sz w:val="17"/>
-                <w:szCs w:val="17"/>
+                <w:sz w:val="20"/>
+                <w:szCs w:val="20"/>
               </w:rPr>
               <w:t>Lab 7 report</w:t>
             </w:r>
@@ -10731,8 +10731,8 @@
             </w:pPr>
             <w:r>
               <w:rPr>
-                <w:sz w:val="16"/>
-                <w:szCs w:val="16"/>
+                <w:sz w:val="20"/>
+                <w:szCs w:val="20"/>
               </w:rPr>
               <w:t>Due 11:59 PM</w:t>
             </w:r>
@@ -10756,8 +10756,8 @@
           <w:p>
             <w:r>
               <w:rPr>
-                <w:sz w:val="17"/>
-                <w:szCs w:val="17"/>
+                <w:sz w:val="20"/>
+                <w:szCs w:val="20"/>
               </w:rPr>
               <w:t>Week 10</w:t>
             </w:r>
@@ -10776,8 +10776,8 @@
           <w:p>
             <w:r>
               <w:rPr>
-                <w:sz w:val="17"/>
-                <w:szCs w:val="17"/>
+                <w:sz w:val="20"/>
+                <w:szCs w:val="20"/>
               </w:rPr>
               <w:t>Lab 9</w:t>
             </w:r>
@@ -10796,8 +10796,8 @@
           <w:p>
             <w:r>
               <w:rPr>
-                <w:sz w:val="17"/>
-                <w:szCs w:val="17"/>
+                <w:sz w:val="20"/>
+                <w:szCs w:val="20"/>
               </w:rPr>
               <w:t>Personality measurement and the role of situations</w:t>
             </w:r>
@@ -10822,8 +10822,8 @@
             </w:pPr>
             <w:r>
               <w:rPr>
-                <w:sz w:val="16"/>
-                <w:szCs w:val="16"/>
+                <w:sz w:val="20"/>
+                <w:szCs w:val="20"/>
               </w:rPr>
               <w:t>Meets Oct 25–29; report due Sun Nov 7</w:t>
             </w:r>
@@ -10847,8 +10847,8 @@
           <w:p>
             <w:r>
               <w:rPr>
-                <w:sz w:val="17"/>
-                <w:szCs w:val="17"/>
+                <w:sz w:val="20"/>
+                <w:szCs w:val="20"/>
               </w:rPr>
               <w:t>Mon Oct 25</w:t>
             </w:r>
@@ -10867,8 +10867,8 @@
           <w:p>
             <w:r>
               <w:rPr>
-                <w:sz w:val="17"/>
-                <w:szCs w:val="17"/>
+                <w:sz w:val="20"/>
+                <w:szCs w:val="20"/>
               </w:rPr>
               <w:t>Lecture 26</w:t>
             </w:r>
@@ -10887,8 +10887,8 @@
           <w:p>
             <w:r>
               <w:rPr>
-                <w:sz w:val="17"/>
-                <w:szCs w:val="17"/>
+                <w:sz w:val="20"/>
+                <w:szCs w:val="20"/>
               </w:rPr>
               <w:t>Adulthood, aging, and cognitive change</w:t>
             </w:r>
@@ -10931,8 +10931,8 @@
           <w:p>
             <w:r>
               <w:rPr>
-                <w:sz w:val="17"/>
-                <w:szCs w:val="17"/>
+                <w:sz w:val="20"/>
+                <w:szCs w:val="20"/>
               </w:rPr>
               <w:t>Wed Oct 27</w:t>
             </w:r>
@@ -10951,8 +10951,8 @@
           <w:p>
             <w:r>
               <w:rPr>
-                <w:sz w:val="17"/>
-                <w:szCs w:val="17"/>
+                <w:sz w:val="20"/>
+                <w:szCs w:val="20"/>
               </w:rPr>
               <w:t>Lecture 27</w:t>
             </w:r>
@@ -10971,8 +10971,8 @@
           <w:p>
             <w:r>
               <w:rPr>
-                <w:sz w:val="17"/>
-                <w:szCs w:val="17"/>
+                <w:sz w:val="20"/>
+                <w:szCs w:val="20"/>
               </w:rPr>
               <w:t>Personality: traits, situations, and the self</w:t>
             </w:r>
@@ -11015,8 +11015,8 @@
           <w:p>
             <w:r>
               <w:rPr>
-                <w:sz w:val="17"/>
-                <w:szCs w:val="17"/>
+                <w:sz w:val="20"/>
+                <w:szCs w:val="20"/>
               </w:rPr>
               <w:t>Fri Oct 29</w:t>
             </w:r>
@@ -11035,8 +11035,8 @@
           <w:p>
             <w:r>
               <w:rPr>
-                <w:sz w:val="17"/>
-                <w:szCs w:val="17"/>
+                <w:sz w:val="20"/>
+                <w:szCs w:val="20"/>
               </w:rPr>
               <w:t>Lecture 28</w:t>
             </w:r>
@@ -11055,8 +11055,8 @@
           <w:p>
             <w:r>
               <w:rPr>
-                <w:sz w:val="17"/>
-                <w:szCs w:val="17"/>
+                <w:sz w:val="20"/>
+                <w:szCs w:val="20"/>
               </w:rPr>
               <w:t>Sex, gender, and sexual behavior</w:t>
             </w:r>
@@ -11081,8 +11081,8 @@
             </w:pPr>
             <w:r>
               <w:rPr>
-                <w:sz w:val="16"/>
-                <w:szCs w:val="16"/>
+                <w:sz w:val="20"/>
+                <w:szCs w:val="20"/>
               </w:rPr>
               <w:t>Methods Assignment 3 due</w:t>
             </w:r>
@@ -11106,8 +11106,8 @@
           <w:p>
             <w:r>
               <w:rPr>
-                <w:sz w:val="17"/>
-                <w:szCs w:val="17"/>
+                <w:sz w:val="20"/>
+                <w:szCs w:val="20"/>
               </w:rPr>
               <w:t>Sun Oct 31</w:t>
             </w:r>
@@ -11126,8 +11126,8 @@
           <w:p>
             <w:r>
               <w:rPr>
-                <w:sz w:val="17"/>
-                <w:szCs w:val="17"/>
+                <w:sz w:val="20"/>
+                <w:szCs w:val="20"/>
               </w:rPr>
               <w:t>Report due</w:t>
             </w:r>
@@ -11146,8 +11146,8 @@
           <w:p>
             <w:r>
               <w:rPr>
-                <w:sz w:val="17"/>
-                <w:szCs w:val="17"/>
+                <w:sz w:val="20"/>
+                <w:szCs w:val="20"/>
               </w:rPr>
               <w:t>Lab 8 report</w:t>
             </w:r>
@@ -11172,8 +11172,8 @@
             </w:pPr>
             <w:r>
               <w:rPr>
-                <w:sz w:val="16"/>
-                <w:szCs w:val="16"/>
+                <w:sz w:val="20"/>
+                <w:szCs w:val="20"/>
               </w:rPr>
               <w:t>Due 11:59 PM</w:t>
             </w:r>
@@ -11197,8 +11197,8 @@
           <w:p>
             <w:r>
               <w:rPr>
-                <w:sz w:val="17"/>
-                <w:szCs w:val="17"/>
+                <w:sz w:val="20"/>
+                <w:szCs w:val="20"/>
               </w:rPr>
               <w:t>Week 11</w:t>
             </w:r>
@@ -11217,8 +11217,8 @@
           <w:p>
             <w:r>
               <w:rPr>
-                <w:sz w:val="17"/>
-                <w:szCs w:val="17"/>
+                <w:sz w:val="20"/>
+                <w:szCs w:val="20"/>
               </w:rPr>
               <w:t>Laboratory</w:t>
             </w:r>
@@ -11237,8 +11237,8 @@
           <w:p>
             <w:r>
               <w:rPr>
-                <w:sz w:val="17"/>
-                <w:szCs w:val="17"/>
+                <w:sz w:val="20"/>
+                <w:szCs w:val="20"/>
               </w:rPr>
               <w:t>Individual experimental practical and mini-replication proposal support</w:t>
             </w:r>
@@ -11263,8 +11263,8 @@
             </w:pPr>
             <w:r>
               <w:rPr>
-                <w:sz w:val="16"/>
-                <w:szCs w:val="16"/>
+                <w:sz w:val="20"/>
+                <w:szCs w:val="20"/>
               </w:rPr>
               <w:t>Practical in assigned lab Nov 2–4; proposal due Fri Nov 5</w:t>
             </w:r>
@@ -11288,8 +11288,8 @@
           <w:p>
             <w:r>
               <w:rPr>
-                <w:sz w:val="17"/>
-                <w:szCs w:val="17"/>
+                <w:sz w:val="20"/>
+                <w:szCs w:val="20"/>
               </w:rPr>
               <w:t>Mon Nov 1</w:t>
             </w:r>
@@ -11308,8 +11308,8 @@
           <w:p>
             <w:r>
               <w:rPr>
-                <w:sz w:val="17"/>
-                <w:szCs w:val="17"/>
+                <w:sz w:val="20"/>
+                <w:szCs w:val="20"/>
               </w:rPr>
               <w:t>Lecture 29</w:t>
             </w:r>
@@ -11328,8 +11328,8 @@
           <w:p>
             <w:r>
               <w:rPr>
-                <w:sz w:val="17"/>
-                <w:szCs w:val="17"/>
+                <w:sz w:val="20"/>
+                <w:szCs w:val="20"/>
               </w:rPr>
               <w:t>Social perception, attribution, and first impressions</w:t>
             </w:r>
@@ -11372,8 +11372,8 @@
           <w:p>
             <w:r>
               <w:rPr>
-                <w:sz w:val="17"/>
-                <w:szCs w:val="17"/>
+                <w:sz w:val="20"/>
+                <w:szCs w:val="20"/>
               </w:rPr>
               <w:t>Wed Nov 3</w:t>
             </w:r>
@@ -11392,8 +11392,8 @@
           <w:p>
             <w:r>
               <w:rPr>
-                <w:sz w:val="17"/>
-                <w:szCs w:val="17"/>
+                <w:sz w:val="20"/>
+                <w:szCs w:val="20"/>
               </w:rPr>
               <w:t>Lecture 30</w:t>
             </w:r>
@@ -11412,8 +11412,8 @@
           <w:p>
             <w:r>
               <w:rPr>
-                <w:sz w:val="17"/>
-                <w:szCs w:val="17"/>
+                <w:sz w:val="20"/>
+                <w:szCs w:val="20"/>
               </w:rPr>
               <w:t>Conformity, obedience, and social power</w:t>
             </w:r>
@@ -11456,8 +11456,8 @@
           <w:p>
             <w:r>
               <w:rPr>
-                <w:sz w:val="17"/>
-                <w:szCs w:val="17"/>
+                <w:sz w:val="20"/>
+                <w:szCs w:val="20"/>
               </w:rPr>
               <w:t>Fri Nov 5</w:t>
             </w:r>
@@ -11476,8 +11476,8 @@
           <w:p>
             <w:r>
               <w:rPr>
-                <w:sz w:val="17"/>
-                <w:szCs w:val="17"/>
+                <w:sz w:val="20"/>
+                <w:szCs w:val="20"/>
               </w:rPr>
               <w:t>Lecture 31</w:t>
             </w:r>
@@ -11496,8 +11496,8 @@
           <w:p>
             <w:r>
               <w:rPr>
-                <w:sz w:val="17"/>
-                <w:szCs w:val="17"/>
+                <w:sz w:val="20"/>
+                <w:szCs w:val="20"/>
               </w:rPr>
               <w:t>Prejudice, discrimination, and intergroup behavior</w:t>
             </w:r>
@@ -11522,8 +11522,8 @@
             </w:pPr>
             <w:r>
               <w:rPr>
-                <w:sz w:val="16"/>
-                <w:szCs w:val="16"/>
+                <w:sz w:val="20"/>
+                <w:szCs w:val="20"/>
               </w:rPr>
               <w:t>Lab-project proposal due</w:t>
             </w:r>
@@ -11547,8 +11547,8 @@
           <w:p>
             <w:r>
               <w:rPr>
-                <w:sz w:val="17"/>
-                <w:szCs w:val="17"/>
+                <w:sz w:val="20"/>
+                <w:szCs w:val="20"/>
               </w:rPr>
               <w:t>Sun Nov 7</w:t>
             </w:r>
@@ -11567,8 +11567,8 @@
           <w:p>
             <w:r>
               <w:rPr>
-                <w:sz w:val="17"/>
-                <w:szCs w:val="17"/>
+                <w:sz w:val="20"/>
+                <w:szCs w:val="20"/>
               </w:rPr>
               <w:t>Report due</w:t>
             </w:r>
@@ -11587,8 +11587,8 @@
           <w:p>
             <w:r>
               <w:rPr>
-                <w:sz w:val="17"/>
-                <w:szCs w:val="17"/>
+                <w:sz w:val="20"/>
+                <w:szCs w:val="20"/>
               </w:rPr>
               <w:t>Lab 9 report</w:t>
             </w:r>
@@ -11613,8 +11613,8 @@
             </w:pPr>
             <w:r>
               <w:rPr>
-                <w:sz w:val="16"/>
-                <w:szCs w:val="16"/>
+                <w:sz w:val="20"/>
+                <w:szCs w:val="20"/>
               </w:rPr>
               <w:t>Due 11:59 PM</w:t>
             </w:r>
@@ -11638,8 +11638,8 @@
           <w:p>
             <w:r>
               <w:rPr>
-                <w:sz w:val="17"/>
-                <w:szCs w:val="17"/>
+                <w:sz w:val="20"/>
+                <w:szCs w:val="20"/>
               </w:rPr>
               <w:t>Week 12</w:t>
             </w:r>
@@ -11658,8 +11658,8 @@
           <w:p>
             <w:r>
               <w:rPr>
-                <w:sz w:val="17"/>
-                <w:szCs w:val="17"/>
+                <w:sz w:val="20"/>
+                <w:szCs w:val="20"/>
               </w:rPr>
               <w:t>Lab 10</w:t>
             </w:r>
@@ -11678,8 +11678,8 @@
           <w:p>
             <w:r>
               <w:rPr>
-                <w:sz w:val="17"/>
-                <w:szCs w:val="17"/>
+                <w:sz w:val="20"/>
+                <w:szCs w:val="20"/>
               </w:rPr>
               <w:t>Cooperation, social norms, and group decisions</w:t>
             </w:r>
@@ -11704,8 +11704,8 @@
             </w:pPr>
             <w:r>
               <w:rPr>
-                <w:sz w:val="16"/>
-                <w:szCs w:val="16"/>
+                <w:sz w:val="20"/>
+                <w:szCs w:val="20"/>
               </w:rPr>
               <w:t>Meets Nov 8–12; report due Sun Nov 21</w:t>
             </w:r>
@@ -11729,8 +11729,8 @@
           <w:p>
             <w:r>
               <w:rPr>
-                <w:sz w:val="17"/>
-                <w:szCs w:val="17"/>
+                <w:sz w:val="20"/>
+                <w:szCs w:val="20"/>
               </w:rPr>
               <w:t>Mon Nov 8</w:t>
             </w:r>
@@ -11749,8 +11749,8 @@
           <w:p>
             <w:r>
               <w:rPr>
-                <w:sz w:val="17"/>
-                <w:szCs w:val="17"/>
+                <w:sz w:val="20"/>
+                <w:szCs w:val="20"/>
               </w:rPr>
               <w:t>EXAM 3</w:t>
             </w:r>
@@ -11769,8 +11769,8 @@
           <w:p>
             <w:r>
               <w:rPr>
-                <w:sz w:val="17"/>
-                <w:szCs w:val="17"/>
+                <w:sz w:val="20"/>
+                <w:szCs w:val="20"/>
               </w:rPr>
               <w:t>Lectures 21 to 30</w:t>
             </w:r>
@@ -11795,8 +11795,8 @@
             </w:pPr>
             <w:r>
               <w:rPr>
-                <w:sz w:val="16"/>
-                <w:szCs w:val="16"/>
+                <w:sz w:val="20"/>
+                <w:szCs w:val="20"/>
               </w:rPr>
               <w:t>Separate exam session; regular lecture also meets</w:t>
             </w:r>
@@ -11820,8 +11820,8 @@
           <w:p>
             <w:r>
               <w:rPr>
-                <w:sz w:val="17"/>
-                <w:szCs w:val="17"/>
+                <w:sz w:val="20"/>
+                <w:szCs w:val="20"/>
               </w:rPr>
               <w:t>Mon Nov 8</w:t>
             </w:r>
@@ -11840,8 +11840,8 @@
           <w:p>
             <w:r>
               <w:rPr>
-                <w:sz w:val="17"/>
-                <w:szCs w:val="17"/>
+                <w:sz w:val="20"/>
+                <w:szCs w:val="20"/>
               </w:rPr>
               <w:t>Lecture 32</w:t>
             </w:r>
@@ -11860,8 +11860,8 @@
           <w:p>
             <w:r>
               <w:rPr>
-                <w:sz w:val="17"/>
-                <w:szCs w:val="17"/>
+                <w:sz w:val="20"/>
+                <w:szCs w:val="20"/>
               </w:rPr>
               <w:t>Cooperation, helping, and collective action</w:t>
             </w:r>
@@ -11904,8 +11904,8 @@
           <w:p>
             <w:r>
               <w:rPr>
-                <w:sz w:val="17"/>
-                <w:szCs w:val="17"/>
+                <w:sz w:val="20"/>
+                <w:szCs w:val="20"/>
               </w:rPr>
               <w:t>Wed Nov 10</w:t>
             </w:r>
@@ -11924,8 +11924,8 @@
           <w:p>
             <w:r>
               <w:rPr>
-                <w:sz w:val="17"/>
-                <w:szCs w:val="17"/>
+                <w:sz w:val="20"/>
+                <w:szCs w:val="20"/>
               </w:rPr>
               <w:t>Lecture 33</w:t>
             </w:r>
@@ -11944,8 +11944,8 @@
           <w:p>
             <w:r>
               <w:rPr>
-                <w:sz w:val="17"/>
-                <w:szCs w:val="17"/>
+                <w:sz w:val="20"/>
+                <w:szCs w:val="20"/>
               </w:rPr>
               <w:t>Relationships, belonging, and loneliness</w:t>
             </w:r>
@@ -11988,8 +11988,8 @@
           <w:p>
             <w:r>
               <w:rPr>
-                <w:sz w:val="17"/>
-                <w:szCs w:val="17"/>
+                <w:sz w:val="20"/>
+                <w:szCs w:val="20"/>
               </w:rPr>
               <w:t>Thu Nov 11</w:t>
             </w:r>
@@ -12008,8 +12008,8 @@
           <w:p>
             <w:r>
               <w:rPr>
-                <w:sz w:val="17"/>
-                <w:szCs w:val="17"/>
+                <w:sz w:val="20"/>
+                <w:szCs w:val="20"/>
               </w:rPr>
               <w:t>Holiday</w:t>
             </w:r>
@@ -12028,8 +12028,8 @@
           <w:p>
             <w:r>
               <w:rPr>
-                <w:sz w:val="17"/>
-                <w:szCs w:val="17"/>
+                <w:sz w:val="20"/>
+                <w:szCs w:val="20"/>
               </w:rPr>
               <w:t>Veterans Day Holiday (Thursday)</w:t>
             </w:r>
@@ -12054,8 +12054,8 @@
             </w:pPr>
             <w:r>
               <w:rPr>
-                <w:sz w:val="16"/>
-                <w:szCs w:val="16"/>
+                <w:sz w:val="20"/>
+                <w:szCs w:val="20"/>
               </w:rPr>
               <w:t>No class or labs</w:t>
             </w:r>
@@ -12079,8 +12079,8 @@
           <w:p>
             <w:r>
               <w:rPr>
-                <w:sz w:val="17"/>
-                <w:szCs w:val="17"/>
+                <w:sz w:val="20"/>
+                <w:szCs w:val="20"/>
               </w:rPr>
               <w:t>Fri Nov 12</w:t>
             </w:r>
@@ -12099,8 +12099,8 @@
           <w:p>
             <w:r>
               <w:rPr>
-                <w:sz w:val="17"/>
-                <w:szCs w:val="17"/>
+                <w:sz w:val="20"/>
+                <w:szCs w:val="20"/>
               </w:rPr>
               <w:t>Lecture 34</w:t>
             </w:r>
@@ -12119,8 +12119,8 @@
           <w:p>
             <w:r>
               <w:rPr>
-                <w:sz w:val="17"/>
-                <w:szCs w:val="17"/>
+                <w:sz w:val="20"/>
+                <w:szCs w:val="20"/>
               </w:rPr>
               <w:t>Culture, work, and behavior in organizations</w:t>
             </w:r>
@@ -12163,8 +12163,8 @@
           <w:p>
             <w:r>
               <w:rPr>
-                <w:sz w:val="17"/>
-                <w:szCs w:val="17"/>
+                <w:sz w:val="20"/>
+                <w:szCs w:val="20"/>
               </w:rPr>
               <w:t>Week 13</w:t>
             </w:r>
@@ -12183,8 +12183,8 @@
           <w:p>
             <w:r>
               <w:rPr>
-                <w:sz w:val="17"/>
-                <w:szCs w:val="17"/>
+                <w:sz w:val="20"/>
+                <w:szCs w:val="20"/>
               </w:rPr>
               <w:t>Laboratory</w:t>
             </w:r>
@@ -12203,8 +12203,8 @@
           <w:p>
             <w:r>
               <w:rPr>
-                <w:sz w:val="17"/>
-                <w:szCs w:val="17"/>
+                <w:sz w:val="20"/>
+                <w:szCs w:val="20"/>
               </w:rPr>
               <w:t>Mini-replication data session and make-up work</w:t>
             </w:r>
@@ -12229,8 +12229,8 @@
             </w:pPr>
             <w:r>
               <w:rPr>
-                <w:sz w:val="16"/>
-                <w:szCs w:val="16"/>
+                <w:sz w:val="20"/>
+                <w:szCs w:val="20"/>
               </w:rPr>
               <w:t>Checkpoint due Fri Nov 19</w:t>
             </w:r>
@@ -12254,8 +12254,8 @@
           <w:p>
             <w:r>
               <w:rPr>
-                <w:sz w:val="17"/>
-                <w:szCs w:val="17"/>
+                <w:sz w:val="20"/>
+                <w:szCs w:val="20"/>
               </w:rPr>
               <w:t>Mon Nov 15</w:t>
             </w:r>
@@ -12274,8 +12274,8 @@
           <w:p>
             <w:r>
               <w:rPr>
-                <w:sz w:val="17"/>
-                <w:szCs w:val="17"/>
+                <w:sz w:val="20"/>
+                <w:szCs w:val="20"/>
               </w:rPr>
               <w:t>Lecture 35</w:t>
             </w:r>
@@ -12294,8 +12294,8 @@
           <w:p>
             <w:r>
               <w:rPr>
-                <w:sz w:val="17"/>
-                <w:szCs w:val="17"/>
+                <w:sz w:val="20"/>
+                <w:szCs w:val="20"/>
               </w:rPr>
               <w:t>Psychological disorders, assessment, and neurodevelopment</w:t>
             </w:r>
@@ -12338,8 +12338,8 @@
           <w:p>
             <w:r>
               <w:rPr>
-                <w:sz w:val="17"/>
-                <w:szCs w:val="17"/>
+                <w:sz w:val="20"/>
+                <w:szCs w:val="20"/>
               </w:rPr>
               <w:t>Wed Nov 17</w:t>
             </w:r>
@@ -12358,8 +12358,8 @@
           <w:p>
             <w:r>
               <w:rPr>
-                <w:sz w:val="17"/>
-                <w:szCs w:val="17"/>
+                <w:sz w:val="20"/>
+                <w:szCs w:val="20"/>
               </w:rPr>
               <w:t>Lecture 36</w:t>
             </w:r>
@@ -12378,8 +12378,8 @@
           <w:p>
             <w:r>
               <w:rPr>
-                <w:sz w:val="17"/>
-                <w:szCs w:val="17"/>
+                <w:sz w:val="20"/>
+                <w:szCs w:val="20"/>
               </w:rPr>
               <w:t>Anxiety, trauma, and obsessive-compulsive disorders</w:t>
             </w:r>
@@ -12422,8 +12422,8 @@
           <w:p>
             <w:r>
               <w:rPr>
-                <w:sz w:val="17"/>
-                <w:szCs w:val="17"/>
+                <w:sz w:val="20"/>
+                <w:szCs w:val="20"/>
               </w:rPr>
               <w:t>Fri Nov 19</w:t>
             </w:r>
@@ -12442,8 +12442,8 @@
           <w:p>
             <w:r>
               <w:rPr>
-                <w:sz w:val="17"/>
-                <w:szCs w:val="17"/>
+                <w:sz w:val="20"/>
+                <w:szCs w:val="20"/>
               </w:rPr>
               <w:t>Lecture 37</w:t>
             </w:r>
@@ -12462,8 +12462,8 @@
           <w:p>
             <w:r>
               <w:rPr>
-                <w:sz w:val="17"/>
-                <w:szCs w:val="17"/>
+                <w:sz w:val="20"/>
+                <w:szCs w:val="20"/>
               </w:rPr>
               <w:t>Mood disorders: depression and bipolar disorder</w:t>
             </w:r>
@@ -12488,8 +12488,8 @@
             </w:pPr>
             <w:r>
               <w:rPr>
-                <w:sz w:val="16"/>
-                <w:szCs w:val="16"/>
+                <w:sz w:val="20"/>
+                <w:szCs w:val="20"/>
               </w:rPr>
               <w:t>Lecture project final and lab-project checkpoint due</w:t>
             </w:r>
@@ -12513,8 +12513,8 @@
           <w:p>
             <w:r>
               <w:rPr>
-                <w:sz w:val="17"/>
-                <w:szCs w:val="17"/>
+                <w:sz w:val="20"/>
+                <w:szCs w:val="20"/>
               </w:rPr>
               <w:t>Sun Nov 21</w:t>
             </w:r>
@@ -12533,8 +12533,8 @@
           <w:p>
             <w:r>
               <w:rPr>
-                <w:sz w:val="17"/>
-                <w:szCs w:val="17"/>
+                <w:sz w:val="20"/>
+                <w:szCs w:val="20"/>
               </w:rPr>
               <w:t>Report due</w:t>
             </w:r>
@@ -12553,8 +12553,8 @@
           <w:p>
             <w:r>
               <w:rPr>
-                <w:sz w:val="17"/>
-                <w:szCs w:val="17"/>
+                <w:sz w:val="20"/>
+                <w:szCs w:val="20"/>
               </w:rPr>
               <w:t>Lab 10 report</w:t>
             </w:r>
@@ -12579,8 +12579,8 @@
             </w:pPr>
             <w:r>
               <w:rPr>
-                <w:sz w:val="16"/>
-                <w:szCs w:val="16"/>
+                <w:sz w:val="20"/>
+                <w:szCs w:val="20"/>
               </w:rPr>
               <w:t>Due 11:59 PM</w:t>
             </w:r>
@@ -12604,8 +12604,8 @@
           <w:p>
             <w:r>
               <w:rPr>
-                <w:sz w:val="17"/>
-                <w:szCs w:val="17"/>
+                <w:sz w:val="20"/>
+                <w:szCs w:val="20"/>
               </w:rPr>
               <w:t>Week 14</w:t>
             </w:r>
@@ -12624,8 +12624,8 @@
           <w:p>
             <w:r>
               <w:rPr>
-                <w:sz w:val="17"/>
-                <w:szCs w:val="17"/>
+                <w:sz w:val="20"/>
+                <w:szCs w:val="20"/>
               </w:rPr>
               <w:t>Laboratory</w:t>
             </w:r>
@@ -12644,8 +12644,8 @@
           <w:p>
             <w:r>
               <w:rPr>
-                <w:sz w:val="17"/>
-                <w:szCs w:val="17"/>
+                <w:sz w:val="20"/>
+                <w:szCs w:val="20"/>
               </w:rPr>
               <w:t>Thanksgiving week</w:t>
             </w:r>
@@ -12670,8 +12670,8 @@
             </w:pPr>
             <w:r>
               <w:rPr>
-                <w:sz w:val="16"/>
-                <w:szCs w:val="16"/>
+                <w:sz w:val="20"/>
+                <w:szCs w:val="20"/>
               </w:rPr>
               <w:t>No required regular lab this week</w:t>
             </w:r>
@@ -12695,8 +12695,8 @@
           <w:p>
             <w:r>
               <w:rPr>
-                <w:sz w:val="17"/>
-                <w:szCs w:val="17"/>
+                <w:sz w:val="20"/>
+                <w:szCs w:val="20"/>
               </w:rPr>
               <w:t>Mon Nov 22</w:t>
             </w:r>
@@ -12715,8 +12715,8 @@
           <w:p>
             <w:r>
               <w:rPr>
-                <w:sz w:val="17"/>
-                <w:szCs w:val="17"/>
+                <w:sz w:val="20"/>
+                <w:szCs w:val="20"/>
               </w:rPr>
               <w:t>Lecture 38</w:t>
             </w:r>
@@ -12735,8 +12735,8 @@
           <w:p>
             <w:r>
               <w:rPr>
-                <w:sz w:val="17"/>
-                <w:szCs w:val="17"/>
+                <w:sz w:val="20"/>
+                <w:szCs w:val="20"/>
               </w:rPr>
               <w:t>Schizophrenia and psychosis</w:t>
             </w:r>
@@ -12779,8 +12779,8 @@
           <w:p>
             <w:r>
               <w:rPr>
-                <w:sz w:val="17"/>
-                <w:szCs w:val="17"/>
+                <w:sz w:val="20"/>
+                <w:szCs w:val="20"/>
               </w:rPr>
               <w:lastRenderedPageBreak/>
               <w:t>Wed Nov 24</w:t>
@@ -12800,8 +12800,8 @@
           <w:p>
             <w:r>
               <w:rPr>
-                <w:sz w:val="17"/>
-                <w:szCs w:val="17"/>
+                <w:sz w:val="20"/>
+                <w:szCs w:val="20"/>
               </w:rPr>
               <w:t>Holiday</w:t>
             </w:r>
@@ -12820,8 +12820,8 @@
           <w:p>
             <w:r>
               <w:rPr>
-                <w:sz w:val="17"/>
-                <w:szCs w:val="17"/>
+                <w:sz w:val="20"/>
+                <w:szCs w:val="20"/>
               </w:rPr>
               <w:t>Thanksgiving Holiday: November 24–28</w:t>
             </w:r>
@@ -12846,8 +12846,8 @@
             </w:pPr>
             <w:r>
               <w:rPr>
-                <w:sz w:val="16"/>
-                <w:szCs w:val="16"/>
+                <w:sz w:val="20"/>
+                <w:szCs w:val="20"/>
               </w:rPr>
               <w:t>No class or labs</w:t>
             </w:r>
@@ -12871,8 +12871,8 @@
           <w:p>
             <w:r>
               <w:rPr>
-                <w:sz w:val="17"/>
-                <w:szCs w:val="17"/>
+                <w:sz w:val="20"/>
+                <w:szCs w:val="20"/>
               </w:rPr>
               <w:t>Week 15</w:t>
             </w:r>
@@ -12891,8 +12891,8 @@
           <w:p>
             <w:r>
               <w:rPr>
-                <w:sz w:val="17"/>
-                <w:szCs w:val="17"/>
+                <w:sz w:val="20"/>
+                <w:szCs w:val="20"/>
               </w:rPr>
               <w:t>Laboratory</w:t>
             </w:r>
@@ -12911,8 +12911,8 @@
           <w:p>
             <w:r>
               <w:rPr>
-                <w:sz w:val="17"/>
-                <w:szCs w:val="17"/>
+                <w:sz w:val="20"/>
+                <w:szCs w:val="20"/>
               </w:rPr>
               <w:t>Mini-replication presentations in LAB sections</w:t>
             </w:r>
@@ -12937,8 +12937,8 @@
             </w:pPr>
             <w:r>
               <w:rPr>
-                <w:sz w:val="16"/>
-                <w:szCs w:val="16"/>
+                <w:sz w:val="20"/>
+                <w:szCs w:val="20"/>
               </w:rPr>
               <w:t>Final due Fri Dec 3; lectures meet normally</w:t>
             </w:r>
@@ -12962,8 +12962,8 @@
           <w:p>
             <w:r>
               <w:rPr>
-                <w:sz w:val="17"/>
-                <w:szCs w:val="17"/>
+                <w:sz w:val="20"/>
+                <w:szCs w:val="20"/>
               </w:rPr>
               <w:t>Mon Nov 29</w:t>
             </w:r>
@@ -12982,8 +12982,8 @@
           <w:p>
             <w:r>
               <w:rPr>
-                <w:sz w:val="17"/>
-                <w:szCs w:val="17"/>
+                <w:sz w:val="20"/>
+                <w:szCs w:val="20"/>
               </w:rPr>
               <w:t>Lecture 39</w:t>
             </w:r>
@@ -13002,8 +13002,8 @@
           <w:p>
             <w:r>
               <w:rPr>
-                <w:sz w:val="17"/>
-                <w:szCs w:val="17"/>
+                <w:sz w:val="20"/>
+                <w:szCs w:val="20"/>
               </w:rPr>
               <w:t>Dissociative, personality, and eating disorders</w:t>
             </w:r>
@@ -13046,8 +13046,8 @@
           <w:p>
             <w:r>
               <w:rPr>
-                <w:sz w:val="17"/>
-                <w:szCs w:val="17"/>
+                <w:sz w:val="20"/>
+                <w:szCs w:val="20"/>
               </w:rPr>
               <w:t>Wed Dec 1</w:t>
             </w:r>
@@ -13066,8 +13066,8 @@
           <w:p>
             <w:r>
               <w:rPr>
-                <w:sz w:val="17"/>
-                <w:szCs w:val="17"/>
+                <w:sz w:val="20"/>
+                <w:szCs w:val="20"/>
               </w:rPr>
               <w:t>Lecture 40</w:t>
             </w:r>
@@ -13086,8 +13086,8 @@
           <w:p>
             <w:r>
               <w:rPr>
-                <w:sz w:val="17"/>
-                <w:szCs w:val="17"/>
+                <w:sz w:val="20"/>
+                <w:szCs w:val="20"/>
               </w:rPr>
               <w:t>Treatments: psychotherapy, medication, and prevention</w:t>
             </w:r>
@@ -13130,8 +13130,8 @@
           <w:p>
             <w:r>
               <w:rPr>
-                <w:sz w:val="17"/>
-                <w:szCs w:val="17"/>
+                <w:sz w:val="20"/>
+                <w:szCs w:val="20"/>
               </w:rPr>
               <w:t>Fri Dec 3</w:t>
             </w:r>
@@ -13150,8 +13150,8 @@
           <w:p>
             <w:r>
               <w:rPr>
-                <w:sz w:val="17"/>
-                <w:szCs w:val="17"/>
+                <w:sz w:val="20"/>
+                <w:szCs w:val="20"/>
               </w:rPr>
               <w:t>Lecture 41</w:t>
             </w:r>
@@ -13170,8 +13170,8 @@
           <w:p>
             <w:r>
               <w:rPr>
-                <w:sz w:val="17"/>
-                <w:szCs w:val="17"/>
+                <w:sz w:val="20"/>
+                <w:szCs w:val="20"/>
               </w:rPr>
               <w:t>Psychology in the digital world: persuasion, misinformation, and AI</w:t>
             </w:r>
@@ -13196,8 +13196,8 @@
             </w:pPr>
             <w:r>
               <w:rPr>
-                <w:sz w:val="16"/>
-                <w:szCs w:val="16"/>
+                <w:sz w:val="20"/>
+                <w:szCs w:val="20"/>
               </w:rPr>
               <w:t>Lab-project final due</w:t>
             </w:r>
@@ -13221,8 +13221,8 @@
           <w:p>
             <w:r>
               <w:rPr>
-                <w:sz w:val="17"/>
-                <w:szCs w:val="17"/>
+                <w:sz w:val="20"/>
+                <w:szCs w:val="20"/>
               </w:rPr>
               <w:t>Dec 4–7</w:t>
             </w:r>
@@ -13241,8 +13241,8 @@
           <w:p>
             <w:r>
               <w:rPr>
-                <w:sz w:val="17"/>
-                <w:szCs w:val="17"/>
+                <w:sz w:val="20"/>
+                <w:szCs w:val="20"/>
               </w:rPr>
               <w:t>Study Days</w:t>
             </w:r>
@@ -13261,8 +13261,8 @@
           <w:p>
             <w:r>
               <w:rPr>
-                <w:sz w:val="17"/>
-                <w:szCs w:val="17"/>
+                <w:sz w:val="20"/>
+                <w:szCs w:val="20"/>
               </w:rPr>
               <w:t>University study period</w:t>
             </w:r>
@@ -13287,8 +13287,8 @@
             </w:pPr>
             <w:r>
               <w:rPr>
-                <w:sz w:val="16"/>
-                <w:szCs w:val="16"/>
+                <w:sz w:val="20"/>
+                <w:szCs w:val="20"/>
               </w:rPr>
               <w:t>No regular lectures or labs</w:t>
             </w:r>
@@ -13312,8 +13312,8 @@
           <w:p>
             <w:r>
               <w:rPr>
-                <w:sz w:val="17"/>
-                <w:szCs w:val="17"/>
+                <w:sz w:val="20"/>
+                <w:szCs w:val="20"/>
               </w:rPr>
               <w:t>Dec 8–15</w:t>
             </w:r>
@@ -13332,8 +13332,8 @@
           <w:p>
             <w:r>
               <w:rPr>
-                <w:sz w:val="17"/>
-                <w:szCs w:val="17"/>
+                <w:sz w:val="20"/>
+                <w:szCs w:val="20"/>
               </w:rPr>
               <w:t>EXAM 4</w:t>
             </w:r>
@@ -13352,8 +13352,8 @@
           <w:p>
             <w:r>
               <w:rPr>
-                <w:sz w:val="17"/>
-                <w:szCs w:val="17"/>
+                <w:sz w:val="20"/>
+                <w:szCs w:val="20"/>
               </w:rPr>
               <w:t>Lectures 31 to 41</w:t>
             </w:r>
@@ -13378,8 +13378,8 @@
             </w:pPr>
             <w:r>
               <w:rPr>
-                <w:sz w:val="16"/>
-                <w:szCs w:val="16"/>
+                <w:sz w:val="20"/>
+                <w:szCs w:val="20"/>
               </w:rPr>
               <w:t>Assigned date/time: ____________________</w:t>
             </w:r>
@@ -13398,8 +13398,8 @@
           <w:b/>
           <w:bCs/>
           <w:color w:val="1A1A1A"/>
-          <w:sz w:val="24"/>
-          <w:szCs w:val="24"/>
+          <w:sz w:val="20"/>
+          <w:szCs w:val="20"/>
         </w:rPr>
         <w:t>Readings Calendar</w:t>
       </w:r>
@@ -13410,8 +13410,8 @@
       </w:pPr>
       <w:r>
         <w:rPr>
-          <w:sz w:val="24"/>
-          <w:szCs w:val="24"/>
+          <w:sz w:val="20"/>
+          <w:szCs w:val="20"/>
         </w:rPr>
         <w:t>Assigned textbook readings and research articles are required course preparation. The dated reading schedule and article list will be posted on the course site. Complete each assigned reading before the corresponding lecture. Current lecture content defines exam coverage.</w:t>
       </w:r>
@@ -13427,8 +13427,8 @@
           <w:b/>
           <w:bCs/>
           <w:color w:val="1A1A1A"/>
-          <w:sz w:val="24"/>
-          <w:szCs w:val="24"/>
+          <w:sz w:val="20"/>
+          <w:szCs w:val="20"/>
         </w:rPr>
         <w:t>Final Word</w:t>
       </w:r>
@@ -13439,8 +13439,8 @@
       </w:pPr>
       <w:r>
         <w:rPr>
-          <w:sz w:val="24"/>
-          <w:szCs w:val="24"/>
+          <w:sz w:val="20"/>
+          <w:szCs w:val="20"/>
         </w:rPr>
         <w:t>This course asks you to think like a psychological scientist: explain a behavior, examine the experiment, and decide what the evidence supports. If you show up to lecture and lab, review the material regularly, and start early, you will leave with a working understanding of how people perceive, learn, remember, develop, and interact. Be prepared to question an explanation, work carefully with data, and revise a conclusion when the evidence changes.</w:t>
       </w:r>
@@ -13451,7 +13451,8 @@
       </w:pPr>
       <w:r>
         <w:rPr>
-          <w:sz w:val="15"/>
+          <w:sz w:val="20"/>
+          <w:szCs w:val="20"/>
         </w:rPr>
         <w:t>Banner: Tractography of the optic radiation, by Maxime Chamberland, Chantal M. W. Tax, and Derek K. Jones, CC BY 4.0. Source: https://commons.wikimedia.org/wiki/File:Tractography_of_the_optic_radiation.png. License: https://creativecommons.org/licenses/by/4.0/.</w:t>
       </w:r>

</xml_diff>

<commit_message>
Add required textbook readings for all 41 lectures in separate readings calendar
</commit_message>
<xml_diff>
--- a/syllabus/PSYC100_L_Introduction_to_Psychology_Fall_2027_Syllabus.docx
+++ b/syllabus/PSYC100_L_Introduction_to_Psychology_Fall_2027_Syllabus.docx
@@ -13413,9 +13413,4278 @@
           <w:sz w:val="20"/>
           <w:szCs w:val="20"/>
         </w:rPr>
-        <w:t>Assigned textbook readings and research articles are required course preparation. The dated reading schedule and article list will be posted on the course site. Complete each assigned reading before the corresponding lecture. Current lecture content defines exam coverage.</w:t>
+        <w:t>Required textbook readings for each lecture are listed below from Myers, DeWall, and Gruber, Psychology (14th ed.). Complete the listed sections before the corresponding lecture. When a chapter appears more than once, read the specified material for that day; entries marked Review ask you to revisit earlier reading. Section titles follow the textbook contents provided for this course. Lectures build on these concepts and extend into contemporary research and applications. Current lecture content defines exam coverage.</w:t>
       </w:r>
     </w:p>
+    <w:tbl>
+      <w:tblPr>
+        <w:tblStyle w:val="af"/>
+        <w:tblW w:w="10080" w:type="dxa"/>
+        <w:tblBorders>
+          <w:top w:val="single" w:sz="4" w:space="0" w:color="999999"/>
+          <w:left w:val="single" w:sz="4" w:space="0" w:color="999999"/>
+          <w:bottom w:val="single" w:sz="4" w:space="0" w:color="999999"/>
+          <w:right w:val="single" w:sz="4" w:space="0" w:color="999999"/>
+          <w:insideH w:val="single" w:sz="4" w:space="0" w:color="999999"/>
+          <w:insideV w:val="single" w:sz="4" w:space="0" w:color="999999"/>
+        </w:tblBorders>
+        <w:tblLayout w:type="fixed"/>
+        <w:tblLook w:val="0400" w:firstRow="0" w:lastRow="0" w:firstColumn="0" w:lastColumn="0" w:noHBand="0" w:noVBand="1"/>
+      </w:tblPr>
+      <w:tblGrid>
+        <w:gridCol w:w="1200"/>
+        <w:gridCol w:w="1200"/>
+        <w:gridCol w:w="2450"/>
+        <w:gridCol w:w="5230"/>
+      </w:tblGrid>
+      <w:tr>
+        <w:trPr>
+          <w:cantSplit/>
+          <w:tblHeader/>
+        </w:trPr>
+        <w:tc>
+          <w:tcPr>
+            <w:tcW w:w="1200" w:type="dxa"/>
+            <w:shd w:val="clear" w:color="auto" w:fill="F2F2F2"/>
+            <w:tcMar>
+              <w:top w:w="50" w:type="dxa"/>
+              <w:left w:w="80" w:type="dxa"/>
+              <w:bottom w:w="50" w:type="dxa"/>
+              <w:right w:w="80" w:type="dxa"/>
+            </w:tcMar>
+          </w:tcPr>
+          <w:p>
+            <w:pPr>
+              <w:keepNext/>
+            </w:pPr>
+            <w:r>
+              <w:rPr>
+                <w:sz w:val="20"/>
+                <w:szCs w:val="20"/>
+                <w:b/>
+              </w:rPr>
+              <w:t>Date (2027)</w:t>
+            </w:r>
+          </w:p>
+        </w:tc>
+        <w:tc>
+          <w:tcPr>
+            <w:tcW w:w="1200" w:type="dxa"/>
+            <w:shd w:val="clear" w:color="auto" w:fill="F2F2F2"/>
+            <w:tcMar>
+              <w:top w:w="50" w:type="dxa"/>
+              <w:left w:w="80" w:type="dxa"/>
+              <w:bottom w:w="50" w:type="dxa"/>
+              <w:right w:w="80" w:type="dxa"/>
+            </w:tcMar>
+          </w:tcPr>
+          <w:p>
+            <w:pPr>
+              <w:keepNext/>
+            </w:pPr>
+            <w:r>
+              <w:rPr>
+                <w:sz w:val="20"/>
+                <w:szCs w:val="20"/>
+                <w:b/>
+              </w:rPr>
+              <w:t>Session</w:t>
+            </w:r>
+          </w:p>
+        </w:tc>
+        <w:tc>
+          <w:tcPr>
+            <w:tcW w:w="2450" w:type="dxa"/>
+            <w:shd w:val="clear" w:color="auto" w:fill="F2F2F2"/>
+            <w:tcMar>
+              <w:top w:w="50" w:type="dxa"/>
+              <w:left w:w="80" w:type="dxa"/>
+              <w:bottom w:w="50" w:type="dxa"/>
+              <w:right w:w="80" w:type="dxa"/>
+            </w:tcMar>
+          </w:tcPr>
+          <w:p>
+            <w:pPr>
+              <w:keepNext/>
+            </w:pPr>
+            <w:r>
+              <w:rPr>
+                <w:sz w:val="20"/>
+                <w:szCs w:val="20"/>
+                <w:b/>
+              </w:rPr>
+              <w:t>Topic</w:t>
+            </w:r>
+          </w:p>
+        </w:tc>
+        <w:tc>
+          <w:tcPr>
+            <w:tcW w:w="5230" w:type="dxa"/>
+            <w:shd w:val="clear" w:color="auto" w:fill="F2F2F2"/>
+            <w:tcMar>
+              <w:top w:w="50" w:type="dxa"/>
+              <w:left w:w="80" w:type="dxa"/>
+              <w:bottom w:w="50" w:type="dxa"/>
+              <w:right w:w="80" w:type="dxa"/>
+            </w:tcMar>
+          </w:tcPr>
+          <w:p>
+            <w:pPr>
+              <w:keepNext/>
+            </w:pPr>
+            <w:r>
+              <w:rPr>
+                <w:sz w:val="20"/>
+                <w:szCs w:val="20"/>
+                <w:b/>
+              </w:rPr>
+              <w:t>Required Textbook Readings</w:t>
+            </w:r>
+          </w:p>
+        </w:tc>
+      </w:tr>
+      <w:tr>
+        <w:trPr>
+          <w:cantSplit/>
+        </w:trPr>
+        <w:tc>
+          <w:tcPr>
+            <w:tcW w:w="1200" w:type="dxa"/>
+            <w:tcMar>
+              <w:top w:w="50" w:type="dxa"/>
+              <w:left w:w="80" w:type="dxa"/>
+              <w:bottom w:w="50" w:type="dxa"/>
+              <w:right w:w="80" w:type="dxa"/>
+            </w:tcMar>
+          </w:tcPr>
+          <w:p>
+            <w:pPr>
+              <w:keepNext/>
+            </w:pPr>
+            <w:r>
+              <w:rPr>
+                <w:sz w:val="20"/>
+                <w:szCs w:val="20"/>
+              </w:rPr>
+              <w:t>Mon Aug 23</w:t>
+            </w:r>
+          </w:p>
+        </w:tc>
+        <w:tc>
+          <w:tcPr>
+            <w:tcW w:w="1200" w:type="dxa"/>
+            <w:tcMar>
+              <w:top w:w="50" w:type="dxa"/>
+              <w:left w:w="80" w:type="dxa"/>
+              <w:bottom w:w="50" w:type="dxa"/>
+              <w:right w:w="80" w:type="dxa"/>
+            </w:tcMar>
+          </w:tcPr>
+          <w:p>
+            <w:pPr>
+              <w:keepNext/>
+            </w:pPr>
+            <w:r>
+              <w:rPr>
+                <w:sz w:val="20"/>
+                <w:szCs w:val="20"/>
+              </w:rPr>
+              <w:t>Lecture 1</w:t>
+            </w:r>
+          </w:p>
+        </w:tc>
+        <w:tc>
+          <w:tcPr>
+            <w:tcW w:w="2450" w:type="dxa"/>
+            <w:tcMar>
+              <w:top w:w="50" w:type="dxa"/>
+              <w:left w:w="80" w:type="dxa"/>
+              <w:bottom w:w="50" w:type="dxa"/>
+              <w:right w:w="80" w:type="dxa"/>
+            </w:tcMar>
+          </w:tcPr>
+          <w:p>
+            <w:pPr>
+              <w:keepNext/>
+            </w:pPr>
+            <w:r>
+              <w:rPr>
+                <w:sz w:val="20"/>
+                <w:szCs w:val="20"/>
+              </w:rPr>
+              <w:t>Perception, illusions, and the mind’s predictions</w:t>
+            </w:r>
+          </w:p>
+        </w:tc>
+        <w:tc>
+          <w:tcPr>
+            <w:tcW w:w="5230" w:type="dxa"/>
+            <w:tcMar>
+              <w:top w:w="50" w:type="dxa"/>
+              <w:left w:w="80" w:type="dxa"/>
+              <w:bottom w:w="50" w:type="dxa"/>
+              <w:right w:w="80" w:type="dxa"/>
+            </w:tcMar>
+          </w:tcPr>
+          <w:p>
+            <w:pPr>
+              <w:keepNext/>
+              <w:rPr>
+                <w:sz w:val="16"/>
+                <w:szCs w:val="16"/>
+              </w:rPr>
+            </w:pPr>
+            <w:r>
+              <w:rPr>
+                <w:sz w:val="20"/>
+                <w:szCs w:val="20"/>
+              </w:rPr>
+              <w:t>Ch. 1: The History and Scope of Psychology. Ch. 6: Basic Concepts of Sensation and Perception; Vision: Sensory and Perceptual Processing. Focus on perceptual organization, context, and illusions.</w:t>
+            </w:r>
+          </w:p>
+        </w:tc>
+      </w:tr>
+      <w:tr>
+        <w:trPr>
+          <w:cantSplit/>
+        </w:trPr>
+        <w:tc>
+          <w:tcPr>
+            <w:tcW w:w="1200" w:type="dxa"/>
+            <w:tcMar>
+              <w:top w:w="50" w:type="dxa"/>
+              <w:left w:w="80" w:type="dxa"/>
+              <w:bottom w:w="50" w:type="dxa"/>
+              <w:right w:w="80" w:type="dxa"/>
+            </w:tcMar>
+          </w:tcPr>
+          <w:p>
+            <w:pPr>
+              <w:keepNext/>
+            </w:pPr>
+            <w:r>
+              <w:rPr>
+                <w:sz w:val="20"/>
+                <w:szCs w:val="20"/>
+              </w:rPr>
+              <w:t>Wed Aug 25</w:t>
+            </w:r>
+          </w:p>
+        </w:tc>
+        <w:tc>
+          <w:tcPr>
+            <w:tcW w:w="1200" w:type="dxa"/>
+            <w:tcMar>
+              <w:top w:w="50" w:type="dxa"/>
+              <w:left w:w="80" w:type="dxa"/>
+              <w:bottom w:w="50" w:type="dxa"/>
+              <w:right w:w="80" w:type="dxa"/>
+            </w:tcMar>
+          </w:tcPr>
+          <w:p>
+            <w:pPr>
+              <w:keepNext/>
+            </w:pPr>
+            <w:r>
+              <w:rPr>
+                <w:sz w:val="20"/>
+                <w:szCs w:val="20"/>
+              </w:rPr>
+              <w:t>Lecture 2</w:t>
+            </w:r>
+          </w:p>
+        </w:tc>
+        <w:tc>
+          <w:tcPr>
+            <w:tcW w:w="2450" w:type="dxa"/>
+            <w:tcMar>
+              <w:top w:w="50" w:type="dxa"/>
+              <w:left w:w="80" w:type="dxa"/>
+              <w:bottom w:w="50" w:type="dxa"/>
+              <w:right w:w="80" w:type="dxa"/>
+            </w:tcMar>
+          </w:tcPr>
+          <w:p>
+            <w:pPr>
+              <w:keepNext/>
+            </w:pPr>
+            <w:r>
+              <w:rPr>
+                <w:sz w:val="20"/>
+                <w:szCs w:val="20"/>
+              </w:rPr>
+              <w:t>Experiments, causality, and psychological evidence</w:t>
+            </w:r>
+          </w:p>
+        </w:tc>
+        <w:tc>
+          <w:tcPr>
+            <w:tcW w:w="5230" w:type="dxa"/>
+            <w:tcMar>
+              <w:top w:w="50" w:type="dxa"/>
+              <w:left w:w="80" w:type="dxa"/>
+              <w:bottom w:w="50" w:type="dxa"/>
+              <w:right w:w="80" w:type="dxa"/>
+            </w:tcMar>
+          </w:tcPr>
+          <w:p>
+            <w:pPr>
+              <w:keepNext/>
+              <w:rPr>
+                <w:sz w:val="16"/>
+                <w:szCs w:val="16"/>
+              </w:rPr>
+            </w:pPr>
+            <w:r>
+              <w:rPr>
+                <w:sz w:val="20"/>
+                <w:szCs w:val="20"/>
+              </w:rPr>
+              <w:t>Ch. 1: Research Strategies: How Psychologists Ask and Answer Questions; Statistical Reasoning in Everyday Life. Focus on experimental control, correlation, sampling, and interpreting evidence.</w:t>
+            </w:r>
+          </w:p>
+        </w:tc>
+      </w:tr>
+      <w:tr>
+        <w:trPr>
+          <w:cantSplit/>
+        </w:trPr>
+        <w:tc>
+          <w:tcPr>
+            <w:tcW w:w="1200" w:type="dxa"/>
+            <w:tcMar>
+              <w:top w:w="50" w:type="dxa"/>
+              <w:left w:w="80" w:type="dxa"/>
+              <w:bottom w:w="50" w:type="dxa"/>
+              <w:right w:w="80" w:type="dxa"/>
+            </w:tcMar>
+          </w:tcPr>
+          <w:p>
+            <w:pPr>
+              <w:keepNext/>
+            </w:pPr>
+            <w:r>
+              <w:rPr>
+                <w:sz w:val="20"/>
+                <w:szCs w:val="20"/>
+              </w:rPr>
+              <w:t>Fri Aug 27</w:t>
+            </w:r>
+          </w:p>
+        </w:tc>
+        <w:tc>
+          <w:tcPr>
+            <w:tcW w:w="1200" w:type="dxa"/>
+            <w:tcMar>
+              <w:top w:w="50" w:type="dxa"/>
+              <w:left w:w="80" w:type="dxa"/>
+              <w:bottom w:w="50" w:type="dxa"/>
+              <w:right w:w="80" w:type="dxa"/>
+            </w:tcMar>
+          </w:tcPr>
+          <w:p>
+            <w:pPr>
+              <w:keepNext/>
+            </w:pPr>
+            <w:r>
+              <w:rPr>
+                <w:sz w:val="20"/>
+                <w:szCs w:val="20"/>
+              </w:rPr>
+              <w:t>Lecture 3</w:t>
+            </w:r>
+          </w:p>
+        </w:tc>
+        <w:tc>
+          <w:tcPr>
+            <w:tcW w:w="2450" w:type="dxa"/>
+            <w:tcMar>
+              <w:top w:w="50" w:type="dxa"/>
+              <w:left w:w="80" w:type="dxa"/>
+              <w:bottom w:w="50" w:type="dxa"/>
+              <w:right w:w="80" w:type="dxa"/>
+            </w:tcMar>
+          </w:tcPr>
+          <w:p>
+            <w:pPr>
+              <w:keepNext/>
+            </w:pPr>
+            <w:r>
+              <w:rPr>
+                <w:sz w:val="20"/>
+                <w:szCs w:val="20"/>
+              </w:rPr>
+              <w:t>Neurons, networks, and the biology of behavior</w:t>
+            </w:r>
+          </w:p>
+        </w:tc>
+        <w:tc>
+          <w:tcPr>
+            <w:tcW w:w="5230" w:type="dxa"/>
+            <w:tcMar>
+              <w:top w:w="50" w:type="dxa"/>
+              <w:left w:w="80" w:type="dxa"/>
+              <w:bottom w:w="50" w:type="dxa"/>
+              <w:right w:w="80" w:type="dxa"/>
+            </w:tcMar>
+          </w:tcPr>
+          <w:p>
+            <w:pPr>
+              <w:keepNext/>
+              <w:rPr>
+                <w:sz w:val="16"/>
+                <w:szCs w:val="16"/>
+              </w:rPr>
+            </w:pPr>
+            <w:r>
+              <w:rPr>
+                <w:sz w:val="20"/>
+                <w:szCs w:val="20"/>
+              </w:rPr>
+              <w:t>Ch. 2: Neural and Hormonal Systems; Tools of Discovery: Having Our Head Examined; Brain Regions and Structures.</w:t>
+            </w:r>
+          </w:p>
+        </w:tc>
+      </w:tr>
+      <w:tr>
+        <w:trPr>
+          <w:cantSplit/>
+        </w:trPr>
+        <w:tc>
+          <w:tcPr>
+            <w:tcW w:w="1200" w:type="dxa"/>
+            <w:tcMar>
+              <w:top w:w="50" w:type="dxa"/>
+              <w:left w:w="80" w:type="dxa"/>
+              <w:bottom w:w="50" w:type="dxa"/>
+              <w:right w:w="80" w:type="dxa"/>
+            </w:tcMar>
+          </w:tcPr>
+          <w:p>
+            <w:pPr>
+              <w:keepNext/>
+            </w:pPr>
+            <w:r>
+              <w:rPr>
+                <w:sz w:val="20"/>
+                <w:szCs w:val="20"/>
+              </w:rPr>
+              <w:t>Mon Aug 30</w:t>
+            </w:r>
+          </w:p>
+        </w:tc>
+        <w:tc>
+          <w:tcPr>
+            <w:tcW w:w="1200" w:type="dxa"/>
+            <w:tcMar>
+              <w:top w:w="50" w:type="dxa"/>
+              <w:left w:w="80" w:type="dxa"/>
+              <w:bottom w:w="50" w:type="dxa"/>
+              <w:right w:w="80" w:type="dxa"/>
+            </w:tcMar>
+          </w:tcPr>
+          <w:p>
+            <w:pPr>
+              <w:keepNext/>
+            </w:pPr>
+            <w:r>
+              <w:rPr>
+                <w:sz w:val="20"/>
+                <w:szCs w:val="20"/>
+              </w:rPr>
+              <w:t>Lecture 4</w:t>
+            </w:r>
+          </w:p>
+        </w:tc>
+        <w:tc>
+          <w:tcPr>
+            <w:tcW w:w="2450" w:type="dxa"/>
+            <w:tcMar>
+              <w:top w:w="50" w:type="dxa"/>
+              <w:left w:w="80" w:type="dxa"/>
+              <w:bottom w:w="50" w:type="dxa"/>
+              <w:right w:w="80" w:type="dxa"/>
+            </w:tcMar>
+          </w:tcPr>
+          <w:p>
+            <w:pPr>
+              <w:keepNext/>
+            </w:pPr>
+            <w:r>
+              <w:rPr>
+                <w:sz w:val="20"/>
+                <w:szCs w:val="20"/>
+              </w:rPr>
+              <w:t>Brain damage, plasticity, and the divided mind</w:t>
+            </w:r>
+          </w:p>
+        </w:tc>
+        <w:tc>
+          <w:tcPr>
+            <w:tcW w:w="5230" w:type="dxa"/>
+            <w:tcMar>
+              <w:top w:w="50" w:type="dxa"/>
+              <w:left w:w="80" w:type="dxa"/>
+              <w:bottom w:w="50" w:type="dxa"/>
+              <w:right w:w="80" w:type="dxa"/>
+            </w:tcMar>
+          </w:tcPr>
+          <w:p>
+            <w:pPr>
+              <w:keepNext/>
+              <w:rPr>
+                <w:sz w:val="16"/>
+                <w:szCs w:val="16"/>
+              </w:rPr>
+            </w:pPr>
+            <w:r>
+              <w:rPr>
+                <w:sz w:val="20"/>
+                <w:szCs w:val="20"/>
+              </w:rPr>
+              <w:t>Ch. 2: Damage Responses and Brain Hemispheres. Review Brain Regions and Structures for the functions discussed in lecture.</w:t>
+            </w:r>
+          </w:p>
+        </w:tc>
+      </w:tr>
+      <w:tr>
+        <w:trPr>
+          <w:cantSplit/>
+        </w:trPr>
+        <w:tc>
+          <w:tcPr>
+            <w:tcW w:w="1200" w:type="dxa"/>
+            <w:tcMar>
+              <w:top w:w="50" w:type="dxa"/>
+              <w:left w:w="80" w:type="dxa"/>
+              <w:bottom w:w="50" w:type="dxa"/>
+              <w:right w:w="80" w:type="dxa"/>
+            </w:tcMar>
+          </w:tcPr>
+          <w:p>
+            <w:pPr>
+              <w:keepNext/>
+            </w:pPr>
+            <w:r>
+              <w:rPr>
+                <w:sz w:val="20"/>
+                <w:szCs w:val="20"/>
+              </w:rPr>
+              <w:t>Wed Sep 1</w:t>
+            </w:r>
+          </w:p>
+        </w:tc>
+        <w:tc>
+          <w:tcPr>
+            <w:tcW w:w="1200" w:type="dxa"/>
+            <w:tcMar>
+              <w:top w:w="50" w:type="dxa"/>
+              <w:left w:w="80" w:type="dxa"/>
+              <w:bottom w:w="50" w:type="dxa"/>
+              <w:right w:w="80" w:type="dxa"/>
+            </w:tcMar>
+          </w:tcPr>
+          <w:p>
+            <w:pPr>
+              <w:keepNext/>
+            </w:pPr>
+            <w:r>
+              <w:rPr>
+                <w:sz w:val="20"/>
+                <w:szCs w:val="20"/>
+              </w:rPr>
+              <w:t>Lecture 5</w:t>
+            </w:r>
+          </w:p>
+        </w:tc>
+        <w:tc>
+          <w:tcPr>
+            <w:tcW w:w="2450" w:type="dxa"/>
+            <w:tcMar>
+              <w:top w:w="50" w:type="dxa"/>
+              <w:left w:w="80" w:type="dxa"/>
+              <w:bottom w:w="50" w:type="dxa"/>
+              <w:right w:w="80" w:type="dxa"/>
+            </w:tcMar>
+          </w:tcPr>
+          <w:p>
+            <w:pPr>
+              <w:keepNext/>
+            </w:pPr>
+            <w:r>
+              <w:rPr>
+                <w:sz w:val="20"/>
+                <w:szCs w:val="20"/>
+              </w:rPr>
+              <w:t>Genes, experience, and human differences</w:t>
+            </w:r>
+          </w:p>
+        </w:tc>
+        <w:tc>
+          <w:tcPr>
+            <w:tcW w:w="5230" w:type="dxa"/>
+            <w:tcMar>
+              <w:top w:w="50" w:type="dxa"/>
+              <w:left w:w="80" w:type="dxa"/>
+              <w:bottom w:w="50" w:type="dxa"/>
+              <w:right w:w="80" w:type="dxa"/>
+            </w:tcMar>
+          </w:tcPr>
+          <w:p>
+            <w:pPr>
+              <w:keepNext/>
+              <w:rPr>
+                <w:sz w:val="16"/>
+                <w:szCs w:val="16"/>
+              </w:rPr>
+            </w:pPr>
+            <w:r>
+              <w:rPr>
+                <w:sz w:val="20"/>
+                <w:szCs w:val="20"/>
+              </w:rPr>
+              <w:t>Ch. 4: Behavior Genetics: Predicting Individual Differences; Evolutionary Psychology: Explaining Human Nature and Nurture. Read the nature–nurture material in Cultural and Gender Diversity.</w:t>
+            </w:r>
+          </w:p>
+        </w:tc>
+      </w:tr>
+      <w:tr>
+        <w:trPr>
+          <w:cantSplit/>
+        </w:trPr>
+        <w:tc>
+          <w:tcPr>
+            <w:tcW w:w="1200" w:type="dxa"/>
+            <w:tcMar>
+              <w:top w:w="50" w:type="dxa"/>
+              <w:left w:w="80" w:type="dxa"/>
+              <w:bottom w:w="50" w:type="dxa"/>
+              <w:right w:w="80" w:type="dxa"/>
+            </w:tcMar>
+          </w:tcPr>
+          <w:p>
+            <w:pPr>
+              <w:keepNext/>
+            </w:pPr>
+            <w:r>
+              <w:rPr>
+                <w:sz w:val="20"/>
+                <w:szCs w:val="20"/>
+              </w:rPr>
+              <w:t>Fri Sep 3</w:t>
+            </w:r>
+          </w:p>
+        </w:tc>
+        <w:tc>
+          <w:tcPr>
+            <w:tcW w:w="1200" w:type="dxa"/>
+            <w:tcMar>
+              <w:top w:w="50" w:type="dxa"/>
+              <w:left w:w="80" w:type="dxa"/>
+              <w:bottom w:w="50" w:type="dxa"/>
+              <w:right w:w="80" w:type="dxa"/>
+            </w:tcMar>
+          </w:tcPr>
+          <w:p>
+            <w:pPr>
+              <w:keepNext/>
+            </w:pPr>
+            <w:r>
+              <w:rPr>
+                <w:sz w:val="20"/>
+                <w:szCs w:val="20"/>
+              </w:rPr>
+              <w:t>Lecture 6</w:t>
+            </w:r>
+          </w:p>
+        </w:tc>
+        <w:tc>
+          <w:tcPr>
+            <w:tcW w:w="2450" w:type="dxa"/>
+            <w:tcMar>
+              <w:top w:w="50" w:type="dxa"/>
+              <w:left w:w="80" w:type="dxa"/>
+              <w:bottom w:w="50" w:type="dxa"/>
+              <w:right w:w="80" w:type="dxa"/>
+            </w:tcMar>
+          </w:tcPr>
+          <w:p>
+            <w:pPr>
+              <w:keepNext/>
+            </w:pPr>
+            <w:r>
+              <w:rPr>
+                <w:sz w:val="20"/>
+                <w:szCs w:val="20"/>
+              </w:rPr>
+              <w:t>Seeing, hearing, and detecting weak signals</w:t>
+            </w:r>
+          </w:p>
+        </w:tc>
+        <w:tc>
+          <w:tcPr>
+            <w:tcW w:w="5230" w:type="dxa"/>
+            <w:tcMar>
+              <w:top w:w="50" w:type="dxa"/>
+              <w:left w:w="80" w:type="dxa"/>
+              <w:bottom w:w="50" w:type="dxa"/>
+              <w:right w:w="80" w:type="dxa"/>
+            </w:tcMar>
+          </w:tcPr>
+          <w:p>
+            <w:pPr>
+              <w:keepNext/>
+              <w:rPr>
+                <w:sz w:val="16"/>
+                <w:szCs w:val="16"/>
+              </w:rPr>
+            </w:pPr>
+            <w:r>
+              <w:rPr>
+                <w:sz w:val="20"/>
+                <w:szCs w:val="20"/>
+              </w:rPr>
+              <w:t>Ch. 6: Basic Concepts of Sensation and Perception; Vision: Sensory and Perceptual Processing; Hearing, Skin, Chemical, and Body Senses. Focus on thresholds, signal detection, and sensory processing.</w:t>
+            </w:r>
+          </w:p>
+        </w:tc>
+      </w:tr>
+      <w:tr>
+        <w:trPr>
+          <w:cantSplit/>
+        </w:trPr>
+        <w:tc>
+          <w:tcPr>
+            <w:tcW w:w="1200" w:type="dxa"/>
+            <w:tcMar>
+              <w:top w:w="50" w:type="dxa"/>
+              <w:left w:w="80" w:type="dxa"/>
+              <w:bottom w:w="50" w:type="dxa"/>
+              <w:right w:w="80" w:type="dxa"/>
+            </w:tcMar>
+          </w:tcPr>
+          <w:p>
+            <w:pPr>
+              <w:keepNext/>
+            </w:pPr>
+            <w:r>
+              <w:rPr>
+                <w:sz w:val="20"/>
+                <w:szCs w:val="20"/>
+              </w:rPr>
+              <w:t>Wed Sep 8</w:t>
+            </w:r>
+          </w:p>
+        </w:tc>
+        <w:tc>
+          <w:tcPr>
+            <w:tcW w:w="1200" w:type="dxa"/>
+            <w:tcMar>
+              <w:top w:w="50" w:type="dxa"/>
+              <w:left w:w="80" w:type="dxa"/>
+              <w:bottom w:w="50" w:type="dxa"/>
+              <w:right w:w="80" w:type="dxa"/>
+            </w:tcMar>
+          </w:tcPr>
+          <w:p>
+            <w:pPr>
+              <w:keepNext/>
+            </w:pPr>
+            <w:r>
+              <w:rPr>
+                <w:sz w:val="20"/>
+                <w:szCs w:val="20"/>
+              </w:rPr>
+              <w:t>Lecture 7</w:t>
+            </w:r>
+          </w:p>
+        </w:tc>
+        <w:tc>
+          <w:tcPr>
+            <w:tcW w:w="2450" w:type="dxa"/>
+            <w:tcMar>
+              <w:top w:w="50" w:type="dxa"/>
+              <w:left w:w="80" w:type="dxa"/>
+              <w:bottom w:w="50" w:type="dxa"/>
+              <w:right w:w="80" w:type="dxa"/>
+            </w:tcMar>
+          </w:tcPr>
+          <w:p>
+            <w:pPr>
+              <w:keepNext/>
+            </w:pPr>
+            <w:r>
+              <w:rPr>
+                <w:sz w:val="20"/>
+                <w:szCs w:val="20"/>
+              </w:rPr>
+              <w:t>Attention, distraction, and failures of awareness</w:t>
+            </w:r>
+          </w:p>
+        </w:tc>
+        <w:tc>
+          <w:tcPr>
+            <w:tcW w:w="5230" w:type="dxa"/>
+            <w:tcMar>
+              <w:top w:w="50" w:type="dxa"/>
+              <w:left w:w="80" w:type="dxa"/>
+              <w:bottom w:w="50" w:type="dxa"/>
+              <w:right w:w="80" w:type="dxa"/>
+            </w:tcMar>
+          </w:tcPr>
+          <w:p>
+            <w:pPr>
+              <w:keepNext/>
+              <w:rPr>
+                <w:sz w:val="16"/>
+                <w:szCs w:val="16"/>
+              </w:rPr>
+            </w:pPr>
+            <w:r>
+              <w:rPr>
+                <w:sz w:val="20"/>
+                <w:szCs w:val="20"/>
+              </w:rPr>
+              <w:t>Ch. 3: Basic Consciousness Concepts. Focus on selective attention, divided attention, inattentional blindness, and change blindness.</w:t>
+            </w:r>
+          </w:p>
+        </w:tc>
+      </w:tr>
+      <w:tr>
+        <w:trPr>
+          <w:cantSplit/>
+        </w:trPr>
+        <w:tc>
+          <w:tcPr>
+            <w:tcW w:w="1200" w:type="dxa"/>
+            <w:tcMar>
+              <w:top w:w="50" w:type="dxa"/>
+              <w:left w:w="80" w:type="dxa"/>
+              <w:bottom w:w="50" w:type="dxa"/>
+              <w:right w:w="80" w:type="dxa"/>
+            </w:tcMar>
+          </w:tcPr>
+          <w:p>
+            <w:pPr>
+              <w:keepNext/>
+            </w:pPr>
+            <w:r>
+              <w:rPr>
+                <w:sz w:val="20"/>
+                <w:szCs w:val="20"/>
+              </w:rPr>
+              <w:t>Fri Sep 10</w:t>
+            </w:r>
+          </w:p>
+        </w:tc>
+        <w:tc>
+          <w:tcPr>
+            <w:tcW w:w="1200" w:type="dxa"/>
+            <w:tcMar>
+              <w:top w:w="50" w:type="dxa"/>
+              <w:left w:w="80" w:type="dxa"/>
+              <w:bottom w:w="50" w:type="dxa"/>
+              <w:right w:w="80" w:type="dxa"/>
+            </w:tcMar>
+          </w:tcPr>
+          <w:p>
+            <w:pPr>
+              <w:keepNext/>
+            </w:pPr>
+            <w:r>
+              <w:rPr>
+                <w:sz w:val="20"/>
+                <w:szCs w:val="20"/>
+              </w:rPr>
+              <w:t>Lecture 8</w:t>
+            </w:r>
+          </w:p>
+        </w:tc>
+        <w:tc>
+          <w:tcPr>
+            <w:tcW w:w="2450" w:type="dxa"/>
+            <w:tcMar>
+              <w:top w:w="50" w:type="dxa"/>
+              <w:left w:w="80" w:type="dxa"/>
+              <w:bottom w:w="50" w:type="dxa"/>
+              <w:right w:w="80" w:type="dxa"/>
+            </w:tcMar>
+          </w:tcPr>
+          <w:p>
+            <w:pPr>
+              <w:keepNext/>
+            </w:pPr>
+            <w:r>
+              <w:rPr>
+                <w:sz w:val="20"/>
+                <w:szCs w:val="20"/>
+              </w:rPr>
+              <w:t>Consciousness, unconscious processing, and agency</w:t>
+            </w:r>
+          </w:p>
+        </w:tc>
+        <w:tc>
+          <w:tcPr>
+            <w:tcW w:w="5230" w:type="dxa"/>
+            <w:tcMar>
+              <w:top w:w="50" w:type="dxa"/>
+              <w:left w:w="80" w:type="dxa"/>
+              <w:bottom w:w="50" w:type="dxa"/>
+              <w:right w:w="80" w:type="dxa"/>
+            </w:tcMar>
+          </w:tcPr>
+          <w:p>
+            <w:pPr>
+              <w:keepNext/>
+              <w:rPr>
+                <w:sz w:val="16"/>
+                <w:szCs w:val="16"/>
+              </w:rPr>
+            </w:pPr>
+            <w:r>
+              <w:rPr>
+                <w:sz w:val="20"/>
+                <w:szCs w:val="20"/>
+              </w:rPr>
+              <w:t>Ch. 3: Basic Consciousness Concepts. Focus on conscious and unconscious processing and the two-track mind; review the attention material from Lecture 7.</w:t>
+            </w:r>
+          </w:p>
+        </w:tc>
+      </w:tr>
+      <w:tr>
+        <w:trPr>
+          <w:cantSplit/>
+        </w:trPr>
+        <w:tc>
+          <w:tcPr>
+            <w:tcW w:w="1200" w:type="dxa"/>
+            <w:tcMar>
+              <w:top w:w="50" w:type="dxa"/>
+              <w:left w:w="80" w:type="dxa"/>
+              <w:bottom w:w="50" w:type="dxa"/>
+              <w:right w:w="80" w:type="dxa"/>
+            </w:tcMar>
+          </w:tcPr>
+          <w:p>
+            <w:pPr>
+              <w:keepNext/>
+            </w:pPr>
+            <w:r>
+              <w:rPr>
+                <w:sz w:val="20"/>
+                <w:szCs w:val="20"/>
+              </w:rPr>
+              <w:t>Mon Sep 13</w:t>
+            </w:r>
+          </w:p>
+        </w:tc>
+        <w:tc>
+          <w:tcPr>
+            <w:tcW w:w="1200" w:type="dxa"/>
+            <w:tcMar>
+              <w:top w:w="50" w:type="dxa"/>
+              <w:left w:w="80" w:type="dxa"/>
+              <w:bottom w:w="50" w:type="dxa"/>
+              <w:right w:w="80" w:type="dxa"/>
+            </w:tcMar>
+          </w:tcPr>
+          <w:p>
+            <w:pPr>
+              <w:keepNext/>
+            </w:pPr>
+            <w:r>
+              <w:rPr>
+                <w:sz w:val="20"/>
+                <w:szCs w:val="20"/>
+              </w:rPr>
+              <w:t>Lecture 9</w:t>
+            </w:r>
+          </w:p>
+        </w:tc>
+        <w:tc>
+          <w:tcPr>
+            <w:tcW w:w="2450" w:type="dxa"/>
+            <w:tcMar>
+              <w:top w:w="50" w:type="dxa"/>
+              <w:left w:w="80" w:type="dxa"/>
+              <w:bottom w:w="50" w:type="dxa"/>
+              <w:right w:w="80" w:type="dxa"/>
+            </w:tcMar>
+          </w:tcPr>
+          <w:p>
+            <w:pPr>
+              <w:keepNext/>
+            </w:pPr>
+            <w:r>
+              <w:rPr>
+                <w:sz w:val="20"/>
+                <w:szCs w:val="20"/>
+              </w:rPr>
+              <w:t>Sleep, dreaming, and biological clocks</w:t>
+            </w:r>
+          </w:p>
+        </w:tc>
+        <w:tc>
+          <w:tcPr>
+            <w:tcW w:w="5230" w:type="dxa"/>
+            <w:tcMar>
+              <w:top w:w="50" w:type="dxa"/>
+              <w:left w:w="80" w:type="dxa"/>
+              <w:bottom w:w="50" w:type="dxa"/>
+              <w:right w:w="80" w:type="dxa"/>
+            </w:tcMar>
+          </w:tcPr>
+          <w:p>
+            <w:pPr>
+              <w:keepNext/>
+              <w:rPr>
+                <w:sz w:val="16"/>
+                <w:szCs w:val="16"/>
+              </w:rPr>
+            </w:pPr>
+            <w:r>
+              <w:rPr>
+                <w:sz w:val="20"/>
+                <w:szCs w:val="20"/>
+              </w:rPr>
+              <w:t>Ch. 3: Sleep and Dreams.</w:t>
+            </w:r>
+          </w:p>
+        </w:tc>
+      </w:tr>
+      <w:tr>
+        <w:trPr>
+          <w:cantSplit/>
+        </w:trPr>
+        <w:tc>
+          <w:tcPr>
+            <w:tcW w:w="1200" w:type="dxa"/>
+            <w:tcMar>
+              <w:top w:w="50" w:type="dxa"/>
+              <w:left w:w="80" w:type="dxa"/>
+              <w:bottom w:w="50" w:type="dxa"/>
+              <w:right w:w="80" w:type="dxa"/>
+            </w:tcMar>
+          </w:tcPr>
+          <w:p>
+            <w:pPr>
+              <w:keepNext/>
+            </w:pPr>
+            <w:r>
+              <w:rPr>
+                <w:sz w:val="20"/>
+                <w:szCs w:val="20"/>
+              </w:rPr>
+              <w:t>Wed Sep 15</w:t>
+            </w:r>
+          </w:p>
+        </w:tc>
+        <w:tc>
+          <w:tcPr>
+            <w:tcW w:w="1200" w:type="dxa"/>
+            <w:tcMar>
+              <w:top w:w="50" w:type="dxa"/>
+              <w:left w:w="80" w:type="dxa"/>
+              <w:bottom w:w="50" w:type="dxa"/>
+              <w:right w:w="80" w:type="dxa"/>
+            </w:tcMar>
+          </w:tcPr>
+          <w:p>
+            <w:pPr>
+              <w:keepNext/>
+            </w:pPr>
+            <w:r>
+              <w:rPr>
+                <w:sz w:val="20"/>
+                <w:szCs w:val="20"/>
+              </w:rPr>
+              <w:t>Lecture 10</w:t>
+            </w:r>
+          </w:p>
+        </w:tc>
+        <w:tc>
+          <w:tcPr>
+            <w:tcW w:w="2450" w:type="dxa"/>
+            <w:tcMar>
+              <w:top w:w="50" w:type="dxa"/>
+              <w:left w:w="80" w:type="dxa"/>
+              <w:bottom w:w="50" w:type="dxa"/>
+              <w:right w:w="80" w:type="dxa"/>
+            </w:tcMar>
+          </w:tcPr>
+          <w:p>
+            <w:pPr>
+              <w:keepNext/>
+            </w:pPr>
+            <w:r>
+              <w:rPr>
+                <w:sz w:val="20"/>
+                <w:szCs w:val="20"/>
+              </w:rPr>
+              <w:t>Drugs, reward, and addiction</w:t>
+            </w:r>
+          </w:p>
+        </w:tc>
+        <w:tc>
+          <w:tcPr>
+            <w:tcW w:w="5230" w:type="dxa"/>
+            <w:tcMar>
+              <w:top w:w="50" w:type="dxa"/>
+              <w:left w:w="80" w:type="dxa"/>
+              <w:bottom w:w="50" w:type="dxa"/>
+              <w:right w:w="80" w:type="dxa"/>
+            </w:tcMar>
+          </w:tcPr>
+          <w:p>
+            <w:pPr>
+              <w:keepNext/>
+              <w:rPr>
+                <w:sz w:val="16"/>
+                <w:szCs w:val="16"/>
+              </w:rPr>
+            </w:pPr>
+            <w:r>
+              <w:rPr>
+                <w:sz w:val="20"/>
+                <w:szCs w:val="20"/>
+              </w:rPr>
+              <w:t>Ch. 3: Drugs and Consciousness. Focus on psychoactive drugs, tolerance, dependence, and addiction.</w:t>
+            </w:r>
+          </w:p>
+        </w:tc>
+      </w:tr>
+      <w:tr>
+        <w:trPr>
+          <w:cantSplit/>
+        </w:trPr>
+        <w:tc>
+          <w:tcPr>
+            <w:tcW w:w="1200" w:type="dxa"/>
+            <w:tcMar>
+              <w:top w:w="50" w:type="dxa"/>
+              <w:left w:w="80" w:type="dxa"/>
+              <w:bottom w:w="50" w:type="dxa"/>
+              <w:right w:w="80" w:type="dxa"/>
+            </w:tcMar>
+          </w:tcPr>
+          <w:p>
+            <w:pPr>
+              <w:keepNext/>
+            </w:pPr>
+            <w:r>
+              <w:rPr>
+                <w:sz w:val="20"/>
+                <w:szCs w:val="20"/>
+              </w:rPr>
+              <w:t>Fri Sep 17</w:t>
+            </w:r>
+          </w:p>
+        </w:tc>
+        <w:tc>
+          <w:tcPr>
+            <w:tcW w:w="1200" w:type="dxa"/>
+            <w:tcMar>
+              <w:top w:w="50" w:type="dxa"/>
+              <w:left w:w="80" w:type="dxa"/>
+              <w:bottom w:w="50" w:type="dxa"/>
+              <w:right w:w="80" w:type="dxa"/>
+            </w:tcMar>
+          </w:tcPr>
+          <w:p>
+            <w:pPr>
+              <w:keepNext/>
+            </w:pPr>
+            <w:r>
+              <w:rPr>
+                <w:sz w:val="20"/>
+                <w:szCs w:val="20"/>
+              </w:rPr>
+              <w:t>Lecture 11</w:t>
+            </w:r>
+          </w:p>
+        </w:tc>
+        <w:tc>
+          <w:tcPr>
+            <w:tcW w:w="2450" w:type="dxa"/>
+            <w:tcMar>
+              <w:top w:w="50" w:type="dxa"/>
+              <w:left w:w="80" w:type="dxa"/>
+              <w:bottom w:w="50" w:type="dxa"/>
+              <w:right w:w="80" w:type="dxa"/>
+            </w:tcMar>
+          </w:tcPr>
+          <w:p>
+            <w:pPr>
+              <w:keepNext/>
+            </w:pPr>
+            <w:r>
+              <w:rPr>
+                <w:sz w:val="20"/>
+                <w:szCs w:val="20"/>
+              </w:rPr>
+              <w:t>Classical conditioning: learning predictive relationships</w:t>
+            </w:r>
+          </w:p>
+        </w:tc>
+        <w:tc>
+          <w:tcPr>
+            <w:tcW w:w="5230" w:type="dxa"/>
+            <w:tcMar>
+              <w:top w:w="50" w:type="dxa"/>
+              <w:left w:w="80" w:type="dxa"/>
+              <w:bottom w:w="50" w:type="dxa"/>
+              <w:right w:w="80" w:type="dxa"/>
+            </w:tcMar>
+          </w:tcPr>
+          <w:p>
+            <w:pPr>
+              <w:keepNext/>
+              <w:rPr>
+                <w:sz w:val="16"/>
+                <w:szCs w:val="16"/>
+              </w:rPr>
+            </w:pPr>
+            <w:r>
+              <w:rPr>
+                <w:sz w:val="20"/>
+                <w:szCs w:val="20"/>
+              </w:rPr>
+              <w:t>Ch. 7: Basic Learning Concepts and Classical Conditioning.</w:t>
+            </w:r>
+          </w:p>
+        </w:tc>
+      </w:tr>
+      <w:tr>
+        <w:trPr>
+          <w:cantSplit/>
+        </w:trPr>
+        <w:tc>
+          <w:tcPr>
+            <w:tcW w:w="1200" w:type="dxa"/>
+            <w:tcMar>
+              <w:top w:w="50" w:type="dxa"/>
+              <w:left w:w="80" w:type="dxa"/>
+              <w:bottom w:w="50" w:type="dxa"/>
+              <w:right w:w="80" w:type="dxa"/>
+            </w:tcMar>
+          </w:tcPr>
+          <w:p>
+            <w:pPr>
+              <w:keepNext/>
+            </w:pPr>
+            <w:r>
+              <w:rPr>
+                <w:sz w:val="20"/>
+                <w:szCs w:val="20"/>
+              </w:rPr>
+              <w:t>Mon Sep 20</w:t>
+            </w:r>
+          </w:p>
+        </w:tc>
+        <w:tc>
+          <w:tcPr>
+            <w:tcW w:w="1200" w:type="dxa"/>
+            <w:tcMar>
+              <w:top w:w="50" w:type="dxa"/>
+              <w:left w:w="80" w:type="dxa"/>
+              <w:bottom w:w="50" w:type="dxa"/>
+              <w:right w:w="80" w:type="dxa"/>
+            </w:tcMar>
+          </w:tcPr>
+          <w:p>
+            <w:pPr>
+              <w:keepNext/>
+            </w:pPr>
+            <w:r>
+              <w:rPr>
+                <w:sz w:val="20"/>
+                <w:szCs w:val="20"/>
+              </w:rPr>
+              <w:t>Lecture 12</w:t>
+            </w:r>
+          </w:p>
+        </w:tc>
+        <w:tc>
+          <w:tcPr>
+            <w:tcW w:w="2450" w:type="dxa"/>
+            <w:tcMar>
+              <w:top w:w="50" w:type="dxa"/>
+              <w:left w:w="80" w:type="dxa"/>
+              <w:bottom w:w="50" w:type="dxa"/>
+              <w:right w:w="80" w:type="dxa"/>
+            </w:tcMar>
+          </w:tcPr>
+          <w:p>
+            <w:pPr>
+              <w:keepNext/>
+            </w:pPr>
+            <w:r>
+              <w:rPr>
+                <w:sz w:val="20"/>
+                <w:szCs w:val="20"/>
+              </w:rPr>
+              <w:t>Operant conditioning: actions and consequences</w:t>
+            </w:r>
+          </w:p>
+        </w:tc>
+        <w:tc>
+          <w:tcPr>
+            <w:tcW w:w="5230" w:type="dxa"/>
+            <w:tcMar>
+              <w:top w:w="50" w:type="dxa"/>
+              <w:left w:w="80" w:type="dxa"/>
+              <w:bottom w:w="50" w:type="dxa"/>
+              <w:right w:w="80" w:type="dxa"/>
+            </w:tcMar>
+          </w:tcPr>
+          <w:p>
+            <w:pPr>
+              <w:keepNext/>
+              <w:rPr>
+                <w:sz w:val="16"/>
+                <w:szCs w:val="16"/>
+              </w:rPr>
+            </w:pPr>
+            <w:r>
+              <w:rPr>
+                <w:sz w:val="20"/>
+                <w:szCs w:val="20"/>
+              </w:rPr>
+              <w:t>Ch. 7: Operant Conditioning.</w:t>
+            </w:r>
+          </w:p>
+        </w:tc>
+      </w:tr>
+      <w:tr>
+        <w:trPr>
+          <w:cantSplit/>
+        </w:trPr>
+        <w:tc>
+          <w:tcPr>
+            <w:tcW w:w="1200" w:type="dxa"/>
+            <w:tcMar>
+              <w:top w:w="50" w:type="dxa"/>
+              <w:left w:w="80" w:type="dxa"/>
+              <w:bottom w:w="50" w:type="dxa"/>
+              <w:right w:w="80" w:type="dxa"/>
+            </w:tcMar>
+          </w:tcPr>
+          <w:p>
+            <w:pPr>
+              <w:keepNext/>
+            </w:pPr>
+            <w:r>
+              <w:rPr>
+                <w:sz w:val="20"/>
+                <w:szCs w:val="20"/>
+              </w:rPr>
+              <w:t>Wed Sep 22</w:t>
+            </w:r>
+          </w:p>
+        </w:tc>
+        <w:tc>
+          <w:tcPr>
+            <w:tcW w:w="1200" w:type="dxa"/>
+            <w:tcMar>
+              <w:top w:w="50" w:type="dxa"/>
+              <w:left w:w="80" w:type="dxa"/>
+              <w:bottom w:w="50" w:type="dxa"/>
+              <w:right w:w="80" w:type="dxa"/>
+            </w:tcMar>
+          </w:tcPr>
+          <w:p>
+            <w:pPr>
+              <w:keepNext/>
+            </w:pPr>
+            <w:r>
+              <w:rPr>
+                <w:sz w:val="20"/>
+                <w:szCs w:val="20"/>
+              </w:rPr>
+              <w:t>Lecture 13</w:t>
+            </w:r>
+          </w:p>
+        </w:tc>
+        <w:tc>
+          <w:tcPr>
+            <w:tcW w:w="2450" w:type="dxa"/>
+            <w:tcMar>
+              <w:top w:w="50" w:type="dxa"/>
+              <w:left w:w="80" w:type="dxa"/>
+              <w:bottom w:w="50" w:type="dxa"/>
+              <w:right w:w="80" w:type="dxa"/>
+            </w:tcMar>
+          </w:tcPr>
+          <w:p>
+            <w:pPr>
+              <w:keepNext/>
+            </w:pPr>
+            <w:r>
+              <w:rPr>
+                <w:sz w:val="20"/>
+                <w:szCs w:val="20"/>
+              </w:rPr>
+              <w:t>Observational learning and cultural transmission</w:t>
+            </w:r>
+          </w:p>
+        </w:tc>
+        <w:tc>
+          <w:tcPr>
+            <w:tcW w:w="5230" w:type="dxa"/>
+            <w:tcMar>
+              <w:top w:w="50" w:type="dxa"/>
+              <w:left w:w="80" w:type="dxa"/>
+              <w:bottom w:w="50" w:type="dxa"/>
+              <w:right w:w="80" w:type="dxa"/>
+            </w:tcMar>
+          </w:tcPr>
+          <w:p>
+            <w:pPr>
+              <w:keepNext/>
+              <w:rPr>
+                <w:sz w:val="16"/>
+                <w:szCs w:val="16"/>
+              </w:rPr>
+            </w:pPr>
+            <w:r>
+              <w:rPr>
+                <w:sz w:val="20"/>
+                <w:szCs w:val="20"/>
+              </w:rPr>
+              <w:t>Ch. 7: Biology, Cognition, and Learning. Focus on observational learning and the biological and cognitive constraints on learning. Review Ch. 4’s cultural influences on behavior.</w:t>
+            </w:r>
+          </w:p>
+        </w:tc>
+      </w:tr>
+      <w:tr>
+        <w:trPr>
+          <w:cantSplit/>
+        </w:trPr>
+        <w:tc>
+          <w:tcPr>
+            <w:tcW w:w="1200" w:type="dxa"/>
+            <w:tcMar>
+              <w:top w:w="50" w:type="dxa"/>
+              <w:left w:w="80" w:type="dxa"/>
+              <w:bottom w:w="50" w:type="dxa"/>
+              <w:right w:w="80" w:type="dxa"/>
+            </w:tcMar>
+          </w:tcPr>
+          <w:p>
+            <w:pPr>
+              <w:keepNext/>
+            </w:pPr>
+            <w:r>
+              <w:rPr>
+                <w:sz w:val="20"/>
+                <w:szCs w:val="20"/>
+              </w:rPr>
+              <w:t>Fri Sep 24</w:t>
+            </w:r>
+          </w:p>
+        </w:tc>
+        <w:tc>
+          <w:tcPr>
+            <w:tcW w:w="1200" w:type="dxa"/>
+            <w:tcMar>
+              <w:top w:w="50" w:type="dxa"/>
+              <w:left w:w="80" w:type="dxa"/>
+              <w:bottom w:w="50" w:type="dxa"/>
+              <w:right w:w="80" w:type="dxa"/>
+            </w:tcMar>
+          </w:tcPr>
+          <w:p>
+            <w:pPr>
+              <w:keepNext/>
+            </w:pPr>
+            <w:r>
+              <w:rPr>
+                <w:sz w:val="20"/>
+                <w:szCs w:val="20"/>
+              </w:rPr>
+              <w:t>Lecture 14</w:t>
+            </w:r>
+          </w:p>
+        </w:tc>
+        <w:tc>
+          <w:tcPr>
+            <w:tcW w:w="2450" w:type="dxa"/>
+            <w:tcMar>
+              <w:top w:w="50" w:type="dxa"/>
+              <w:left w:w="80" w:type="dxa"/>
+              <w:bottom w:w="50" w:type="dxa"/>
+              <w:right w:w="80" w:type="dxa"/>
+            </w:tcMar>
+          </w:tcPr>
+          <w:p>
+            <w:pPr>
+              <w:keepNext/>
+            </w:pPr>
+            <w:r>
+              <w:rPr>
+                <w:sz w:val="20"/>
+                <w:szCs w:val="20"/>
+              </w:rPr>
+              <w:t>Working memory, amnesia, and memory systems</w:t>
+            </w:r>
+          </w:p>
+        </w:tc>
+        <w:tc>
+          <w:tcPr>
+            <w:tcW w:w="5230" w:type="dxa"/>
+            <w:tcMar>
+              <w:top w:w="50" w:type="dxa"/>
+              <w:left w:w="80" w:type="dxa"/>
+              <w:bottom w:w="50" w:type="dxa"/>
+              <w:right w:w="80" w:type="dxa"/>
+            </w:tcMar>
+          </w:tcPr>
+          <w:p>
+            <w:pPr>
+              <w:keepNext/>
+              <w:rPr>
+                <w:sz w:val="16"/>
+                <w:szCs w:val="16"/>
+              </w:rPr>
+            </w:pPr>
+            <w:r>
+              <w:rPr>
+                <w:sz w:val="20"/>
+                <w:szCs w:val="20"/>
+              </w:rPr>
+              <w:t>Ch. 8: Studying and Encoding Memories; Storing and Retrieving Memories. Focus on working memory, explicit and implicit memory, and amnesia.</w:t>
+            </w:r>
+          </w:p>
+        </w:tc>
+      </w:tr>
+      <w:tr>
+        <w:trPr>
+          <w:cantSplit/>
+        </w:trPr>
+        <w:tc>
+          <w:tcPr>
+            <w:tcW w:w="1200" w:type="dxa"/>
+            <w:tcMar>
+              <w:top w:w="50" w:type="dxa"/>
+              <w:left w:w="80" w:type="dxa"/>
+              <w:bottom w:w="50" w:type="dxa"/>
+              <w:right w:w="80" w:type="dxa"/>
+            </w:tcMar>
+          </w:tcPr>
+          <w:p>
+            <w:pPr>
+              <w:keepNext/>
+            </w:pPr>
+            <w:r>
+              <w:rPr>
+                <w:sz w:val="20"/>
+                <w:szCs w:val="20"/>
+              </w:rPr>
+              <w:t>Mon Sep 27</w:t>
+            </w:r>
+          </w:p>
+        </w:tc>
+        <w:tc>
+          <w:tcPr>
+            <w:tcW w:w="1200" w:type="dxa"/>
+            <w:tcMar>
+              <w:top w:w="50" w:type="dxa"/>
+              <w:left w:w="80" w:type="dxa"/>
+              <w:bottom w:w="50" w:type="dxa"/>
+              <w:right w:w="80" w:type="dxa"/>
+            </w:tcMar>
+          </w:tcPr>
+          <w:p>
+            <w:pPr>
+              <w:keepNext/>
+            </w:pPr>
+            <w:r>
+              <w:rPr>
+                <w:sz w:val="20"/>
+                <w:szCs w:val="20"/>
+              </w:rPr>
+              <w:t>Lecture 15</w:t>
+            </w:r>
+          </w:p>
+        </w:tc>
+        <w:tc>
+          <w:tcPr>
+            <w:tcW w:w="2450" w:type="dxa"/>
+            <w:tcMar>
+              <w:top w:w="50" w:type="dxa"/>
+              <w:left w:w="80" w:type="dxa"/>
+              <w:bottom w:w="50" w:type="dxa"/>
+              <w:right w:w="80" w:type="dxa"/>
+            </w:tcMar>
+          </w:tcPr>
+          <w:p>
+            <w:pPr>
+              <w:keepNext/>
+            </w:pPr>
+            <w:r>
+              <w:rPr>
+                <w:sz w:val="20"/>
+                <w:szCs w:val="20"/>
+              </w:rPr>
+              <w:t>False memories and eyewitness identification</w:t>
+            </w:r>
+          </w:p>
+        </w:tc>
+        <w:tc>
+          <w:tcPr>
+            <w:tcW w:w="5230" w:type="dxa"/>
+            <w:tcMar>
+              <w:top w:w="50" w:type="dxa"/>
+              <w:left w:w="80" w:type="dxa"/>
+              <w:bottom w:w="50" w:type="dxa"/>
+              <w:right w:w="80" w:type="dxa"/>
+            </w:tcMar>
+          </w:tcPr>
+          <w:p>
+            <w:pPr>
+              <w:keepNext/>
+              <w:rPr>
+                <w:sz w:val="16"/>
+                <w:szCs w:val="16"/>
+              </w:rPr>
+            </w:pPr>
+            <w:r>
+              <w:rPr>
+                <w:sz w:val="20"/>
+                <w:szCs w:val="20"/>
+              </w:rPr>
+              <w:t>Ch. 8: Forgetting, Memory Construction, and Improving Memory. Focus on misinformation, source errors, and eyewitness memory.</w:t>
+            </w:r>
+          </w:p>
+        </w:tc>
+      </w:tr>
+      <w:tr>
+        <w:trPr>
+          <w:cantSplit/>
+        </w:trPr>
+        <w:tc>
+          <w:tcPr>
+            <w:tcW w:w="1200" w:type="dxa"/>
+            <w:tcMar>
+              <w:top w:w="50" w:type="dxa"/>
+              <w:left w:w="80" w:type="dxa"/>
+              <w:bottom w:w="50" w:type="dxa"/>
+              <w:right w:w="80" w:type="dxa"/>
+            </w:tcMar>
+          </w:tcPr>
+          <w:p>
+            <w:pPr>
+              <w:keepNext/>
+            </w:pPr>
+            <w:r>
+              <w:rPr>
+                <w:sz w:val="20"/>
+                <w:szCs w:val="20"/>
+              </w:rPr>
+              <w:t>Wed Sep 29</w:t>
+            </w:r>
+          </w:p>
+        </w:tc>
+        <w:tc>
+          <w:tcPr>
+            <w:tcW w:w="1200" w:type="dxa"/>
+            <w:tcMar>
+              <w:top w:w="50" w:type="dxa"/>
+              <w:left w:w="80" w:type="dxa"/>
+              <w:bottom w:w="50" w:type="dxa"/>
+              <w:right w:w="80" w:type="dxa"/>
+            </w:tcMar>
+          </w:tcPr>
+          <w:p>
+            <w:pPr>
+              <w:keepNext/>
+            </w:pPr>
+            <w:r>
+              <w:rPr>
+                <w:sz w:val="20"/>
+                <w:szCs w:val="20"/>
+              </w:rPr>
+              <w:t>Lecture 16</w:t>
+            </w:r>
+          </w:p>
+        </w:tc>
+        <w:tc>
+          <w:tcPr>
+            <w:tcW w:w="2450" w:type="dxa"/>
+            <w:tcMar>
+              <w:top w:w="50" w:type="dxa"/>
+              <w:left w:w="80" w:type="dxa"/>
+              <w:bottom w:w="50" w:type="dxa"/>
+              <w:right w:w="80" w:type="dxa"/>
+            </w:tcMar>
+          </w:tcPr>
+          <w:p>
+            <w:pPr>
+              <w:keepNext/>
+            </w:pPr>
+            <w:r>
+              <w:rPr>
+                <w:sz w:val="20"/>
+                <w:szCs w:val="20"/>
+              </w:rPr>
+              <w:t>Retrieval, forgetting, and durable learning</w:t>
+            </w:r>
+          </w:p>
+        </w:tc>
+        <w:tc>
+          <w:tcPr>
+            <w:tcW w:w="5230" w:type="dxa"/>
+            <w:tcMar>
+              <w:top w:w="50" w:type="dxa"/>
+              <w:left w:w="80" w:type="dxa"/>
+              <w:bottom w:w="50" w:type="dxa"/>
+              <w:right w:w="80" w:type="dxa"/>
+            </w:tcMar>
+          </w:tcPr>
+          <w:p>
+            <w:pPr>
+              <w:keepNext/>
+              <w:rPr>
+                <w:sz w:val="16"/>
+                <w:szCs w:val="16"/>
+              </w:rPr>
+            </w:pPr>
+            <w:r>
+              <w:rPr>
+                <w:sz w:val="20"/>
+                <w:szCs w:val="20"/>
+              </w:rPr>
+              <w:t>Ch. 8: Storing and Retrieving Memories; Forgetting, Memory Construction, and Improving Memory. Focus on retrieval cues, forgetting, retrieval practice, and effective study strategies.</w:t>
+            </w:r>
+          </w:p>
+        </w:tc>
+      </w:tr>
+      <w:tr>
+        <w:trPr>
+          <w:cantSplit/>
+        </w:trPr>
+        <w:tc>
+          <w:tcPr>
+            <w:tcW w:w="1200" w:type="dxa"/>
+            <w:tcMar>
+              <w:top w:w="50" w:type="dxa"/>
+              <w:left w:w="80" w:type="dxa"/>
+              <w:bottom w:w="50" w:type="dxa"/>
+              <w:right w:w="80" w:type="dxa"/>
+            </w:tcMar>
+          </w:tcPr>
+          <w:p>
+            <w:pPr>
+              <w:keepNext/>
+            </w:pPr>
+            <w:r>
+              <w:rPr>
+                <w:sz w:val="20"/>
+                <w:szCs w:val="20"/>
+              </w:rPr>
+              <w:t>Fri Oct 1</w:t>
+            </w:r>
+          </w:p>
+        </w:tc>
+        <w:tc>
+          <w:tcPr>
+            <w:tcW w:w="1200" w:type="dxa"/>
+            <w:tcMar>
+              <w:top w:w="50" w:type="dxa"/>
+              <w:left w:w="80" w:type="dxa"/>
+              <w:bottom w:w="50" w:type="dxa"/>
+              <w:right w:w="80" w:type="dxa"/>
+            </w:tcMar>
+          </w:tcPr>
+          <w:p>
+            <w:pPr>
+              <w:keepNext/>
+            </w:pPr>
+            <w:r>
+              <w:rPr>
+                <w:sz w:val="20"/>
+                <w:szCs w:val="20"/>
+              </w:rPr>
+              <w:t>Lecture 17</w:t>
+            </w:r>
+          </w:p>
+        </w:tc>
+        <w:tc>
+          <w:tcPr>
+            <w:tcW w:w="2450" w:type="dxa"/>
+            <w:tcMar>
+              <w:top w:w="50" w:type="dxa"/>
+              <w:left w:w="80" w:type="dxa"/>
+              <w:bottom w:w="50" w:type="dxa"/>
+              <w:right w:w="80" w:type="dxa"/>
+            </w:tcMar>
+          </w:tcPr>
+          <w:p>
+            <w:pPr>
+              <w:keepNext/>
+            </w:pPr>
+            <w:r>
+              <w:rPr>
+                <w:sz w:val="20"/>
+                <w:szCs w:val="20"/>
+              </w:rPr>
+              <w:t>Language: acquisition, comprehension, and the brain</w:t>
+            </w:r>
+          </w:p>
+        </w:tc>
+        <w:tc>
+          <w:tcPr>
+            <w:tcW w:w="5230" w:type="dxa"/>
+            <w:tcMar>
+              <w:top w:w="50" w:type="dxa"/>
+              <w:left w:w="80" w:type="dxa"/>
+              <w:bottom w:w="50" w:type="dxa"/>
+              <w:right w:w="80" w:type="dxa"/>
+            </w:tcMar>
+          </w:tcPr>
+          <w:p>
+            <w:pPr>
+              <w:keepNext/>
+              <w:rPr>
+                <w:sz w:val="16"/>
+                <w:szCs w:val="16"/>
+              </w:rPr>
+            </w:pPr>
+            <w:r>
+              <w:rPr>
+                <w:sz w:val="20"/>
+                <w:szCs w:val="20"/>
+              </w:rPr>
+              <w:t>Ch. 9: Language and Thought.</w:t>
+            </w:r>
+          </w:p>
+        </w:tc>
+      </w:tr>
+      <w:tr>
+        <w:trPr>
+          <w:cantSplit/>
+        </w:trPr>
+        <w:tc>
+          <w:tcPr>
+            <w:tcW w:w="1200" w:type="dxa"/>
+            <w:tcMar>
+              <w:top w:w="50" w:type="dxa"/>
+              <w:left w:w="80" w:type="dxa"/>
+              <w:bottom w:w="50" w:type="dxa"/>
+              <w:right w:w="80" w:type="dxa"/>
+            </w:tcMar>
+          </w:tcPr>
+          <w:p>
+            <w:pPr>
+              <w:keepNext/>
+            </w:pPr>
+            <w:r>
+              <w:rPr>
+                <w:sz w:val="20"/>
+                <w:szCs w:val="20"/>
+              </w:rPr>
+              <w:t>Mon Oct 4</w:t>
+            </w:r>
+          </w:p>
+        </w:tc>
+        <w:tc>
+          <w:tcPr>
+            <w:tcW w:w="1200" w:type="dxa"/>
+            <w:tcMar>
+              <w:top w:w="50" w:type="dxa"/>
+              <w:left w:w="80" w:type="dxa"/>
+              <w:bottom w:w="50" w:type="dxa"/>
+              <w:right w:w="80" w:type="dxa"/>
+            </w:tcMar>
+          </w:tcPr>
+          <w:p>
+            <w:pPr>
+              <w:keepNext/>
+            </w:pPr>
+            <w:r>
+              <w:rPr>
+                <w:sz w:val="20"/>
+                <w:szCs w:val="20"/>
+              </w:rPr>
+              <w:t>Lecture 18</w:t>
+            </w:r>
+          </w:p>
+        </w:tc>
+        <w:tc>
+          <w:tcPr>
+            <w:tcW w:w="2450" w:type="dxa"/>
+            <w:tcMar>
+              <w:top w:w="50" w:type="dxa"/>
+              <w:left w:w="80" w:type="dxa"/>
+              <w:bottom w:w="50" w:type="dxa"/>
+              <w:right w:w="80" w:type="dxa"/>
+            </w:tcMar>
+          </w:tcPr>
+          <w:p>
+            <w:pPr>
+              <w:keepNext/>
+            </w:pPr>
+            <w:r>
+              <w:rPr>
+                <w:sz w:val="20"/>
+                <w:szCs w:val="20"/>
+              </w:rPr>
+              <w:t>Judgment, risk, and decision-making</w:t>
+            </w:r>
+          </w:p>
+        </w:tc>
+        <w:tc>
+          <w:tcPr>
+            <w:tcW w:w="5230" w:type="dxa"/>
+            <w:tcMar>
+              <w:top w:w="50" w:type="dxa"/>
+              <w:left w:w="80" w:type="dxa"/>
+              <w:bottom w:w="50" w:type="dxa"/>
+              <w:right w:w="80" w:type="dxa"/>
+            </w:tcMar>
+          </w:tcPr>
+          <w:p>
+            <w:pPr>
+              <w:keepNext/>
+              <w:rPr>
+                <w:sz w:val="16"/>
+                <w:szCs w:val="16"/>
+              </w:rPr>
+            </w:pPr>
+            <w:r>
+              <w:rPr>
+                <w:sz w:val="20"/>
+                <w:szCs w:val="20"/>
+              </w:rPr>
+              <w:t>Ch. 9: Thinking. Focus on concepts, problem solving, heuristics, biases, judgment, and decision-making.</w:t>
+            </w:r>
+          </w:p>
+        </w:tc>
+      </w:tr>
+      <w:tr>
+        <w:trPr>
+          <w:cantSplit/>
+        </w:trPr>
+        <w:tc>
+          <w:tcPr>
+            <w:tcW w:w="1200" w:type="dxa"/>
+            <w:tcMar>
+              <w:top w:w="50" w:type="dxa"/>
+              <w:left w:w="80" w:type="dxa"/>
+              <w:bottom w:w="50" w:type="dxa"/>
+              <w:right w:w="80" w:type="dxa"/>
+            </w:tcMar>
+          </w:tcPr>
+          <w:p>
+            <w:pPr>
+              <w:keepNext/>
+            </w:pPr>
+            <w:r>
+              <w:rPr>
+                <w:sz w:val="20"/>
+                <w:szCs w:val="20"/>
+              </w:rPr>
+              <w:t>Wed Oct 6</w:t>
+            </w:r>
+          </w:p>
+        </w:tc>
+        <w:tc>
+          <w:tcPr>
+            <w:tcW w:w="1200" w:type="dxa"/>
+            <w:tcMar>
+              <w:top w:w="50" w:type="dxa"/>
+              <w:left w:w="80" w:type="dxa"/>
+              <w:bottom w:w="50" w:type="dxa"/>
+              <w:right w:w="80" w:type="dxa"/>
+            </w:tcMar>
+          </w:tcPr>
+          <w:p>
+            <w:pPr>
+              <w:keepNext/>
+            </w:pPr>
+            <w:r>
+              <w:rPr>
+                <w:sz w:val="20"/>
+                <w:szCs w:val="20"/>
+              </w:rPr>
+              <w:t>Lecture 19</w:t>
+            </w:r>
+          </w:p>
+        </w:tc>
+        <w:tc>
+          <w:tcPr>
+            <w:tcW w:w="2450" w:type="dxa"/>
+            <w:tcMar>
+              <w:top w:w="50" w:type="dxa"/>
+              <w:left w:w="80" w:type="dxa"/>
+              <w:bottom w:w="50" w:type="dxa"/>
+              <w:right w:w="80" w:type="dxa"/>
+            </w:tcMar>
+          </w:tcPr>
+          <w:p>
+            <w:pPr>
+              <w:keepNext/>
+            </w:pPr>
+            <w:r>
+              <w:rPr>
+                <w:sz w:val="20"/>
+                <w:szCs w:val="20"/>
+              </w:rPr>
+              <w:t>Intelligence: measurement, development, and fairness</w:t>
+            </w:r>
+          </w:p>
+        </w:tc>
+        <w:tc>
+          <w:tcPr>
+            <w:tcW w:w="5230" w:type="dxa"/>
+            <w:tcMar>
+              <w:top w:w="50" w:type="dxa"/>
+              <w:left w:w="80" w:type="dxa"/>
+              <w:bottom w:w="50" w:type="dxa"/>
+              <w:right w:w="80" w:type="dxa"/>
+            </w:tcMar>
+          </w:tcPr>
+          <w:p>
+            <w:pPr>
+              <w:keepNext/>
+              <w:rPr>
+                <w:sz w:val="16"/>
+                <w:szCs w:val="16"/>
+              </w:rPr>
+            </w:pPr>
+            <w:r>
+              <w:rPr>
+                <w:sz w:val="20"/>
+                <w:szCs w:val="20"/>
+              </w:rPr>
+              <w:t>Ch. 10: What Is Intelligence?; Intelligence Assessment and Dynamics; Genetic and Environmental Influences on Intelligence.</w:t>
+            </w:r>
+          </w:p>
+        </w:tc>
+      </w:tr>
+      <w:tr>
+        <w:trPr>
+          <w:cantSplit/>
+        </w:trPr>
+        <w:tc>
+          <w:tcPr>
+            <w:tcW w:w="1200" w:type="dxa"/>
+            <w:tcMar>
+              <w:top w:w="50" w:type="dxa"/>
+              <w:left w:w="80" w:type="dxa"/>
+              <w:bottom w:w="50" w:type="dxa"/>
+              <w:right w:w="80" w:type="dxa"/>
+            </w:tcMar>
+          </w:tcPr>
+          <w:p>
+            <w:pPr>
+              <w:keepNext/>
+            </w:pPr>
+            <w:r>
+              <w:rPr>
+                <w:sz w:val="20"/>
+                <w:szCs w:val="20"/>
+              </w:rPr>
+              <w:t>Mon Oct 11</w:t>
+            </w:r>
+          </w:p>
+        </w:tc>
+        <w:tc>
+          <w:tcPr>
+            <w:tcW w:w="1200" w:type="dxa"/>
+            <w:tcMar>
+              <w:top w:w="50" w:type="dxa"/>
+              <w:left w:w="80" w:type="dxa"/>
+              <w:bottom w:w="50" w:type="dxa"/>
+              <w:right w:w="80" w:type="dxa"/>
+            </w:tcMar>
+          </w:tcPr>
+          <w:p>
+            <w:pPr>
+              <w:keepNext/>
+            </w:pPr>
+            <w:r>
+              <w:rPr>
+                <w:sz w:val="20"/>
+                <w:szCs w:val="20"/>
+              </w:rPr>
+              <w:t>Lecture 20</w:t>
+            </w:r>
+          </w:p>
+        </w:tc>
+        <w:tc>
+          <w:tcPr>
+            <w:tcW w:w="2450" w:type="dxa"/>
+            <w:tcMar>
+              <w:top w:w="50" w:type="dxa"/>
+              <w:left w:w="80" w:type="dxa"/>
+              <w:bottom w:w="50" w:type="dxa"/>
+              <w:right w:w="80" w:type="dxa"/>
+            </w:tcMar>
+          </w:tcPr>
+          <w:p>
+            <w:pPr>
+              <w:keepNext/>
+            </w:pPr>
+            <w:r>
+              <w:rPr>
+                <w:sz w:val="20"/>
+                <w:szCs w:val="20"/>
+              </w:rPr>
+              <w:t>Motivation: hunger, goals, and self-control</w:t>
+            </w:r>
+          </w:p>
+        </w:tc>
+        <w:tc>
+          <w:tcPr>
+            <w:tcW w:w="5230" w:type="dxa"/>
+            <w:tcMar>
+              <w:top w:w="50" w:type="dxa"/>
+              <w:left w:w="80" w:type="dxa"/>
+              <w:bottom w:w="50" w:type="dxa"/>
+              <w:right w:w="80" w:type="dxa"/>
+            </w:tcMar>
+          </w:tcPr>
+          <w:p>
+            <w:pPr>
+              <w:keepNext/>
+              <w:rPr>
+                <w:sz w:val="16"/>
+                <w:szCs w:val="16"/>
+              </w:rPr>
+            </w:pPr>
+            <w:r>
+              <w:rPr>
+                <w:sz w:val="20"/>
+                <w:szCs w:val="20"/>
+              </w:rPr>
+              <w:t>Ch. 11: Basic Motivational Concepts; Hunger; Affiliation and Achievement. Focus on motivational theories, physiological regulation, goals, and achievement.</w:t>
+            </w:r>
+          </w:p>
+        </w:tc>
+      </w:tr>
+      <w:tr>
+        <w:trPr>
+          <w:cantSplit/>
+        </w:trPr>
+        <w:tc>
+          <w:tcPr>
+            <w:tcW w:w="1200" w:type="dxa"/>
+            <w:tcMar>
+              <w:top w:w="50" w:type="dxa"/>
+              <w:left w:w="80" w:type="dxa"/>
+              <w:bottom w:w="50" w:type="dxa"/>
+              <w:right w:w="80" w:type="dxa"/>
+            </w:tcMar>
+          </w:tcPr>
+          <w:p>
+            <w:pPr>
+              <w:keepNext/>
+            </w:pPr>
+            <w:r>
+              <w:rPr>
+                <w:sz w:val="20"/>
+                <w:szCs w:val="20"/>
+              </w:rPr>
+              <w:t>Wed Oct 13</w:t>
+            </w:r>
+          </w:p>
+        </w:tc>
+        <w:tc>
+          <w:tcPr>
+            <w:tcW w:w="1200" w:type="dxa"/>
+            <w:tcMar>
+              <w:top w:w="50" w:type="dxa"/>
+              <w:left w:w="80" w:type="dxa"/>
+              <w:bottom w:w="50" w:type="dxa"/>
+              <w:right w:w="80" w:type="dxa"/>
+            </w:tcMar>
+          </w:tcPr>
+          <w:p>
+            <w:pPr>
+              <w:keepNext/>
+            </w:pPr>
+            <w:r>
+              <w:rPr>
+                <w:sz w:val="20"/>
+                <w:szCs w:val="20"/>
+              </w:rPr>
+              <w:t>Lecture 21</w:t>
+            </w:r>
+          </w:p>
+        </w:tc>
+        <w:tc>
+          <w:tcPr>
+            <w:tcW w:w="2450" w:type="dxa"/>
+            <w:tcMar>
+              <w:top w:w="50" w:type="dxa"/>
+              <w:left w:w="80" w:type="dxa"/>
+              <w:bottom w:w="50" w:type="dxa"/>
+              <w:right w:w="80" w:type="dxa"/>
+            </w:tcMar>
+          </w:tcPr>
+          <w:p>
+            <w:pPr>
+              <w:keepNext/>
+            </w:pPr>
+            <w:r>
+              <w:rPr>
+                <w:sz w:val="20"/>
+                <w:szCs w:val="20"/>
+              </w:rPr>
+              <w:t>Emotion: bodily responses, appraisal, and regulation</w:t>
+            </w:r>
+          </w:p>
+        </w:tc>
+        <w:tc>
+          <w:tcPr>
+            <w:tcW w:w="5230" w:type="dxa"/>
+            <w:tcMar>
+              <w:top w:w="50" w:type="dxa"/>
+              <w:left w:w="80" w:type="dxa"/>
+              <w:bottom w:w="50" w:type="dxa"/>
+              <w:right w:w="80" w:type="dxa"/>
+            </w:tcMar>
+          </w:tcPr>
+          <w:p>
+            <w:pPr>
+              <w:keepNext/>
+              <w:rPr>
+                <w:sz w:val="16"/>
+                <w:szCs w:val="16"/>
+              </w:rPr>
+            </w:pPr>
+            <w:r>
+              <w:rPr>
+                <w:sz w:val="20"/>
+                <w:szCs w:val="20"/>
+              </w:rPr>
+              <w:t>Ch. 12: Introduction to Emotion; Expressing Emotion; Experiencing Emotion.</w:t>
+            </w:r>
+          </w:p>
+        </w:tc>
+      </w:tr>
+      <w:tr>
+        <w:trPr>
+          <w:cantSplit/>
+        </w:trPr>
+        <w:tc>
+          <w:tcPr>
+            <w:tcW w:w="1200" w:type="dxa"/>
+            <w:tcMar>
+              <w:top w:w="50" w:type="dxa"/>
+              <w:left w:w="80" w:type="dxa"/>
+              <w:bottom w:w="50" w:type="dxa"/>
+              <w:right w:w="80" w:type="dxa"/>
+            </w:tcMar>
+          </w:tcPr>
+          <w:p>
+            <w:pPr>
+              <w:keepNext/>
+            </w:pPr>
+            <w:r>
+              <w:rPr>
+                <w:sz w:val="20"/>
+                <w:szCs w:val="20"/>
+              </w:rPr>
+              <w:t>Fri Oct 15</w:t>
+            </w:r>
+          </w:p>
+        </w:tc>
+        <w:tc>
+          <w:tcPr>
+            <w:tcW w:w="1200" w:type="dxa"/>
+            <w:tcMar>
+              <w:top w:w="50" w:type="dxa"/>
+              <w:left w:w="80" w:type="dxa"/>
+              <w:bottom w:w="50" w:type="dxa"/>
+              <w:right w:w="80" w:type="dxa"/>
+            </w:tcMar>
+          </w:tcPr>
+          <w:p>
+            <w:pPr>
+              <w:keepNext/>
+            </w:pPr>
+            <w:r>
+              <w:rPr>
+                <w:sz w:val="20"/>
+                <w:szCs w:val="20"/>
+              </w:rPr>
+              <w:t>Lecture 22</w:t>
+            </w:r>
+          </w:p>
+        </w:tc>
+        <w:tc>
+          <w:tcPr>
+            <w:tcW w:w="2450" w:type="dxa"/>
+            <w:tcMar>
+              <w:top w:w="50" w:type="dxa"/>
+              <w:left w:w="80" w:type="dxa"/>
+              <w:bottom w:w="50" w:type="dxa"/>
+              <w:right w:w="80" w:type="dxa"/>
+            </w:tcMar>
+          </w:tcPr>
+          <w:p>
+            <w:pPr>
+              <w:keepNext/>
+            </w:pPr>
+            <w:r>
+              <w:rPr>
+                <w:sz w:val="20"/>
+                <w:szCs w:val="20"/>
+              </w:rPr>
+              <w:t>Stress, health, and the social environment</w:t>
+            </w:r>
+          </w:p>
+        </w:tc>
+        <w:tc>
+          <w:tcPr>
+            <w:tcW w:w="5230" w:type="dxa"/>
+            <w:tcMar>
+              <w:top w:w="50" w:type="dxa"/>
+              <w:left w:w="80" w:type="dxa"/>
+              <w:bottom w:w="50" w:type="dxa"/>
+              <w:right w:w="80" w:type="dxa"/>
+            </w:tcMar>
+          </w:tcPr>
+          <w:p>
+            <w:pPr>
+              <w:keepNext/>
+              <w:rPr>
+                <w:sz w:val="16"/>
+                <w:szCs w:val="16"/>
+              </w:rPr>
+            </w:pPr>
+            <w:r>
+              <w:rPr>
+                <w:sz w:val="20"/>
+                <w:szCs w:val="20"/>
+              </w:rPr>
+              <w:t>Ch. 12: Stress and Illness; Health and Coping.</w:t>
+            </w:r>
+          </w:p>
+        </w:tc>
+      </w:tr>
+      <w:tr>
+        <w:trPr>
+          <w:cantSplit/>
+        </w:trPr>
+        <w:tc>
+          <w:tcPr>
+            <w:tcW w:w="1200" w:type="dxa"/>
+            <w:tcMar>
+              <w:top w:w="50" w:type="dxa"/>
+              <w:left w:w="80" w:type="dxa"/>
+              <w:bottom w:w="50" w:type="dxa"/>
+              <w:right w:w="80" w:type="dxa"/>
+            </w:tcMar>
+          </w:tcPr>
+          <w:p>
+            <w:pPr>
+              <w:keepNext/>
+            </w:pPr>
+            <w:r>
+              <w:rPr>
+                <w:sz w:val="20"/>
+                <w:szCs w:val="20"/>
+              </w:rPr>
+              <w:t>Mon Oct 18</w:t>
+            </w:r>
+          </w:p>
+        </w:tc>
+        <w:tc>
+          <w:tcPr>
+            <w:tcW w:w="1200" w:type="dxa"/>
+            <w:tcMar>
+              <w:top w:w="50" w:type="dxa"/>
+              <w:left w:w="80" w:type="dxa"/>
+              <w:bottom w:w="50" w:type="dxa"/>
+              <w:right w:w="80" w:type="dxa"/>
+            </w:tcMar>
+          </w:tcPr>
+          <w:p>
+            <w:pPr>
+              <w:keepNext/>
+            </w:pPr>
+            <w:r>
+              <w:rPr>
+                <w:sz w:val="20"/>
+                <w:szCs w:val="20"/>
+              </w:rPr>
+              <w:t>Lecture 23</w:t>
+            </w:r>
+          </w:p>
+        </w:tc>
+        <w:tc>
+          <w:tcPr>
+            <w:tcW w:w="2450" w:type="dxa"/>
+            <w:tcMar>
+              <w:top w:w="50" w:type="dxa"/>
+              <w:left w:w="80" w:type="dxa"/>
+              <w:bottom w:w="50" w:type="dxa"/>
+              <w:right w:w="80" w:type="dxa"/>
+            </w:tcMar>
+          </w:tcPr>
+          <w:p>
+            <w:pPr>
+              <w:keepNext/>
+            </w:pPr>
+            <w:r>
+              <w:rPr>
+                <w:sz w:val="20"/>
+                <w:szCs w:val="20"/>
+              </w:rPr>
+              <w:t>Infant cognition and the developing mind</w:t>
+            </w:r>
+          </w:p>
+        </w:tc>
+        <w:tc>
+          <w:tcPr>
+            <w:tcW w:w="5230" w:type="dxa"/>
+            <w:tcMar>
+              <w:top w:w="50" w:type="dxa"/>
+              <w:left w:w="80" w:type="dxa"/>
+              <w:bottom w:w="50" w:type="dxa"/>
+              <w:right w:w="80" w:type="dxa"/>
+            </w:tcMar>
+          </w:tcPr>
+          <w:p>
+            <w:pPr>
+              <w:keepNext/>
+              <w:rPr>
+                <w:sz w:val="16"/>
+                <w:szCs w:val="16"/>
+              </w:rPr>
+            </w:pPr>
+            <w:r>
+              <w:rPr>
+                <w:sz w:val="20"/>
+                <w:szCs w:val="20"/>
+              </w:rPr>
+              <w:t>Ch. 5: Developmental Issues, Prenatal Development, and the Newborn; Infancy and Childhood. Focus on developmental research methods and infant perceptual and cognitive development.</w:t>
+            </w:r>
+          </w:p>
+        </w:tc>
+      </w:tr>
+      <w:tr>
+        <w:trPr>
+          <w:cantSplit/>
+        </w:trPr>
+        <w:tc>
+          <w:tcPr>
+            <w:tcW w:w="1200" w:type="dxa"/>
+            <w:tcMar>
+              <w:top w:w="50" w:type="dxa"/>
+              <w:left w:w="80" w:type="dxa"/>
+              <w:bottom w:w="50" w:type="dxa"/>
+              <w:right w:w="80" w:type="dxa"/>
+            </w:tcMar>
+          </w:tcPr>
+          <w:p>
+            <w:pPr>
+              <w:keepNext/>
+            </w:pPr>
+            <w:r>
+              <w:rPr>
+                <w:sz w:val="20"/>
+                <w:szCs w:val="20"/>
+              </w:rPr>
+              <w:t>Wed Oct 20</w:t>
+            </w:r>
+          </w:p>
+        </w:tc>
+        <w:tc>
+          <w:tcPr>
+            <w:tcW w:w="1200" w:type="dxa"/>
+            <w:tcMar>
+              <w:top w:w="50" w:type="dxa"/>
+              <w:left w:w="80" w:type="dxa"/>
+              <w:bottom w:w="50" w:type="dxa"/>
+              <w:right w:w="80" w:type="dxa"/>
+            </w:tcMar>
+          </w:tcPr>
+          <w:p>
+            <w:pPr>
+              <w:keepNext/>
+            </w:pPr>
+            <w:r>
+              <w:rPr>
+                <w:sz w:val="20"/>
+                <w:szCs w:val="20"/>
+              </w:rPr>
+              <w:t>Lecture 24</w:t>
+            </w:r>
+          </w:p>
+        </w:tc>
+        <w:tc>
+          <w:tcPr>
+            <w:tcW w:w="2450" w:type="dxa"/>
+            <w:tcMar>
+              <w:top w:w="50" w:type="dxa"/>
+              <w:left w:w="80" w:type="dxa"/>
+              <w:bottom w:w="50" w:type="dxa"/>
+              <w:right w:w="80" w:type="dxa"/>
+            </w:tcMar>
+          </w:tcPr>
+          <w:p>
+            <w:pPr>
+              <w:keepNext/>
+            </w:pPr>
+            <w:r>
+              <w:rPr>
+                <w:sz w:val="20"/>
+                <w:szCs w:val="20"/>
+              </w:rPr>
+              <w:t>Attachment, caregiving, and social development</w:t>
+            </w:r>
+          </w:p>
+        </w:tc>
+        <w:tc>
+          <w:tcPr>
+            <w:tcW w:w="5230" w:type="dxa"/>
+            <w:tcMar>
+              <w:top w:w="50" w:type="dxa"/>
+              <w:left w:w="80" w:type="dxa"/>
+              <w:bottom w:w="50" w:type="dxa"/>
+              <w:right w:w="80" w:type="dxa"/>
+            </w:tcMar>
+          </w:tcPr>
+          <w:p>
+            <w:pPr>
+              <w:keepNext/>
+              <w:rPr>
+                <w:sz w:val="16"/>
+                <w:szCs w:val="16"/>
+              </w:rPr>
+            </w:pPr>
+            <w:r>
+              <w:rPr>
+                <w:sz w:val="20"/>
+                <w:szCs w:val="20"/>
+              </w:rPr>
+              <w:t>Ch. 5: Infancy and Childhood. Focus on attachment, caregiving, temperament, and social development.</w:t>
+            </w:r>
+          </w:p>
+        </w:tc>
+      </w:tr>
+      <w:tr>
+        <w:trPr>
+          <w:cantSplit/>
+        </w:trPr>
+        <w:tc>
+          <w:tcPr>
+            <w:tcW w:w="1200" w:type="dxa"/>
+            <w:tcMar>
+              <w:top w:w="50" w:type="dxa"/>
+              <w:left w:w="80" w:type="dxa"/>
+              <w:bottom w:w="50" w:type="dxa"/>
+              <w:right w:w="80" w:type="dxa"/>
+            </w:tcMar>
+          </w:tcPr>
+          <w:p>
+            <w:pPr>
+              <w:keepNext/>
+            </w:pPr>
+            <w:r>
+              <w:rPr>
+                <w:sz w:val="20"/>
+                <w:szCs w:val="20"/>
+              </w:rPr>
+              <w:t>Fri Oct 22</w:t>
+            </w:r>
+          </w:p>
+        </w:tc>
+        <w:tc>
+          <w:tcPr>
+            <w:tcW w:w="1200" w:type="dxa"/>
+            <w:tcMar>
+              <w:top w:w="50" w:type="dxa"/>
+              <w:left w:w="80" w:type="dxa"/>
+              <w:bottom w:w="50" w:type="dxa"/>
+              <w:right w:w="80" w:type="dxa"/>
+            </w:tcMar>
+          </w:tcPr>
+          <w:p>
+            <w:pPr>
+              <w:keepNext/>
+            </w:pPr>
+            <w:r>
+              <w:rPr>
+                <w:sz w:val="20"/>
+                <w:szCs w:val="20"/>
+              </w:rPr>
+              <w:t>Lecture 25</w:t>
+            </w:r>
+          </w:p>
+        </w:tc>
+        <w:tc>
+          <w:tcPr>
+            <w:tcW w:w="2450" w:type="dxa"/>
+            <w:tcMar>
+              <w:top w:w="50" w:type="dxa"/>
+              <w:left w:w="80" w:type="dxa"/>
+              <w:bottom w:w="50" w:type="dxa"/>
+              <w:right w:w="80" w:type="dxa"/>
+            </w:tcMar>
+          </w:tcPr>
+          <w:p>
+            <w:pPr>
+              <w:keepNext/>
+            </w:pPr>
+            <w:r>
+              <w:rPr>
+                <w:sz w:val="20"/>
+                <w:szCs w:val="20"/>
+              </w:rPr>
+              <w:t>Adolescence: identity, peers, and risk</w:t>
+            </w:r>
+          </w:p>
+        </w:tc>
+        <w:tc>
+          <w:tcPr>
+            <w:tcW w:w="5230" w:type="dxa"/>
+            <w:tcMar>
+              <w:top w:w="50" w:type="dxa"/>
+              <w:left w:w="80" w:type="dxa"/>
+              <w:bottom w:w="50" w:type="dxa"/>
+              <w:right w:w="80" w:type="dxa"/>
+            </w:tcMar>
+          </w:tcPr>
+          <w:p>
+            <w:pPr>
+              <w:keepNext/>
+              <w:rPr>
+                <w:sz w:val="16"/>
+                <w:szCs w:val="16"/>
+              </w:rPr>
+            </w:pPr>
+            <w:r>
+              <w:rPr>
+                <w:sz w:val="20"/>
+                <w:szCs w:val="20"/>
+              </w:rPr>
+              <w:t>Ch. 5: Adolescence and Emerging Adulthood.</w:t>
+            </w:r>
+          </w:p>
+        </w:tc>
+      </w:tr>
+      <w:tr>
+        <w:trPr>
+          <w:cantSplit/>
+        </w:trPr>
+        <w:tc>
+          <w:tcPr>
+            <w:tcW w:w="1200" w:type="dxa"/>
+            <w:tcMar>
+              <w:top w:w="50" w:type="dxa"/>
+              <w:left w:w="80" w:type="dxa"/>
+              <w:bottom w:w="50" w:type="dxa"/>
+              <w:right w:w="80" w:type="dxa"/>
+            </w:tcMar>
+          </w:tcPr>
+          <w:p>
+            <w:pPr>
+              <w:keepNext/>
+            </w:pPr>
+            <w:r>
+              <w:rPr>
+                <w:sz w:val="20"/>
+                <w:szCs w:val="20"/>
+              </w:rPr>
+              <w:t>Mon Oct 25</w:t>
+            </w:r>
+          </w:p>
+        </w:tc>
+        <w:tc>
+          <w:tcPr>
+            <w:tcW w:w="1200" w:type="dxa"/>
+            <w:tcMar>
+              <w:top w:w="50" w:type="dxa"/>
+              <w:left w:w="80" w:type="dxa"/>
+              <w:bottom w:w="50" w:type="dxa"/>
+              <w:right w:w="80" w:type="dxa"/>
+            </w:tcMar>
+          </w:tcPr>
+          <w:p>
+            <w:pPr>
+              <w:keepNext/>
+            </w:pPr>
+            <w:r>
+              <w:rPr>
+                <w:sz w:val="20"/>
+                <w:szCs w:val="20"/>
+              </w:rPr>
+              <w:t>Lecture 26</w:t>
+            </w:r>
+          </w:p>
+        </w:tc>
+        <w:tc>
+          <w:tcPr>
+            <w:tcW w:w="2450" w:type="dxa"/>
+            <w:tcMar>
+              <w:top w:w="50" w:type="dxa"/>
+              <w:left w:w="80" w:type="dxa"/>
+              <w:bottom w:w="50" w:type="dxa"/>
+              <w:right w:w="80" w:type="dxa"/>
+            </w:tcMar>
+          </w:tcPr>
+          <w:p>
+            <w:pPr>
+              <w:keepNext/>
+            </w:pPr>
+            <w:r>
+              <w:rPr>
+                <w:sz w:val="20"/>
+                <w:szCs w:val="20"/>
+              </w:rPr>
+              <w:t>Adulthood, aging, and cognitive change</w:t>
+            </w:r>
+          </w:p>
+        </w:tc>
+        <w:tc>
+          <w:tcPr>
+            <w:tcW w:w="5230" w:type="dxa"/>
+            <w:tcMar>
+              <w:top w:w="50" w:type="dxa"/>
+              <w:left w:w="80" w:type="dxa"/>
+              <w:bottom w:w="50" w:type="dxa"/>
+              <w:right w:w="80" w:type="dxa"/>
+            </w:tcMar>
+          </w:tcPr>
+          <w:p>
+            <w:pPr>
+              <w:keepNext/>
+              <w:rPr>
+                <w:sz w:val="16"/>
+                <w:szCs w:val="16"/>
+              </w:rPr>
+            </w:pPr>
+            <w:r>
+              <w:rPr>
+                <w:sz w:val="20"/>
+                <w:szCs w:val="20"/>
+              </w:rPr>
+              <w:t>Ch. 5: Adulthood.</w:t>
+            </w:r>
+          </w:p>
+        </w:tc>
+      </w:tr>
+      <w:tr>
+        <w:trPr>
+          <w:cantSplit/>
+        </w:trPr>
+        <w:tc>
+          <w:tcPr>
+            <w:tcW w:w="1200" w:type="dxa"/>
+            <w:tcMar>
+              <w:top w:w="50" w:type="dxa"/>
+              <w:left w:w="80" w:type="dxa"/>
+              <w:bottom w:w="50" w:type="dxa"/>
+              <w:right w:w="80" w:type="dxa"/>
+            </w:tcMar>
+          </w:tcPr>
+          <w:p>
+            <w:pPr>
+              <w:keepNext/>
+            </w:pPr>
+            <w:r>
+              <w:rPr>
+                <w:sz w:val="20"/>
+                <w:szCs w:val="20"/>
+              </w:rPr>
+              <w:t>Wed Oct 27</w:t>
+            </w:r>
+          </w:p>
+        </w:tc>
+        <w:tc>
+          <w:tcPr>
+            <w:tcW w:w="1200" w:type="dxa"/>
+            <w:tcMar>
+              <w:top w:w="50" w:type="dxa"/>
+              <w:left w:w="80" w:type="dxa"/>
+              <w:bottom w:w="50" w:type="dxa"/>
+              <w:right w:w="80" w:type="dxa"/>
+            </w:tcMar>
+          </w:tcPr>
+          <w:p>
+            <w:pPr>
+              <w:keepNext/>
+            </w:pPr>
+            <w:r>
+              <w:rPr>
+                <w:sz w:val="20"/>
+                <w:szCs w:val="20"/>
+              </w:rPr>
+              <w:t>Lecture 27</w:t>
+            </w:r>
+          </w:p>
+        </w:tc>
+        <w:tc>
+          <w:tcPr>
+            <w:tcW w:w="2450" w:type="dxa"/>
+            <w:tcMar>
+              <w:top w:w="50" w:type="dxa"/>
+              <w:left w:w="80" w:type="dxa"/>
+              <w:bottom w:w="50" w:type="dxa"/>
+              <w:right w:w="80" w:type="dxa"/>
+            </w:tcMar>
+          </w:tcPr>
+          <w:p>
+            <w:pPr>
+              <w:keepNext/>
+            </w:pPr>
+            <w:r>
+              <w:rPr>
+                <w:sz w:val="20"/>
+                <w:szCs w:val="20"/>
+              </w:rPr>
+              <w:t>Personality: traits, situations, and the self</w:t>
+            </w:r>
+          </w:p>
+        </w:tc>
+        <w:tc>
+          <w:tcPr>
+            <w:tcW w:w="5230" w:type="dxa"/>
+            <w:tcMar>
+              <w:top w:w="50" w:type="dxa"/>
+              <w:left w:w="80" w:type="dxa"/>
+              <w:bottom w:w="50" w:type="dxa"/>
+              <w:right w:w="80" w:type="dxa"/>
+            </w:tcMar>
+          </w:tcPr>
+          <w:p>
+            <w:pPr>
+              <w:keepNext/>
+              <w:rPr>
+                <w:sz w:val="16"/>
+                <w:szCs w:val="16"/>
+              </w:rPr>
+            </w:pPr>
+            <w:r>
+              <w:rPr>
+                <w:sz w:val="20"/>
+                <w:szCs w:val="20"/>
+              </w:rPr>
+              <w:t>Ch. 14: Introduction to Personality and Psychodynamic Theories; Humanistic Theories and Trait Theories; Social-Cognitive Theories and the Self.</w:t>
+            </w:r>
+          </w:p>
+        </w:tc>
+      </w:tr>
+      <w:tr>
+        <w:trPr>
+          <w:cantSplit/>
+        </w:trPr>
+        <w:tc>
+          <w:tcPr>
+            <w:tcW w:w="1200" w:type="dxa"/>
+            <w:tcMar>
+              <w:top w:w="50" w:type="dxa"/>
+              <w:left w:w="80" w:type="dxa"/>
+              <w:bottom w:w="50" w:type="dxa"/>
+              <w:right w:w="80" w:type="dxa"/>
+            </w:tcMar>
+          </w:tcPr>
+          <w:p>
+            <w:pPr>
+              <w:keepNext/>
+            </w:pPr>
+            <w:r>
+              <w:rPr>
+                <w:sz w:val="20"/>
+                <w:szCs w:val="20"/>
+              </w:rPr>
+              <w:t>Fri Oct 29</w:t>
+            </w:r>
+          </w:p>
+        </w:tc>
+        <w:tc>
+          <w:tcPr>
+            <w:tcW w:w="1200" w:type="dxa"/>
+            <w:tcMar>
+              <w:top w:w="50" w:type="dxa"/>
+              <w:left w:w="80" w:type="dxa"/>
+              <w:bottom w:w="50" w:type="dxa"/>
+              <w:right w:w="80" w:type="dxa"/>
+            </w:tcMar>
+          </w:tcPr>
+          <w:p>
+            <w:pPr>
+              <w:keepNext/>
+            </w:pPr>
+            <w:r>
+              <w:rPr>
+                <w:sz w:val="20"/>
+                <w:szCs w:val="20"/>
+              </w:rPr>
+              <w:t>Lecture 28</w:t>
+            </w:r>
+          </w:p>
+        </w:tc>
+        <w:tc>
+          <w:tcPr>
+            <w:tcW w:w="2450" w:type="dxa"/>
+            <w:tcMar>
+              <w:top w:w="50" w:type="dxa"/>
+              <w:left w:w="80" w:type="dxa"/>
+              <w:bottom w:w="50" w:type="dxa"/>
+              <w:right w:w="80" w:type="dxa"/>
+            </w:tcMar>
+          </w:tcPr>
+          <w:p>
+            <w:pPr>
+              <w:keepNext/>
+            </w:pPr>
+            <w:r>
+              <w:rPr>
+                <w:sz w:val="20"/>
+                <w:szCs w:val="20"/>
+              </w:rPr>
+              <w:t>Sex, gender, and sexual behavior</w:t>
+            </w:r>
+          </w:p>
+        </w:tc>
+        <w:tc>
+          <w:tcPr>
+            <w:tcW w:w="5230" w:type="dxa"/>
+            <w:tcMar>
+              <w:top w:w="50" w:type="dxa"/>
+              <w:left w:w="80" w:type="dxa"/>
+              <w:bottom w:w="50" w:type="dxa"/>
+              <w:right w:w="80" w:type="dxa"/>
+            </w:tcMar>
+          </w:tcPr>
+          <w:p>
+            <w:pPr>
+              <w:keepNext/>
+              <w:rPr>
+                <w:sz w:val="16"/>
+                <w:szCs w:val="16"/>
+              </w:rPr>
+            </w:pPr>
+            <w:r>
+              <w:rPr>
+                <w:sz w:val="20"/>
+                <w:szCs w:val="20"/>
+              </w:rPr>
+              <w:t>Ch. 4: Cultural and Gender Diversity: Understanding Nature and Nurture. Ch. 11: Sexual Motivation.</w:t>
+            </w:r>
+          </w:p>
+        </w:tc>
+      </w:tr>
+      <w:tr>
+        <w:trPr>
+          <w:cantSplit/>
+        </w:trPr>
+        <w:tc>
+          <w:tcPr>
+            <w:tcW w:w="1200" w:type="dxa"/>
+            <w:tcMar>
+              <w:top w:w="50" w:type="dxa"/>
+              <w:left w:w="80" w:type="dxa"/>
+              <w:bottom w:w="50" w:type="dxa"/>
+              <w:right w:w="80" w:type="dxa"/>
+            </w:tcMar>
+          </w:tcPr>
+          <w:p>
+            <w:pPr>
+              <w:keepNext/>
+            </w:pPr>
+            <w:r>
+              <w:rPr>
+                <w:sz w:val="20"/>
+                <w:szCs w:val="20"/>
+              </w:rPr>
+              <w:t>Mon Nov 1</w:t>
+            </w:r>
+          </w:p>
+        </w:tc>
+        <w:tc>
+          <w:tcPr>
+            <w:tcW w:w="1200" w:type="dxa"/>
+            <w:tcMar>
+              <w:top w:w="50" w:type="dxa"/>
+              <w:left w:w="80" w:type="dxa"/>
+              <w:bottom w:w="50" w:type="dxa"/>
+              <w:right w:w="80" w:type="dxa"/>
+            </w:tcMar>
+          </w:tcPr>
+          <w:p>
+            <w:pPr>
+              <w:keepNext/>
+            </w:pPr>
+            <w:r>
+              <w:rPr>
+                <w:sz w:val="20"/>
+                <w:szCs w:val="20"/>
+              </w:rPr>
+              <w:t>Lecture 29</w:t>
+            </w:r>
+          </w:p>
+        </w:tc>
+        <w:tc>
+          <w:tcPr>
+            <w:tcW w:w="2450" w:type="dxa"/>
+            <w:tcMar>
+              <w:top w:w="50" w:type="dxa"/>
+              <w:left w:w="80" w:type="dxa"/>
+              <w:bottom w:w="50" w:type="dxa"/>
+              <w:right w:w="80" w:type="dxa"/>
+            </w:tcMar>
+          </w:tcPr>
+          <w:p>
+            <w:pPr>
+              <w:keepNext/>
+            </w:pPr>
+            <w:r>
+              <w:rPr>
+                <w:sz w:val="20"/>
+                <w:szCs w:val="20"/>
+              </w:rPr>
+              <w:t>Social perception, attribution, and first impressions</w:t>
+            </w:r>
+          </w:p>
+        </w:tc>
+        <w:tc>
+          <w:tcPr>
+            <w:tcW w:w="5230" w:type="dxa"/>
+            <w:tcMar>
+              <w:top w:w="50" w:type="dxa"/>
+              <w:left w:w="80" w:type="dxa"/>
+              <w:bottom w:w="50" w:type="dxa"/>
+              <w:right w:w="80" w:type="dxa"/>
+            </w:tcMar>
+          </w:tcPr>
+          <w:p>
+            <w:pPr>
+              <w:keepNext/>
+              <w:rPr>
+                <w:sz w:val="16"/>
+                <w:szCs w:val="16"/>
+              </w:rPr>
+            </w:pPr>
+            <w:r>
+              <w:rPr>
+                <w:sz w:val="20"/>
+                <w:szCs w:val="20"/>
+              </w:rPr>
+              <w:t>Ch. 13: Social Thinking. Focus on attribution, attitudes, and interpretations of other people’s behavior.</w:t>
+            </w:r>
+          </w:p>
+        </w:tc>
+      </w:tr>
+      <w:tr>
+        <w:trPr>
+          <w:cantSplit/>
+        </w:trPr>
+        <w:tc>
+          <w:tcPr>
+            <w:tcW w:w="1200" w:type="dxa"/>
+            <w:tcMar>
+              <w:top w:w="50" w:type="dxa"/>
+              <w:left w:w="80" w:type="dxa"/>
+              <w:bottom w:w="50" w:type="dxa"/>
+              <w:right w:w="80" w:type="dxa"/>
+            </w:tcMar>
+          </w:tcPr>
+          <w:p>
+            <w:pPr>
+              <w:keepNext/>
+            </w:pPr>
+            <w:r>
+              <w:rPr>
+                <w:sz w:val="20"/>
+                <w:szCs w:val="20"/>
+              </w:rPr>
+              <w:t>Wed Nov 3</w:t>
+            </w:r>
+          </w:p>
+        </w:tc>
+        <w:tc>
+          <w:tcPr>
+            <w:tcW w:w="1200" w:type="dxa"/>
+            <w:tcMar>
+              <w:top w:w="50" w:type="dxa"/>
+              <w:left w:w="80" w:type="dxa"/>
+              <w:bottom w:w="50" w:type="dxa"/>
+              <w:right w:w="80" w:type="dxa"/>
+            </w:tcMar>
+          </w:tcPr>
+          <w:p>
+            <w:pPr>
+              <w:keepNext/>
+            </w:pPr>
+            <w:r>
+              <w:rPr>
+                <w:sz w:val="20"/>
+                <w:szCs w:val="20"/>
+              </w:rPr>
+              <w:t>Lecture 30</w:t>
+            </w:r>
+          </w:p>
+        </w:tc>
+        <w:tc>
+          <w:tcPr>
+            <w:tcW w:w="2450" w:type="dxa"/>
+            <w:tcMar>
+              <w:top w:w="50" w:type="dxa"/>
+              <w:left w:w="80" w:type="dxa"/>
+              <w:bottom w:w="50" w:type="dxa"/>
+              <w:right w:w="80" w:type="dxa"/>
+            </w:tcMar>
+          </w:tcPr>
+          <w:p>
+            <w:pPr>
+              <w:keepNext/>
+            </w:pPr>
+            <w:r>
+              <w:rPr>
+                <w:sz w:val="20"/>
+                <w:szCs w:val="20"/>
+              </w:rPr>
+              <w:t>Conformity, obedience, and social power</w:t>
+            </w:r>
+          </w:p>
+        </w:tc>
+        <w:tc>
+          <w:tcPr>
+            <w:tcW w:w="5230" w:type="dxa"/>
+            <w:tcMar>
+              <w:top w:w="50" w:type="dxa"/>
+              <w:left w:w="80" w:type="dxa"/>
+              <w:bottom w:w="50" w:type="dxa"/>
+              <w:right w:w="80" w:type="dxa"/>
+            </w:tcMar>
+          </w:tcPr>
+          <w:p>
+            <w:pPr>
+              <w:keepNext/>
+              <w:rPr>
+                <w:sz w:val="16"/>
+                <w:szCs w:val="16"/>
+              </w:rPr>
+            </w:pPr>
+            <w:r>
+              <w:rPr>
+                <w:sz w:val="20"/>
+                <w:szCs w:val="20"/>
+              </w:rPr>
+              <w:t>Ch. 13: Social Influence. Focus on conformity, obedience, group processes, and the power of situations.</w:t>
+            </w:r>
+          </w:p>
+        </w:tc>
+      </w:tr>
+      <w:tr>
+        <w:trPr>
+          <w:cantSplit/>
+        </w:trPr>
+        <w:tc>
+          <w:tcPr>
+            <w:tcW w:w="1200" w:type="dxa"/>
+            <w:tcMar>
+              <w:top w:w="50" w:type="dxa"/>
+              <w:left w:w="80" w:type="dxa"/>
+              <w:bottom w:w="50" w:type="dxa"/>
+              <w:right w:w="80" w:type="dxa"/>
+            </w:tcMar>
+          </w:tcPr>
+          <w:p>
+            <w:pPr>
+              <w:keepNext/>
+            </w:pPr>
+            <w:r>
+              <w:rPr>
+                <w:sz w:val="20"/>
+                <w:szCs w:val="20"/>
+              </w:rPr>
+              <w:t>Fri Nov 5</w:t>
+            </w:r>
+          </w:p>
+        </w:tc>
+        <w:tc>
+          <w:tcPr>
+            <w:tcW w:w="1200" w:type="dxa"/>
+            <w:tcMar>
+              <w:top w:w="50" w:type="dxa"/>
+              <w:left w:w="80" w:type="dxa"/>
+              <w:bottom w:w="50" w:type="dxa"/>
+              <w:right w:w="80" w:type="dxa"/>
+            </w:tcMar>
+          </w:tcPr>
+          <w:p>
+            <w:pPr>
+              <w:keepNext/>
+            </w:pPr>
+            <w:r>
+              <w:rPr>
+                <w:sz w:val="20"/>
+                <w:szCs w:val="20"/>
+              </w:rPr>
+              <w:t>Lecture 31</w:t>
+            </w:r>
+          </w:p>
+        </w:tc>
+        <w:tc>
+          <w:tcPr>
+            <w:tcW w:w="2450" w:type="dxa"/>
+            <w:tcMar>
+              <w:top w:w="50" w:type="dxa"/>
+              <w:left w:w="80" w:type="dxa"/>
+              <w:bottom w:w="50" w:type="dxa"/>
+              <w:right w:w="80" w:type="dxa"/>
+            </w:tcMar>
+          </w:tcPr>
+          <w:p>
+            <w:pPr>
+              <w:keepNext/>
+            </w:pPr>
+            <w:r>
+              <w:rPr>
+                <w:sz w:val="20"/>
+                <w:szCs w:val="20"/>
+              </w:rPr>
+              <w:t>Prejudice, discrimination, and intergroup behavior</w:t>
+            </w:r>
+          </w:p>
+        </w:tc>
+        <w:tc>
+          <w:tcPr>
+            <w:tcW w:w="5230" w:type="dxa"/>
+            <w:tcMar>
+              <w:top w:w="50" w:type="dxa"/>
+              <w:left w:w="80" w:type="dxa"/>
+              <w:bottom w:w="50" w:type="dxa"/>
+              <w:right w:w="80" w:type="dxa"/>
+            </w:tcMar>
+          </w:tcPr>
+          <w:p>
+            <w:pPr>
+              <w:keepNext/>
+              <w:rPr>
+                <w:sz w:val="16"/>
+                <w:szCs w:val="16"/>
+              </w:rPr>
+            </w:pPr>
+            <w:r>
+              <w:rPr>
+                <w:sz w:val="20"/>
+                <w:szCs w:val="20"/>
+              </w:rPr>
+              <w:t>Ch. 13: Antisocial Relations. Focus on prejudice, discrimination, aggression, and intergroup conflict.</w:t>
+            </w:r>
+          </w:p>
+        </w:tc>
+      </w:tr>
+      <w:tr>
+        <w:trPr>
+          <w:cantSplit/>
+        </w:trPr>
+        <w:tc>
+          <w:tcPr>
+            <w:tcW w:w="1200" w:type="dxa"/>
+            <w:tcMar>
+              <w:top w:w="50" w:type="dxa"/>
+              <w:left w:w="80" w:type="dxa"/>
+              <w:bottom w:w="50" w:type="dxa"/>
+              <w:right w:w="80" w:type="dxa"/>
+            </w:tcMar>
+          </w:tcPr>
+          <w:p>
+            <w:pPr>
+              <w:keepNext/>
+            </w:pPr>
+            <w:r>
+              <w:rPr>
+                <w:sz w:val="20"/>
+                <w:szCs w:val="20"/>
+              </w:rPr>
+              <w:t>Mon Nov 8</w:t>
+            </w:r>
+          </w:p>
+        </w:tc>
+        <w:tc>
+          <w:tcPr>
+            <w:tcW w:w="1200" w:type="dxa"/>
+            <w:tcMar>
+              <w:top w:w="50" w:type="dxa"/>
+              <w:left w:w="80" w:type="dxa"/>
+              <w:bottom w:w="50" w:type="dxa"/>
+              <w:right w:w="80" w:type="dxa"/>
+            </w:tcMar>
+          </w:tcPr>
+          <w:p>
+            <w:pPr>
+              <w:keepNext/>
+            </w:pPr>
+            <w:r>
+              <w:rPr>
+                <w:sz w:val="20"/>
+                <w:szCs w:val="20"/>
+              </w:rPr>
+              <w:t>Lecture 32</w:t>
+            </w:r>
+          </w:p>
+        </w:tc>
+        <w:tc>
+          <w:tcPr>
+            <w:tcW w:w="2450" w:type="dxa"/>
+            <w:tcMar>
+              <w:top w:w="50" w:type="dxa"/>
+              <w:left w:w="80" w:type="dxa"/>
+              <w:bottom w:w="50" w:type="dxa"/>
+              <w:right w:w="80" w:type="dxa"/>
+            </w:tcMar>
+          </w:tcPr>
+          <w:p>
+            <w:pPr>
+              <w:keepNext/>
+            </w:pPr>
+            <w:r>
+              <w:rPr>
+                <w:sz w:val="20"/>
+                <w:szCs w:val="20"/>
+              </w:rPr>
+              <w:t>Cooperation, helping, and collective action</w:t>
+            </w:r>
+          </w:p>
+        </w:tc>
+        <w:tc>
+          <w:tcPr>
+            <w:tcW w:w="5230" w:type="dxa"/>
+            <w:tcMar>
+              <w:top w:w="50" w:type="dxa"/>
+              <w:left w:w="80" w:type="dxa"/>
+              <w:bottom w:w="50" w:type="dxa"/>
+              <w:right w:w="80" w:type="dxa"/>
+            </w:tcMar>
+          </w:tcPr>
+          <w:p>
+            <w:pPr>
+              <w:keepNext/>
+              <w:rPr>
+                <w:sz w:val="16"/>
+                <w:szCs w:val="16"/>
+              </w:rPr>
+            </w:pPr>
+            <w:r>
+              <w:rPr>
+                <w:sz w:val="20"/>
+                <w:szCs w:val="20"/>
+              </w:rPr>
+              <w:t>Ch. 13: Prosocial Relations. Focus on altruism, cooperation, conflict, and peacemaking. Review group processes in Social Influence.</w:t>
+            </w:r>
+          </w:p>
+        </w:tc>
+      </w:tr>
+      <w:tr>
+        <w:trPr>
+          <w:cantSplit/>
+        </w:trPr>
+        <w:tc>
+          <w:tcPr>
+            <w:tcW w:w="1200" w:type="dxa"/>
+            <w:tcMar>
+              <w:top w:w="50" w:type="dxa"/>
+              <w:left w:w="80" w:type="dxa"/>
+              <w:bottom w:w="50" w:type="dxa"/>
+              <w:right w:w="80" w:type="dxa"/>
+            </w:tcMar>
+          </w:tcPr>
+          <w:p>
+            <w:pPr>
+              <w:keepNext/>
+            </w:pPr>
+            <w:r>
+              <w:rPr>
+                <w:sz w:val="20"/>
+                <w:szCs w:val="20"/>
+              </w:rPr>
+              <w:t>Wed Nov 10</w:t>
+            </w:r>
+          </w:p>
+        </w:tc>
+        <w:tc>
+          <w:tcPr>
+            <w:tcW w:w="1200" w:type="dxa"/>
+            <w:tcMar>
+              <w:top w:w="50" w:type="dxa"/>
+              <w:left w:w="80" w:type="dxa"/>
+              <w:bottom w:w="50" w:type="dxa"/>
+              <w:right w:w="80" w:type="dxa"/>
+            </w:tcMar>
+          </w:tcPr>
+          <w:p>
+            <w:pPr>
+              <w:keepNext/>
+            </w:pPr>
+            <w:r>
+              <w:rPr>
+                <w:sz w:val="20"/>
+                <w:szCs w:val="20"/>
+              </w:rPr>
+              <w:t>Lecture 33</w:t>
+            </w:r>
+          </w:p>
+        </w:tc>
+        <w:tc>
+          <w:tcPr>
+            <w:tcW w:w="2450" w:type="dxa"/>
+            <w:tcMar>
+              <w:top w:w="50" w:type="dxa"/>
+              <w:left w:w="80" w:type="dxa"/>
+              <w:bottom w:w="50" w:type="dxa"/>
+              <w:right w:w="80" w:type="dxa"/>
+            </w:tcMar>
+          </w:tcPr>
+          <w:p>
+            <w:pPr>
+              <w:keepNext/>
+            </w:pPr>
+            <w:r>
+              <w:rPr>
+                <w:sz w:val="20"/>
+                <w:szCs w:val="20"/>
+              </w:rPr>
+              <w:t>Relationships, belonging, and loneliness</w:t>
+            </w:r>
+          </w:p>
+        </w:tc>
+        <w:tc>
+          <w:tcPr>
+            <w:tcW w:w="5230" w:type="dxa"/>
+            <w:tcMar>
+              <w:top w:w="50" w:type="dxa"/>
+              <w:left w:w="80" w:type="dxa"/>
+              <w:bottom w:w="50" w:type="dxa"/>
+              <w:right w:w="80" w:type="dxa"/>
+            </w:tcMar>
+          </w:tcPr>
+          <w:p>
+            <w:pPr>
+              <w:keepNext/>
+              <w:rPr>
+                <w:sz w:val="16"/>
+                <w:szCs w:val="16"/>
+              </w:rPr>
+            </w:pPr>
+            <w:r>
+              <w:rPr>
+                <w:sz w:val="20"/>
+                <w:szCs w:val="20"/>
+              </w:rPr>
+              <w:t>Ch. 11: Affiliation and Achievement, focusing on belongingness. Ch. 13: Prosocial Relations, focusing on attraction and close relationships.</w:t>
+            </w:r>
+          </w:p>
+        </w:tc>
+      </w:tr>
+      <w:tr>
+        <w:trPr>
+          <w:cantSplit/>
+        </w:trPr>
+        <w:tc>
+          <w:tcPr>
+            <w:tcW w:w="1200" w:type="dxa"/>
+            <w:tcMar>
+              <w:top w:w="50" w:type="dxa"/>
+              <w:left w:w="80" w:type="dxa"/>
+              <w:bottom w:w="50" w:type="dxa"/>
+              <w:right w:w="80" w:type="dxa"/>
+            </w:tcMar>
+          </w:tcPr>
+          <w:p>
+            <w:pPr>
+              <w:keepNext/>
+            </w:pPr>
+            <w:r>
+              <w:rPr>
+                <w:sz w:val="20"/>
+                <w:szCs w:val="20"/>
+              </w:rPr>
+              <w:t>Fri Nov 12</w:t>
+            </w:r>
+          </w:p>
+        </w:tc>
+        <w:tc>
+          <w:tcPr>
+            <w:tcW w:w="1200" w:type="dxa"/>
+            <w:tcMar>
+              <w:top w:w="50" w:type="dxa"/>
+              <w:left w:w="80" w:type="dxa"/>
+              <w:bottom w:w="50" w:type="dxa"/>
+              <w:right w:w="80" w:type="dxa"/>
+            </w:tcMar>
+          </w:tcPr>
+          <w:p>
+            <w:pPr>
+              <w:keepNext/>
+            </w:pPr>
+            <w:r>
+              <w:rPr>
+                <w:sz w:val="20"/>
+                <w:szCs w:val="20"/>
+              </w:rPr>
+              <w:t>Lecture 34</w:t>
+            </w:r>
+          </w:p>
+        </w:tc>
+        <w:tc>
+          <w:tcPr>
+            <w:tcW w:w="2450" w:type="dxa"/>
+            <w:tcMar>
+              <w:top w:w="50" w:type="dxa"/>
+              <w:left w:w="80" w:type="dxa"/>
+              <w:bottom w:w="50" w:type="dxa"/>
+              <w:right w:w="80" w:type="dxa"/>
+            </w:tcMar>
+          </w:tcPr>
+          <w:p>
+            <w:pPr>
+              <w:keepNext/>
+            </w:pPr>
+            <w:r>
+              <w:rPr>
+                <w:sz w:val="20"/>
+                <w:szCs w:val="20"/>
+              </w:rPr>
+              <w:t>Culture, work, and behavior in organizations</w:t>
+            </w:r>
+          </w:p>
+        </w:tc>
+        <w:tc>
+          <w:tcPr>
+            <w:tcW w:w="5230" w:type="dxa"/>
+            <w:tcMar>
+              <w:top w:w="50" w:type="dxa"/>
+              <w:left w:w="80" w:type="dxa"/>
+              <w:bottom w:w="50" w:type="dxa"/>
+              <w:right w:w="80" w:type="dxa"/>
+            </w:tcMar>
+          </w:tcPr>
+          <w:p>
+            <w:pPr>
+              <w:keepNext/>
+              <w:rPr>
+                <w:sz w:val="16"/>
+                <w:szCs w:val="16"/>
+              </w:rPr>
+            </w:pPr>
+            <w:r>
+              <w:rPr>
+                <w:sz w:val="20"/>
+                <w:szCs w:val="20"/>
+              </w:rPr>
+              <w:t>Ch. 4: Cultural and Gender Diversity: Understanding Nature and Nurture. Review Ch. 11: Affiliation and Achievement, focusing on achievement; and Ch. 13: Social Influence, focusing on group behavior. These sections provide the foundations for the lecture’s applications to work and organizations.</w:t>
+            </w:r>
+          </w:p>
+        </w:tc>
+      </w:tr>
+      <w:tr>
+        <w:trPr>
+          <w:cantSplit/>
+        </w:trPr>
+        <w:tc>
+          <w:tcPr>
+            <w:tcW w:w="1200" w:type="dxa"/>
+            <w:tcMar>
+              <w:top w:w="50" w:type="dxa"/>
+              <w:left w:w="80" w:type="dxa"/>
+              <w:bottom w:w="50" w:type="dxa"/>
+              <w:right w:w="80" w:type="dxa"/>
+            </w:tcMar>
+          </w:tcPr>
+          <w:p>
+            <w:pPr>
+              <w:keepNext/>
+            </w:pPr>
+            <w:r>
+              <w:rPr>
+                <w:sz w:val="20"/>
+                <w:szCs w:val="20"/>
+              </w:rPr>
+              <w:t>Mon Nov 15</w:t>
+            </w:r>
+          </w:p>
+        </w:tc>
+        <w:tc>
+          <w:tcPr>
+            <w:tcW w:w="1200" w:type="dxa"/>
+            <w:tcMar>
+              <w:top w:w="50" w:type="dxa"/>
+              <w:left w:w="80" w:type="dxa"/>
+              <w:bottom w:w="50" w:type="dxa"/>
+              <w:right w:w="80" w:type="dxa"/>
+            </w:tcMar>
+          </w:tcPr>
+          <w:p>
+            <w:pPr>
+              <w:keepNext/>
+            </w:pPr>
+            <w:r>
+              <w:rPr>
+                <w:sz w:val="20"/>
+                <w:szCs w:val="20"/>
+              </w:rPr>
+              <w:t>Lecture 35</w:t>
+            </w:r>
+          </w:p>
+        </w:tc>
+        <w:tc>
+          <w:tcPr>
+            <w:tcW w:w="2450" w:type="dxa"/>
+            <w:tcMar>
+              <w:top w:w="50" w:type="dxa"/>
+              <w:left w:w="80" w:type="dxa"/>
+              <w:bottom w:w="50" w:type="dxa"/>
+              <w:right w:w="80" w:type="dxa"/>
+            </w:tcMar>
+          </w:tcPr>
+          <w:p>
+            <w:pPr>
+              <w:keepNext/>
+            </w:pPr>
+            <w:r>
+              <w:rPr>
+                <w:sz w:val="20"/>
+                <w:szCs w:val="20"/>
+              </w:rPr>
+              <w:t>Psychological disorders, assessment, and neurodevelopment</w:t>
+            </w:r>
+          </w:p>
+        </w:tc>
+        <w:tc>
+          <w:tcPr>
+            <w:tcW w:w="5230" w:type="dxa"/>
+            <w:tcMar>
+              <w:top w:w="50" w:type="dxa"/>
+              <w:left w:w="80" w:type="dxa"/>
+              <w:bottom w:w="50" w:type="dxa"/>
+              <w:right w:w="80" w:type="dxa"/>
+            </w:tcMar>
+          </w:tcPr>
+          <w:p>
+            <w:pPr>
+              <w:keepNext/>
+              <w:rPr>
+                <w:sz w:val="16"/>
+                <w:szCs w:val="16"/>
+              </w:rPr>
+            </w:pPr>
+            <w:r>
+              <w:rPr>
+                <w:sz w:val="20"/>
+                <w:szCs w:val="20"/>
+              </w:rPr>
+              <w:t>Ch. 15: Introduction to Psychological Disorders; Neurodevelopmental Disorders. Focus on classification, assessment, explanatory models, and developmental context.</w:t>
+            </w:r>
+          </w:p>
+        </w:tc>
+      </w:tr>
+      <w:tr>
+        <w:trPr>
+          <w:cantSplit/>
+        </w:trPr>
+        <w:tc>
+          <w:tcPr>
+            <w:tcW w:w="1200" w:type="dxa"/>
+            <w:tcMar>
+              <w:top w:w="50" w:type="dxa"/>
+              <w:left w:w="80" w:type="dxa"/>
+              <w:bottom w:w="50" w:type="dxa"/>
+              <w:right w:w="80" w:type="dxa"/>
+            </w:tcMar>
+          </w:tcPr>
+          <w:p>
+            <w:pPr>
+              <w:keepNext/>
+            </w:pPr>
+            <w:r>
+              <w:rPr>
+                <w:sz w:val="20"/>
+                <w:szCs w:val="20"/>
+              </w:rPr>
+              <w:t>Wed Nov 17</w:t>
+            </w:r>
+          </w:p>
+        </w:tc>
+        <w:tc>
+          <w:tcPr>
+            <w:tcW w:w="1200" w:type="dxa"/>
+            <w:tcMar>
+              <w:top w:w="50" w:type="dxa"/>
+              <w:left w:w="80" w:type="dxa"/>
+              <w:bottom w:w="50" w:type="dxa"/>
+              <w:right w:w="80" w:type="dxa"/>
+            </w:tcMar>
+          </w:tcPr>
+          <w:p>
+            <w:pPr>
+              <w:keepNext/>
+            </w:pPr>
+            <w:r>
+              <w:rPr>
+                <w:sz w:val="20"/>
+                <w:szCs w:val="20"/>
+              </w:rPr>
+              <w:t>Lecture 36</w:t>
+            </w:r>
+          </w:p>
+        </w:tc>
+        <w:tc>
+          <w:tcPr>
+            <w:tcW w:w="2450" w:type="dxa"/>
+            <w:tcMar>
+              <w:top w:w="50" w:type="dxa"/>
+              <w:left w:w="80" w:type="dxa"/>
+              <w:bottom w:w="50" w:type="dxa"/>
+              <w:right w:w="80" w:type="dxa"/>
+            </w:tcMar>
+          </w:tcPr>
+          <w:p>
+            <w:pPr>
+              <w:keepNext/>
+            </w:pPr>
+            <w:r>
+              <w:rPr>
+                <w:sz w:val="20"/>
+                <w:szCs w:val="20"/>
+              </w:rPr>
+              <w:t>Anxiety, trauma, and obsessive-compulsive disorders</w:t>
+            </w:r>
+          </w:p>
+        </w:tc>
+        <w:tc>
+          <w:tcPr>
+            <w:tcW w:w="5230" w:type="dxa"/>
+            <w:tcMar>
+              <w:top w:w="50" w:type="dxa"/>
+              <w:left w:w="80" w:type="dxa"/>
+              <w:bottom w:w="50" w:type="dxa"/>
+              <w:right w:w="80" w:type="dxa"/>
+            </w:tcMar>
+          </w:tcPr>
+          <w:p>
+            <w:pPr>
+              <w:keepNext/>
+              <w:rPr>
+                <w:sz w:val="16"/>
+                <w:szCs w:val="16"/>
+              </w:rPr>
+            </w:pPr>
+            <w:r>
+              <w:rPr>
+                <w:sz w:val="20"/>
+                <w:szCs w:val="20"/>
+              </w:rPr>
+              <w:t>Ch. 15: Anxiety Disorders, Obsessive Compulsive and Related Disorders, Trauma- and Stressor-Related Disorders, and Somatic Symptom and Related Disorders.</w:t>
+            </w:r>
+          </w:p>
+        </w:tc>
+      </w:tr>
+      <w:tr>
+        <w:trPr>
+          <w:cantSplit/>
+        </w:trPr>
+        <w:tc>
+          <w:tcPr>
+            <w:tcW w:w="1200" w:type="dxa"/>
+            <w:tcMar>
+              <w:top w:w="50" w:type="dxa"/>
+              <w:left w:w="80" w:type="dxa"/>
+              <w:bottom w:w="50" w:type="dxa"/>
+              <w:right w:w="80" w:type="dxa"/>
+            </w:tcMar>
+          </w:tcPr>
+          <w:p>
+            <w:pPr>
+              <w:keepNext/>
+            </w:pPr>
+            <w:r>
+              <w:rPr>
+                <w:sz w:val="20"/>
+                <w:szCs w:val="20"/>
+              </w:rPr>
+              <w:t>Fri Nov 19</w:t>
+            </w:r>
+          </w:p>
+        </w:tc>
+        <w:tc>
+          <w:tcPr>
+            <w:tcW w:w="1200" w:type="dxa"/>
+            <w:tcMar>
+              <w:top w:w="50" w:type="dxa"/>
+              <w:left w:w="80" w:type="dxa"/>
+              <w:bottom w:w="50" w:type="dxa"/>
+              <w:right w:w="80" w:type="dxa"/>
+            </w:tcMar>
+          </w:tcPr>
+          <w:p>
+            <w:pPr>
+              <w:keepNext/>
+            </w:pPr>
+            <w:r>
+              <w:rPr>
+                <w:sz w:val="20"/>
+                <w:szCs w:val="20"/>
+              </w:rPr>
+              <w:t>Lecture 37</w:t>
+            </w:r>
+          </w:p>
+        </w:tc>
+        <w:tc>
+          <w:tcPr>
+            <w:tcW w:w="2450" w:type="dxa"/>
+            <w:tcMar>
+              <w:top w:w="50" w:type="dxa"/>
+              <w:left w:w="80" w:type="dxa"/>
+              <w:bottom w:w="50" w:type="dxa"/>
+              <w:right w:w="80" w:type="dxa"/>
+            </w:tcMar>
+          </w:tcPr>
+          <w:p>
+            <w:pPr>
+              <w:keepNext/>
+            </w:pPr>
+            <w:r>
+              <w:rPr>
+                <w:sz w:val="20"/>
+                <w:szCs w:val="20"/>
+              </w:rPr>
+              <w:t>Mood disorders: depression and bipolar disorder</w:t>
+            </w:r>
+          </w:p>
+        </w:tc>
+        <w:tc>
+          <w:tcPr>
+            <w:tcW w:w="5230" w:type="dxa"/>
+            <w:tcMar>
+              <w:top w:w="50" w:type="dxa"/>
+              <w:left w:w="80" w:type="dxa"/>
+              <w:bottom w:w="50" w:type="dxa"/>
+              <w:right w:w="80" w:type="dxa"/>
+            </w:tcMar>
+          </w:tcPr>
+          <w:p>
+            <w:pPr>
+              <w:keepNext/>
+              <w:rPr>
+                <w:sz w:val="16"/>
+                <w:szCs w:val="16"/>
+              </w:rPr>
+            </w:pPr>
+            <w:r>
+              <w:rPr>
+                <w:sz w:val="20"/>
+                <w:szCs w:val="20"/>
+              </w:rPr>
+              <w:t>Ch. 15: Depressive Disorders and Bipolar Disorders.</w:t>
+            </w:r>
+          </w:p>
+        </w:tc>
+      </w:tr>
+      <w:tr>
+        <w:trPr>
+          <w:cantSplit/>
+        </w:trPr>
+        <w:tc>
+          <w:tcPr>
+            <w:tcW w:w="1200" w:type="dxa"/>
+            <w:tcMar>
+              <w:top w:w="50" w:type="dxa"/>
+              <w:left w:w="80" w:type="dxa"/>
+              <w:bottom w:w="50" w:type="dxa"/>
+              <w:right w:w="80" w:type="dxa"/>
+            </w:tcMar>
+          </w:tcPr>
+          <w:p>
+            <w:pPr>
+              <w:keepNext/>
+            </w:pPr>
+            <w:r>
+              <w:rPr>
+                <w:sz w:val="20"/>
+                <w:szCs w:val="20"/>
+              </w:rPr>
+              <w:t>Mon Nov 22</w:t>
+            </w:r>
+          </w:p>
+        </w:tc>
+        <w:tc>
+          <w:tcPr>
+            <w:tcW w:w="1200" w:type="dxa"/>
+            <w:tcMar>
+              <w:top w:w="50" w:type="dxa"/>
+              <w:left w:w="80" w:type="dxa"/>
+              <w:bottom w:w="50" w:type="dxa"/>
+              <w:right w:w="80" w:type="dxa"/>
+            </w:tcMar>
+          </w:tcPr>
+          <w:p>
+            <w:pPr>
+              <w:keepNext/>
+            </w:pPr>
+            <w:r>
+              <w:rPr>
+                <w:sz w:val="20"/>
+                <w:szCs w:val="20"/>
+              </w:rPr>
+              <w:t>Lecture 38</w:t>
+            </w:r>
+          </w:p>
+        </w:tc>
+        <w:tc>
+          <w:tcPr>
+            <w:tcW w:w="2450" w:type="dxa"/>
+            <w:tcMar>
+              <w:top w:w="50" w:type="dxa"/>
+              <w:left w:w="80" w:type="dxa"/>
+              <w:bottom w:w="50" w:type="dxa"/>
+              <w:right w:w="80" w:type="dxa"/>
+            </w:tcMar>
+          </w:tcPr>
+          <w:p>
+            <w:pPr>
+              <w:keepNext/>
+            </w:pPr>
+            <w:r>
+              <w:rPr>
+                <w:sz w:val="20"/>
+                <w:szCs w:val="20"/>
+              </w:rPr>
+              <w:t>Schizophrenia and psychosis</w:t>
+            </w:r>
+          </w:p>
+        </w:tc>
+        <w:tc>
+          <w:tcPr>
+            <w:tcW w:w="5230" w:type="dxa"/>
+            <w:tcMar>
+              <w:top w:w="50" w:type="dxa"/>
+              <w:left w:w="80" w:type="dxa"/>
+              <w:bottom w:w="50" w:type="dxa"/>
+              <w:right w:w="80" w:type="dxa"/>
+            </w:tcMar>
+          </w:tcPr>
+          <w:p>
+            <w:pPr>
+              <w:keepNext/>
+              <w:rPr>
+                <w:sz w:val="16"/>
+                <w:szCs w:val="16"/>
+              </w:rPr>
+            </w:pPr>
+            <w:r>
+              <w:rPr>
+                <w:sz w:val="20"/>
+                <w:szCs w:val="20"/>
+              </w:rPr>
+              <w:t>Ch. 15: Schizophrenia.</w:t>
+            </w:r>
+          </w:p>
+        </w:tc>
+      </w:tr>
+      <w:tr>
+        <w:trPr>
+          <w:cantSplit/>
+        </w:trPr>
+        <w:tc>
+          <w:tcPr>
+            <w:tcW w:w="1200" w:type="dxa"/>
+            <w:tcMar>
+              <w:top w:w="50" w:type="dxa"/>
+              <w:left w:w="80" w:type="dxa"/>
+              <w:bottom w:w="50" w:type="dxa"/>
+              <w:right w:w="80" w:type="dxa"/>
+            </w:tcMar>
+          </w:tcPr>
+          <w:p>
+            <w:pPr>
+              <w:keepNext/>
+            </w:pPr>
+            <w:r>
+              <w:rPr>
+                <w:sz w:val="20"/>
+                <w:szCs w:val="20"/>
+              </w:rPr>
+              <w:t>Mon Nov 29</w:t>
+            </w:r>
+          </w:p>
+        </w:tc>
+        <w:tc>
+          <w:tcPr>
+            <w:tcW w:w="1200" w:type="dxa"/>
+            <w:tcMar>
+              <w:top w:w="50" w:type="dxa"/>
+              <w:left w:w="80" w:type="dxa"/>
+              <w:bottom w:w="50" w:type="dxa"/>
+              <w:right w:w="80" w:type="dxa"/>
+            </w:tcMar>
+          </w:tcPr>
+          <w:p>
+            <w:pPr>
+              <w:keepNext/>
+            </w:pPr>
+            <w:r>
+              <w:rPr>
+                <w:sz w:val="20"/>
+                <w:szCs w:val="20"/>
+              </w:rPr>
+              <w:t>Lecture 39</w:t>
+            </w:r>
+          </w:p>
+        </w:tc>
+        <w:tc>
+          <w:tcPr>
+            <w:tcW w:w="2450" w:type="dxa"/>
+            <w:tcMar>
+              <w:top w:w="50" w:type="dxa"/>
+              <w:left w:w="80" w:type="dxa"/>
+              <w:bottom w:w="50" w:type="dxa"/>
+              <w:right w:w="80" w:type="dxa"/>
+            </w:tcMar>
+          </w:tcPr>
+          <w:p>
+            <w:pPr>
+              <w:keepNext/>
+            </w:pPr>
+            <w:r>
+              <w:rPr>
+                <w:sz w:val="20"/>
+                <w:szCs w:val="20"/>
+              </w:rPr>
+              <w:t>Dissociative, personality, and eating disorders</w:t>
+            </w:r>
+          </w:p>
+        </w:tc>
+        <w:tc>
+          <w:tcPr>
+            <w:tcW w:w="5230" w:type="dxa"/>
+            <w:tcMar>
+              <w:top w:w="50" w:type="dxa"/>
+              <w:left w:w="80" w:type="dxa"/>
+              <w:bottom w:w="50" w:type="dxa"/>
+              <w:right w:w="80" w:type="dxa"/>
+            </w:tcMar>
+          </w:tcPr>
+          <w:p>
+            <w:pPr>
+              <w:keepNext/>
+              <w:rPr>
+                <w:sz w:val="16"/>
+                <w:szCs w:val="16"/>
+              </w:rPr>
+            </w:pPr>
+            <w:r>
+              <w:rPr>
+                <w:sz w:val="20"/>
+                <w:szCs w:val="20"/>
+              </w:rPr>
+              <w:t>Ch. 15: Dissociative, Personality, and Eating Disorders.</w:t>
+            </w:r>
+          </w:p>
+        </w:tc>
+      </w:tr>
+      <w:tr>
+        <w:trPr>
+          <w:cantSplit/>
+        </w:trPr>
+        <w:tc>
+          <w:tcPr>
+            <w:tcW w:w="1200" w:type="dxa"/>
+            <w:tcMar>
+              <w:top w:w="50" w:type="dxa"/>
+              <w:left w:w="80" w:type="dxa"/>
+              <w:bottom w:w="50" w:type="dxa"/>
+              <w:right w:w="80" w:type="dxa"/>
+            </w:tcMar>
+          </w:tcPr>
+          <w:p>
+            <w:pPr>
+              <w:keepNext/>
+            </w:pPr>
+            <w:r>
+              <w:rPr>
+                <w:sz w:val="20"/>
+                <w:szCs w:val="20"/>
+              </w:rPr>
+              <w:t>Wed Dec 1</w:t>
+            </w:r>
+          </w:p>
+        </w:tc>
+        <w:tc>
+          <w:tcPr>
+            <w:tcW w:w="1200" w:type="dxa"/>
+            <w:tcMar>
+              <w:top w:w="50" w:type="dxa"/>
+              <w:left w:w="80" w:type="dxa"/>
+              <w:bottom w:w="50" w:type="dxa"/>
+              <w:right w:w="80" w:type="dxa"/>
+            </w:tcMar>
+          </w:tcPr>
+          <w:p>
+            <w:pPr>
+              <w:keepNext/>
+            </w:pPr>
+            <w:r>
+              <w:rPr>
+                <w:sz w:val="20"/>
+                <w:szCs w:val="20"/>
+              </w:rPr>
+              <w:t>Lecture 40</w:t>
+            </w:r>
+          </w:p>
+        </w:tc>
+        <w:tc>
+          <w:tcPr>
+            <w:tcW w:w="2450" w:type="dxa"/>
+            <w:tcMar>
+              <w:top w:w="50" w:type="dxa"/>
+              <w:left w:w="80" w:type="dxa"/>
+              <w:bottom w:w="50" w:type="dxa"/>
+              <w:right w:w="80" w:type="dxa"/>
+            </w:tcMar>
+          </w:tcPr>
+          <w:p>
+            <w:pPr>
+              <w:keepNext/>
+            </w:pPr>
+            <w:r>
+              <w:rPr>
+                <w:sz w:val="20"/>
+                <w:szCs w:val="20"/>
+              </w:rPr>
+              <w:t>Treatments: psychotherapy, medication, and prevention</w:t>
+            </w:r>
+          </w:p>
+        </w:tc>
+        <w:tc>
+          <w:tcPr>
+            <w:tcW w:w="5230" w:type="dxa"/>
+            <w:tcMar>
+              <w:top w:w="50" w:type="dxa"/>
+              <w:left w:w="80" w:type="dxa"/>
+              <w:bottom w:w="50" w:type="dxa"/>
+              <w:right w:w="80" w:type="dxa"/>
+            </w:tcMar>
+          </w:tcPr>
+          <w:p>
+            <w:pPr>
+              <w:keepNext/>
+              <w:rPr>
+                <w:sz w:val="16"/>
+                <w:szCs w:val="16"/>
+              </w:rPr>
+            </w:pPr>
+            <w:r>
+              <w:rPr>
+                <w:sz w:val="20"/>
+                <w:szCs w:val="20"/>
+              </w:rPr>
+              <w:t>Ch. 16: Introduction to Therapy and the Psychological Therapies; Evaluating Psychotherapies; The Biomedical Therapies and Preventing Psychological Disorders.</w:t>
+            </w:r>
+          </w:p>
+        </w:tc>
+      </w:tr>
+      <w:tr>
+        <w:trPr>
+          <w:cantSplit/>
+        </w:trPr>
+        <w:tc>
+          <w:tcPr>
+            <w:tcW w:w="1200" w:type="dxa"/>
+            <w:tcMar>
+              <w:top w:w="50" w:type="dxa"/>
+              <w:left w:w="80" w:type="dxa"/>
+              <w:bottom w:w="50" w:type="dxa"/>
+              <w:right w:w="80" w:type="dxa"/>
+            </w:tcMar>
+          </w:tcPr>
+          <w:p>
+            <w:pPr>
+              <w:keepNext/>
+            </w:pPr>
+            <w:r>
+              <w:rPr>
+                <w:sz w:val="20"/>
+                <w:szCs w:val="20"/>
+              </w:rPr>
+              <w:t>Fri Dec 3</w:t>
+            </w:r>
+          </w:p>
+        </w:tc>
+        <w:tc>
+          <w:tcPr>
+            <w:tcW w:w="1200" w:type="dxa"/>
+            <w:tcMar>
+              <w:top w:w="50" w:type="dxa"/>
+              <w:left w:w="80" w:type="dxa"/>
+              <w:bottom w:w="50" w:type="dxa"/>
+              <w:right w:w="80" w:type="dxa"/>
+            </w:tcMar>
+          </w:tcPr>
+          <w:p>
+            <w:pPr>
+              <w:keepNext/>
+            </w:pPr>
+            <w:r>
+              <w:rPr>
+                <w:sz w:val="20"/>
+                <w:szCs w:val="20"/>
+              </w:rPr>
+              <w:t>Lecture 41</w:t>
+            </w:r>
+          </w:p>
+        </w:tc>
+        <w:tc>
+          <w:tcPr>
+            <w:tcW w:w="2450" w:type="dxa"/>
+            <w:tcMar>
+              <w:top w:w="50" w:type="dxa"/>
+              <w:left w:w="80" w:type="dxa"/>
+              <w:bottom w:w="50" w:type="dxa"/>
+              <w:right w:w="80" w:type="dxa"/>
+            </w:tcMar>
+          </w:tcPr>
+          <w:p>
+            <w:pPr>
+              <w:keepNext/>
+            </w:pPr>
+            <w:r>
+              <w:rPr>
+                <w:sz w:val="20"/>
+                <w:szCs w:val="20"/>
+              </w:rPr>
+              <w:t>Psychology in the digital world: persuasion, misinformation, and AI</w:t>
+            </w:r>
+          </w:p>
+        </w:tc>
+        <w:tc>
+          <w:tcPr>
+            <w:tcW w:w="5230" w:type="dxa"/>
+            <w:tcMar>
+              <w:top w:w="50" w:type="dxa"/>
+              <w:left w:w="80" w:type="dxa"/>
+              <w:bottom w:w="50" w:type="dxa"/>
+              <w:right w:w="80" w:type="dxa"/>
+            </w:tcMar>
+          </w:tcPr>
+          <w:p>
+            <w:pPr>
+              <w:keepNext/>
+              <w:rPr>
+                <w:sz w:val="16"/>
+                <w:szCs w:val="16"/>
+              </w:rPr>
+            </w:pPr>
+            <w:r>
+              <w:rPr>
+                <w:sz w:val="20"/>
+                <w:szCs w:val="20"/>
+              </w:rPr>
+              <w:t>Review Ch. 9: Thinking, focusing on judgment and belief; Ch. 13: Social Thinking and Social Influence, focusing on attitudes and persuasion; and Ch. 1: Research Strategies: How Psychologists Ask and Answer Questions. These sections provide the foundations for the lecture’s applications to digital media, misinformation, and AI.</w:t>
+            </w:r>
+          </w:p>
+        </w:tc>
+      </w:tr>
+    </w:tbl>
     <w:p>
       <w:pPr>
         <w:pStyle w:val="Heading2"/>

</xml_diff>

<commit_message>
Rewrite project and laboratory descriptions in instructor voice
</commit_message>
<xml_diff>
--- a/syllabus/PSYC100_L_Introduction_to_Psychology_Fall_2027_Syllabus.docx
+++ b/syllabus/PSYC100_L_Introduction_to_Psychology_Fall_2027_Syllabus.docx
@@ -3608,8 +3608,10 @@
         <w:rPr>
           <w:sz w:val="24"/>
           <w:szCs w:val="24"/>
+          <w:b w:val="0"/>
+          <w:bCs w:val="0"/>
         </w:rPr>
-        <w:t>Each student completes one Psychological Evidence Project based on a focused question covered in class. Choose ONE option. Your choice is due with your proposal. Both routes are individual work and are worth 120 points.</w:t>
+        <w:t xml:space="preserve">Each student completes one project on a psychological question covered in class. Choose ONE option. Your choice is due with your proposal. Both options are individual work and are worth 120 points.</w:t>
       </w:r>
     </w:p>
     <w:p>
@@ -3633,28 +3635,16 @@
       <w:pPr>
         <w:spacing w:after="120" w:line="276" w:lineRule="auto"/>
       </w:pPr>
-      <w:r>
-        <w:rPr>
-          <w:sz w:val="24"/>
-          <w:szCs w:val="24"/>
-        </w:rPr>
-        <w:t xml:space="preserve">Use an instructor-approved, deidentified public or provided dataset to examine a psychological question. State a prediction, reproduce a meaningful comparison, create an accurately labeled figure from the actual data, and interpret the finding. Submit the editable analysis file, a 4–6-page APA-style report, and a 5-minute recorded explanation. Include at least 4 primary studies, at least 2 published from 2000 onward and at least 1 from 2020 onward. Use a spreadsheet, </w:t>
-      </w:r>
       <w:proofErr w:type="spellStart"/>
-      <w:r>
-        <w:rPr>
-          <w:sz w:val="24"/>
-          <w:szCs w:val="24"/>
-        </w:rPr>
-        <w:t>jamovi</w:t>
-      </w:r>
       <w:proofErr w:type="spellEnd"/>
       <w:r>
         <w:rPr>
           <w:sz w:val="24"/>
           <w:szCs w:val="24"/>
+          <w:b w:val="0"/>
+          <w:bCs w:val="0"/>
         </w:rPr>
-        <w:t>, or an equivalent tool; advanced coding is not required. Do not collect new participant data for this project.</w:t>
+        <w:t xml:space="preserve">Use a dataset I provide or approve to investigate a psychological question covered in lecture. For example, you might examine how distraction affects memory or how a change in instructions affects reaction time. State what you expect to find, carry out the analysis, and show what the data actually tell you. Submit your editable analysis file, a 4–6-page APA-style report, and a 5-minute recorded walkthrough. Explain your methods, include a clearly labeled figure, and discuss what the results do and do not support. Connect your analysis to at least 4 primary research articles, including at least 2 published from 2000 onward and at least 1 from 2020 onward. A spreadsheet, jamovi, or an equivalent tool is fine; advanced coding is not required. Use deidentified data only. Do not collect new participant data for this project.</w:t>
       </w:r>
     </w:p>
     <w:p>
@@ -3682,8 +3672,10 @@
         <w:rPr>
           <w:sz w:val="24"/>
           <w:szCs w:val="24"/>
+          <w:b w:val="0"/>
+          <w:bCs w:val="0"/>
         </w:rPr>
-        <w:t>Write a 4–6-page paper in APA 7th edition format, excluding title page, figures, and references, on a focused psychological claim. Compare at least 5 primary research articles, at least 3 published from 2000 onward and at least 1 from 2020 onward. Explain what researchers did and found, assess agreements and disagreements, and propose a feasible follow-up experiment. Submit a 5-minute recorded explanation. Unrelated summaries of individual papers are insufficient.</w:t>
+        <w:t xml:space="preserve">Write a 4–6-page paper in APA 7th edition format, excluding the title page, figures, and references, on a psychological claim covered in class. Compare at least 5 primary research articles, including at least 3 published from 2000 onward and at least 1 from 2020 onward. Explain the experiments, evaluate the evidence, and make an argument about what we can reasonably conclude. Where do the studies agree? Where do they disagree, and why? Finish by proposing a feasible experiment that could help answer an unresolved question. Submit a 5-minute recorded explanation with the paper. A sequence of article summaries is not enough. The paper must argue something.</w:t>
       </w:r>
     </w:p>
     <w:p>
@@ -3953,16 +3945,10 @@
         <w:rPr>
           <w:sz w:val="24"/>
           <w:szCs w:val="24"/>
+          <w:b w:val="0"/>
+          <w:bCs w:val="0"/>
         </w:rPr>
-        <w:t xml:space="preserve">The lab is a required, graded component and begins in Week 1, August 23–27. The first session includes a reaction-time experiment, with brief instruction in ethical participation and data handling. Labs use low-risk </w:t>
-      </w:r>
-      <w:r>
-        <w:rPr>
-          <w:sz w:val="24"/>
-          <w:szCs w:val="24"/>
-        </w:rPr>
-        <w:lastRenderedPageBreak/>
-        <w:t>behavioral tasks and approved deidentified data. Personal participation as a research subject is voluntary; an equivalent analysis route is available without penalty. No task requires personal clinical disclosure, diagnostic testing of classmates, sleep deprivation, aversive stimulation, or outside recruitment. Use coded data on the approved course system. Classroom activities are not automatically approved for external human-subjects research.</w:t>
+        <w:t xml:space="preserve">The lab is a required, graded part of this course and begins in Week 1, August 23–27. We start with a reaction-time experiment and an introduction to ethical participation and handling data. You will conduct low-risk behavioral experiments and work with approved deidentified datasets. You are expected to do the laboratory work, but you are not required to provide your own responses as research data; an equivalent analysis option is available without penalty. You will not be asked to disclose personal clinical information, diagnose classmates, lose sleep, undergo aversive stimulation, or recruit people outside the course. Keep data coded and on the approved course system. Class exercises do not constitute approval to conduct external human-subjects research.</w:t>
       </w:r>
     </w:p>
     <w:p>
@@ -3982,21 +3968,23 @@
       </w:pPr>
       <w:r>
         <w:rPr>
-          <w:b/>
-          <w:bCs/>
+          <w:b w:val="1"/>
+          <w:bCs w:val="1"/>
           <w:color w:val="000000"/>
           <w:sz w:val="24"/>
           <w:szCs w:val="24"/>
         </w:rPr>
-        <w:t>Lab Reports (10 labs, lowest 2 dropped, 7.5% each for the 8 counted).</w:t>
+        <w:t xml:space="preserve">Lab Reports (10 labs, lowest 2 dropped, 7.5% each for the 8 counted).</w:t>
       </w:r>
       <w:r>
         <w:rPr>
+          <w:b w:val="0"/>
+          <w:bCs w:val="0"/>
           <w:color w:val="000000"/>
           <w:sz w:val="24"/>
           <w:szCs w:val="24"/>
         </w:rPr>
-        <w:t xml:space="preserve"> Lab 1 uses a guided 2–3-page report; later reports are normally 3–4 pages, excluding figures and references. Use Question and Prediction, Methods, Results, Discussion, and References. Submit a labeled authentic-data figure and an editable analysis file. Apply the comparison taught for the task rather than adding an unjustified significance test to every claim.</w:t>
+        <w:t xml:space="preserve"> Each report should explain what you tested, how you tested it, what you found, and what the findings mean. Lab 1 is a guided 2–3-page report; later reports are normally 3–4 pages, excluding figures and references. Use Question and Prediction, Methods, Results, Discussion, and References. Include a clearly labeled figure made from the actual data and submit your editable analysis file. Use the analysis taught for that experiment and explain why it fits the question. Do not add a statistical test simply because you think every result needs one.</w:t>
       </w:r>
     </w:p>
     <w:p>
@@ -4016,13 +4004,13 @@
       </w:pPr>
       <w:r>
         <w:rPr>
-          <w:b/>
-          <w:bCs/>
+          <w:b w:val="1"/>
+          <w:bCs w:val="1"/>
           <w:color w:val="000000"/>
           <w:sz w:val="24"/>
           <w:szCs w:val="24"/>
         </w:rPr>
-        <w:t>Individual Experimental Practical (10%).</w:t>
+        <w:t xml:space="preserve">Individual Experimental Practical (10%).</w:t>
       </w:r>
       <w:r>
         <w:rPr>
@@ -4032,7 +4020,7 @@
           <w:sz w:val="24"/>
           <w:szCs w:val="24"/>
         </w:rPr>
-        <w:t xml:space="preserve"> During your Week 11 lab section (November 2–4), you will complete an individual practical on one of five experiments introduced earlier in the course. Select your topic by Friday, October 22, at 11:59 PM. For your chosen experiment, explain the hypothesis and design, demonstrate the procedure, analyze a provided dataset, create a labeled figure, and interpret the findings. Preparation guides containing the protocols, assessment prompts, and practice datasets for all five options will be available by October 19, at least two weeks before the first practical. Assessment datasets contain different observations but use the same structure and analysis methods practiced beforehand. All options assess comparable experimental skills. Your grade reflects your experimental skills and reasoning, not your personal psychological performance or whether results support the hypothesis.</w:t>
+        <w:t xml:space="preserve"> In your Week 11 lab section, November 2–4, you will demonstrate that you can conduct and explain an experiment we have already done. Choose ONE of the five options below by Friday, October 22, at 11:59 PM. You will explain the question and design, demonstrate the procedure, analyze a provided dataset, make a labeled figure, and explain your findings. Preparation guides, procedures, assessment prompts, and practice datasets for all five options will be available by October 19, at least two weeks before the first practical. You will know what you are expected to do. The assessment uses different observations, but the task structure and analysis methods will be familiar. Each option tests comparable skills. Your grade depends on how well you conduct the work and explain the evidence, not how fast you respond or whether the results match your prediction.</w:t>
       </w:r>
     </w:p>
     <w:p>
@@ -4053,13 +4041,13 @@
       </w:pPr>
       <w:r>
         <w:rPr>
-          <w:b/>
-          <w:bCs/>
+          <w:b w:val="1"/>
+          <w:bCs w:val="1"/>
           <w:color w:val="000000"/>
           <w:sz w:val="24"/>
           <w:szCs w:val="24"/>
         </w:rPr>
-        <w:t>Reaction time and the speed–accuracy trade-off:</w:t>
+        <w:t xml:space="preserve">Reaction time and the speed–accuracy trade-off:</w:t>
       </w:r>
       <w:r>
         <w:rPr>
@@ -4069,7 +4057,7 @@
           <w:sz w:val="24"/>
           <w:szCs w:val="24"/>
         </w:rPr>
-        <w:t xml:space="preserve"> Compare speed-focused and accuracy-focused instructions; summarize reaction times and errors and interpret the trade-off.</w:t>
+        <w:t xml:space="preserve"> Run the task under speed-focused and accuracy-focused instructions. Compare reaction times and errors, and explain what changes when people prioritize one over the other.</w:t>
       </w:r>
     </w:p>
     <w:p>
@@ -4090,13 +4078,13 @@
       </w:pPr>
       <w:r>
         <w:rPr>
-          <w:b/>
-          <w:bCs/>
+          <w:b w:val="1"/>
+          <w:bCs w:val="1"/>
           <w:color w:val="000000"/>
           <w:sz w:val="24"/>
           <w:szCs w:val="24"/>
         </w:rPr>
-        <w:t>Psychophysics and signal detection:</w:t>
+        <w:t xml:space="preserve">Psychophysics and signal detection:</w:t>
       </w:r>
       <w:r>
         <w:rPr>
@@ -4106,7 +4094,7 @@
           <w:sz w:val="24"/>
           <w:szCs w:val="24"/>
         </w:rPr>
-        <w:t xml:space="preserve"> Distinguish signal and noise trials, classify hits and false alarms, and interpret sensitivity and response criterion using the methods taught in Lab 2.</w:t>
+        <w:t xml:space="preserve"> Use the Lab 2 procedure to distinguish signal from noise. Identify hits and false alarms, and explain the difference between detecting a stimulus and being willing to say it was there.</w:t>
       </w:r>
     </w:p>
     <w:p>
@@ -4127,13 +4115,13 @@
       </w:pPr>
       <w:r>
         <w:rPr>
-          <w:b/>
-          <w:bCs/>
+          <w:b w:val="1"/>
+          <w:bCs w:val="1"/>
           <w:color w:val="000000"/>
           <w:sz w:val="24"/>
           <w:szCs w:val="24"/>
         </w:rPr>
-        <w:t>Selective attention and Stroop interference:</w:t>
+        <w:t xml:space="preserve">Selective attention and Stroop interference:</w:t>
       </w:r>
       <w:r>
         <w:rPr>
@@ -4143,7 +4131,7 @@
           <w:sz w:val="24"/>
           <w:szCs w:val="24"/>
         </w:rPr>
-        <w:t xml:space="preserve"> Compare congruent and incongruent trials; calculate interference and interpret reaction time alongside accuracy.</w:t>
+        <w:t xml:space="preserve"> Compare congruent and incongruent trials. Calculate the interference effect and use both reaction time and accuracy to explain the result.</w:t>
       </w:r>
     </w:p>
     <w:p>
@@ -4164,13 +4152,13 @@
       </w:pPr>
       <w:r>
         <w:rPr>
-          <w:b/>
-          <w:bCs/>
+          <w:b w:val="1"/>
+          <w:bCs w:val="1"/>
           <w:color w:val="000000"/>
           <w:sz w:val="24"/>
           <w:szCs w:val="24"/>
         </w:rPr>
-        <w:t>Working memory and distraction:</w:t>
+        <w:t xml:space="preserve">Working memory and distraction:</w:t>
       </w:r>
       <w:r>
         <w:rPr>
@@ -4180,7 +4168,7 @@
           <w:sz w:val="24"/>
           <w:szCs w:val="24"/>
         </w:rPr>
-        <w:t xml:space="preserve"> Compare memory-load and distraction conditions; calculate accuracy and interpret the effects and limitations of the design.</w:t>
+        <w:t xml:space="preserve"> Compare performance across memory loads and distraction conditions. Calculate accuracy, explain the pattern, and identify a limitation of the experiment.</w:t>
       </w:r>
     </w:p>
     <w:p>
@@ -4201,13 +4189,13 @@
       </w:pPr>
       <w:r>
         <w:rPr>
-          <w:b/>
-          <w:bCs/>
+          <w:b w:val="1"/>
+          <w:bCs w:val="1"/>
           <w:color w:val="000000"/>
           <w:sz w:val="24"/>
           <w:szCs w:val="24"/>
         </w:rPr>
-        <w:t>Memory reconstruction and source monitoring:</w:t>
+        <w:t xml:space="preserve">Memory reconstruction and source monitoring:</w:t>
       </w:r>
       <w:r>
         <w:rPr>
@@ -4217,7 +4205,7 @@
           <w:sz w:val="24"/>
           <w:szCs w:val="24"/>
         </w:rPr>
-        <w:t xml:space="preserve"> Follow the standardized memory procedure; distinguish recognition from source errors and interpret the findings.</w:t>
+        <w:t xml:space="preserve"> Follow the memory-task procedure and distinguish recognizing an item from remembering where it came from. Identify recognition and source errors and explain what they tell us about memory.</w:t>
       </w:r>
     </w:p>
     <w:p>
@@ -4237,21 +4225,23 @@
       </w:pPr>
       <w:r>
         <w:rPr>
-          <w:b/>
-          <w:bCs/>
+          <w:b w:val="1"/>
+          <w:bCs w:val="1"/>
           <w:color w:val="000000"/>
           <w:sz w:val="24"/>
           <w:szCs w:val="24"/>
         </w:rPr>
-        <w:t>Methods Assignments (3 assignments, 5% each, 15% total).</w:t>
+        <w:t xml:space="preserve">Methods Assignments (3 assignments, 5% each, 15% total).</w:t>
       </w:r>
       <w:r>
         <w:rPr>
+          <w:b w:val="0"/>
+          <w:bCs w:val="0"/>
           <w:color w:val="000000"/>
           <w:sz w:val="24"/>
           <w:szCs w:val="24"/>
         </w:rPr>
-        <w:t xml:space="preserve"> Assignment 1, due September 10, teaches cleaning a reaction-time file, condition summaries, and an accurate figure. Assignment 2, due October 1, asks you to design an ethical, controlled experiment and identify a confound. Assignment 3, due October 29, compares study results, uncertainty, and generalization. Submit the editable analysis and a 1–2-page interpretation or design, as specified in the prompt. Use free graphical tools or a spreadsheet; coding is optional.</w:t>
+        <w:t xml:space="preserve"> Three short assignments build the skills you will use in your reports and projects. Assignment 1, due September 10, asks you to clean a reaction-time file, summarize the conditions, and make a clear figure. Assignment 2, due October 1, asks you to design an ethical, controlled experiment and identify a confound. Assignment 3, due October 29, asks you to compare study results and explain uncertainty and generalization. Submit your editable analysis and a 1–2-page explanation or experimental design, as directed in the assignment. A spreadsheet or free graphical analysis tool is sufficient; coding is optional.</w:t>
       </w:r>
     </w:p>
     <w:p>
@@ -4271,21 +4261,23 @@
       </w:pPr>
       <w:r>
         <w:rPr>
-          <w:b/>
-          <w:bCs/>
+          <w:b w:val="1"/>
+          <w:bCs w:val="1"/>
           <w:color w:val="000000"/>
           <w:sz w:val="24"/>
           <w:szCs w:val="24"/>
         </w:rPr>
-        <w:t>Mini-Replication Project (15%).</w:t>
+        <w:t xml:space="preserve">Mini-Replication Project (15%).</w:t>
       </w:r>
       <w:r>
         <w:rPr>
+          <w:b w:val="0"/>
+          <w:bCs w:val="0"/>
           <w:color w:val="000000"/>
           <w:sz w:val="24"/>
           <w:szCs w:val="24"/>
         </w:rPr>
-        <w:t xml:space="preserve"> Teams of 3–4 select an approved neutral task already introduced in lab. Before collecting data or inspecting the outcome, submit a one-page prediction, design, exclusion rule, and analysis plan by November 5. A data checkpoint is due November 19. Submit a shared poster and editable analysis plus an individual 2–3-page interpretation by December 3. Present for 5 minutes in your assigned Week 15 lab section. Do not submit the lecture project again as the lab project.</w:t>
+        <w:t xml:space="preserve"> In teams of 3–4, return to an approved neutral task we have already used in lab and test it again. Before collecting data or looking at the outcome, submit a one-page plan stating your prediction, experimental design, exclusion rule, and analysis. The plan is due November 5, and your data checkpoint is due November 19. Submit a shared poster and editable analysis file, along with your own 2–3-page interpretation, by December 3. Your team will give a 5-minute presentation in your assigned Week 15 lab section. Explain what you found, whether it supports your prediction, and what might account for differences from the earlier experiment. This is a separate project; do not resubmit your lecture project.</w:t>
       </w:r>
     </w:p>
     <w:p>
@@ -4308,21 +4300,23 @@
       </w:pPr>
       <w:r>
         <w:rPr>
-          <w:b/>
-          <w:bCs/>
+          <w:b w:val="1"/>
+          <w:bCs w:val="1"/>
           <w:color w:val="000000"/>
           <w:sz w:val="24"/>
           <w:szCs w:val="24"/>
         </w:rPr>
-        <w:t xml:space="preserve">Participation and access: </w:t>
+        <w:t xml:space="preserve">Participation and access:</w:t>
       </w:r>
       <w:r>
         <w:rPr>
+          <w:b w:val="0"/>
+          <w:bCs w:val="0"/>
           <w:color w:val="000000"/>
           <w:sz w:val="24"/>
           <w:szCs w:val="24"/>
         </w:rPr>
-        <w:t>The project may use an approved classroom task or an approved public-data reanalysis. No outside recruitment is authorized. A student’s grade depends on reasoning and analysis, not a particular psychological score or agreement to supply personal data. Report authentic results even when they are inconclusive; do not fabricate findings or citations.</w:t>
+        <w:t xml:space="preserve"> Use an approved classroom task or an approved public dataset for reanalysis. Do not recruit participants outside the course. You can complete the project without providing your own personal data. Report what happened, including an unclear result or one that does not support your prediction. Your grade depends on your reasoning and analysis, not on producing a particular effect. Do not fabricate data or citations.</w:t>
       </w:r>
     </w:p>
     <w:p>

</xml_diff>

<commit_message>
Simplify project and laboratory explanations without changing exams
</commit_message>
<xml_diff>
--- a/syllabus/PSYC100_L_Introduction_to_Psychology_Fall_2027_Syllabus.docx
+++ b/syllabus/PSYC100_L_Introduction_to_Psychology_Fall_2027_Syllabus.docx
@@ -3611,7 +3611,7 @@
           <w:b w:val="0"/>
           <w:bCs w:val="0"/>
         </w:rPr>
-        <w:t xml:space="preserve">Each student completes one project on a psychological question covered in class. Choose ONE option. Your choice is due with your proposal. Both options are individual work and are worth 120 points.</w:t>
+        <w:t xml:space="preserve">Each student completes one individual project on a psychological question covered in class. Choose ONE option and include your choice in your proposal. Both options are worth 120 points.</w:t>
       </w:r>
     </w:p>
     <w:p>
@@ -3644,7 +3644,7 @@
           <w:b w:val="0"/>
           <w:bCs w:val="0"/>
         </w:rPr>
-        <w:t xml:space="preserve">Use a dataset I provide or approve to investigate a psychological question covered in lecture. For example, you might examine how distraction affects memory or how a change in instructions affects reaction time. State what you expect to find, carry out the analysis, and show what the data actually tell you. Submit your editable analysis file, a 4–6-page APA-style report, and a 5-minute recorded walkthrough. Explain your methods, include a clearly labeled figure, and discuss what the results do and do not support. Connect your analysis to at least 4 primary research articles, including at least 2 published from 2000 onward and at least 1 from 2020 onward. A spreadsheet, jamovi, or an equivalent tool is fine; advanced coding is not required. Use deidentified data only. Do not collect new participant data for this project.</w:t>
+        <w:t xml:space="preserve">Use data I provide or approve to answer a psychological question from class. Explain what you expected, how you analyzed the data, and what you found. Submit your analysis file, a 4–6-page APA-style report with a labeled figure, and a 5-minute recorded explanation. Use at least 4 original research articles to put your results in context, including at least 2 published from 2000 onward and at least 1 from 2020 onward. You may use a spreadsheet, jamovi, or a similar program. Advanced coding is not required. Use data with identifying information removed; do not collect new participant data.</w:t>
       </w:r>
     </w:p>
     <w:p>
@@ -3675,7 +3675,7 @@
           <w:b w:val="0"/>
           <w:bCs w:val="0"/>
         </w:rPr>
-        <w:t xml:space="preserve">Write a 4–6-page paper in APA 7th edition format, excluding the title page, figures, and references, on a psychological claim covered in class. Compare at least 5 primary research articles, including at least 3 published from 2000 onward and at least 1 from 2020 onward. Explain the experiments, evaluate the evidence, and make an argument about what we can reasonably conclude. Where do the studies agree? Where do they disagree, and why? Finish by proposing a feasible experiment that could help answer an unresolved question. Submit a 5-minute recorded explanation with the paper. A sequence of article summaries is not enough. The paper must argue something.</w:t>
+        <w:t xml:space="preserve">Write a 4–6-page paper in APA 7th edition format on a psychological claim covered in class. The title page, figures, and references do not count toward the page limit. Compare at least 5 original research articles, including at least 3 published from 2000 onward and at least 1 from 2020 onward. Explain what the studies found, where they agree or disagree, and what you think the evidence supports. Propose an experiment that could help answer a remaining question. Submit a 5-minute recorded explanation with your paper. Do not simply summarize one article after another. The paper must argue something.</w:t>
       </w:r>
     </w:p>
     <w:p>
@@ -3948,7 +3948,7 @@
           <w:b w:val="0"/>
           <w:bCs w:val="0"/>
         </w:rPr>
-        <w:t xml:space="preserve">The lab is a required, graded part of this course and begins in Week 1, August 23–27. We start with a reaction-time experiment and an introduction to ethical participation and handling data. You will conduct low-risk behavioral experiments and work with approved deidentified datasets. You are expected to do the laboratory work, but you are not required to provide your own responses as research data; an equivalent analysis option is available without penalty. You will not be asked to disclose personal clinical information, diagnose classmates, lose sleep, undergo aversive stimulation, or recruit people outside the course. Keep data coded and on the approved course system. Class exercises do not constitute approval to conduct external human-subjects research.</w:t>
+        <w:t xml:space="preserve">The lab is a required, graded part of this course and begins in the first week. Labs meet separately from lecture. You will conduct psychological experiments, analyze data, and explain your findings in written reports.</w:t>
       </w:r>
     </w:p>
     <w:p>
@@ -3984,7 +3984,7 @@
           <w:sz w:val="24"/>
           <w:szCs w:val="24"/>
         </w:rPr>
-        <w:t xml:space="preserve"> Each report should explain what you tested, how you tested it, what you found, and what the findings mean. Lab 1 is a guided 2–3-page report; later reports are normally 3–4 pages, excluding figures and references. Use Question and Prediction, Methods, Results, Discussion, and References. Include a clearly labeled figure made from the actual data and submit your editable analysis file. Use the analysis taught for that experiment and explain why it fits the question. Do not add a statistical test simply because you think every result needs one.</w:t>
+        <w:t xml:space="preserve"> Explain what you tested, how you tested it, what you found, and what the results mean. The first report is a guided 2–3 pages; later reports are normally 3–4 pages, excluding figures and references. Use Question and Prediction, Methods, Results, Discussion, and References. Include a labeled figure and your analysis file. Use the analysis taught for the experiment and explain your results.</w:t>
       </w:r>
     </w:p>
     <w:p>
@@ -4020,7 +4020,7 @@
           <w:sz w:val="24"/>
           <w:szCs w:val="24"/>
         </w:rPr>
-        <w:t xml:space="preserve"> In your Week 11 lab section, November 2–4, you will demonstrate that you can conduct and explain an experiment we have already done. Choose ONE of the five options below by Friday, October 22, at 11:59 PM. You will explain the question and design, demonstrate the procedure, analyze a provided dataset, make a labeled figure, and explain your findings. Preparation guides, procedures, assessment prompts, and practice datasets for all five options will be available by October 19, at least two weeks before the first practical. You will know what you are expected to do. The assessment uses different observations, but the task structure and analysis methods will be familiar. Each option tests comparable skills. Your grade depends on how well you conduct the work and explain the evidence, not how fast you respond or whether the results match your prediction.</w:t>
+        <w:t xml:space="preserve"> During your Week 11 lab, you will carry out and explain an experiment we have already done. Choose ONE of the five topics below by the deadline in the schedule. You will explain the experiment, demonstrate the procedure, analyze provided data, make a figure, and discuss your findings. Instructions, questions, and practice data for every option will be available by October 19, at least two weeks before the practical. You will know what to prepare. The assessment uses new data with the same format and analysis methods you practiced. All options test comparable skills. You are graded on your work and explanation, not your personal test performance or whether the results match your prediction.</w:t>
       </w:r>
     </w:p>
     <w:p>
@@ -4057,7 +4057,7 @@
           <w:sz w:val="24"/>
           <w:szCs w:val="24"/>
         </w:rPr>
-        <w:t xml:space="preserve"> Run the task under speed-focused and accuracy-focused instructions. Compare reaction times and errors, and explain what changes when people prioritize one over the other.</w:t>
+        <w:t xml:space="preserve"> Compare what happens when people are told to respond quickly or accurately. Explain the differences in response times and errors.</w:t>
       </w:r>
     </w:p>
     <w:p>
@@ -4094,7 +4094,7 @@
           <w:sz w:val="24"/>
           <w:szCs w:val="24"/>
         </w:rPr>
-        <w:t xml:space="preserve"> Use the Lab 2 procedure to distinguish signal from noise. Identify hits and false alarms, and explain the difference between detecting a stimulus and being willing to say it was there.</w:t>
+        <w:t xml:space="preserve"> Use the Lab 2 task to explain when people notice a stimulus, miss it, or report seeing something that was not there.</w:t>
       </w:r>
     </w:p>
     <w:p>
@@ -4131,7 +4131,7 @@
           <w:sz w:val="24"/>
           <w:szCs w:val="24"/>
         </w:rPr>
-        <w:t xml:space="preserve"> Compare congruent and incongruent trials. Calculate the interference effect and use both reaction time and accuracy to explain the result.</w:t>
+        <w:t xml:space="preserve"> Compare trials where the word and ink color match with trials where they conflict. Calculate the difference and explain the response times and errors.</w:t>
       </w:r>
     </w:p>
     <w:p>
@@ -4168,7 +4168,7 @@
           <w:sz w:val="24"/>
           <w:szCs w:val="24"/>
         </w:rPr>
-        <w:t xml:space="preserve"> Compare performance across memory loads and distraction conditions. Calculate accuracy, explain the pattern, and identify a limitation of the experiment.</w:t>
+        <w:t xml:space="preserve"> Compare how much people remember with different amounts of information and distraction. Explain the results and a limitation of the experiment.</w:t>
       </w:r>
     </w:p>
     <w:p>
@@ -4205,7 +4205,7 @@
           <w:sz w:val="24"/>
           <w:szCs w:val="24"/>
         </w:rPr>
-        <w:t xml:space="preserve"> Follow the memory-task procedure and distinguish recognizing an item from remembering where it came from. Identify recognition and source errors and explain what they tell us about memory.</w:t>
+        <w:t xml:space="preserve"> Use the memory task to compare remembering an item with remembering where it came from. Identify the errors and explain what they suggest about memory.</w:t>
       </w:r>
     </w:p>
     <w:p>
@@ -4241,7 +4241,7 @@
           <w:sz w:val="24"/>
           <w:szCs w:val="24"/>
         </w:rPr>
-        <w:t xml:space="preserve"> Three short assignments build the skills you will use in your reports and projects. Assignment 1, due September 10, asks you to clean a reaction-time file, summarize the conditions, and make a clear figure. Assignment 2, due October 1, asks you to design an ethical, controlled experiment and identify a confound. Assignment 3, due October 29, asks you to compare study results and explain uncertainty and generalization. Submit your editable analysis and a 1–2-page explanation or experimental design, as directed in the assignment. A spreadsheet or free graphical analysis tool is sufficient; coding is optional.</w:t>
+        <w:t xml:space="preserve"> These short assignments build the skills you need for your reports and projects. You will organize and analyze reaction-time data, design a controlled experiment, and compare findings across studies. Submit your analysis file and a 1–2-page explanation or study design, as directed. Use a spreadsheet or free analysis program; coding is optional. Due dates are listed below.</w:t>
       </w:r>
     </w:p>
     <w:p>
@@ -4277,7 +4277,7 @@
           <w:sz w:val="24"/>
           <w:szCs w:val="24"/>
         </w:rPr>
-        <w:t xml:space="preserve"> In teams of 3–4, return to an approved neutral task we have already used in lab and test it again. Before collecting data or looking at the outcome, submit a one-page plan stating your prediction, experimental design, exclusion rule, and analysis. The plan is due November 5, and your data checkpoint is due November 19. Submit a shared poster and editable analysis file, along with your own 2–3-page interpretation, by December 3. Your team will give a 5-minute presentation in your assigned Week 15 lab section. Explain what you found, whether it supports your prediction, and what might account for differences from the earlier experiment. This is a separate project; do not resubmit your lecture project.</w:t>
+        <w:t xml:space="preserve"> Work in a team of 3–4 to repeat an approved experiment from lab. Before collecting data or looking at the results, submit a one-page plan explaining what you expect to find, how you will run the experiment, which responses you would exclude and why, and how you will analyze the data. Submit your plan and data check by the deadlines below. The final submission includes a team poster and analysis file, plus your own 2–3-page explanation of the findings. Give a 5-minute team presentation in your Week 15 lab. Explain what happened and why your results might differ from the earlier experiment. Do not resubmit your lecture project.</w:t>
       </w:r>
     </w:p>
     <w:p>
@@ -4316,7 +4316,7 @@
           <w:sz w:val="24"/>
           <w:szCs w:val="24"/>
         </w:rPr>
-        <w:t xml:space="preserve"> Use an approved classroom task or an approved public dataset for reanalysis. Do not recruit participants outside the course. You can complete the project without providing your own personal data. Report what happened, including an unclear result or one that does not support your prediction. Your grade depends on your reasoning and analysis, not on producing a particular effect. Do not fabricate data or citations.</w:t>
+        <w:t xml:space="preserve"> You must complete the lab work, but you do not have to provide your own responses as research data. An equivalent analysis option is available without penalty. Use an approved class experiment or an approved dataset with identifying information removed, and keep course data on the approved course system. Do not recruit people outside the course or use class activities for outside research without institutional approval. No assignment requires personal clinical disclosures, diagnosing classmates, sleep deprivation, or unpleasant stimulation. Report your actual results, even if they are unclear or unexpected. Do not invent data or citations.</w:t>
       </w:r>
     </w:p>
     <w:p>

</xml_diff>

<commit_message>
Shorten all lab descriptions and remove page-count details
</commit_message>
<xml_diff>
--- a/syllabus/PSYC100_L_Introduction_to_Psychology_Fall_2027_Syllabus.docx
+++ b/syllabus/PSYC100_L_Introduction_to_Psychology_Fall_2027_Syllabus.docx
@@ -3984,7 +3984,7 @@
           <w:sz w:val="24"/>
           <w:szCs w:val="24"/>
         </w:rPr>
-        <w:t xml:space="preserve"> Explain what you tested, how you tested it, what you found, and what the results mean. The first report is a guided 2–3 pages; later reports are normally 3–4 pages, excluding figures and references. Use Question and Prediction, Methods, Results, Discussion, and References. Include a labeled figure and your analysis file. Use the analysis taught for the experiment and explain your results.</w:t>
+        <w:t xml:space="preserve"> Write a short report explaining the experiment, your results, and what they mean. Include your methods, a labeled figure, and your analysis file.</w:t>
       </w:r>
     </w:p>
     <w:p>
@@ -4020,7 +4020,7 @@
           <w:sz w:val="24"/>
           <w:szCs w:val="24"/>
         </w:rPr>
-        <w:t xml:space="preserve"> During your Week 11 lab, you will carry out and explain an experiment we have already done. Choose ONE of the five topics below by the deadline in the schedule. You will explain the experiment, demonstrate the procedure, analyze provided data, make a figure, and discuss your findings. Instructions, questions, and practice data for every option will be available by October 19, at least two weeks before the practical. You will know what to prepare. The assessment uses new data with the same format and analysis methods you practiced. All options test comparable skills. You are graded on your work and explanation, not your personal test performance or whether the results match your prediction.</w:t>
+        <w:t xml:space="preserve"> In Week 11, carry out and explain one experiment from an earlier lab. Choose one of the five topics below. You will demonstrate the procedure, analyze data, and explain your results. Instructions and practice materials will be available in advance; preparation and selection dates are in the schedule.</w:t>
       </w:r>
     </w:p>
     <w:p>
@@ -4057,7 +4057,7 @@
           <w:sz w:val="24"/>
           <w:szCs w:val="24"/>
         </w:rPr>
-        <w:t xml:space="preserve"> Compare what happens when people are told to respond quickly or accurately. Explain the differences in response times and errors.</w:t>
+        <w:t xml:space="preserve"> Test how responding faster affects accuracy.</w:t>
       </w:r>
     </w:p>
     <w:p>
@@ -4094,7 +4094,7 @@
           <w:sz w:val="24"/>
           <w:szCs w:val="24"/>
         </w:rPr>
-        <w:t xml:space="preserve"> Use the Lab 2 task to explain when people notice a stimulus, miss it, or report seeing something that was not there.</w:t>
+        <w:t xml:space="preserve"> Test how people detect faint stimuli and distinguish them from noise.</w:t>
       </w:r>
     </w:p>
     <w:p>
@@ -4131,7 +4131,7 @@
           <w:sz w:val="24"/>
           <w:szCs w:val="24"/>
         </w:rPr>
-        <w:t xml:space="preserve"> Compare trials where the word and ink color match with trials where they conflict. Calculate the difference and explain the response times and errors.</w:t>
+        <w:t xml:space="preserve"> Test how conflicting word and color information affects attention.</w:t>
       </w:r>
     </w:p>
     <w:p>
@@ -4168,7 +4168,7 @@
           <w:sz w:val="24"/>
           <w:szCs w:val="24"/>
         </w:rPr>
-        <w:t xml:space="preserve"> Compare how much people remember with different amounts of information and distraction. Explain the results and a limitation of the experiment.</w:t>
+        <w:t xml:space="preserve"> Test how distraction affects the amount of information people remember.</w:t>
       </w:r>
     </w:p>
     <w:p>
@@ -4205,7 +4205,7 @@
           <w:sz w:val="24"/>
           <w:szCs w:val="24"/>
         </w:rPr>
-        <w:t xml:space="preserve"> Use the memory task to compare remembering an item with remembering where it came from. Identify the errors and explain what they suggest about memory.</w:t>
+        <w:t xml:space="preserve"> Examine memory errors and how people remember where information came from.</w:t>
       </w:r>
     </w:p>
     <w:p>
@@ -4241,7 +4241,7 @@
           <w:sz w:val="24"/>
           <w:szCs w:val="24"/>
         </w:rPr>
-        <w:t xml:space="preserve"> These short assignments build the skills you need for your reports and projects. You will organize and analyze reaction-time data, design a controlled experiment, and compare findings across studies. Submit your analysis file and a 1–2-page explanation or study design, as directed. Use a spreadsheet or free analysis program; coding is optional. Due dates are listed below.</w:t>
+        <w:t xml:space="preserve"> Short assignments covering data analysis, experimental design, and interpretation of research. Submit your analysis file and a written explanation or study design. Coding is optional. Due dates are listed below.</w:t>
       </w:r>
     </w:p>
     <w:p>
@@ -4277,7 +4277,7 @@
           <w:sz w:val="24"/>
           <w:szCs w:val="24"/>
         </w:rPr>
-        <w:t xml:space="preserve"> Work in a team of 3–4 to repeat an approved experiment from lab. Before collecting data or looking at the results, submit a one-page plan explaining what you expect to find, how you will run the experiment, which responses you would exclude and why, and how you will analyze the data. Submit your plan and data check by the deadlines below. The final submission includes a team poster and analysis file, plus your own 2–3-page explanation of the findings. Give a 5-minute team presentation in your Week 15 lab. Explain what happened and why your results might differ from the earlier experiment. Do not resubmit your lecture project.</w:t>
+        <w:t xml:space="preserve"> Work with your team to repeat an approved experiment from lab and compare your findings with the earlier results. Submit a plan before collecting or analyzing data, followed by a data check. Your final work includes a team poster and analysis file, your own explanation, and a team presentation in Week 15. Deadlines are listed below. This is separate from your lecture project.</w:t>
       </w:r>
     </w:p>
     <w:p>
@@ -4316,7 +4316,7 @@
           <w:sz w:val="24"/>
           <w:szCs w:val="24"/>
         </w:rPr>
-        <w:t xml:space="preserve"> You must complete the lab work, but you do not have to provide your own responses as research data. An equivalent analysis option is available without penalty. Use an approved class experiment or an approved dataset with identifying information removed, and keep course data on the approved course system. Do not recruit people outside the course or use class activities for outside research without institutional approval. No assignment requires personal clinical disclosures, diagnosing classmates, sleep deprivation, or unpleasant stimulation. Report your actual results, even if they are unclear or unexpected. Do not invent data or citations.</w:t>
+        <w:t xml:space="preserve"> You are required to complete the work, but you do not have to provide personal data. An equivalent option is available without penalty. Use only approved tasks and data, protect classmates’ privacy, and report your actual results. Do not recruit participants outside the course.</w:t>
       </w:r>
     </w:p>
     <w:p>

</xml_diff>

<commit_message>
Rewrite lab assessment descriptions as connected explanatory prose
</commit_message>
<xml_diff>
--- a/syllabus/PSYC100_L_Introduction_to_Psychology_Fall_2027_Syllabus.docx
+++ b/syllabus/PSYC100_L_Introduction_to_Psychology_Fall_2027_Syllabus.docx
@@ -3984,7 +3984,7 @@
           <w:sz w:val="24"/>
           <w:szCs w:val="24"/>
         </w:rPr>
-        <w:t xml:space="preserve"> Write a short report explaining the experiment, your results, and what they mean. Include your methods, a labeled figure, and your analysis file.</w:t>
+        <w:t xml:space="preserve"> Laboratory reports ask you to connect the experiment we conducted with the psychological process it examines. Your report should explain the question being tested, describe the methods, and interpret the results using the concepts covered in class. Include a labeled figure and your analysis file so that the evidence supporting your interpretation is clear.</w:t>
       </w:r>
     </w:p>
     <w:p>
@@ -4020,7 +4020,7 @@
           <w:sz w:val="24"/>
           <w:szCs w:val="24"/>
         </w:rPr>
-        <w:t xml:space="preserve"> In Week 11, carry out and explain one experiment from an earlier lab. Choose one of the five topics below. You will demonstrate the procedure, analyze data, and explain your results. Instructions and practice materials will be available in advance; preparation and selection dates are in the schedule.</w:t>
+        <w:t xml:space="preserve"> During Week 11, you will complete a practical based on one of the five experiments listed below, all of which you will have encountered in an earlier lab. The practical gives you an opportunity to demonstrate your understanding of the experiment by carrying out the procedure, analyzing the data, and explaining what the results tell us about behavior. Instructions and practice materials will be available in advance so that you can prepare for the work you will be asked to complete; preparation and topic-selection dates are listed in the schedule.</w:t>
       </w:r>
     </w:p>
     <w:p>
@@ -4057,7 +4057,7 @@
           <w:sz w:val="24"/>
           <w:szCs w:val="24"/>
         </w:rPr>
-        <w:t xml:space="preserve"> Test how responding faster affects accuracy.</w:t>
+        <w:t xml:space="preserve"> Examine how instructions to prioritize speed or accuracy affect performance, using response times and errors to explain the relationship between the two.</w:t>
       </w:r>
     </w:p>
     <w:p>
@@ -4094,7 +4094,7 @@
           <w:sz w:val="24"/>
           <w:szCs w:val="24"/>
         </w:rPr>
-        <w:t xml:space="preserve"> Test how people detect faint stimuli and distinguish them from noise.</w:t>
+        <w:t xml:space="preserve"> Examine how people detect faint stimuli against background noise and how their willingness to report a stimulus affects the responses they make.</w:t>
       </w:r>
     </w:p>
     <w:p>
@@ -4131,7 +4131,7 @@
           <w:sz w:val="24"/>
           <w:szCs w:val="24"/>
         </w:rPr>
-        <w:t xml:space="preserve"> Test how conflicting word and color information affects attention.</w:t>
+        <w:t xml:space="preserve"> Examine how conflicting word and color information affects performance, using response times and errors to explain the interference observed in the task.</w:t>
       </w:r>
     </w:p>
     <w:p>
@@ -4168,7 +4168,7 @@
           <w:sz w:val="24"/>
           <w:szCs w:val="24"/>
         </w:rPr>
-        <w:t xml:space="preserve"> Test how distraction affects the amount of information people remember.</w:t>
+        <w:t xml:space="preserve"> Examine how distraction affects memory at different levels of difficulty, using the results to explain how much information people can hold and work with at one time.</w:t>
       </w:r>
     </w:p>
     <w:p>
@@ -4205,7 +4205,7 @@
           <w:sz w:val="24"/>
           <w:szCs w:val="24"/>
         </w:rPr>
-        <w:t xml:space="preserve"> Examine memory errors and how people remember where information came from.</w:t>
+        <w:t xml:space="preserve"> Examine the errors people make when remembering information and its source, considering what those errors reveal about how memories are formed and recalled.</w:t>
       </w:r>
     </w:p>
     <w:p>
@@ -4241,7 +4241,7 @@
           <w:sz w:val="24"/>
           <w:szCs w:val="24"/>
         </w:rPr>
-        <w:t xml:space="preserve"> Short assignments covering data analysis, experimental design, and interpretation of research. Submit your analysis file and a written explanation or study design. Coding is optional. Due dates are listed below.</w:t>
+        <w:t xml:space="preserve"> These assignments develop your ability to work with psychological data, design experiments, and evaluate research findings. You will apply the methods introduced in lab and explain the reasoning behind your analysis or proposed study, submitting an analysis file and written explanation or study design as directed in the assignment. Coding is optional, and due dates are listed in the schedule below.</w:t>
       </w:r>
     </w:p>
     <w:p>
@@ -4277,7 +4277,7 @@
           <w:sz w:val="24"/>
           <w:szCs w:val="24"/>
         </w:rPr>
-        <w:t xml:space="preserve"> Work with your team to repeat an approved experiment from lab and compare your findings with the earlier results. Submit a plan before collecting or analyzing data, followed by a data check. Your final work includes a team poster and analysis file, your own explanation, and a team presentation in Week 15. Deadlines are listed below. This is separate from your lecture project.</w:t>
+        <w:t xml:space="preserve"> Working with your team, you will repeat an approved experiment from lab and examine how your findings compare with the earlier results. Your plan should explain what you expect to find and how you will conduct and analyze the experiment before you begin collecting or examining the data, followed by a data check as the project develops. The final work includes a team poster and analysis file, an individual explanation of the findings, and a team presentation during Week 15. This project is separate from your lecture project, with deadlines listed in the schedule below.</w:t>
       </w:r>
     </w:p>
     <w:p>
@@ -4316,7 +4316,7 @@
           <w:sz w:val="24"/>
           <w:szCs w:val="24"/>
         </w:rPr>
-        <w:t xml:space="preserve"> You are required to complete the work, but you do not have to provide personal data. An equivalent option is available without penalty. Use only approved tasks and data, protect classmates’ privacy, and report your actual results. Do not recruit participants outside the course.</w:t>
+        <w:t xml:space="preserve"> Completing the laboratory work is required, but providing your own personal data is voluntary, and an equivalent option is available without penalty. All work must use approved tasks and data, with classmates’ privacy protected and results reported accurately regardless of whether they support the expected outcome. Participants may not be recruited outside the course.</w:t>
       </w:r>
     </w:p>
     <w:p>

</xml_diff>

<commit_message>
Restore uploaded lecture project wording and page requirements
</commit_message>
<xml_diff>
--- a/syllabus/PSYC100_L_Introduction_to_Psychology_Fall_2027_Syllabus.docx
+++ b/syllabus/PSYC100_L_Introduction_to_Psychology_Fall_2027_Syllabus.docx
@@ -3604,10 +3604,8 @@
         <w:rPr>
           <w:sz w:val="24"/>
           <w:szCs w:val="24"/>
-          <w:b w:val="0"/>
-          <w:bCs w:val="0"/>
         </w:rPr>
-        <w:t xml:space="preserve">The lecture project gives you an opportunity to explore a psychological question from class in greater depth through either an individual data analysis project or a research paper. Both options are worth 120 points and emphasize your ability to connect psychological concepts with evidence and develop an informed interpretation of what the research shows.</w:t>
+        <w:t>Each student completes one individual project on a psychological question covered in class. Choose ONE option and include your choice in your proposal. Both options are worth 120 points.</w:t>
       </w:r>
     </w:p>
     <w:p>
@@ -3633,10 +3631,44 @@
         <w:rPr>
           <w:sz w:val="24"/>
           <w:szCs w:val="24"/>
-          <w:b w:val="0"/>
-          <w:bCs w:val="0"/>
         </w:rPr>
-        <w:t xml:space="preserve">The data analysis project explores a psychological question through an approved dataset, connecting the patterns in the data with the concepts and research discussed in class. The emphasis is on understanding what the results reveal about behavior, how the analysis supports that interpretation, and where the evidence leaves questions unanswered.</w:t>
+        <w:t xml:space="preserve">Use data </w:t>
+      </w:r>
+      <w:r>
+        <w:rPr>
+          <w:sz w:val="24"/>
+          <w:szCs w:val="24"/>
+        </w:rPr>
+        <w:t>provided</w:t>
+      </w:r>
+      <w:r>
+        <w:rPr>
+          <w:sz w:val="24"/>
+          <w:szCs w:val="24"/>
+        </w:rPr>
+        <w:t xml:space="preserve"> or approve</w:t>
+      </w:r>
+      <w:r>
+        <w:rPr>
+          <w:sz w:val="24"/>
+          <w:szCs w:val="24"/>
+        </w:rPr>
+        <w:t xml:space="preserve">d </w:t>
+      </w:r>
+      <w:r>
+        <w:rPr>
+          <w:sz w:val="24"/>
+          <w:szCs w:val="24"/>
+        </w:rPr>
+        <w:t xml:space="preserve">to answer a psychological question from class. Explain what you expected, how you analyzed the data, and what you found. Submit your analysis file, a 4–6-page APA-style report with a labeled figure, and a 5-minute recorded explanation. Use at least 4 original research articles to put your results in context, including at least 2 published </w:t>
+      </w:r>
+      <w:r>
+        <w:rPr>
+          <w:sz w:val="24"/>
+          <w:szCs w:val="24"/>
+        </w:rPr>
+        <w:lastRenderedPageBreak/>
+        <w:t>from 2000 onward and at least 1 from 2020 onward. You may use a spreadsheet, jamovi, or a similar program. Advanced coding is not required. Use data with identifying information removed; do not collect new participant data.</w:t>
       </w:r>
     </w:p>
     <w:p>
@@ -3662,10 +3694,8 @@
         <w:rPr>
           <w:sz w:val="24"/>
           <w:szCs w:val="24"/>
-          <w:b w:val="0"/>
-          <w:bCs w:val="0"/>
         </w:rPr>
-        <w:t xml:space="preserve">The paper examines a psychological claim through the research supporting it, bringing studies into conversation with one another to develop an argument about what we know and what remains uncertain. The emphasis is on explaining how the evidence fits together, why findings may differ, and how further research could improve our understanding of the question.</w:t>
+        <w:t>Write a 4–6-page paper in APA 7th edition format on a psychological claim covered in class. The title page, figures, and references do not count toward the page limit. Compare at least 5 original research articles, including at least 3 published from 2000 onward and at least 1 from 2020 onward. Explain what the studies found, where they agree or disagree, and what you think the evidence supports. Propose an experiment that could help answer a remaining question. Submit a 5-minute recorded explanation with your paper. Do not simply summarize one article after another. The paper must argue something.</w:t>
       </w:r>
     </w:p>
     <w:p>

</xml_diff>

<commit_message>
Use uploaded V2 and correct only mini-replication project wording
</commit_message>
<xml_diff>
--- a/syllabus/PSYC100_L_Introduction_to_Psychology_Fall_2027_Syllabus.docx
+++ b/syllabus/PSYC100_L_Introduction_to_Psychology_Fall_2027_Syllabus.docx
@@ -3216,7 +3216,7 @@
           <w:sz w:val="24"/>
           <w:szCs w:val="24"/>
         </w:rPr>
-        <w:t>There are four exams, each worth 120 points. Exam 1 covers Lectures 1 to 10, Exam 2 covers Lectures 11 to 20, Exam 3 covers Lectures 21 to 30, and Exam 4 covers Lectures 31 to 41. Exams are not cumulative, but the concepts build on one another. Planned dates are Monday, September 20; Monday, October 18; and Monday, November 8. Exam 4 will use the assigned university appointment within December 8–15. All exams use the separate exam session. Exams 1–3 meet Mondays at 5:00 PM in NEU 100A or NEU 100B. Exam 4’s assigned date and time will be announced separately. Dates and room reservations remain subject to departmental confirmation.</w:t>
+        <w:t>There are four exams, each worth 120 points. Exam 1 covers Lectures 1 to 10, Exam 2 covers Lectures 11 to 20, Exam 3 covers Lectures 21 to 30, and Exam 4 covers Lectures 31 to 41. Exams are not cumulative.</w:t>
       </w:r>
     </w:p>
     <w:p>
@@ -3242,7 +3242,7 @@
           <w:sz w:val="24"/>
           <w:szCs w:val="24"/>
         </w:rPr>
-        <w:t xml:space="preserve">Number of questions and versions: </w:t>
+        <w:t xml:space="preserve">Number of questions: </w:t>
       </w:r>
       <w:r>
         <w:rPr>
@@ -3250,7 +3250,39 @@
           <w:sz w:val="24"/>
           <w:szCs w:val="24"/>
         </w:rPr>
-        <w:t>Expect 65 questions totaling 120 points: 10 multiple-choice questions at 1 point each, 10 fill-in-the-blank questions at 1 point each, 35 short written-response questions at 2 points each, and 10 extended written-response or data-interpretation questions at 3 points each. Written-response questions account for 45 of the 65 questions and 100 of the 120 points. The final timing will be checked against the assigned exam-session length. Each exam comes in three versions (V1, V2, and V3). The three versions contain the same questions, with the order of questions and answer choices mixed within each lecture section.</w:t>
+        <w:t xml:space="preserve">Expect 65 questions totaling 120 points: 10 </w:t>
+      </w:r>
+      <w:r>
+        <w:rPr>
+          <w:color w:val="000000"/>
+          <w:sz w:val="24"/>
+          <w:szCs w:val="24"/>
+        </w:rPr>
+        <w:t>MCQ</w:t>
+      </w:r>
+      <w:r>
+        <w:rPr>
+          <w:color w:val="000000"/>
+          <w:sz w:val="24"/>
+          <w:szCs w:val="24"/>
+        </w:rPr>
+        <w:t xml:space="preserve"> at 1 point each, 10 fill-in-the-blank at 1 point each, 35 short written-response questions at 2 points each, and 10 </w:t>
+      </w:r>
+      <w:r>
+        <w:rPr>
+          <w:color w:val="000000"/>
+          <w:sz w:val="24"/>
+          <w:szCs w:val="24"/>
+        </w:rPr>
+        <w:t>experimental</w:t>
+      </w:r>
+      <w:r>
+        <w:rPr>
+          <w:color w:val="000000"/>
+          <w:sz w:val="24"/>
+          <w:szCs w:val="24"/>
+        </w:rPr>
+        <w:t xml:space="preserve"> or data-interpretation questions at 3 points each. </w:t>
       </w:r>
     </w:p>
     <w:p>
@@ -3276,7 +3308,7 @@
           <w:sz w:val="24"/>
           <w:szCs w:val="24"/>
         </w:rPr>
-        <w:t xml:space="preserve">Question order: </w:t>
+        <w:t xml:space="preserve">Exam versions: </w:t>
       </w:r>
       <w:r>
         <w:rPr>
@@ -3284,7 +3316,23 @@
           <w:sz w:val="24"/>
           <w:szCs w:val="24"/>
         </w:rPr>
-        <w:t>Exam questions are ordered by lecture. Questions on Lecture 1 come first, followed by questions on Lecture 2, and so on through the last lecture covered by that exam.</w:t>
+        <w:t>Each exam comes in three versions (V1, V2, and V3).</w:t>
+      </w:r>
+      <w:r>
+        <w:rPr>
+          <w:color w:val="000000"/>
+          <w:sz w:val="24"/>
+          <w:szCs w:val="24"/>
+        </w:rPr>
+        <w:t xml:space="preserve"> </w:t>
+      </w:r>
+      <w:r>
+        <w:rPr>
+          <w:color w:val="000000"/>
+          <w:sz w:val="24"/>
+          <w:szCs w:val="24"/>
+        </w:rPr>
+        <w:t>The three versions contain the same questions, with the order of questions and answer choices mixed within each lecture section.</w:t>
       </w:r>
     </w:p>
     <w:p>
@@ -3310,7 +3358,7 @@
           <w:sz w:val="24"/>
           <w:szCs w:val="24"/>
         </w:rPr>
-        <w:t xml:space="preserve">Room and version assignment: </w:t>
+        <w:t xml:space="preserve">Question order: </w:t>
       </w:r>
       <w:r>
         <w:rPr>
@@ -3318,16 +3366,41 @@
           <w:sz w:val="24"/>
           <w:szCs w:val="24"/>
         </w:rPr>
-        <w:t xml:space="preserve">Before each exam, a randomized algorithm assigns every student to Room A (NEU 100A) or Room B (NEU 100B) and to one of three </w:t>
-      </w:r>
-      <w:r>
-        <w:rPr>
+        <w:t>Exam questions are ordered by lecture. Questions on Lecture 1 come first, followed by questions on Lecture 2, and so on through the last lecture covered by that exam.</w:t>
+      </w:r>
+    </w:p>
+    <w:p>
+      <w:pPr>
+        <w:numPr>
+          <w:ilvl w:val="0"/>
+          <w:numId w:val="2"/>
+        </w:numPr>
+        <w:pBdr>
+          <w:top w:val="nil"/>
+          <w:left w:val="nil"/>
+          <w:bottom w:val="nil"/>
+          <w:right w:val="nil"/>
+          <w:between w:val="nil"/>
+        </w:pBdr>
+        <w:spacing w:after="60" w:line="276" w:lineRule="auto"/>
+      </w:pPr>
+      <w:r>
+        <w:rPr>
+          <w:b/>
+          <w:bCs/>
           <w:color w:val="000000"/>
           <w:sz w:val="24"/>
           <w:szCs w:val="24"/>
         </w:rPr>
-        <w:lastRenderedPageBreak/>
-        <w:t>versions (V1, V2, or V3). Assignments are posted on the course site before the exam. Assignments are random, and requests to change them will not be accepted. Approved accommodations are implemented through the university process.</w:t>
+        <w:t xml:space="preserve">Room and version assignment: </w:t>
+      </w:r>
+      <w:r>
+        <w:rPr>
+          <w:color w:val="000000"/>
+          <w:sz w:val="24"/>
+          <w:szCs w:val="24"/>
+        </w:rPr>
+        <w:t>Before each exam, a randomized algorithm assigns every student to Room A (NEU 100A) or Room B (NEU 100B) and to one of three versions (V1, V2, or V3). Assignments are posted on the course site before the exam. Assignments are random, and requests to change them will not be accepted. Approved accommodations are implemented through the university process.</w:t>
       </w:r>
     </w:p>
     <w:p>
@@ -3370,7 +3443,16 @@
           <w:sz w:val="24"/>
           <w:szCs w:val="24"/>
         </w:rPr>
-        <w:t>In-person paper exams consisting primarily of written free-response and fill-in-the-blank questions, with a smaller number of multiple-choice questions. Questions may require definitions in context, explanations of findings, interpretation of figures and data, or evaluation of an experimental design. Approximately 40% of points address concepts directly and 60% address studies or experimental reasoning.</w:t>
+        <w:t xml:space="preserve">In-person paper exams consisting primarily of written free-response and fill-in-the-blank questions, with a smaller number of multiple-choice questions. Questions may require definitions in context, explanations of findings, interpretation of </w:t>
+      </w:r>
+      <w:r>
+        <w:rPr>
+          <w:color w:val="000000"/>
+          <w:sz w:val="24"/>
+          <w:szCs w:val="24"/>
+        </w:rPr>
+        <w:lastRenderedPageBreak/>
+        <w:t>figures and data, or evaluation of an experimental design. Approximately 40% of points address concepts directly and 60% address studies or experimental reasoning.</w:t>
       </w:r>
     </w:p>
     <w:p>
@@ -3660,15 +3742,7 @@
           <w:sz w:val="24"/>
           <w:szCs w:val="24"/>
         </w:rPr>
-        <w:t xml:space="preserve">to answer a psychological question from class. Explain what you expected, how you analyzed the data, and what you found. Submit your analysis file, a 4–6-page APA-style report with a labeled figure, and a 5-minute recorded explanation. Use at least 4 original research articles to put your results in context, including at least 2 published </w:t>
-      </w:r>
-      <w:r>
-        <w:rPr>
-          <w:sz w:val="24"/>
-          <w:szCs w:val="24"/>
-        </w:rPr>
-        <w:lastRenderedPageBreak/>
-        <w:t>from 2000 onward and at least 1 from 2020 onward. You may use a spreadsheet, jamovi, or a similar program. Advanced coding is not required. Use data with identifying information removed; do not collect new participant data.</w:t>
+        <w:t>to answer a psychological question from class. Explain what you expected, how you analyzed the data, and what you found. Submit your analysis file, a 4–6-page APA-style report with a labeled figure, and a 5-minute recorded explanation. Use at least 4 original research articles to put your results in context, including at least 2 published from 2000 onward and at least 1 from 2020 onward. You may use a spreadsheet, jamovi, or a similar program.</w:t>
       </w:r>
     </w:p>
     <w:p>
@@ -3695,7 +3769,15 @@
           <w:sz w:val="24"/>
           <w:szCs w:val="24"/>
         </w:rPr>
-        <w:t>Write a 4–6-page paper in APA 7th edition format on a psychological claim covered in class. The title page, figures, and references do not count toward the page limit. Compare at least 5 original research articles, including at least 3 published from 2000 onward and at least 1 from 2020 onward. Explain what the studies found, where they agree or disagree, and what you think the evidence supports. Propose an experiment that could help answer a remaining question. Submit a 5-minute recorded explanation with your paper. Do not simply summarize one article after another. The paper must argue something.</w:t>
+        <w:t xml:space="preserve">Write a 4–6-page paper in APA 7th edition format on a psychological claim covered in class. The title page, figures, and references do not count toward the page limit. Compare at least 5 original research articles, including at least 3 published from 2000 onward and at least 1 from </w:t>
+      </w:r>
+      <w:r>
+        <w:rPr>
+          <w:sz w:val="24"/>
+          <w:szCs w:val="24"/>
+        </w:rPr>
+        <w:lastRenderedPageBreak/>
+        <w:t>2020 onward. Explain what the studies found, where they agree or disagree, and what you think the evidence supports. Propose an experiment that could help answer a remaining question. Submit a 5-minute recorded explanation with your paper. Do not simply summarize one article after another. The paper must argue something.</w:t>
       </w:r>
     </w:p>
     <w:p>
@@ -3963,10 +4045,8 @@
         <w:rPr>
           <w:sz w:val="24"/>
           <w:szCs w:val="24"/>
-          <w:b w:val="0"/>
-          <w:bCs w:val="0"/>
-        </w:rPr>
-        <w:t xml:space="preserve">The laboratory is a required, graded part of the course that begins in the first week and meets separately from lecture, giving you experience with the experiments behind the concepts we discuss in class. Through experimental work and analysis, you will examine how psychologists study behavior and how the choices made in a study affect the conclusions we can draw.</w:t>
+        </w:rPr>
+        <w:t>The laboratory is a required, graded part of the course that begins in the first week and meets separately from lecture. Through experimental work and analysis, you will examine how psychologists study behavior and how the choices made in a study affect the conclusions we can draw.</w:t>
       </w:r>
     </w:p>
     <w:p>
@@ -3986,23 +4066,141 @@
       </w:pPr>
       <w:r>
         <w:rPr>
-          <w:b w:val="1"/>
-          <w:bCs w:val="1"/>
+          <w:b/>
+          <w:bCs/>
           <w:color w:val="000000"/>
           <w:sz w:val="24"/>
           <w:szCs w:val="24"/>
         </w:rPr>
-        <w:t xml:space="preserve">Lab Reports (10 labs, lowest 2 dropped, 7.5% each for the 8 counted).</w:t>
-      </w:r>
-      <w:r>
-        <w:rPr>
-          <w:b w:val="0"/>
-          <w:bCs w:val="0"/>
+        <w:t>Lab Reports (10 labs, lowest 2 dropped, 7.5% each for the 8 counted).</w:t>
+      </w:r>
+      <w:r>
+        <w:rPr>
           <w:color w:val="000000"/>
           <w:sz w:val="24"/>
           <w:szCs w:val="24"/>
         </w:rPr>
-        <w:t xml:space="preserve"> Laboratory reports connect the experiments conducted in lab with the psychological processes they examine, developing your ability to explain how a study was carried out and what its findings mean. The emphasis is on interpreting the evidence and relating the results to the concepts covered in class.</w:t>
+        <w:t xml:space="preserve"> </w:t>
+      </w:r>
+      <w:r>
+        <w:rPr>
+          <w:sz w:val="24"/>
+          <w:szCs w:val="24"/>
+        </w:rPr>
+        <w:t xml:space="preserve">Each </w:t>
+      </w:r>
+      <w:r>
+        <w:rPr>
+          <w:sz w:val="24"/>
+          <w:szCs w:val="24"/>
+        </w:rPr>
+        <w:t xml:space="preserve">Lab </w:t>
+      </w:r>
+      <w:r>
+        <w:rPr>
+          <w:sz w:val="24"/>
+          <w:szCs w:val="24"/>
+        </w:rPr>
+        <w:t xml:space="preserve">report should explain </w:t>
+      </w:r>
+      <w:r>
+        <w:rPr>
+          <w:sz w:val="24"/>
+          <w:szCs w:val="24"/>
+        </w:rPr>
+        <w:t>the q</w:t>
+      </w:r>
+      <w:r>
+        <w:rPr>
+          <w:sz w:val="24"/>
+          <w:szCs w:val="24"/>
+        </w:rPr>
+        <w:t>uestion</w:t>
+      </w:r>
+      <w:r>
+        <w:rPr>
+          <w:sz w:val="24"/>
+          <w:szCs w:val="24"/>
+        </w:rPr>
+        <w:t>, p</w:t>
+      </w:r>
+      <w:r>
+        <w:rPr>
+          <w:sz w:val="24"/>
+          <w:szCs w:val="24"/>
+        </w:rPr>
+        <w:t xml:space="preserve">rediction, </w:t>
+      </w:r>
+      <w:r>
+        <w:rPr>
+          <w:sz w:val="24"/>
+          <w:szCs w:val="24"/>
+        </w:rPr>
+        <w:t>m</w:t>
+      </w:r>
+      <w:r>
+        <w:rPr>
+          <w:sz w:val="24"/>
+          <w:szCs w:val="24"/>
+        </w:rPr>
+        <w:t xml:space="preserve">ethods, </w:t>
+      </w:r>
+      <w:r>
+        <w:rPr>
+          <w:sz w:val="24"/>
+          <w:szCs w:val="24"/>
+        </w:rPr>
+        <w:t>r</w:t>
+      </w:r>
+      <w:r>
+        <w:rPr>
+          <w:sz w:val="24"/>
+          <w:szCs w:val="24"/>
+        </w:rPr>
+        <w:t xml:space="preserve">esults, </w:t>
+      </w:r>
+      <w:r>
+        <w:rPr>
+          <w:sz w:val="24"/>
+          <w:szCs w:val="24"/>
+        </w:rPr>
+        <w:t>d</w:t>
+      </w:r>
+      <w:r>
+        <w:rPr>
+          <w:sz w:val="24"/>
+          <w:szCs w:val="24"/>
+        </w:rPr>
+        <w:t xml:space="preserve">iscussion, and </w:t>
+      </w:r>
+      <w:r>
+        <w:rPr>
+          <w:sz w:val="24"/>
+          <w:szCs w:val="24"/>
+        </w:rPr>
+        <w:t>r</w:t>
+      </w:r>
+      <w:r>
+        <w:rPr>
+          <w:sz w:val="24"/>
+          <w:szCs w:val="24"/>
+        </w:rPr>
+        <w:t>eferences.</w:t>
+      </w:r>
+      <w:r>
+        <w:rPr>
+          <w:sz w:val="24"/>
+          <w:szCs w:val="24"/>
+        </w:rPr>
+        <w:t xml:space="preserve"> </w:t>
+      </w:r>
+      <w:r>
+        <w:rPr>
+          <w:color w:val="000000"/>
+          <w:sz w:val="24"/>
+          <w:szCs w:val="24"/>
+        </w:rPr>
+        <w:t>Include a labeled figure and your analysis file so that the evidence supporting your interpretation is clear.</w:t>
       </w:r>
     </w:p>
     <w:p>
@@ -4022,23 +4220,53 @@
       </w:pPr>
       <w:r>
         <w:rPr>
-          <w:b w:val="1"/>
-          <w:bCs w:val="1"/>
+          <w:b/>
+          <w:bCs/>
           <w:color w:val="000000"/>
           <w:sz w:val="24"/>
           <w:szCs w:val="24"/>
         </w:rPr>
-        <w:t xml:space="preserve">Individual Experimental Practical (10%).</w:t>
-      </w:r>
-      <w:r>
-        <w:rPr>
-          <w:b w:val="0"/>
-          <w:bCs w:val="0"/>
+        <w:t>Individual Experimental Practical (10%).</w:t>
+      </w:r>
+      <w:r>
+        <w:rPr>
           <w:color w:val="000000"/>
           <w:sz w:val="24"/>
           <w:szCs w:val="24"/>
         </w:rPr>
-        <w:t xml:space="preserve"> The Week 11 practical focuses on one of the five experiments listed below, chosen from work you have already completed in lab. It brings together your understanding of the experimental procedure, analysis, and psychological concepts through a familiar task, with preparation materials available in advance.</w:t>
+        <w:t xml:space="preserve"> </w:t>
+      </w:r>
+      <w:r>
+        <w:rPr>
+          <w:color w:val="000000"/>
+          <w:sz w:val="24"/>
+          <w:szCs w:val="24"/>
+        </w:rPr>
+        <w:t xml:space="preserve">During Week 11, you will complete a practical based on one of the five experiments listed below. The practical gives you an opportunity to demonstrate your understanding of the experiment by carrying out the procedure, analyzing the data, and explaining what the results tell us about behavior. Instructions and practice materials will be available </w:t>
+      </w:r>
+      <w:r>
+        <w:rPr>
+          <w:color w:val="000000"/>
+          <w:sz w:val="24"/>
+          <w:szCs w:val="24"/>
+        </w:rPr>
+        <w:t xml:space="preserve">two weeks </w:t>
+      </w:r>
+      <w:r>
+        <w:rPr>
+          <w:color w:val="000000"/>
+          <w:sz w:val="24"/>
+          <w:szCs w:val="24"/>
+        </w:rPr>
+        <w:t>in advance so that you can prepare for the work you will be asked to complete</w:t>
+      </w:r>
+      <w:r>
+        <w:rPr>
+          <w:color w:val="000000"/>
+          <w:sz w:val="24"/>
+          <w:szCs w:val="24"/>
+        </w:rPr>
+        <w:t>.</w:t>
       </w:r>
     </w:p>
     <w:p>
@@ -4135,7 +4363,6 @@
           <w:sz w:val="24"/>
           <w:szCs w:val="24"/>
         </w:rPr>
-        <w:lastRenderedPageBreak/>
         <w:t>Selective attention and Stroop interference:</w:t>
       </w:r>
       <w:r>
@@ -4206,6 +4433,7 @@
           <w:sz w:val="24"/>
           <w:szCs w:val="24"/>
         </w:rPr>
+        <w:lastRenderedPageBreak/>
         <w:t>Memory reconstruction and source monitoring:</w:t>
       </w:r>
       <w:r>
@@ -4234,23 +4462,40 @@
       </w:pPr>
       <w:r>
         <w:rPr>
-          <w:b w:val="1"/>
-          <w:bCs w:val="1"/>
+          <w:b/>
+          <w:bCs/>
           <w:color w:val="000000"/>
           <w:sz w:val="24"/>
           <w:szCs w:val="24"/>
         </w:rPr>
-        <w:t xml:space="preserve">Methods Assignments (3 assignments, 5% each, 15% total).</w:t>
-      </w:r>
-      <w:r>
-        <w:rPr>
-          <w:b w:val="0"/>
-          <w:bCs w:val="0"/>
+        <w:t>Methods Assignments (3 assignments, 5% each, 15% total).</w:t>
+      </w:r>
+      <w:r>
+        <w:rPr>
           <w:color w:val="000000"/>
           <w:sz w:val="24"/>
           <w:szCs w:val="24"/>
         </w:rPr>
-        <w:t xml:space="preserve"> These assignments develop the analytical skills used throughout the course through work with psychological data, experimental design, and interpretation of research. They connect the methods introduced in lab with the questions those methods allow us to answer, building your ability to explain the reasoning behind a study and its conclusions.</w:t>
+        <w:t xml:space="preserve"> </w:t>
+      </w:r>
+      <w:r>
+        <w:rPr>
+          <w:color w:val="000000"/>
+          <w:sz w:val="24"/>
+          <w:szCs w:val="24"/>
+        </w:rPr>
+        <w:t>These assignments develop your ability to work with psychological data, design experiments, and evaluate research findings</w:t>
+      </w:r>
+      <w:r>
+        <w:rPr>
+          <w:color w:val="000000"/>
+          <w:sz w:val="24"/>
+          <w:szCs w:val="24"/>
+        </w:rPr>
+        <w:t>.</w:t>
+      </w:r>
+      <w:r>
+        <w:t xml:space="preserve"> </w:t>
       </w:r>
     </w:p>
     <w:p>
@@ -4267,9 +4512,13 @@
           <w:between w:val="nil"/>
         </w:pBdr>
         <w:spacing w:after="60" w:line="276" w:lineRule="auto"/>
+        <w:rPr>
+          <w:sz w:val="24"/>
+          <w:szCs w:val="24"/>
+        </w:rPr>
       </w:pPr>
-      <w:proofErr w:type="gramStart"/>
-      <w:proofErr w:type="gramEnd"/>
+      <w:proofErr w:type="spellStart"/>
+      <w:proofErr w:type="spellEnd"/>
       <w:proofErr w:type="spellStart"/>
       <w:proofErr w:type="gramStart"/>
       <w:proofErr w:type="spellEnd"/>
@@ -4292,7 +4541,7 @@
           <w:sz w:val="24"/>
           <w:szCs w:val="24"/>
         </w:rPr>
-        <w:t xml:space="preserve"> Working in teams of 2–3, you will revisit an approved experiment from lab and examine how your findings compare with the earlier results. The project explores why a finding may hold across studies or change under different conditions, with attention to what those differences tell us about the behavior being studied. Teams will present their work during the Week 15 laboratory sessions.</w:t>
+        <w:t xml:space="preserve"> Working in teams of 2–3, you will repeat an approved experiment from lab and examine how your findings compare with the earlier results. Each student will write an individual four-page paper presenting the research question, prediction, methods, results, discussion, and references. Teams will present their work during the Week 15 laboratory sessions.</w:t>
       </w:r>
     </w:p>
     <w:p>
@@ -5655,7 +5904,6 @@
                 <w:sz w:val="17"/>
                 <w:szCs w:val="17"/>
               </w:rPr>
-              <w:lastRenderedPageBreak/>
               <w:t>Methods Assignment 2</w:t>
             </w:r>
           </w:p>
@@ -5989,7 +6237,15 @@
           <w:sz w:val="24"/>
           <w:szCs w:val="24"/>
         </w:rPr>
-        <w:t>Lab sections meet at the times listed under Course Times &amp; Locations; all sections meet in NEU LAB1A. All report and assignment deadlines are 11:59 PM Pacific time. No required regular lab meets in Week 7 or Week 14. Fall Recess is October 7–8, Veterans Day is November 11, and Thanksgiving is November 24–28. Holiday-affected sections receive an equivalent task without required participation on a closure day. The late work policy applies (see Late Work below).</w:t>
+        <w:t xml:space="preserve">Lab sections meet at the times listed under Course Times &amp; Locations; all sections meet in NEU LAB1A. All report and assignment deadlines are 11:59 PM Pacific time. No required regular lab meets in Week 7 or Week 14. Fall Recess is October 7–8, Veterans Day is November 11, and Thanksgiving is November 24–28. Holiday-affected sections receive an </w:t>
+      </w:r>
+      <w:r>
+        <w:rPr>
+          <w:sz w:val="24"/>
+          <w:szCs w:val="24"/>
+        </w:rPr>
+        <w:lastRenderedPageBreak/>
+        <w:t>equivalent task without required participation on a closure day. The late work policy applies (see Late Work below).</w:t>
       </w:r>
     </w:p>
     <w:p>
@@ -6184,7 +6440,6 @@
           <w:sz w:val="24"/>
           <w:szCs w:val="24"/>
         </w:rPr>
-        <w:lastRenderedPageBreak/>
         <w:t>Late Work</w:t>
       </w:r>
     </w:p>
@@ -6261,6 +6516,7 @@
           <w:sz w:val="24"/>
           <w:szCs w:val="24"/>
         </w:rPr>
+        <w:lastRenderedPageBreak/>
         <w:t>Lecture project:</w:t>
       </w:r>
       <w:r>
@@ -6402,16 +6658,7 @@
           <w:sz w:val="24"/>
           <w:szCs w:val="24"/>
         </w:rPr>
-        <w:t xml:space="preserve">I will make every effort to respond to emails and messages promptly; however, because I teach multiple courses and run an active research laboratory, response times may be delayed. Students should generally expect responses within one business day. Messages sent in the </w:t>
-      </w:r>
-      <w:r>
-        <w:rPr>
-          <w:color w:val="000000"/>
-          <w:sz w:val="24"/>
-          <w:szCs w:val="24"/>
-        </w:rPr>
-        <w:lastRenderedPageBreak/>
-        <w:t>evening, overnight, or on weekends will typically be addressed the following business day. Use clear subject lines that include the course number and topic, such as “PSYC100 L: Lab 3 report question.” Keep questions concise and include relevant context, such as the assignment name or lab section. Reach out early rather than waiting until deadlines or exam days. Consult the syllabus and current lecture materials for exam coverage before emailing.</w:t>
+        <w:t>I will make every effort to respond to emails and messages promptly; however, because I teach multiple courses and run an active research laboratory, response times may be delayed. Students should generally expect responses within one business day. Messages sent in the evening, overnight, or on weekends will typically be addressed the following business day. Use clear subject lines that include the course number and topic, such as “PSYC100 L: Lab 3 report question.” Keep questions concise and include relevant context, such as the assignment name or lab section. Reach out early rather than waiting until deadlines or exam days. Consult the syllabus and current lecture materials for exam coverage before emailing.</w:t>
       </w:r>
     </w:p>
     <w:p>
@@ -6451,7 +6698,16 @@
           <w:sz w:val="24"/>
           <w:szCs w:val="24"/>
         </w:rPr>
-        <w:t>I understand that many students balance academic responsibilities with work, family obligations, and other commitments. If you anticipate an absence or experience an emergency, contact me as soon as possible. For lab absences, notify your TA promptly and arrange the appropriate documentation, make-up, or equivalent task. Communicating early helps us find an appropriate arrangement.</w:t>
+        <w:t xml:space="preserve">I understand that many students balance academic responsibilities with work, family obligations, and other commitments. If you anticipate an absence or experience an emergency, contact me as soon as possible. For lab absences, notify your TA promptly and </w:t>
+      </w:r>
+      <w:r>
+        <w:rPr>
+          <w:color w:val="000000"/>
+          <w:sz w:val="24"/>
+          <w:szCs w:val="24"/>
+        </w:rPr>
+        <w:lastRenderedPageBreak/>
+        <w:t>arrange the appropriate documentation, make-up, or equivalent task. Communicating early helps us find an appropriate arrangement.</w:t>
       </w:r>
     </w:p>
     <w:p>
@@ -7403,7 +7659,6 @@
           </w:tcPr>
           <w:p>
             <w:r>
-              <w:lastRenderedPageBreak/>
               <w:t>Week 3</w:t>
             </w:r>
           </w:p>
@@ -7920,6 +8175,7 @@
           </w:tcPr>
           <w:p>
             <w:r>
+              <w:lastRenderedPageBreak/>
               <w:t>Fri Sep 17</w:t>
             </w:r>
           </w:p>
@@ -9540,7 +9796,6 @@
           </w:tcPr>
           <w:p>
             <w:r>
-              <w:lastRenderedPageBreak/>
               <w:t>Week 9</w:t>
             </w:r>
           </w:p>
@@ -9920,6 +10175,7 @@
           </w:tcPr>
           <w:p>
             <w:r>
+              <w:lastRenderedPageBreak/>
               <w:t>Fri Oct 22</w:t>
             </w:r>
           </w:p>
@@ -11396,7 +11652,6 @@
           </w:tcPr>
           <w:p>
             <w:r>
-              <w:lastRenderedPageBreak/>
               <w:t>Wed Nov 17</w:t>
             </w:r>
           </w:p>
@@ -11841,6 +12096,7 @@
           </w:tcPr>
           <w:p>
             <w:r>
+              <w:lastRenderedPageBreak/>
               <w:t>Week 15</w:t>
             </w:r>
           </w:p>

</xml_diff>